<commit_message>
Zabbix push monitoring for all nodes, wired into lab-up/down; log updated
</commit_message>
<xml_diff>
--- a/ZT_Project_Implementation_Log.docx
+++ b/ZT_Project_Implementation_Log.docx
@@ -84,7 +84,7 @@
           <w:sz w:val="22"/>
           <w:szCs w:val="22"/>
         </w:rPr>
-        <w:t xml:space="preserve">Last updated 14 October 2026 at 12:03</w:t>
+        <w:t xml:space="preserve">Last updated 14 October 2026 at 12:10</w:t>
       </w:r>
     </w:p>
     <w:p>
@@ -809,7 +809,7 @@
           </w:pPr>
           <w:hyperlink w:history="1" w:anchor="_Toc31">
             <w:r>
-              <w:t xml:space="preserve">8.3 Being added: every node pushes its own data</w:t>
+              <w:t xml:space="preserve">8.3 Every node pushes its own data (zt_zbx_push.py)</w:t>
             </w:r>
             <w:r>
               <w:tab/>
@@ -1475,7 +1475,7 @@
           </w:tcPr>
           <w:p>
             <w:r>
-              <w:t xml:space="preserve">Collection started 14 Oct (about 65 minutes)</w:t>
+              <w:t xml:space="preserve">First run (14 Oct) set aside after an MTU fault was found; re-collection pending</w:t>
             </w:r>
           </w:p>
         </w:tc>
@@ -1659,7 +1659,7 @@
           </w:tcPr>
           <w:p>
             <w:r>
-              <w:t xml:space="preserve">Being built (section 8)</w:t>
+              <w:t xml:space="preserve">Done and verified: 9 nodes push 54 values per cycle, test alert raised a Problem</w:t>
             </w:r>
           </w:p>
         </w:tc>
@@ -7312,7 +7312,15 @@
         <w:pStyle w:val="Heading3"/>
       </w:pPr>
       <w:r>
-        <w:t xml:space="preserve">Dataset collection (started 14 October)</w:t>
+        <w:t xml:space="preserve">Dataset collection and the MTU fault</w:t>
+      </w:r>
+    </w:p>
+    <w:p>
+      <w:pPr>
+        <w:spacing w:after="120"/>
+      </w:pPr>
+      <w:r>
+        <w:t xml:space="preserve">The first full collection (11:03 to 12:08) completed, but the summary showed the insider attack produced only about 31 packets per window instead of megabytes. Investigation found an MTU mismatch: the Linux nodes used 9500-byte jumbo frames while the cEOS switches route at 1500, so large HTTP replies were dropped at the core. Pings and small pages fit, which is why nothing had looked wrong before. All Linux lab interfaces were set to MTU 1500 in the topology; afterwards a 20 MB download ran at about 6 MB/s and an insider smoke test showed about 15 MB per window. The first datasets were moved to data/old_mtu_bug/ as evidence and are being re-collected.</w:t>
       </w:r>
     </w:p>
     <w:p>
@@ -9517,6 +9525,74 @@
           </w:tcPr>
           <w:p>
             <w:r>
+              <w:t xml:space="preserve">Insider downloads never happened; 200 kB downloads stalled</w:t>
+            </w:r>
+          </w:p>
+        </w:tc>
+        <w:tc>
+          <w:tcPr>
+            <w:tcW w:type="dxa" w:w="3069"/>
+            <w:tcBorders>
+              <w:top w:val="single" w:color="BFBFBF" w:sz="4"/>
+              <w:left w:val="single" w:color="BFBFBF" w:sz="4"/>
+              <w:bottom w:val="single" w:color="BFBFBF" w:sz="4"/>
+              <w:right w:val="single" w:color="BFBFBF" w:sz="4"/>
+            </w:tcBorders>
+            <w:tcMar>
+              <w:top w:type="dxa" w:w="60"/>
+              <w:left w:type="dxa" w:w="100"/>
+              <w:bottom w:type="dxa" w:w="60"/>
+              <w:right w:type="dxa" w:w="100"/>
+            </w:tcMar>
+          </w:tcPr>
+          <w:p>
+            <w:r>
+              <w:t xml:space="preserve">Linux nodes used MTU 9500 but cEOS routes at 1500, so large replies were dropped at the core</w:t>
+            </w:r>
+          </w:p>
+        </w:tc>
+        <w:tc>
+          <w:tcPr>
+            <w:tcW w:type="dxa" w:w="3430"/>
+            <w:tcBorders>
+              <w:top w:val="single" w:color="BFBFBF" w:sz="4"/>
+              <w:left w:val="single" w:color="BFBFBF" w:sz="4"/>
+              <w:bottom w:val="single" w:color="BFBFBF" w:sz="4"/>
+              <w:right w:val="single" w:color="BFBFBF" w:sz="4"/>
+            </w:tcBorders>
+            <w:tcMar>
+              <w:top w:type="dxa" w:w="60"/>
+              <w:left w:type="dxa" w:w="100"/>
+              <w:bottom w:type="dxa" w:w="60"/>
+              <w:right w:type="dxa" w:w="100"/>
+            </w:tcMar>
+          </w:tcPr>
+          <w:p>
+            <w:r>
+              <w:t xml:space="preserve">All Linux lab interfaces set to MTU 1500 in zt-dev.clab.yml; first datasets kept in data/old_mtu_bug/ and re-collected</w:t>
+            </w:r>
+          </w:p>
+        </w:tc>
+      </w:tr>
+      <w:tr>
+        <w:tc>
+          <w:tcPr>
+            <w:tcW w:type="dxa" w:w="2527"/>
+            <w:tcBorders>
+              <w:top w:val="single" w:color="BFBFBF" w:sz="4"/>
+              <w:left w:val="single" w:color="BFBFBF" w:sz="4"/>
+              <w:bottom w:val="single" w:color="BFBFBF" w:sz="4"/>
+              <w:right w:val="single" w:color="BFBFBF" w:sz="4"/>
+            </w:tcBorders>
+            <w:tcMar>
+              <w:top w:type="dxa" w:w="60"/>
+              <w:left w:type="dxa" w:w="100"/>
+              <w:bottom w:type="dxa" w:w="60"/>
+              <w:right w:type="dxa" w:w="100"/>
+            </w:tcMar>
+          </w:tcPr>
+          <w:p>
+            <w:r>
               <w:t xml:space="preserve">Little free RAM for captures</w:t>
             </w:r>
           </w:p>
@@ -9693,7 +9769,7 @@
       </w:pPr>
       <w:bookmarkStart w:name="_Toc31" w:id="31"/>
       <w:r>
-        <w:t xml:space="preserve">8.3 Being added: every node pushes its own data</w:t>
+        <w:t xml:space="preserve">8.3 Every node pushes its own data (zt_zbx_push.py)</w:t>
       </w:r>
       <w:bookmarkEnd w:id="31"/>
     </w:p>
@@ -9702,7 +9778,386 @@
         <w:spacing w:after="120"/>
       </w:pPr>
       <w:r>
-        <w:t xml:space="preserve">SNMP and ping are pull-based and tell little about the Linux nodes. A push script sends each node's interface packet and byte counters, CPU load and memory use to Zabbix trapper items every 30 seconds, and the response engine will use the same channel to push security alerts. The result is one Zabbix view of the whole topology: switches, servers, PCs and incidents.</w:t>
+        <w:t xml:space="preserve">SNMP and ping are pull-based and tell little about the Linux nodes. zt_zbx_push.py reads each container's own counters and sends them to Zabbix with the Zabbix sender protocol (TCP 10051) every 30 seconds. Zabbix converts the counters into per-second rates.</w:t>
+      </w:r>
+    </w:p>
+    <w:tbl>
+      <w:tblPr>
+        <w:tblW w:type="dxa" w:w="9026"/>
+        <w:tblBorders>
+          <w:top w:val="single" w:color="auto" w:sz="4"/>
+          <w:left w:val="single" w:color="auto" w:sz="4"/>
+          <w:bottom w:val="single" w:color="auto" w:sz="4"/>
+          <w:right w:val="single" w:color="auto" w:sz="4"/>
+          <w:insideH w:val="single" w:color="auto" w:sz="4"/>
+          <w:insideV w:val="single" w:color="auto" w:sz="4"/>
+        </w:tblBorders>
+      </w:tblPr>
+      <w:tblGrid>
+        <w:gridCol w:w="4062"/>
+        <w:gridCol w:w="4964"/>
+      </w:tblGrid>
+      <w:tr>
+        <w:trPr>
+          <w:tblHeader/>
+        </w:trPr>
+        <w:tc>
+          <w:tcPr>
+            <w:tcW w:type="dxa" w:w="4062"/>
+            <w:tcBorders>
+              <w:top w:val="single" w:color="BFBFBF" w:sz="4"/>
+              <w:left w:val="single" w:color="BFBFBF" w:sz="4"/>
+              <w:bottom w:val="single" w:color="BFBFBF" w:sz="4"/>
+              <w:right w:val="single" w:color="BFBFBF" w:sz="4"/>
+            </w:tcBorders>
+            <w:shd w:fill="1F4E79" w:color="auto" w:val="clear"/>
+            <w:tcMar>
+              <w:top w:type="dxa" w:w="60"/>
+              <w:left w:type="dxa" w:w="100"/>
+              <w:bottom w:type="dxa" w:w="60"/>
+              <w:right w:type="dxa" w:w="100"/>
+            </w:tcMar>
+          </w:tcPr>
+          <w:p>
+            <w:r>
+              <w:rPr>
+                <w:b/>
+                <w:bCs/>
+                <w:color w:val="FFFFFF"/>
+                <w:sz w:val="19"/>
+                <w:szCs w:val="19"/>
+              </w:rPr>
+              <w:t xml:space="preserve">Item</w:t>
+            </w:r>
+          </w:p>
+        </w:tc>
+        <w:tc>
+          <w:tcPr>
+            <w:tcW w:type="dxa" w:w="4964"/>
+            <w:tcBorders>
+              <w:top w:val="single" w:color="BFBFBF" w:sz="4"/>
+              <w:left w:val="single" w:color="BFBFBF" w:sz="4"/>
+              <w:bottom w:val="single" w:color="BFBFBF" w:sz="4"/>
+              <w:right w:val="single" w:color="BFBFBF" w:sz="4"/>
+            </w:tcBorders>
+            <w:shd w:fill="1F4E79" w:color="auto" w:val="clear"/>
+            <w:tcMar>
+              <w:top w:type="dxa" w:w="60"/>
+              <w:left w:type="dxa" w:w="100"/>
+              <w:bottom w:type="dxa" w:w="60"/>
+              <w:right w:type="dxa" w:w="100"/>
+            </w:tcMar>
+          </w:tcPr>
+          <w:p>
+            <w:r>
+              <w:rPr>
+                <w:b/>
+                <w:bCs/>
+                <w:color w:val="FFFFFF"/>
+                <w:sz w:val="19"/>
+                <w:szCs w:val="19"/>
+              </w:rPr>
+              <w:t xml:space="preserve">Meaning</w:t>
+            </w:r>
+          </w:p>
+        </w:tc>
+      </w:tr>
+      <w:tr>
+        <w:tc>
+          <w:tcPr>
+            <w:tcW w:type="dxa" w:w="4062"/>
+            <w:tcBorders>
+              <w:top w:val="single" w:color="BFBFBF" w:sz="4"/>
+              <w:left w:val="single" w:color="BFBFBF" w:sz="4"/>
+              <w:bottom w:val="single" w:color="BFBFBF" w:sz="4"/>
+              <w:right w:val="single" w:color="BFBFBF" w:sz="4"/>
+            </w:tcBorders>
+            <w:tcMar>
+              <w:top w:type="dxa" w:w="60"/>
+              <w:left w:type="dxa" w:w="100"/>
+              <w:bottom w:type="dxa" w:w="60"/>
+              <w:right w:type="dxa" w:w="100"/>
+            </w:tcMar>
+          </w:tcPr>
+          <w:p>
+            <w:r>
+              <w:t xml:space="preserve">Data ports: packets in / out per second</w:t>
+            </w:r>
+          </w:p>
+        </w:tc>
+        <w:tc>
+          <w:tcPr>
+            <w:tcW w:type="dxa" w:w="4964"/>
+            <w:tcBorders>
+              <w:top w:val="single" w:color="BFBFBF" w:sz="4"/>
+              <w:left w:val="single" w:color="BFBFBF" w:sz="4"/>
+              <w:bottom w:val="single" w:color="BFBFBF" w:sz="4"/>
+              <w:right w:val="single" w:color="BFBFBF" w:sz="4"/>
+            </w:tcBorders>
+            <w:tcMar>
+              <w:top w:type="dxa" w:w="60"/>
+              <w:left w:type="dxa" w:w="100"/>
+              <w:bottom w:type="dxa" w:w="60"/>
+              <w:right w:type="dxa" w:w="100"/>
+            </w:tcMar>
+          </w:tcPr>
+          <w:p>
+            <w:r>
+              <w:t xml:space="preserve">Traffic on the node's lab interfaces (management eth0 excluded)</w:t>
+            </w:r>
+          </w:p>
+        </w:tc>
+      </w:tr>
+      <w:tr>
+        <w:tc>
+          <w:tcPr>
+            <w:tcW w:type="dxa" w:w="4062"/>
+            <w:tcBorders>
+              <w:top w:val="single" w:color="BFBFBF" w:sz="4"/>
+              <w:left w:val="single" w:color="BFBFBF" w:sz="4"/>
+              <w:bottom w:val="single" w:color="BFBFBF" w:sz="4"/>
+              <w:right w:val="single" w:color="BFBFBF" w:sz="4"/>
+            </w:tcBorders>
+            <w:tcMar>
+              <w:top w:type="dxa" w:w="60"/>
+              <w:left w:type="dxa" w:w="100"/>
+              <w:bottom w:type="dxa" w:w="60"/>
+              <w:right w:type="dxa" w:w="100"/>
+            </w:tcMar>
+          </w:tcPr>
+          <w:p>
+            <w:r>
+              <w:t xml:space="preserve">Data ports: bytes in / out per second</w:t>
+            </w:r>
+          </w:p>
+        </w:tc>
+        <w:tc>
+          <w:tcPr>
+            <w:tcW w:type="dxa" w:w="4964"/>
+            <w:tcBorders>
+              <w:top w:val="single" w:color="BFBFBF" w:sz="4"/>
+              <w:left w:val="single" w:color="BFBFBF" w:sz="4"/>
+              <w:bottom w:val="single" w:color="BFBFBF" w:sz="4"/>
+              <w:right w:val="single" w:color="BFBFBF" w:sz="4"/>
+            </w:tcBorders>
+            <w:tcMar>
+              <w:top w:type="dxa" w:w="60"/>
+              <w:left w:type="dxa" w:w="100"/>
+              <w:bottom w:type="dxa" w:w="60"/>
+              <w:right w:type="dxa" w:w="100"/>
+            </w:tcMar>
+          </w:tcPr>
+          <w:p>
+            <w:r>
+              <w:t xml:space="preserve">Throughput on the lab interfaces</w:t>
+            </w:r>
+          </w:p>
+        </w:tc>
+      </w:tr>
+      <w:tr>
+        <w:tc>
+          <w:tcPr>
+            <w:tcW w:type="dxa" w:w="4062"/>
+            <w:tcBorders>
+              <w:top w:val="single" w:color="BFBFBF" w:sz="4"/>
+              <w:left w:val="single" w:color="BFBFBF" w:sz="4"/>
+              <w:bottom w:val="single" w:color="BFBFBF" w:sz="4"/>
+              <w:right w:val="single" w:color="BFBFBF" w:sz="4"/>
+            </w:tcBorders>
+            <w:tcMar>
+              <w:top w:type="dxa" w:w="60"/>
+              <w:left w:type="dxa" w:w="100"/>
+              <w:bottom w:type="dxa" w:w="60"/>
+              <w:right w:type="dxa" w:w="100"/>
+            </w:tcMar>
+          </w:tcPr>
+          <w:p>
+            <w:r>
+              <w:t xml:space="preserve">Data ports: dropped packets per second</w:t>
+            </w:r>
+          </w:p>
+        </w:tc>
+        <w:tc>
+          <w:tcPr>
+            <w:tcW w:type="dxa" w:w="4964"/>
+            <w:tcBorders>
+              <w:top w:val="single" w:color="BFBFBF" w:sz="4"/>
+              <w:left w:val="single" w:color="BFBFBF" w:sz="4"/>
+              <w:bottom w:val="single" w:color="BFBFBF" w:sz="4"/>
+              <w:right w:val="single" w:color="BFBFBF" w:sz="4"/>
+            </w:tcBorders>
+            <w:tcMar>
+              <w:top w:type="dxa" w:w="60"/>
+              <w:left w:type="dxa" w:w="100"/>
+              <w:bottom w:type="dxa" w:w="60"/>
+              <w:right w:type="dxa" w:w="100"/>
+            </w:tcMar>
+          </w:tcPr>
+          <w:p>
+            <w:r>
+              <w:t xml:space="preserve">Receive and transmit drops</w:t>
+            </w:r>
+          </w:p>
+        </w:tc>
+      </w:tr>
+      <w:tr>
+        <w:tc>
+          <w:tcPr>
+            <w:tcW w:type="dxa" w:w="4062"/>
+            <w:tcBorders>
+              <w:top w:val="single" w:color="BFBFBF" w:sz="4"/>
+              <w:left w:val="single" w:color="BFBFBF" w:sz="4"/>
+              <w:bottom w:val="single" w:color="BFBFBF" w:sz="4"/>
+              <w:right w:val="single" w:color="BFBFBF" w:sz="4"/>
+            </w:tcBorders>
+            <w:tcMar>
+              <w:top w:type="dxa" w:w="60"/>
+              <w:left w:type="dxa" w:w="100"/>
+              <w:bottom w:type="dxa" w:w="60"/>
+              <w:right w:type="dxa" w:w="100"/>
+            </w:tcMar>
+          </w:tcPr>
+          <w:p>
+            <w:r>
+              <w:t xml:space="preserve">Container CPU usage</w:t>
+            </w:r>
+          </w:p>
+        </w:tc>
+        <w:tc>
+          <w:tcPr>
+            <w:tcW w:type="dxa" w:w="4964"/>
+            <w:tcBorders>
+              <w:top w:val="single" w:color="BFBFBF" w:sz="4"/>
+              <w:left w:val="single" w:color="BFBFBF" w:sz="4"/>
+              <w:bottom w:val="single" w:color="BFBFBF" w:sz="4"/>
+              <w:right w:val="single" w:color="BFBFBF" w:sz="4"/>
+            </w:tcBorders>
+            <w:tcMar>
+              <w:top w:type="dxa" w:w="60"/>
+              <w:left w:type="dxa" w:w="100"/>
+              <w:bottom w:type="dxa" w:w="60"/>
+              <w:right w:type="dxa" w:w="100"/>
+            </w:tcMar>
+          </w:tcPr>
+          <w:p>
+            <w:r>
+              <w:t xml:space="preserve">CPU time used by the container, in percent</w:t>
+            </w:r>
+          </w:p>
+        </w:tc>
+      </w:tr>
+      <w:tr>
+        <w:tc>
+          <w:tcPr>
+            <w:tcW w:type="dxa" w:w="4062"/>
+            <w:tcBorders>
+              <w:top w:val="single" w:color="BFBFBF" w:sz="4"/>
+              <w:left w:val="single" w:color="BFBFBF" w:sz="4"/>
+              <w:bottom w:val="single" w:color="BFBFBF" w:sz="4"/>
+              <w:right w:val="single" w:color="BFBFBF" w:sz="4"/>
+            </w:tcBorders>
+            <w:tcMar>
+              <w:top w:type="dxa" w:w="60"/>
+              <w:left w:type="dxa" w:w="100"/>
+              <w:bottom w:type="dxa" w:w="60"/>
+              <w:right w:type="dxa" w:w="100"/>
+            </w:tcMar>
+          </w:tcPr>
+          <w:p>
+            <w:r>
+              <w:t xml:space="preserve">Container memory in use</w:t>
+            </w:r>
+          </w:p>
+        </w:tc>
+        <w:tc>
+          <w:tcPr>
+            <w:tcW w:type="dxa" w:w="4964"/>
+            <w:tcBorders>
+              <w:top w:val="single" w:color="BFBFBF" w:sz="4"/>
+              <w:left w:val="single" w:color="BFBFBF" w:sz="4"/>
+              <w:bottom w:val="single" w:color="BFBFBF" w:sz="4"/>
+              <w:right w:val="single" w:color="BFBFBF" w:sz="4"/>
+            </w:tcBorders>
+            <w:tcMar>
+              <w:top w:type="dxa" w:w="60"/>
+              <w:left w:type="dxa" w:w="100"/>
+              <w:bottom w:type="dxa" w:w="60"/>
+              <w:right w:type="dxa" w:w="100"/>
+            </w:tcMar>
+          </w:tcPr>
+          <w:p>
+            <w:r>
+              <w:t xml:space="preserve">Memory charged to the container (cgroup)</w:t>
+            </w:r>
+          </w:p>
+        </w:tc>
+      </w:tr>
+      <w:tr>
+        <w:tc>
+          <w:tcPr>
+            <w:tcW w:type="dxa" w:w="4062"/>
+            <w:tcBorders>
+              <w:top w:val="single" w:color="BFBFBF" w:sz="4"/>
+              <w:left w:val="single" w:color="BFBFBF" w:sz="4"/>
+              <w:bottom w:val="single" w:color="BFBFBF" w:sz="4"/>
+              <w:right w:val="single" w:color="BFBFBF" w:sz="4"/>
+            </w:tcBorders>
+            <w:tcMar>
+              <w:top w:type="dxa" w:w="60"/>
+              <w:left w:type="dxa" w:w="100"/>
+              <w:bottom w:type="dxa" w:w="60"/>
+              <w:right w:type="dxa" w:w="100"/>
+            </w:tcMar>
+          </w:tcPr>
+          <w:p>
+            <w:r>
+              <w:t xml:space="preserve">Security alert (detection pipeline)</w:t>
+            </w:r>
+          </w:p>
+        </w:tc>
+        <w:tc>
+          <w:tcPr>
+            <w:tcW w:type="dxa" w:w="4964"/>
+            <w:tcBorders>
+              <w:top w:val="single" w:color="BFBFBF" w:sz="4"/>
+              <w:left w:val="single" w:color="BFBFBF" w:sz="4"/>
+              <w:bottom w:val="single" w:color="BFBFBF" w:sz="4"/>
+              <w:right w:val="single" w:color="BFBFBF" w:sz="4"/>
+            </w:tcBorders>
+            <w:tcMar>
+              <w:top w:type="dxa" w:w="60"/>
+              <w:left w:type="dxa" w:w="100"/>
+              <w:bottom w:type="dxa" w:w="60"/>
+              <w:right w:type="dxa" w:w="100"/>
+            </w:tcMar>
+          </w:tcPr>
+          <w:p>
+            <w:r>
+              <w:t xml:space="preserve">Text alerts from the response engine; each one opens a Problem</w:t>
+            </w:r>
+          </w:p>
+        </w:tc>
+      </w:tr>
+    </w:tbl>
+    <w:p>
+      <w:pPr>
+        <w:spacing w:after="120"/>
+      </w:pPr>
+    </w:p>
+    <w:p>
+      <w:pPr>
+        <w:spacing w:after="120"/>
+      </w:pPr>
+      <w:r>
+        <w:t xml:space="preserve">Triggers: high packet rate (over 1000 packets/s), container CPU above 80 % for 2 minutes, and security alert (stays open until an administrator closes it). A dashboard "ZT Lab overview" shows problems, host availability and graphs of traffic, CPU and memory for every node. lab-up.sh starts the push loop and lab-down.sh stops it.</w:t>
+      </w:r>
+    </w:p>
+    <w:p>
+      <w:pPr>
+        <w:spacing w:after="120"/>
+      </w:pPr>
+      <w:r>
+        <w:t xml:space="preserve">Verified on 14 October: all 9 nodes pushed 54 values per cycle with 0 failures, and a test alert for guest-pc appeared under Monitoring &gt; Problems. Zabbix also reported that both cEOS switches use over 90 % of their memory allowance, which matches the RAM pressure seen throughout the project.</w:t>
       </w:r>
     </w:p>
     <w:p>

</xml_diff>

<commit_message>
Panel demo script (demo.md); log updated with dashboard pages
</commit_message>
<xml_diff>
--- a/ZT_Project_Implementation_Log.docx
+++ b/ZT_Project_Implementation_Log.docx
@@ -84,7 +84,7 @@
           <w:sz w:val="22"/>
           <w:szCs w:val="22"/>
         </w:rPr>
-        <w:t xml:space="preserve">Last updated 14 October 2026 at 12:10</w:t>
+        <w:t xml:space="preserve">Last updated 14 October 2026 at 12:23</w:t>
       </w:r>
     </w:p>
     <w:p>
@@ -824,37 +824,37 @@
         </w:p>
         <w:p>
           <w:pPr>
-            <w:pStyle w:val="TOC1"/>
-            <w:tabs>
-              <w:tab w:val="right" w:pos="9026" w:leader="dot"/>
-            </w:tabs>
-          </w:pPr>
-          <w:hyperlink w:history="1" w:anchor="_Toc32">
-            <w:r>
-              <w:t xml:space="preserve">9. Remaining Work</w:t>
-            </w:r>
-            <w:r>
-              <w:tab/>
-            </w:r>
-            <w:r>
-              <w:fldChar w:fldCharType="begin" w:dirty="true"/>
-              <w:instrText xml:space="preserve">PAGEREF _Toc32 \h</w:instrText>
-              <w:fldChar w:fldCharType="separate"/>
-              <w:fldChar w:fldCharType="end"/>
-            </w:r>
-          </w:hyperlink>
-        </w:p>
-        <w:p>
-          <w:pPr>
             <w:pStyle w:val="TOC2"/>
             <w:tabs>
               <w:tab w:val="right" w:pos="9026" w:leader="dot"/>
             </w:tabs>
             <w:ind w:left="220"/>
           </w:pPr>
+          <w:hyperlink w:history="1" w:anchor="_Toc32">
+            <w:r>
+              <w:t xml:space="preserve">8.4 The two dashboard pages</w:t>
+            </w:r>
+            <w:r>
+              <w:tab/>
+            </w:r>
+            <w:r>
+              <w:fldChar w:fldCharType="begin" w:dirty="true"/>
+              <w:instrText xml:space="preserve">PAGEREF _Toc32 \h</w:instrText>
+              <w:fldChar w:fldCharType="separate"/>
+              <w:fldChar w:fldCharType="end"/>
+            </w:r>
+          </w:hyperlink>
+        </w:p>
+        <w:p>
+          <w:pPr>
+            <w:pStyle w:val="TOC1"/>
+            <w:tabs>
+              <w:tab w:val="right" w:pos="9026" w:leader="dot"/>
+            </w:tabs>
+          </w:pPr>
           <w:hyperlink w:history="1" w:anchor="_Toc33">
             <w:r>
-              <w:t xml:space="preserve">Phase 3 (detection and response)</w:t>
+              <w:t xml:space="preserve">9. Remaining Work</w:t>
             </w:r>
             <w:r>
               <w:tab/>
@@ -877,7 +877,7 @@
           </w:pPr>
           <w:hyperlink w:history="1" w:anchor="_Toc34">
             <w:r>
-              <w:t xml:space="preserve">Phase 4 (validation and report)</w:t>
+              <w:t xml:space="preserve">Phase 3 (detection and response)</w:t>
             </w:r>
             <w:r>
               <w:tab/>
@@ -885,28 +885,6 @@
             <w:r>
               <w:fldChar w:fldCharType="begin" w:dirty="true"/>
               <w:instrText xml:space="preserve">PAGEREF _Toc34 \h</w:instrText>
-              <w:fldChar w:fldCharType="separate"/>
-              <w:fldChar w:fldCharType="end"/>
-            </w:r>
-          </w:hyperlink>
-        </w:p>
-        <w:p>
-          <w:pPr>
-            <w:pStyle w:val="TOC1"/>
-            <w:tabs>
-              <w:tab w:val="right" w:pos="9026" w:leader="dot"/>
-            </w:tabs>
-          </w:pPr>
-          <w:hyperlink w:history="1" w:anchor="_Toc35">
-            <w:r>
-              <w:t xml:space="preserve">10. Files and Commands</w:t>
-            </w:r>
-            <w:r>
-              <w:tab/>
-            </w:r>
-            <w:r>
-              <w:fldChar w:fldCharType="begin" w:dirty="true"/>
-              <w:instrText xml:space="preserve">PAGEREF _Toc35 \h</w:instrText>
               <w:fldChar w:fldCharType="separate"/>
               <w:fldChar w:fldCharType="end"/>
             </w:r>
@@ -920,16 +898,16 @@
             </w:tabs>
             <w:ind w:left="220"/>
           </w:pPr>
-          <w:hyperlink w:history="1" w:anchor="_Toc36">
-            <w:r>
-              <w:t xml:space="preserve">Daily routine</w:t>
+          <w:hyperlink w:history="1" w:anchor="_Toc35">
+            <w:r>
+              <w:t xml:space="preserve">Phase 4 (validation and report)</w:t>
             </w:r>
             <w:r>
               <w:tab/>
             </w:r>
             <w:r>
               <w:fldChar w:fldCharType="begin" w:dirty="true"/>
-              <w:instrText xml:space="preserve">PAGEREF _Toc36 \h</w:instrText>
+              <w:instrText xml:space="preserve">PAGEREF _Toc35 \h</w:instrText>
               <w:fldChar w:fldCharType="separate"/>
               <w:fldChar w:fldCharType="end"/>
             </w:r>
@@ -942,9 +920,32 @@
               <w:tab w:val="right" w:pos="9026" w:leader="dot"/>
             </w:tabs>
           </w:pPr>
+          <w:hyperlink w:history="1" w:anchor="_Toc36">
+            <w:r>
+              <w:t xml:space="preserve">10. Files and Commands</w:t>
+            </w:r>
+            <w:r>
+              <w:tab/>
+            </w:r>
+            <w:r>
+              <w:fldChar w:fldCharType="begin" w:dirty="true"/>
+              <w:instrText xml:space="preserve">PAGEREF _Toc36 \h</w:instrText>
+              <w:fldChar w:fldCharType="separate"/>
+              <w:fldChar w:fldCharType="end"/>
+            </w:r>
+          </w:hyperlink>
+        </w:p>
+        <w:p>
+          <w:pPr>
+            <w:pStyle w:val="TOC2"/>
+            <w:tabs>
+              <w:tab w:val="right" w:pos="9026" w:leader="dot"/>
+            </w:tabs>
+            <w:ind w:left="220"/>
+          </w:pPr>
           <w:hyperlink w:history="1" w:anchor="_Toc37">
             <w:r>
-              <w:t xml:space="preserve">11. Report Corrections Needed</w:t>
+              <w:t xml:space="preserve">Daily routine</w:t>
             </w:r>
             <w:r>
               <w:tab/>
@@ -966,7 +967,7 @@
           </w:pPr>
           <w:hyperlink w:history="1" w:anchor="_Toc38">
             <w:r>
-              <w:t xml:space="preserve">12. Risks and Open Questions</w:t>
+              <w:t xml:space="preserve">11. Report Corrections Needed</w:t>
             </w:r>
             <w:r>
               <w:tab/>
@@ -974,6 +975,28 @@
             <w:r>
               <w:fldChar w:fldCharType="begin" w:dirty="true"/>
               <w:instrText xml:space="preserve">PAGEREF _Toc38 \h</w:instrText>
+              <w:fldChar w:fldCharType="separate"/>
+              <w:fldChar w:fldCharType="end"/>
+            </w:r>
+          </w:hyperlink>
+        </w:p>
+        <w:p>
+          <w:pPr>
+            <w:pStyle w:val="TOC1"/>
+            <w:tabs>
+              <w:tab w:val="right" w:pos="9026" w:leader="dot"/>
+            </w:tabs>
+          </w:pPr>
+          <w:hyperlink w:history="1" w:anchor="_Toc39">
+            <w:r>
+              <w:t xml:space="preserve">12. Risks and Open Questions</w:t>
+            </w:r>
+            <w:r>
+              <w:tab/>
+            </w:r>
+            <w:r>
+              <w:fldChar w:fldCharType="begin" w:dirty="true"/>
+              <w:instrText xml:space="preserve">PAGEREF _Toc39 \h</w:instrText>
               <w:fldChar w:fldCharType="separate"/>
               <w:fldChar w:fldCharType="end"/>
             </w:r>
@@ -10154,6 +10177,278 @@
     </w:p>
     <w:p>
       <w:pPr>
+        <w:pStyle w:val="Heading2"/>
+      </w:pPr>
+      <w:bookmarkStart w:name="_Toc32" w:id="32"/>
+      <w:r>
+        <w:t xml:space="preserve">8.4 The two dashboard pages</w:t>
+      </w:r>
+      <w:bookmarkEnd w:id="32"/>
+    </w:p>
+    <w:tbl>
+      <w:tblPr>
+        <w:tblW w:type="dxa" w:w="9026"/>
+        <w:tblBorders>
+          <w:top w:val="single" w:color="auto" w:sz="4"/>
+          <w:left w:val="single" w:color="auto" w:sz="4"/>
+          <w:bottom w:val="single" w:color="auto" w:sz="4"/>
+          <w:right w:val="single" w:color="auto" w:sz="4"/>
+          <w:insideH w:val="single" w:color="auto" w:sz="4"/>
+          <w:insideV w:val="single" w:color="auto" w:sz="4"/>
+        </w:tblBorders>
+      </w:tblPr>
+      <w:tblGrid>
+        <w:gridCol w:w="1805"/>
+        <w:gridCol w:w="4062"/>
+        <w:gridCol w:w="3159"/>
+      </w:tblGrid>
+      <w:tr>
+        <w:trPr>
+          <w:tblHeader/>
+        </w:trPr>
+        <w:tc>
+          <w:tcPr>
+            <w:tcW w:type="dxa" w:w="1805"/>
+            <w:tcBorders>
+              <w:top w:val="single" w:color="BFBFBF" w:sz="4"/>
+              <w:left w:val="single" w:color="BFBFBF" w:sz="4"/>
+              <w:bottom w:val="single" w:color="BFBFBF" w:sz="4"/>
+              <w:right w:val="single" w:color="BFBFBF" w:sz="4"/>
+            </w:tcBorders>
+            <w:shd w:fill="1F4E79" w:color="auto" w:val="clear"/>
+            <w:tcMar>
+              <w:top w:type="dxa" w:w="60"/>
+              <w:left w:type="dxa" w:w="100"/>
+              <w:bottom w:type="dxa" w:w="60"/>
+              <w:right w:type="dxa" w:w="100"/>
+            </w:tcMar>
+          </w:tcPr>
+          <w:p>
+            <w:r>
+              <w:rPr>
+                <w:b/>
+                <w:bCs/>
+                <w:color w:val="FFFFFF"/>
+                <w:sz w:val="19"/>
+                <w:szCs w:val="19"/>
+              </w:rPr>
+              <w:t xml:space="preserve">Page</w:t>
+            </w:r>
+          </w:p>
+        </w:tc>
+        <w:tc>
+          <w:tcPr>
+            <w:tcW w:type="dxa" w:w="4062"/>
+            <w:tcBorders>
+              <w:top w:val="single" w:color="BFBFBF" w:sz="4"/>
+              <w:left w:val="single" w:color="BFBFBF" w:sz="4"/>
+              <w:bottom w:val="single" w:color="BFBFBF" w:sz="4"/>
+              <w:right w:val="single" w:color="BFBFBF" w:sz="4"/>
+            </w:tcBorders>
+            <w:shd w:fill="1F4E79" w:color="auto" w:val="clear"/>
+            <w:tcMar>
+              <w:top w:type="dxa" w:w="60"/>
+              <w:left w:type="dxa" w:w="100"/>
+              <w:bottom w:type="dxa" w:w="60"/>
+              <w:right w:type="dxa" w:w="100"/>
+            </w:tcMar>
+          </w:tcPr>
+          <w:p>
+            <w:r>
+              <w:rPr>
+                <w:b/>
+                <w:bCs/>
+                <w:color w:val="FFFFFF"/>
+                <w:sz w:val="19"/>
+                <w:szCs w:val="19"/>
+              </w:rPr>
+              <w:t xml:space="preserve">Shows</w:t>
+            </w:r>
+          </w:p>
+        </w:tc>
+        <w:tc>
+          <w:tcPr>
+            <w:tcW w:type="dxa" w:w="3159"/>
+            <w:tcBorders>
+              <w:top w:val="single" w:color="BFBFBF" w:sz="4"/>
+              <w:left w:val="single" w:color="BFBFBF" w:sz="4"/>
+              <w:bottom w:val="single" w:color="BFBFBF" w:sz="4"/>
+              <w:right w:val="single" w:color="BFBFBF" w:sz="4"/>
+            </w:tcBorders>
+            <w:shd w:fill="1F4E79" w:color="auto" w:val="clear"/>
+            <w:tcMar>
+              <w:top w:type="dxa" w:w="60"/>
+              <w:left w:type="dxa" w:w="100"/>
+              <w:bottom w:type="dxa" w:w="60"/>
+              <w:right w:type="dxa" w:w="100"/>
+            </w:tcMar>
+          </w:tcPr>
+          <w:p>
+            <w:r>
+              <w:rPr>
+                <w:b/>
+                <w:bCs/>
+                <w:color w:val="FFFFFF"/>
+                <w:sz w:val="19"/>
+                <w:szCs w:val="19"/>
+              </w:rPr>
+              <w:t xml:space="preserve">Used in the demo for</w:t>
+            </w:r>
+          </w:p>
+        </w:tc>
+      </w:tr>
+      <w:tr>
+        <w:tc>
+          <w:tcPr>
+            <w:tcW w:type="dxa" w:w="1805"/>
+            <w:tcBorders>
+              <w:top w:val="single" w:color="BFBFBF" w:sz="4"/>
+              <w:left w:val="single" w:color="BFBFBF" w:sz="4"/>
+              <w:bottom w:val="single" w:color="BFBFBF" w:sz="4"/>
+              <w:right w:val="single" w:color="BFBFBF" w:sz="4"/>
+            </w:tcBorders>
+            <w:tcMar>
+              <w:top w:type="dxa" w:w="60"/>
+              <w:left w:type="dxa" w:w="100"/>
+              <w:bottom w:type="dxa" w:w="60"/>
+              <w:right w:type="dxa" w:w="100"/>
+            </w:tcMar>
+          </w:tcPr>
+          <w:p>
+            <w:r>
+              <w:t xml:space="preserve">Network health</w:t>
+            </w:r>
+          </w:p>
+        </w:tc>
+        <w:tc>
+          <w:tcPr>
+            <w:tcW w:type="dxa" w:w="4062"/>
+            <w:tcBorders>
+              <w:top w:val="single" w:color="BFBFBF" w:sz="4"/>
+              <w:left w:val="single" w:color="BFBFBF" w:sz="4"/>
+              <w:bottom w:val="single" w:color="BFBFBF" w:sz="4"/>
+              <w:right w:val="single" w:color="BFBFBF" w:sz="4"/>
+            </w:tcBorders>
+            <w:tcMar>
+              <w:top w:type="dxa" w:w="60"/>
+              <w:left w:type="dxa" w:w="100"/>
+              <w:bottom w:type="dxa" w:w="60"/>
+              <w:right w:type="dxa" w:w="100"/>
+            </w:tcMar>
+          </w:tcPr>
+          <w:p>
+            <w:r>
+              <w:t xml:space="preserve">Problems list, host availability, packets and bytes per second, CPU and memory for all nodes</w:t>
+            </w:r>
+          </w:p>
+        </w:tc>
+        <w:tc>
+          <w:tcPr>
+            <w:tcW w:type="dxa" w:w="3159"/>
+            <w:tcBorders>
+              <w:top w:val="single" w:color="BFBFBF" w:sz="4"/>
+              <w:left w:val="single" w:color="BFBFBF" w:sz="4"/>
+              <w:bottom w:val="single" w:color="BFBFBF" w:sz="4"/>
+              <w:right w:val="single" w:color="BFBFBF" w:sz="4"/>
+            </w:tcBorders>
+            <w:tcMar>
+              <w:top w:type="dxa" w:w="60"/>
+              <w:left w:type="dxa" w:w="100"/>
+              <w:bottom w:type="dxa" w:w="60"/>
+              <w:right w:type="dxa" w:w="100"/>
+            </w:tcMar>
+          </w:tcPr>
+          <w:p>
+            <w:r>
+              <w:t xml:space="preserve">Proving the whole topology is monitored; traffic spikes during attacks</w:t>
+            </w:r>
+          </w:p>
+        </w:tc>
+      </w:tr>
+      <w:tr>
+        <w:tc>
+          <w:tcPr>
+            <w:tcW w:type="dxa" w:w="1805"/>
+            <w:tcBorders>
+              <w:top w:val="single" w:color="BFBFBF" w:sz="4"/>
+              <w:left w:val="single" w:color="BFBFBF" w:sz="4"/>
+              <w:bottom w:val="single" w:color="BFBFBF" w:sz="4"/>
+              <w:right w:val="single" w:color="BFBFBF" w:sz="4"/>
+            </w:tcBorders>
+            <w:tcMar>
+              <w:top w:type="dxa" w:w="60"/>
+              <w:left w:type="dxa" w:w="100"/>
+              <w:bottom w:type="dxa" w:w="60"/>
+              <w:right w:type="dxa" w:w="100"/>
+            </w:tcMar>
+          </w:tcPr>
+          <w:p>
+            <w:r>
+              <w:t xml:space="preserve">Threat detection and response</w:t>
+            </w:r>
+          </w:p>
+        </w:tc>
+        <w:tc>
+          <w:tcPr>
+            <w:tcW w:type="dxa" w:w="4062"/>
+            <w:tcBorders>
+              <w:top w:val="single" w:color="BFBFBF" w:sz="4"/>
+              <w:left w:val="single" w:color="BFBFBF" w:sz="4"/>
+              <w:bottom w:val="single" w:color="BFBFBF" w:sz="4"/>
+              <w:right w:val="single" w:color="BFBFBF" w:sz="4"/>
+            </w:tcBorders>
+            <w:tcMar>
+              <w:top w:type="dxa" w:w="60"/>
+              <w:left w:type="dxa" w:w="100"/>
+              <w:bottom w:type="dxa" w:w="60"/>
+              <w:right w:type="dxa" w:w="100"/>
+            </w:tcMar>
+          </w:tcPr>
+          <w:p>
+            <w:r>
+              <w:t xml:space="preserve">Anomaly score per PC with the threshold line, security alerts, last response action per PC, detection-to-action time</w:t>
+            </w:r>
+          </w:p>
+        </w:tc>
+        <w:tc>
+          <w:tcPr>
+            <w:tcW w:type="dxa" w:w="3159"/>
+            <w:tcBorders>
+              <w:top w:val="single" w:color="BFBFBF" w:sz="4"/>
+              <w:left w:val="single" w:color="BFBFBF" w:sz="4"/>
+              <w:bottom w:val="single" w:color="BFBFBF" w:sz="4"/>
+              <w:right w:val="single" w:color="BFBFBF" w:sz="4"/>
+            </w:tcBorders>
+            <w:tcMar>
+              <w:top w:type="dxa" w:w="60"/>
+              <w:left w:type="dxa" w:w="100"/>
+              <w:bottom w:type="dxa" w:w="60"/>
+              <w:right w:type="dxa" w:w="100"/>
+            </w:tcMar>
+          </w:tcPr>
+          <w:p>
+            <w:r>
+              <w:t xml:space="preserve">Showing each attack being detected and answered automatically</w:t>
+            </w:r>
+          </w:p>
+        </w:tc>
+      </w:tr>
+    </w:tbl>
+    <w:p>
+      <w:pPr>
+        <w:spacing w:after="120"/>
+      </w:pPr>
+    </w:p>
+    <w:p>
+      <w:pPr>
+        <w:spacing w:after="120"/>
+      </w:pPr>
+      <w:r>
+        <w:t xml:space="preserve">The detection page was checked on 14 October with clearly labelled test values: the score graph drew the threshold line, and the action and timing widgets displayed the test entries. In Zabbix 7.0 the old Plain text widget is no longer available, so the Item history widget is used.</w:t>
+      </w:r>
+    </w:p>
+    <w:p>
+      <w:pPr>
         <w:spacing w:after="120"/>
       </w:pPr>
       <w:r>
@@ -10165,21 +10460,21 @@
         <w:pStyle w:val="Heading1"/>
         <w:pageBreakBefore/>
       </w:pPr>
-      <w:bookmarkStart w:name="_Toc32" w:id="32"/>
+      <w:bookmarkStart w:name="_Toc33" w:id="33"/>
       <w:r>
         <w:t xml:space="preserve">9. Remaining Work</w:t>
       </w:r>
-      <w:bookmarkEnd w:id="32"/>
+      <w:bookmarkEnd w:id="33"/>
     </w:p>
     <w:p>
       <w:pPr>
         <w:pStyle w:val="Heading2"/>
       </w:pPr>
-      <w:bookmarkStart w:name="_Toc33" w:id="33"/>
+      <w:bookmarkStart w:name="_Toc34" w:id="34"/>
       <w:r>
         <w:t xml:space="preserve">Phase 3 (detection and response)</w:t>
       </w:r>
-      <w:bookmarkEnd w:id="33"/>
+      <w:bookmarkEnd w:id="34"/>
     </w:p>
     <w:p>
       <w:pPr>
@@ -10325,11 +10620,11 @@
       <w:pPr>
         <w:pStyle w:val="Heading2"/>
       </w:pPr>
-      <w:bookmarkStart w:name="_Toc34" w:id="34"/>
+      <w:bookmarkStart w:name="_Toc35" w:id="35"/>
       <w:r>
         <w:t xml:space="preserve">Phase 4 (validation and report)</w:t>
       </w:r>
-      <w:bookmarkEnd w:id="34"/>
+      <w:bookmarkEnd w:id="35"/>
     </w:p>
     <w:p>
       <w:pPr>
@@ -10375,11 +10670,11 @@
         <w:pStyle w:val="Heading1"/>
         <w:pageBreakBefore/>
       </w:pPr>
-      <w:bookmarkStart w:name="_Toc35" w:id="35"/>
+      <w:bookmarkStart w:name="_Toc36" w:id="36"/>
       <w:r>
         <w:t xml:space="preserve">10. Files and Commands</w:t>
       </w:r>
-      <w:bookmarkEnd w:id="35"/>
+      <w:bookmarkEnd w:id="36"/>
     </w:p>
     <w:p>
       <w:pPr>
@@ -11273,6 +11568,52 @@
           </w:p>
         </w:tc>
       </w:tr>
+      <w:tr>
+        <w:tc>
+          <w:tcPr>
+            <w:tcW w:type="dxa" w:w="4062"/>
+            <w:tcBorders>
+              <w:top w:val="single" w:color="BFBFBF" w:sz="4"/>
+              <w:left w:val="single" w:color="BFBFBF" w:sz="4"/>
+              <w:bottom w:val="single" w:color="BFBFBF" w:sz="4"/>
+              <w:right w:val="single" w:color="BFBFBF" w:sz="4"/>
+            </w:tcBorders>
+            <w:tcMar>
+              <w:top w:type="dxa" w:w="60"/>
+              <w:left w:type="dxa" w:w="100"/>
+              <w:bottom w:type="dxa" w:w="60"/>
+              <w:right w:type="dxa" w:w="100"/>
+            </w:tcMar>
+          </w:tcPr>
+          <w:p>
+            <w:r>
+              <w:t xml:space="preserve">demo.md</w:t>
+            </w:r>
+          </w:p>
+        </w:tc>
+        <w:tc>
+          <w:tcPr>
+            <w:tcW w:type="dxa" w:w="4964"/>
+            <w:tcBorders>
+              <w:top w:val="single" w:color="BFBFBF" w:sz="4"/>
+              <w:left w:val="single" w:color="BFBFBF" w:sz="4"/>
+              <w:bottom w:val="single" w:color="BFBFBF" w:sz="4"/>
+              <w:right w:val="single" w:color="BFBFBF" w:sz="4"/>
+            </w:tcBorders>
+            <w:tcMar>
+              <w:top w:type="dxa" w:w="60"/>
+              <w:left w:type="dxa" w:w="100"/>
+              <w:bottom w:type="dxa" w:w="60"/>
+              <w:right w:type="dxa" w:w="100"/>
+            </w:tcMar>
+          </w:tcPr>
+          <w:p>
+            <w:r>
+              <w:t xml:space="preserve">Step-by-step panel demonstration script with exact commands</w:t>
+            </w:r>
+          </w:p>
+        </w:tc>
+      </w:tr>
     </w:tbl>
     <w:p>
       <w:pPr>
@@ -11283,11 +11624,11 @@
       <w:pPr>
         <w:pStyle w:val="Heading2"/>
       </w:pPr>
-      <w:bookmarkStart w:name="_Toc36" w:id="36"/>
+      <w:bookmarkStart w:name="_Toc37" w:id="37"/>
       <w:r>
         <w:t xml:space="preserve">Daily routine</w:t>
       </w:r>
-      <w:bookmarkEnd w:id="36"/>
+      <w:bookmarkEnd w:id="37"/>
     </w:p>
     <w:p>
       <w:pPr>
@@ -11407,11 +11748,11 @@
         <w:pStyle w:val="Heading1"/>
         <w:pageBreakBefore/>
       </w:pPr>
-      <w:bookmarkStart w:name="_Toc37" w:id="37"/>
+      <w:bookmarkStart w:name="_Toc38" w:id="38"/>
       <w:r>
         <w:t xml:space="preserve">11. Report Corrections Needed</w:t>
       </w:r>
-      <w:bookmarkEnd w:id="37"/>
+      <w:bookmarkEnd w:id="38"/>
     </w:p>
     <w:p>
       <w:pPr>
@@ -11538,11 +11879,11 @@
         <w:pStyle w:val="Heading1"/>
         <w:pageBreakBefore/>
       </w:pPr>
-      <w:bookmarkStart w:name="_Toc38" w:id="38"/>
+      <w:bookmarkStart w:name="_Toc39" w:id="39"/>
       <w:r>
         <w:t xml:space="preserve">12. Risks and Open Questions</w:t>
       </w:r>
-      <w:bookmarkEnd w:id="38"/>
+      <w:bookmarkEnd w:id="39"/>
     </w:p>
     <w:p>
       <w:pPr>

</xml_diff>

<commit_message>
Demo step 3b tested; dataset results in the log
</commit_message>
<xml_diff>
--- a/ZT_Project_Implementation_Log.docx
+++ b/ZT_Project_Implementation_Log.docx
@@ -84,7 +84,7 @@
           <w:sz w:val="22"/>
           <w:szCs w:val="22"/>
         </w:rPr>
-        <w:t xml:space="preserve">Last updated 14 October 2026 at 12:23</w:t>
+        <w:t xml:space="preserve">Last updated 14 October 2026 at 13:25</w:t>
       </w:r>
     </w:p>
     <w:p>
@@ -1498,7 +1498,7 @@
           </w:tcPr>
           <w:p>
             <w:r>
-              <w:t xml:space="preserve">First run (14 Oct) set aside after an MTU fault was found; re-collection pending</w:t>
+              <w:t xml:space="preserve">Done: 594 normal rows from 4 runs, 20 attack windows each for DoS, port scan, insider and off-hours</w:t>
             </w:r>
           </w:p>
         </w:tc>
@@ -7343,7 +7343,1045 @@
         <w:spacing w:after="120"/>
       </w:pPr>
       <w:r>
-        <w:t xml:space="preserve">The first full collection (11:03 to 12:08) completed, but the summary showed the insider attack produced only about 31 packets per window instead of megabytes. Investigation found an MTU mismatch: the Linux nodes used 9500-byte jumbo frames while the cEOS switches route at 1500, so large HTTP replies were dropped at the core. Pings and small pages fit, which is why nothing had looked wrong before. All Linux lab interfaces were set to MTU 1500 in the topology; afterwards a 20 MB download ran at about 6 MB/s and an insider smoke test showed about 15 MB per window. The first datasets were moved to data/old_mtu_bug/ as evidence and are being re-collected.</w:t>
+        <w:t xml:space="preserve">The first full collection (11:03 to 12:08) completed, but the summary showed the insider attack produced only about 31 packets per window instead of megabytes. Investigation found an MTU mismatch: the Linux nodes used 9500-byte jumbo frames while the cEOS switches route at 1500, so large HTTP replies were dropped at the core. Pings and small pages fit, which is why nothing had looked wrong before. All Linux lab interfaces were set to MTU 1500 in the topology; afterwards a 20 MB download ran at about 6 MB/s and an insider smoke test showed about 15 MB per window. The first datasets were moved to data/old_mtu_bug/ as evidence and everything was re-collected (12:25 to 13:30).</w:t>
+      </w:r>
+    </w:p>
+    <w:p>
+      <w:pPr>
+        <w:pStyle w:val="Heading3"/>
+      </w:pPr>
+      <w:r>
+        <w:t xml:space="preserve">Final datasets</w:t>
+      </w:r>
+    </w:p>
+    <w:tbl>
+      <w:tblPr>
+        <w:tblW w:type="dxa" w:w="9026"/>
+        <w:tblBorders>
+          <w:top w:val="single" w:color="auto" w:sz="4"/>
+          <w:left w:val="single" w:color="auto" w:sz="4"/>
+          <w:bottom w:val="single" w:color="auto" w:sz="4"/>
+          <w:right w:val="single" w:color="auto" w:sz="4"/>
+          <w:insideH w:val="single" w:color="auto" w:sz="4"/>
+          <w:insideV w:val="single" w:color="auto" w:sz="4"/>
+        </w:tblBorders>
+      </w:tblPr>
+      <w:tblGrid>
+        <w:gridCol w:w="1625"/>
+        <w:gridCol w:w="812"/>
+        <w:gridCol w:w="1173"/>
+        <w:gridCol w:w="1354"/>
+        <w:gridCol w:w="1534"/>
+        <w:gridCol w:w="1173"/>
+        <w:gridCol w:w="1355"/>
+      </w:tblGrid>
+      <w:tr>
+        <w:trPr>
+          <w:tblHeader/>
+        </w:trPr>
+        <w:tc>
+          <w:tcPr>
+            <w:tcW w:type="dxa" w:w="1625"/>
+            <w:tcBorders>
+              <w:top w:val="single" w:color="BFBFBF" w:sz="4"/>
+              <w:left w:val="single" w:color="BFBFBF" w:sz="4"/>
+              <w:bottom w:val="single" w:color="BFBFBF" w:sz="4"/>
+              <w:right w:val="single" w:color="BFBFBF" w:sz="4"/>
+            </w:tcBorders>
+            <w:shd w:fill="1F4E79" w:color="auto" w:val="clear"/>
+            <w:tcMar>
+              <w:top w:type="dxa" w:w="60"/>
+              <w:left w:type="dxa" w:w="100"/>
+              <w:bottom w:type="dxa" w:w="60"/>
+              <w:right w:type="dxa" w:w="100"/>
+            </w:tcMar>
+          </w:tcPr>
+          <w:p>
+            <w:r>
+              <w:rPr>
+                <w:b/>
+                <w:bCs/>
+                <w:color w:val="FFFFFF"/>
+                <w:sz w:val="19"/>
+                <w:szCs w:val="19"/>
+              </w:rPr>
+              <w:t xml:space="preserve">Class</w:t>
+            </w:r>
+          </w:p>
+        </w:tc>
+        <w:tc>
+          <w:tcPr>
+            <w:tcW w:type="dxa" w:w="812"/>
+            <w:tcBorders>
+              <w:top w:val="single" w:color="BFBFBF" w:sz="4"/>
+              <w:left w:val="single" w:color="BFBFBF" w:sz="4"/>
+              <w:bottom w:val="single" w:color="BFBFBF" w:sz="4"/>
+              <w:right w:val="single" w:color="BFBFBF" w:sz="4"/>
+            </w:tcBorders>
+            <w:shd w:fill="1F4E79" w:color="auto" w:val="clear"/>
+            <w:tcMar>
+              <w:top w:type="dxa" w:w="60"/>
+              <w:left w:type="dxa" w:w="100"/>
+              <w:bottom w:type="dxa" w:w="60"/>
+              <w:right w:type="dxa" w:w="100"/>
+            </w:tcMar>
+          </w:tcPr>
+          <w:p>
+            <w:r>
+              <w:rPr>
+                <w:b/>
+                <w:bCs/>
+                <w:color w:val="FFFFFF"/>
+                <w:sz w:val="19"/>
+                <w:szCs w:val="19"/>
+              </w:rPr>
+              <w:t xml:space="preserve">Rows</w:t>
+            </w:r>
+          </w:p>
+        </w:tc>
+        <w:tc>
+          <w:tcPr>
+            <w:tcW w:type="dxa" w:w="1173"/>
+            <w:tcBorders>
+              <w:top w:val="single" w:color="BFBFBF" w:sz="4"/>
+              <w:left w:val="single" w:color="BFBFBF" w:sz="4"/>
+              <w:bottom w:val="single" w:color="BFBFBF" w:sz="4"/>
+              <w:right w:val="single" w:color="BFBFBF" w:sz="4"/>
+            </w:tcBorders>
+            <w:shd w:fill="1F4E79" w:color="auto" w:val="clear"/>
+            <w:tcMar>
+              <w:top w:type="dxa" w:w="60"/>
+              <w:left w:type="dxa" w:w="100"/>
+              <w:bottom w:type="dxa" w:w="60"/>
+              <w:right w:type="dxa" w:w="100"/>
+            </w:tcMar>
+          </w:tcPr>
+          <w:p>
+            <w:r>
+              <w:rPr>
+                <w:b/>
+                <w:bCs/>
+                <w:color w:val="FFFFFF"/>
+                <w:sz w:val="19"/>
+                <w:szCs w:val="19"/>
+              </w:rPr>
+              <w:t xml:space="preserve">Attack windows</w:t>
+            </w:r>
+          </w:p>
+        </w:tc>
+        <w:tc>
+          <w:tcPr>
+            <w:tcW w:type="dxa" w:w="1354"/>
+            <w:tcBorders>
+              <w:top w:val="single" w:color="BFBFBF" w:sz="4"/>
+              <w:left w:val="single" w:color="BFBFBF" w:sz="4"/>
+              <w:bottom w:val="single" w:color="BFBFBF" w:sz="4"/>
+              <w:right w:val="single" w:color="BFBFBF" w:sz="4"/>
+            </w:tcBorders>
+            <w:shd w:fill="1F4E79" w:color="auto" w:val="clear"/>
+            <w:tcMar>
+              <w:top w:type="dxa" w:w="60"/>
+              <w:left w:type="dxa" w:w="100"/>
+              <w:bottom w:type="dxa" w:w="60"/>
+              <w:right w:type="dxa" w:w="100"/>
+            </w:tcMar>
+          </w:tcPr>
+          <w:p>
+            <w:r>
+              <w:rPr>
+                <w:b/>
+                <w:bCs/>
+                <w:color w:val="FFFFFF"/>
+                <w:sz w:val="19"/>
+                <w:szCs w:val="19"/>
+              </w:rPr>
+              <w:t xml:space="preserve">Median packets</w:t>
+            </w:r>
+          </w:p>
+        </w:tc>
+        <w:tc>
+          <w:tcPr>
+            <w:tcW w:type="dxa" w:w="1534"/>
+            <w:tcBorders>
+              <w:top w:val="single" w:color="BFBFBF" w:sz="4"/>
+              <w:left w:val="single" w:color="BFBFBF" w:sz="4"/>
+              <w:bottom w:val="single" w:color="BFBFBF" w:sz="4"/>
+              <w:right w:val="single" w:color="BFBFBF" w:sz="4"/>
+            </w:tcBorders>
+            <w:shd w:fill="1F4E79" w:color="auto" w:val="clear"/>
+            <w:tcMar>
+              <w:top w:type="dxa" w:w="60"/>
+              <w:left w:type="dxa" w:w="100"/>
+              <w:bottom w:type="dxa" w:w="60"/>
+              <w:right w:type="dxa" w:w="100"/>
+            </w:tcMar>
+          </w:tcPr>
+          <w:p>
+            <w:r>
+              <w:rPr>
+                <w:b/>
+                <w:bCs/>
+                <w:color w:val="FFFFFF"/>
+                <w:sz w:val="19"/>
+                <w:szCs w:val="19"/>
+              </w:rPr>
+              <w:t xml:space="preserve">Median bytes</w:t>
+            </w:r>
+          </w:p>
+        </w:tc>
+        <w:tc>
+          <w:tcPr>
+            <w:tcW w:type="dxa" w:w="1173"/>
+            <w:tcBorders>
+              <w:top w:val="single" w:color="BFBFBF" w:sz="4"/>
+              <w:left w:val="single" w:color="BFBFBF" w:sz="4"/>
+              <w:bottom w:val="single" w:color="BFBFBF" w:sz="4"/>
+              <w:right w:val="single" w:color="BFBFBF" w:sz="4"/>
+            </w:tcBorders>
+            <w:shd w:fill="1F4E79" w:color="auto" w:val="clear"/>
+            <w:tcMar>
+              <w:top w:type="dxa" w:w="60"/>
+              <w:left w:type="dxa" w:w="100"/>
+              <w:bottom w:type="dxa" w:w="60"/>
+              <w:right w:type="dxa" w:w="100"/>
+            </w:tcMar>
+          </w:tcPr>
+          <w:p>
+            <w:r>
+              <w:rPr>
+                <w:b/>
+                <w:bCs/>
+                <w:color w:val="FFFFFF"/>
+                <w:sz w:val="19"/>
+                <w:szCs w:val="19"/>
+              </w:rPr>
+              <w:t xml:space="preserve">Median ports</w:t>
+            </w:r>
+          </w:p>
+        </w:tc>
+        <w:tc>
+          <w:tcPr>
+            <w:tcW w:type="dxa" w:w="1355"/>
+            <w:tcBorders>
+              <w:top w:val="single" w:color="BFBFBF" w:sz="4"/>
+              <w:left w:val="single" w:color="BFBFBF" w:sz="4"/>
+              <w:bottom w:val="single" w:color="BFBFBF" w:sz="4"/>
+              <w:right w:val="single" w:color="BFBFBF" w:sz="4"/>
+            </w:tcBorders>
+            <w:shd w:fill="1F4E79" w:color="auto" w:val="clear"/>
+            <w:tcMar>
+              <w:top w:type="dxa" w:w="60"/>
+              <w:left w:type="dxa" w:w="100"/>
+              <w:bottom w:type="dxa" w:w="60"/>
+              <w:right w:type="dxa" w:w="100"/>
+            </w:tcMar>
+          </w:tcPr>
+          <w:p>
+            <w:r>
+              <w:rPr>
+                <w:b/>
+                <w:bCs/>
+                <w:color w:val="FFFFFF"/>
+                <w:sz w:val="19"/>
+                <w:szCs w:val="19"/>
+              </w:rPr>
+              <w:t xml:space="preserve">Median req/min</w:t>
+            </w:r>
+          </w:p>
+        </w:tc>
+      </w:tr>
+      <w:tr>
+        <w:tc>
+          <w:tcPr>
+            <w:tcW w:type="dxa" w:w="1625"/>
+            <w:tcBorders>
+              <w:top w:val="single" w:color="BFBFBF" w:sz="4"/>
+              <w:left w:val="single" w:color="BFBFBF" w:sz="4"/>
+              <w:bottom w:val="single" w:color="BFBFBF" w:sz="4"/>
+              <w:right w:val="single" w:color="BFBFBF" w:sz="4"/>
+            </w:tcBorders>
+            <w:tcMar>
+              <w:top w:type="dxa" w:w="60"/>
+              <w:left w:type="dxa" w:w="100"/>
+              <w:bottom w:type="dxa" w:w="60"/>
+              <w:right w:type="dxa" w:w="100"/>
+            </w:tcMar>
+          </w:tcPr>
+          <w:p>
+            <w:r>
+              <w:t xml:space="preserve">normal (4 runs)</w:t>
+            </w:r>
+          </w:p>
+        </w:tc>
+        <w:tc>
+          <w:tcPr>
+            <w:tcW w:type="dxa" w:w="812"/>
+            <w:tcBorders>
+              <w:top w:val="single" w:color="BFBFBF" w:sz="4"/>
+              <w:left w:val="single" w:color="BFBFBF" w:sz="4"/>
+              <w:bottom w:val="single" w:color="BFBFBF" w:sz="4"/>
+              <w:right w:val="single" w:color="BFBFBF" w:sz="4"/>
+            </w:tcBorders>
+            <w:tcMar>
+              <w:top w:type="dxa" w:w="60"/>
+              <w:left w:type="dxa" w:w="100"/>
+              <w:bottom w:type="dxa" w:w="60"/>
+              <w:right w:type="dxa" w:w="100"/>
+            </w:tcMar>
+          </w:tcPr>
+          <w:p>
+            <w:r>
+              <w:t xml:space="preserve">594</w:t>
+            </w:r>
+          </w:p>
+        </w:tc>
+        <w:tc>
+          <w:tcPr>
+            <w:tcW w:type="dxa" w:w="1173"/>
+            <w:tcBorders>
+              <w:top w:val="single" w:color="BFBFBF" w:sz="4"/>
+              <w:left w:val="single" w:color="BFBFBF" w:sz="4"/>
+              <w:bottom w:val="single" w:color="BFBFBF" w:sz="4"/>
+              <w:right w:val="single" w:color="BFBFBF" w:sz="4"/>
+            </w:tcBorders>
+            <w:tcMar>
+              <w:top w:type="dxa" w:w="60"/>
+              <w:left w:type="dxa" w:w="100"/>
+              <w:bottom w:type="dxa" w:w="60"/>
+              <w:right w:type="dxa" w:w="100"/>
+            </w:tcMar>
+          </w:tcPr>
+          <w:p>
+            <w:r>
+              <w:t xml:space="preserve">0</w:t>
+            </w:r>
+          </w:p>
+        </w:tc>
+        <w:tc>
+          <w:tcPr>
+            <w:tcW w:type="dxa" w:w="1354"/>
+            <w:tcBorders>
+              <w:top w:val="single" w:color="BFBFBF" w:sz="4"/>
+              <w:left w:val="single" w:color="BFBFBF" w:sz="4"/>
+              <w:bottom w:val="single" w:color="BFBFBF" w:sz="4"/>
+              <w:right w:val="single" w:color="BFBFBF" w:sz="4"/>
+            </w:tcBorders>
+            <w:tcMar>
+              <w:top w:type="dxa" w:w="60"/>
+              <w:left w:type="dxa" w:w="100"/>
+              <w:bottom w:type="dxa" w:w="60"/>
+              <w:right w:type="dxa" w:w="100"/>
+            </w:tcMar>
+          </w:tcPr>
+          <w:p>
+            <w:r>
+              <w:t xml:space="preserve">22</w:t>
+            </w:r>
+          </w:p>
+        </w:tc>
+        <w:tc>
+          <w:tcPr>
+            <w:tcW w:type="dxa" w:w="1534"/>
+            <w:tcBorders>
+              <w:top w:val="single" w:color="BFBFBF" w:sz="4"/>
+              <w:left w:val="single" w:color="BFBFBF" w:sz="4"/>
+              <w:bottom w:val="single" w:color="BFBFBF" w:sz="4"/>
+              <w:right w:val="single" w:color="BFBFBF" w:sz="4"/>
+            </w:tcBorders>
+            <w:tcMar>
+              <w:top w:type="dxa" w:w="60"/>
+              <w:left w:type="dxa" w:w="100"/>
+              <w:bottom w:type="dxa" w:w="60"/>
+              <w:right w:type="dxa" w:w="100"/>
+            </w:tcMar>
+          </w:tcPr>
+          <w:p>
+            <w:r>
+              <w:t xml:space="preserve">1,876</w:t>
+            </w:r>
+          </w:p>
+        </w:tc>
+        <w:tc>
+          <w:tcPr>
+            <w:tcW w:type="dxa" w:w="1173"/>
+            <w:tcBorders>
+              <w:top w:val="single" w:color="BFBFBF" w:sz="4"/>
+              <w:left w:val="single" w:color="BFBFBF" w:sz="4"/>
+              <w:bottom w:val="single" w:color="BFBFBF" w:sz="4"/>
+              <w:right w:val="single" w:color="BFBFBF" w:sz="4"/>
+            </w:tcBorders>
+            <w:tcMar>
+              <w:top w:type="dxa" w:w="60"/>
+              <w:left w:type="dxa" w:w="100"/>
+              <w:bottom w:type="dxa" w:w="60"/>
+              <w:right w:type="dxa" w:w="100"/>
+            </w:tcMar>
+          </w:tcPr>
+          <w:p>
+            <w:r>
+              <w:t xml:space="preserve">1</w:t>
+            </w:r>
+          </w:p>
+        </w:tc>
+        <w:tc>
+          <w:tcPr>
+            <w:tcW w:type="dxa" w:w="1355"/>
+            <w:tcBorders>
+              <w:top w:val="single" w:color="BFBFBF" w:sz="4"/>
+              <w:left w:val="single" w:color="BFBFBF" w:sz="4"/>
+              <w:bottom w:val="single" w:color="BFBFBF" w:sz="4"/>
+              <w:right w:val="single" w:color="BFBFBF" w:sz="4"/>
+            </w:tcBorders>
+            <w:tcMar>
+              <w:top w:type="dxa" w:w="60"/>
+              <w:left w:type="dxa" w:w="100"/>
+              <w:bottom w:type="dxa" w:w="60"/>
+              <w:right w:type="dxa" w:w="100"/>
+            </w:tcMar>
+          </w:tcPr>
+          <w:p>
+            <w:r>
+              <w:t xml:space="preserve">12</w:t>
+            </w:r>
+          </w:p>
+        </w:tc>
+      </w:tr>
+      <w:tr>
+        <w:tc>
+          <w:tcPr>
+            <w:tcW w:type="dxa" w:w="1625"/>
+            <w:tcBorders>
+              <w:top w:val="single" w:color="BFBFBF" w:sz="4"/>
+              <w:left w:val="single" w:color="BFBFBF" w:sz="4"/>
+              <w:bottom w:val="single" w:color="BFBFBF" w:sz="4"/>
+              <w:right w:val="single" w:color="BFBFBF" w:sz="4"/>
+            </w:tcBorders>
+            <w:tcMar>
+              <w:top w:type="dxa" w:w="60"/>
+              <w:left w:type="dxa" w:w="100"/>
+              <w:bottom w:type="dxa" w:w="60"/>
+              <w:right w:type="dxa" w:w="100"/>
+            </w:tcMar>
+          </w:tcPr>
+          <w:p>
+            <w:r>
+              <w:t xml:space="preserve">DoS</w:t>
+            </w:r>
+          </w:p>
+        </w:tc>
+        <w:tc>
+          <w:tcPr>
+            <w:tcW w:type="dxa" w:w="812"/>
+            <w:tcBorders>
+              <w:top w:val="single" w:color="BFBFBF" w:sz="4"/>
+              <w:left w:val="single" w:color="BFBFBF" w:sz="4"/>
+              <w:bottom w:val="single" w:color="BFBFBF" w:sz="4"/>
+              <w:right w:val="single" w:color="BFBFBF" w:sz="4"/>
+            </w:tcBorders>
+            <w:tcMar>
+              <w:top w:type="dxa" w:w="60"/>
+              <w:left w:type="dxa" w:w="100"/>
+              <w:bottom w:type="dxa" w:w="60"/>
+              <w:right w:type="dxa" w:w="100"/>
+            </w:tcMar>
+          </w:tcPr>
+          <w:p>
+            <w:r>
+              <w:t xml:space="preserve">83</w:t>
+            </w:r>
+          </w:p>
+        </w:tc>
+        <w:tc>
+          <w:tcPr>
+            <w:tcW w:type="dxa" w:w="1173"/>
+            <w:tcBorders>
+              <w:top w:val="single" w:color="BFBFBF" w:sz="4"/>
+              <w:left w:val="single" w:color="BFBFBF" w:sz="4"/>
+              <w:bottom w:val="single" w:color="BFBFBF" w:sz="4"/>
+              <w:right w:val="single" w:color="BFBFBF" w:sz="4"/>
+            </w:tcBorders>
+            <w:tcMar>
+              <w:top w:type="dxa" w:w="60"/>
+              <w:left w:type="dxa" w:w="100"/>
+              <w:bottom w:type="dxa" w:w="60"/>
+              <w:right w:type="dxa" w:w="100"/>
+            </w:tcMar>
+          </w:tcPr>
+          <w:p>
+            <w:r>
+              <w:t xml:space="preserve">20</w:t>
+            </w:r>
+          </w:p>
+        </w:tc>
+        <w:tc>
+          <w:tcPr>
+            <w:tcW w:type="dxa" w:w="1354"/>
+            <w:tcBorders>
+              <w:top w:val="single" w:color="BFBFBF" w:sz="4"/>
+              <w:left w:val="single" w:color="BFBFBF" w:sz="4"/>
+              <w:bottom w:val="single" w:color="BFBFBF" w:sz="4"/>
+              <w:right w:val="single" w:color="BFBFBF" w:sz="4"/>
+            </w:tcBorders>
+            <w:tcMar>
+              <w:top w:type="dxa" w:w="60"/>
+              <w:left w:type="dxa" w:w="100"/>
+              <w:bottom w:type="dxa" w:w="60"/>
+              <w:right w:type="dxa" w:w="100"/>
+            </w:tcMar>
+          </w:tcPr>
+          <w:p>
+            <w:r>
+              <w:t xml:space="preserve">8,341</w:t>
+            </w:r>
+          </w:p>
+        </w:tc>
+        <w:tc>
+          <w:tcPr>
+            <w:tcW w:type="dxa" w:w="1534"/>
+            <w:tcBorders>
+              <w:top w:val="single" w:color="BFBFBF" w:sz="4"/>
+              <w:left w:val="single" w:color="BFBFBF" w:sz="4"/>
+              <w:bottom w:val="single" w:color="BFBFBF" w:sz="4"/>
+              <w:right w:val="single" w:color="BFBFBF" w:sz="4"/>
+            </w:tcBorders>
+            <w:tcMar>
+              <w:top w:type="dxa" w:w="60"/>
+              <w:left w:type="dxa" w:w="100"/>
+              <w:bottom w:type="dxa" w:w="60"/>
+              <w:right w:type="dxa" w:w="100"/>
+            </w:tcMar>
+          </w:tcPr>
+          <w:p>
+            <w:r>
+              <w:t xml:space="preserve">836,670</w:t>
+            </w:r>
+          </w:p>
+        </w:tc>
+        <w:tc>
+          <w:tcPr>
+            <w:tcW w:type="dxa" w:w="1173"/>
+            <w:tcBorders>
+              <w:top w:val="single" w:color="BFBFBF" w:sz="4"/>
+              <w:left w:val="single" w:color="BFBFBF" w:sz="4"/>
+              <w:bottom w:val="single" w:color="BFBFBF" w:sz="4"/>
+              <w:right w:val="single" w:color="BFBFBF" w:sz="4"/>
+            </w:tcBorders>
+            <w:tcMar>
+              <w:top w:type="dxa" w:w="60"/>
+              <w:left w:type="dxa" w:w="100"/>
+              <w:bottom w:type="dxa" w:w="60"/>
+              <w:right w:type="dxa" w:w="100"/>
+            </w:tcMar>
+          </w:tcPr>
+          <w:p>
+            <w:r>
+              <w:t xml:space="preserve">1</w:t>
+            </w:r>
+          </w:p>
+        </w:tc>
+        <w:tc>
+          <w:tcPr>
+            <w:tcW w:type="dxa" w:w="1355"/>
+            <w:tcBorders>
+              <w:top w:val="single" w:color="BFBFBF" w:sz="4"/>
+              <w:left w:val="single" w:color="BFBFBF" w:sz="4"/>
+              <w:bottom w:val="single" w:color="BFBFBF" w:sz="4"/>
+              <w:right w:val="single" w:color="BFBFBF" w:sz="4"/>
+            </w:tcBorders>
+            <w:tcMar>
+              <w:top w:type="dxa" w:w="60"/>
+              <w:left w:type="dxa" w:w="100"/>
+              <w:bottom w:type="dxa" w:w="60"/>
+              <w:right w:type="dxa" w:w="100"/>
+            </w:tcMar>
+          </w:tcPr>
+          <w:p>
+            <w:r>
+              <w:t xml:space="preserve">4,632</w:t>
+            </w:r>
+          </w:p>
+        </w:tc>
+      </w:tr>
+      <w:tr>
+        <w:tc>
+          <w:tcPr>
+            <w:tcW w:type="dxa" w:w="1625"/>
+            <w:tcBorders>
+              <w:top w:val="single" w:color="BFBFBF" w:sz="4"/>
+              <w:left w:val="single" w:color="BFBFBF" w:sz="4"/>
+              <w:bottom w:val="single" w:color="BFBFBF" w:sz="4"/>
+              <w:right w:val="single" w:color="BFBFBF" w:sz="4"/>
+            </w:tcBorders>
+            <w:tcMar>
+              <w:top w:type="dxa" w:w="60"/>
+              <w:left w:type="dxa" w:w="100"/>
+              <w:bottom w:type="dxa" w:w="60"/>
+              <w:right w:type="dxa" w:w="100"/>
+            </w:tcMar>
+          </w:tcPr>
+          <w:p>
+            <w:r>
+              <w:t xml:space="preserve">port scan</w:t>
+            </w:r>
+          </w:p>
+        </w:tc>
+        <w:tc>
+          <w:tcPr>
+            <w:tcW w:type="dxa" w:w="812"/>
+            <w:tcBorders>
+              <w:top w:val="single" w:color="BFBFBF" w:sz="4"/>
+              <w:left w:val="single" w:color="BFBFBF" w:sz="4"/>
+              <w:bottom w:val="single" w:color="BFBFBF" w:sz="4"/>
+              <w:right w:val="single" w:color="BFBFBF" w:sz="4"/>
+            </w:tcBorders>
+            <w:tcMar>
+              <w:top w:type="dxa" w:w="60"/>
+              <w:left w:type="dxa" w:w="100"/>
+              <w:bottom w:type="dxa" w:w="60"/>
+              <w:right w:type="dxa" w:w="100"/>
+            </w:tcMar>
+          </w:tcPr>
+          <w:p>
+            <w:r>
+              <w:t xml:space="preserve">72</w:t>
+            </w:r>
+          </w:p>
+        </w:tc>
+        <w:tc>
+          <w:tcPr>
+            <w:tcW w:type="dxa" w:w="1173"/>
+            <w:tcBorders>
+              <w:top w:val="single" w:color="BFBFBF" w:sz="4"/>
+              <w:left w:val="single" w:color="BFBFBF" w:sz="4"/>
+              <w:bottom w:val="single" w:color="BFBFBF" w:sz="4"/>
+              <w:right w:val="single" w:color="BFBFBF" w:sz="4"/>
+            </w:tcBorders>
+            <w:tcMar>
+              <w:top w:type="dxa" w:w="60"/>
+              <w:left w:type="dxa" w:w="100"/>
+              <w:bottom w:type="dxa" w:w="60"/>
+              <w:right w:type="dxa" w:w="100"/>
+            </w:tcMar>
+          </w:tcPr>
+          <w:p>
+            <w:r>
+              <w:t xml:space="preserve">20</w:t>
+            </w:r>
+          </w:p>
+        </w:tc>
+        <w:tc>
+          <w:tcPr>
+            <w:tcW w:type="dxa" w:w="1354"/>
+            <w:tcBorders>
+              <w:top w:val="single" w:color="BFBFBF" w:sz="4"/>
+              <w:left w:val="single" w:color="BFBFBF" w:sz="4"/>
+              <w:bottom w:val="single" w:color="BFBFBF" w:sz="4"/>
+              <w:right w:val="single" w:color="BFBFBF" w:sz="4"/>
+            </w:tcBorders>
+            <w:tcMar>
+              <w:top w:type="dxa" w:w="60"/>
+              <w:left w:type="dxa" w:w="100"/>
+              <w:bottom w:type="dxa" w:w="60"/>
+              <w:right w:type="dxa" w:w="100"/>
+            </w:tcMar>
+          </w:tcPr>
+          <w:p>
+            <w:r>
+              <w:t xml:space="preserve">376</w:t>
+            </w:r>
+          </w:p>
+        </w:tc>
+        <w:tc>
+          <w:tcPr>
+            <w:tcW w:type="dxa" w:w="1534"/>
+            <w:tcBorders>
+              <w:top w:val="single" w:color="BFBFBF" w:sz="4"/>
+              <w:left w:val="single" w:color="BFBFBF" w:sz="4"/>
+              <w:bottom w:val="single" w:color="BFBFBF" w:sz="4"/>
+              <w:right w:val="single" w:color="BFBFBF" w:sz="4"/>
+            </w:tcBorders>
+            <w:tcMar>
+              <w:top w:type="dxa" w:w="60"/>
+              <w:left w:type="dxa" w:w="100"/>
+              <w:bottom w:type="dxa" w:w="60"/>
+              <w:right w:type="dxa" w:w="100"/>
+            </w:tcMar>
+          </w:tcPr>
+          <w:p>
+            <w:r>
+              <w:t xml:space="preserve">25,829</w:t>
+            </w:r>
+          </w:p>
+        </w:tc>
+        <w:tc>
+          <w:tcPr>
+            <w:tcW w:type="dxa" w:w="1173"/>
+            <w:tcBorders>
+              <w:top w:val="single" w:color="BFBFBF" w:sz="4"/>
+              <w:left w:val="single" w:color="BFBFBF" w:sz="4"/>
+              <w:bottom w:val="single" w:color="BFBFBF" w:sz="4"/>
+              <w:right w:val="single" w:color="BFBFBF" w:sz="4"/>
+            </w:tcBorders>
+            <w:tcMar>
+              <w:top w:type="dxa" w:w="60"/>
+              <w:left w:type="dxa" w:w="100"/>
+              <w:bottom w:type="dxa" w:w="60"/>
+              <w:right w:type="dxa" w:w="100"/>
+            </w:tcMar>
+          </w:tcPr>
+          <w:p>
+            <w:r>
+              <w:t xml:space="preserve">296</w:t>
+            </w:r>
+          </w:p>
+        </w:tc>
+        <w:tc>
+          <w:tcPr>
+            <w:tcW w:type="dxa" w:w="1355"/>
+            <w:tcBorders>
+              <w:top w:val="single" w:color="BFBFBF" w:sz="4"/>
+              <w:left w:val="single" w:color="BFBFBF" w:sz="4"/>
+              <w:bottom w:val="single" w:color="BFBFBF" w:sz="4"/>
+              <w:right w:val="single" w:color="BFBFBF" w:sz="4"/>
+            </w:tcBorders>
+            <w:tcMar>
+              <w:top w:type="dxa" w:w="60"/>
+              <w:left w:type="dxa" w:w="100"/>
+              <w:bottom w:type="dxa" w:w="60"/>
+              <w:right w:type="dxa" w:w="100"/>
+            </w:tcMar>
+          </w:tcPr>
+          <w:p>
+            <w:r>
+              <w:t xml:space="preserve">1,779</w:t>
+            </w:r>
+          </w:p>
+        </w:tc>
+      </w:tr>
+      <w:tr>
+        <w:tc>
+          <w:tcPr>
+            <w:tcW w:type="dxa" w:w="1625"/>
+            <w:tcBorders>
+              <w:top w:val="single" w:color="BFBFBF" w:sz="4"/>
+              <w:left w:val="single" w:color="BFBFBF" w:sz="4"/>
+              <w:bottom w:val="single" w:color="BFBFBF" w:sz="4"/>
+              <w:right w:val="single" w:color="BFBFBF" w:sz="4"/>
+            </w:tcBorders>
+            <w:tcMar>
+              <w:top w:type="dxa" w:w="60"/>
+              <w:left w:type="dxa" w:w="100"/>
+              <w:bottom w:type="dxa" w:w="60"/>
+              <w:right w:type="dxa" w:w="100"/>
+            </w:tcMar>
+          </w:tcPr>
+          <w:p>
+            <w:r>
+              <w:t xml:space="preserve">insider</w:t>
+            </w:r>
+          </w:p>
+        </w:tc>
+        <w:tc>
+          <w:tcPr>
+            <w:tcW w:type="dxa" w:w="812"/>
+            <w:tcBorders>
+              <w:top w:val="single" w:color="BFBFBF" w:sz="4"/>
+              <w:left w:val="single" w:color="BFBFBF" w:sz="4"/>
+              <w:bottom w:val="single" w:color="BFBFBF" w:sz="4"/>
+              <w:right w:val="single" w:color="BFBFBF" w:sz="4"/>
+            </w:tcBorders>
+            <w:tcMar>
+              <w:top w:type="dxa" w:w="60"/>
+              <w:left w:type="dxa" w:w="100"/>
+              <w:bottom w:type="dxa" w:w="60"/>
+              <w:right w:type="dxa" w:w="100"/>
+            </w:tcMar>
+          </w:tcPr>
+          <w:p>
+            <w:r>
+              <w:t xml:space="preserve">75</w:t>
+            </w:r>
+          </w:p>
+        </w:tc>
+        <w:tc>
+          <w:tcPr>
+            <w:tcW w:type="dxa" w:w="1173"/>
+            <w:tcBorders>
+              <w:top w:val="single" w:color="BFBFBF" w:sz="4"/>
+              <w:left w:val="single" w:color="BFBFBF" w:sz="4"/>
+              <w:bottom w:val="single" w:color="BFBFBF" w:sz="4"/>
+              <w:right w:val="single" w:color="BFBFBF" w:sz="4"/>
+            </w:tcBorders>
+            <w:tcMar>
+              <w:top w:type="dxa" w:w="60"/>
+              <w:left w:type="dxa" w:w="100"/>
+              <w:bottom w:type="dxa" w:w="60"/>
+              <w:right w:type="dxa" w:w="100"/>
+            </w:tcMar>
+          </w:tcPr>
+          <w:p>
+            <w:r>
+              <w:t xml:space="preserve">20</w:t>
+            </w:r>
+          </w:p>
+        </w:tc>
+        <w:tc>
+          <w:tcPr>
+            <w:tcW w:type="dxa" w:w="1354"/>
+            <w:tcBorders>
+              <w:top w:val="single" w:color="BFBFBF" w:sz="4"/>
+              <w:left w:val="single" w:color="BFBFBF" w:sz="4"/>
+              <w:bottom w:val="single" w:color="BFBFBF" w:sz="4"/>
+              <w:right w:val="single" w:color="BFBFBF" w:sz="4"/>
+            </w:tcBorders>
+            <w:tcMar>
+              <w:top w:type="dxa" w:w="60"/>
+              <w:left w:type="dxa" w:w="100"/>
+              <w:bottom w:type="dxa" w:w="60"/>
+              <w:right w:type="dxa" w:w="100"/>
+            </w:tcMar>
+          </w:tcPr>
+          <w:p>
+            <w:r>
+              <w:t xml:space="preserve">12,215</w:t>
+            </w:r>
+          </w:p>
+        </w:tc>
+        <w:tc>
+          <w:tcPr>
+            <w:tcW w:type="dxa" w:w="1534"/>
+            <w:tcBorders>
+              <w:top w:val="single" w:color="BFBFBF" w:sz="4"/>
+              <w:left w:val="single" w:color="BFBFBF" w:sz="4"/>
+              <w:bottom w:val="single" w:color="BFBFBF" w:sz="4"/>
+              <w:right w:val="single" w:color="BFBFBF" w:sz="4"/>
+            </w:tcBorders>
+            <w:tcMar>
+              <w:top w:type="dxa" w:w="60"/>
+              <w:left w:type="dxa" w:w="100"/>
+              <w:bottom w:type="dxa" w:w="60"/>
+              <w:right w:type="dxa" w:w="100"/>
+            </w:tcMar>
+          </w:tcPr>
+          <w:p>
+            <w:r>
+              <w:t xml:space="preserve">15,528,831</w:t>
+            </w:r>
+          </w:p>
+        </w:tc>
+        <w:tc>
+          <w:tcPr>
+            <w:tcW w:type="dxa" w:w="1173"/>
+            <w:tcBorders>
+              <w:top w:val="single" w:color="BFBFBF" w:sz="4"/>
+              <w:left w:val="single" w:color="BFBFBF" w:sz="4"/>
+              <w:bottom w:val="single" w:color="BFBFBF" w:sz="4"/>
+              <w:right w:val="single" w:color="BFBFBF" w:sz="4"/>
+            </w:tcBorders>
+            <w:tcMar>
+              <w:top w:type="dxa" w:w="60"/>
+              <w:left w:type="dxa" w:w="100"/>
+              <w:bottom w:type="dxa" w:w="60"/>
+              <w:right w:type="dxa" w:w="100"/>
+            </w:tcMar>
+          </w:tcPr>
+          <w:p>
+            <w:r>
+              <w:t xml:space="preserve">1</w:t>
+            </w:r>
+          </w:p>
+        </w:tc>
+        <w:tc>
+          <w:tcPr>
+            <w:tcW w:type="dxa" w:w="1355"/>
+            <w:tcBorders>
+              <w:top w:val="single" w:color="BFBFBF" w:sz="4"/>
+              <w:left w:val="single" w:color="BFBFBF" w:sz="4"/>
+              <w:bottom w:val="single" w:color="BFBFBF" w:sz="4"/>
+              <w:right w:val="single" w:color="BFBFBF" w:sz="4"/>
+            </w:tcBorders>
+            <w:tcMar>
+              <w:top w:type="dxa" w:w="60"/>
+              <w:left w:type="dxa" w:w="100"/>
+              <w:bottom w:type="dxa" w:w="60"/>
+              <w:right w:type="dxa" w:w="100"/>
+            </w:tcMar>
+          </w:tcPr>
+          <w:p>
+            <w:r>
+              <w:t xml:space="preserve">24</w:t>
+            </w:r>
+          </w:p>
+        </w:tc>
+      </w:tr>
+      <w:tr>
+        <w:tc>
+          <w:tcPr>
+            <w:tcW w:type="dxa" w:w="1625"/>
+            <w:tcBorders>
+              <w:top w:val="single" w:color="BFBFBF" w:sz="4"/>
+              <w:left w:val="single" w:color="BFBFBF" w:sz="4"/>
+              <w:bottom w:val="single" w:color="BFBFBF" w:sz="4"/>
+              <w:right w:val="single" w:color="BFBFBF" w:sz="4"/>
+            </w:tcBorders>
+            <w:tcMar>
+              <w:top w:type="dxa" w:w="60"/>
+              <w:left w:type="dxa" w:w="100"/>
+              <w:bottom w:type="dxa" w:w="60"/>
+              <w:right w:type="dxa" w:w="100"/>
+            </w:tcMar>
+          </w:tcPr>
+          <w:p>
+            <w:r>
+              <w:t xml:space="preserve">off-hours</w:t>
+            </w:r>
+          </w:p>
+        </w:tc>
+        <w:tc>
+          <w:tcPr>
+            <w:tcW w:type="dxa" w:w="812"/>
+            <w:tcBorders>
+              <w:top w:val="single" w:color="BFBFBF" w:sz="4"/>
+              <w:left w:val="single" w:color="BFBFBF" w:sz="4"/>
+              <w:bottom w:val="single" w:color="BFBFBF" w:sz="4"/>
+              <w:right w:val="single" w:color="BFBFBF" w:sz="4"/>
+            </w:tcBorders>
+            <w:tcMar>
+              <w:top w:type="dxa" w:w="60"/>
+              <w:left w:type="dxa" w:w="100"/>
+              <w:bottom w:type="dxa" w:w="60"/>
+              <w:right w:type="dxa" w:w="100"/>
+            </w:tcMar>
+          </w:tcPr>
+          <w:p>
+            <w:r>
+              <w:t xml:space="preserve">69</w:t>
+            </w:r>
+          </w:p>
+        </w:tc>
+        <w:tc>
+          <w:tcPr>
+            <w:tcW w:type="dxa" w:w="1173"/>
+            <w:tcBorders>
+              <w:top w:val="single" w:color="BFBFBF" w:sz="4"/>
+              <w:left w:val="single" w:color="BFBFBF" w:sz="4"/>
+              <w:bottom w:val="single" w:color="BFBFBF" w:sz="4"/>
+              <w:right w:val="single" w:color="BFBFBF" w:sz="4"/>
+            </w:tcBorders>
+            <w:tcMar>
+              <w:top w:type="dxa" w:w="60"/>
+              <w:left w:type="dxa" w:w="100"/>
+              <w:bottom w:type="dxa" w:w="60"/>
+              <w:right w:type="dxa" w:w="100"/>
+            </w:tcMar>
+          </w:tcPr>
+          <w:p>
+            <w:r>
+              <w:t xml:space="preserve">20</w:t>
+            </w:r>
+          </w:p>
+        </w:tc>
+        <w:tc>
+          <w:tcPr>
+            <w:tcW w:type="dxa" w:w="1354"/>
+            <w:tcBorders>
+              <w:top w:val="single" w:color="BFBFBF" w:sz="4"/>
+              <w:left w:val="single" w:color="BFBFBF" w:sz="4"/>
+              <w:bottom w:val="single" w:color="BFBFBF" w:sz="4"/>
+              <w:right w:val="single" w:color="BFBFBF" w:sz="4"/>
+            </w:tcBorders>
+            <w:tcMar>
+              <w:top w:type="dxa" w:w="60"/>
+              <w:left w:type="dxa" w:w="100"/>
+              <w:bottom w:type="dxa" w:w="60"/>
+              <w:right w:type="dxa" w:w="100"/>
+            </w:tcMar>
+          </w:tcPr>
+          <w:p>
+            <w:r>
+              <w:t xml:space="preserve">14</w:t>
+            </w:r>
+          </w:p>
+        </w:tc>
+        <w:tc>
+          <w:tcPr>
+            <w:tcW w:type="dxa" w:w="1534"/>
+            <w:tcBorders>
+              <w:top w:val="single" w:color="BFBFBF" w:sz="4"/>
+              <w:left w:val="single" w:color="BFBFBF" w:sz="4"/>
+              <w:bottom w:val="single" w:color="BFBFBF" w:sz="4"/>
+              <w:right w:val="single" w:color="BFBFBF" w:sz="4"/>
+            </w:tcBorders>
+            <w:tcMar>
+              <w:top w:type="dxa" w:w="60"/>
+              <w:left w:type="dxa" w:w="100"/>
+              <w:bottom w:type="dxa" w:w="60"/>
+              <w:right w:type="dxa" w:w="100"/>
+            </w:tcMar>
+          </w:tcPr>
+          <w:p>
+            <w:r>
+              <w:t xml:space="preserve">1,190</w:t>
+            </w:r>
+          </w:p>
+        </w:tc>
+        <w:tc>
+          <w:tcPr>
+            <w:tcW w:type="dxa" w:w="1173"/>
+            <w:tcBorders>
+              <w:top w:val="single" w:color="BFBFBF" w:sz="4"/>
+              <w:left w:val="single" w:color="BFBFBF" w:sz="4"/>
+              <w:bottom w:val="single" w:color="BFBFBF" w:sz="4"/>
+              <w:right w:val="single" w:color="BFBFBF" w:sz="4"/>
+            </w:tcBorders>
+            <w:tcMar>
+              <w:top w:type="dxa" w:w="60"/>
+              <w:left w:type="dxa" w:w="100"/>
+              <w:bottom w:type="dxa" w:w="60"/>
+              <w:right w:type="dxa" w:w="100"/>
+            </w:tcMar>
+          </w:tcPr>
+          <w:p>
+            <w:r>
+              <w:t xml:space="preserve">1</w:t>
+            </w:r>
+          </w:p>
+        </w:tc>
+        <w:tc>
+          <w:tcPr>
+            <w:tcW w:type="dxa" w:w="1355"/>
+            <w:tcBorders>
+              <w:top w:val="single" w:color="BFBFBF" w:sz="4"/>
+              <w:left w:val="single" w:color="BFBFBF" w:sz="4"/>
+              <w:bottom w:val="single" w:color="BFBFBF" w:sz="4"/>
+              <w:right w:val="single" w:color="BFBFBF" w:sz="4"/>
+            </w:tcBorders>
+            <w:tcMar>
+              <w:top w:type="dxa" w:w="60"/>
+              <w:left w:type="dxa" w:w="100"/>
+              <w:bottom w:type="dxa" w:w="60"/>
+              <w:right w:type="dxa" w:w="100"/>
+            </w:tcMar>
+          </w:tcPr>
+          <w:p>
+            <w:r>
+              <w:t xml:space="preserve">12</w:t>
+            </w:r>
+          </w:p>
+        </w:tc>
+      </w:tr>
+    </w:tbl>
+    <w:p>
+      <w:pPr>
+        <w:spacing w:after="120"/>
+      </w:pPr>
+    </w:p>
+    <w:p>
+      <w:pPr>
+        <w:spacing w:after="120"/>
+      </w:pPr>
+      <w:r>
+        <w:t xml:space="preserve">Rows in attack runs that are not attack windows are the other two PCs and the attacker before and after the attack; they are labelled normal. For comparison, the 99th percentile of normal windows is 540 packets, 430 kB, 1 destination port and 48 requests per minute, so every attack type is clearly separated on at least one feature, while the off-hours class differs only in its off_hours flag, which is by design.</w:t>
       </w:r>
     </w:p>
     <w:p>
@@ -8274,6 +9312,52 @@
           <w:p>
             <w:r>
               <w:t xml:space="preserve">output of lab-up.sh</w:t>
+            </w:r>
+          </w:p>
+        </w:tc>
+      </w:tr>
+      <w:tr>
+        <w:tc>
+          <w:tcPr>
+            <w:tcW w:type="dxa" w:w="5867"/>
+            <w:tcBorders>
+              <w:top w:val="single" w:color="BFBFBF" w:sz="4"/>
+              <w:left w:val="single" w:color="BFBFBF" w:sz="4"/>
+              <w:bottom w:val="single" w:color="BFBFBF" w:sz="4"/>
+              <w:right w:val="single" w:color="BFBFBF" w:sz="4"/>
+            </w:tcBorders>
+            <w:tcMar>
+              <w:top w:type="dxa" w:w="60"/>
+              <w:left w:type="dxa" w:w="100"/>
+              <w:bottom w:type="dxa" w:w="60"/>
+              <w:right w:type="dxa" w:w="100"/>
+            </w:tcMar>
+          </w:tcPr>
+          <w:p>
+            <w:r>
+              <w:t xml:space="preserve">Wrong password: Et4 FAILED with no VLAN, 100% ping loss; restore to SUCCESS after a port bounce (demo step 3b, tested 14 Oct)</w:t>
+            </w:r>
+          </w:p>
+        </w:tc>
+        <w:tc>
+          <w:tcPr>
+            <w:tcW w:type="dxa" w:w="3159"/>
+            <w:tcBorders>
+              <w:top w:val="single" w:color="BFBFBF" w:sz="4"/>
+              <w:left w:val="single" w:color="BFBFBF" w:sz="4"/>
+              <w:bottom w:val="single" w:color="BFBFBF" w:sz="4"/>
+              <w:right w:val="single" w:color="BFBFBF" w:sz="4"/>
+            </w:tcBorders>
+            <w:tcMar>
+              <w:top w:type="dxa" w:w="60"/>
+              <w:left w:type="dxa" w:w="100"/>
+              <w:bottom w:type="dxa" w:w="60"/>
+              <w:right w:type="dxa" w:w="100"/>
+            </w:tcMar>
+          </w:tcPr>
+          <w:p>
+            <w:r>
+              <w:t xml:space="preserve">acc1, guest-pc</w:t>
             </w:r>
           </w:p>
         </w:tc>

</xml_diff>

<commit_message>
Brute-force generator via RADIUS, after-effect labelling, 5 brute-force runs; demo commands
</commit_message>
<xml_diff>
--- a/ZT_Project_Implementation_Log.docx
+++ b/ZT_Project_Implementation_Log.docx
@@ -84,7 +84,7 @@
           <w:sz w:val="22"/>
           <w:szCs w:val="22"/>
         </w:rPr>
-        <w:t xml:space="preserve">Last updated 14 October 2026 at 13:25</w:t>
+        <w:t xml:space="preserve">Last updated 14 October 2026 at 13:38</w:t>
       </w:r>
     </w:p>
     <w:p>
@@ -1498,7 +1498,7 @@
           </w:tcPr>
           <w:p>
             <w:r>
-              <w:t xml:space="preserve">Done: 594 normal rows from 4 runs, 20 attack windows each for DoS, port scan, insider and off-hours</w:t>
+              <w:t xml:space="preserve">Done: 594 normal rows from 4 runs, 20 attack windows each for DoS, port scan, insider, off-hours and brute force</w:t>
             </w:r>
           </w:p>
         </w:tc>
@@ -1590,7 +1590,7 @@
           </w:tcPr>
           <w:p>
             <w:r>
-              <w:t xml:space="preserve">Not started</w:t>
+              <w:t xml:space="preserve">Done: 10 to 80 failed logins per window; 5 runs collected</w:t>
             </w:r>
           </w:p>
         </w:tc>
@@ -8378,6 +8378,501 @@
     </w:p>
     <w:p>
       <w:pPr>
+        <w:pStyle w:val="Heading3"/>
+      </w:pPr>
+      <w:r>
+        <w:t xml:space="preserve">Brute-force generator (step 3D)</w:t>
+      </w:r>
+    </w:p>
+    <w:p>
+      <w:pPr>
+        <w:spacing w:after="120"/>
+      </w:pPr>
+      <w:r>
+        <w:t xml:space="preserve">802.1X login frames are layer 2, so a password attack leaves only one trace on the IP side: the RADIUS requests the switch relays for that port, and the rejects that follow. A real supplicant retries only about every 20 seconds, too slowly to look like an attack. The generator therefore injects the relayed requests at the RADIUS server itself, with the switch's NAS address (10.10.10.11) and guest-pc's MAC as Calling-Station-Id, guessing passwords for bob, alice and admin. It cannot run on the SIEM because the SIEM's switch port is the SPAN destination, which is receive-only. The RADIUS secret is read from radius/clients.conf rather than written into the code.</w:t>
+      </w:r>
+    </w:p>
+    <w:p>
+      <w:pPr>
+        <w:spacing w:after="120"/>
+      </w:pPr>
+      <w:r>
+        <w:t xml:space="preserve">A smoke test exposed a labelling flaw: FreeRADIUS delays each reject by one second, so rejects for the last attempts arrived after the attack had ended and the following window was labelled normal with 9 failed logins. An after-effect allowance (4 seconds for brute force) now drops such windows as transitions; a unit test covers it.</w:t>
+      </w:r>
+    </w:p>
+    <w:tbl>
+      <w:tblPr>
+        <w:tblW w:type="dxa" w:w="9026"/>
+        <w:tblBorders>
+          <w:top w:val="single" w:color="auto" w:sz="4"/>
+          <w:left w:val="single" w:color="auto" w:sz="4"/>
+          <w:bottom w:val="single" w:color="auto" w:sz="4"/>
+          <w:right w:val="single" w:color="auto" w:sz="4"/>
+          <w:insideH w:val="single" w:color="auto" w:sz="4"/>
+          <w:insideV w:val="single" w:color="auto" w:sz="4"/>
+        </w:tblBorders>
+      </w:tblPr>
+      <w:tblGrid>
+        <w:gridCol w:w="2708"/>
+        <w:gridCol w:w="2708"/>
+        <w:gridCol w:w="3610"/>
+      </w:tblGrid>
+      <w:tr>
+        <w:trPr>
+          <w:tblHeader/>
+        </w:trPr>
+        <w:tc>
+          <w:tcPr>
+            <w:tcW w:type="dxa" w:w="2708"/>
+            <w:tcBorders>
+              <w:top w:val="single" w:color="BFBFBF" w:sz="4"/>
+              <w:left w:val="single" w:color="BFBFBF" w:sz="4"/>
+              <w:bottom w:val="single" w:color="BFBFBF" w:sz="4"/>
+              <w:right w:val="single" w:color="BFBFBF" w:sz="4"/>
+            </w:tcBorders>
+            <w:shd w:fill="1F4E79" w:color="auto" w:val="clear"/>
+            <w:tcMar>
+              <w:top w:type="dxa" w:w="60"/>
+              <w:left w:type="dxa" w:w="100"/>
+              <w:bottom w:type="dxa" w:w="60"/>
+              <w:right w:type="dxa" w:w="100"/>
+            </w:tcMar>
+          </w:tcPr>
+          <w:p>
+            <w:r>
+              <w:rPr>
+                <w:b/>
+                <w:bCs/>
+                <w:color w:val="FFFFFF"/>
+                <w:sz w:val="19"/>
+                <w:szCs w:val="19"/>
+              </w:rPr>
+              <w:t xml:space="preserve">Run</w:t>
+            </w:r>
+          </w:p>
+        </w:tc>
+        <w:tc>
+          <w:tcPr>
+            <w:tcW w:type="dxa" w:w="2708"/>
+            <w:tcBorders>
+              <w:top w:val="single" w:color="BFBFBF" w:sz="4"/>
+              <w:left w:val="single" w:color="BFBFBF" w:sz="4"/>
+              <w:bottom w:val="single" w:color="BFBFBF" w:sz="4"/>
+              <w:right w:val="single" w:color="BFBFBF" w:sz="4"/>
+            </w:tcBorders>
+            <w:shd w:fill="1F4E79" w:color="auto" w:val="clear"/>
+            <w:tcMar>
+              <w:top w:type="dxa" w:w="60"/>
+              <w:left w:type="dxa" w:w="100"/>
+              <w:bottom w:type="dxa" w:w="60"/>
+              <w:right w:type="dxa" w:w="100"/>
+            </w:tcMar>
+          </w:tcPr>
+          <w:p>
+            <w:r>
+              <w:rPr>
+                <w:b/>
+                <w:bCs/>
+                <w:color w:val="FFFFFF"/>
+                <w:sz w:val="19"/>
+                <w:szCs w:val="19"/>
+              </w:rPr>
+              <w:t xml:space="preserve">Attempts per second</w:t>
+            </w:r>
+          </w:p>
+        </w:tc>
+        <w:tc>
+          <w:tcPr>
+            <w:tcW w:type="dxa" w:w="3610"/>
+            <w:tcBorders>
+              <w:top w:val="single" w:color="BFBFBF" w:sz="4"/>
+              <w:left w:val="single" w:color="BFBFBF" w:sz="4"/>
+              <w:bottom w:val="single" w:color="BFBFBF" w:sz="4"/>
+              <w:right w:val="single" w:color="BFBFBF" w:sz="4"/>
+            </w:tcBorders>
+            <w:shd w:fill="1F4E79" w:color="auto" w:val="clear"/>
+            <w:tcMar>
+              <w:top w:type="dxa" w:w="60"/>
+              <w:left w:type="dxa" w:w="100"/>
+              <w:bottom w:type="dxa" w:w="60"/>
+              <w:right w:type="dxa" w:w="100"/>
+            </w:tcMar>
+          </w:tcPr>
+          <w:p>
+            <w:r>
+              <w:rPr>
+                <w:b/>
+                <w:bCs/>
+                <w:color w:val="FFFFFF"/>
+                <w:sz w:val="19"/>
+                <w:szCs w:val="19"/>
+              </w:rPr>
+              <w:t xml:space="preserve">Failed logins per attack window</w:t>
+            </w:r>
+          </w:p>
+        </w:tc>
+      </w:tr>
+      <w:tr>
+        <w:tc>
+          <w:tcPr>
+            <w:tcW w:type="dxa" w:w="2708"/>
+            <w:tcBorders>
+              <w:top w:val="single" w:color="BFBFBF" w:sz="4"/>
+              <w:left w:val="single" w:color="BFBFBF" w:sz="4"/>
+              <w:bottom w:val="single" w:color="BFBFBF" w:sz="4"/>
+              <w:right w:val="single" w:color="BFBFBF" w:sz="4"/>
+            </w:tcBorders>
+            <w:tcMar>
+              <w:top w:type="dxa" w:w="60"/>
+              <w:left w:type="dxa" w:w="100"/>
+              <w:bottom w:type="dxa" w:w="60"/>
+              <w:right w:type="dxa" w:w="100"/>
+            </w:tcMar>
+          </w:tcPr>
+          <w:p>
+            <w:r>
+              <w:t xml:space="preserve">bruteforce_01</w:t>
+            </w:r>
+          </w:p>
+        </w:tc>
+        <w:tc>
+          <w:tcPr>
+            <w:tcW w:type="dxa" w:w="2708"/>
+            <w:tcBorders>
+              <w:top w:val="single" w:color="BFBFBF" w:sz="4"/>
+              <w:left w:val="single" w:color="BFBFBF" w:sz="4"/>
+              <w:bottom w:val="single" w:color="BFBFBF" w:sz="4"/>
+              <w:right w:val="single" w:color="BFBFBF" w:sz="4"/>
+            </w:tcBorders>
+            <w:tcMar>
+              <w:top w:type="dxa" w:w="60"/>
+              <w:left w:type="dxa" w:w="100"/>
+              <w:bottom w:type="dxa" w:w="60"/>
+              <w:right w:type="dxa" w:w="100"/>
+            </w:tcMar>
+          </w:tcPr>
+          <w:p>
+            <w:r>
+              <w:t xml:space="preserve">1</w:t>
+            </w:r>
+          </w:p>
+        </w:tc>
+        <w:tc>
+          <w:tcPr>
+            <w:tcW w:type="dxa" w:w="3610"/>
+            <w:tcBorders>
+              <w:top w:val="single" w:color="BFBFBF" w:sz="4"/>
+              <w:left w:val="single" w:color="BFBFBF" w:sz="4"/>
+              <w:bottom w:val="single" w:color="BFBFBF" w:sz="4"/>
+              <w:right w:val="single" w:color="BFBFBF" w:sz="4"/>
+            </w:tcBorders>
+            <w:tcMar>
+              <w:top w:type="dxa" w:w="60"/>
+              <w:left w:type="dxa" w:w="100"/>
+              <w:bottom w:type="dxa" w:w="60"/>
+              <w:right w:type="dxa" w:w="100"/>
+            </w:tcMar>
+          </w:tcPr>
+          <w:p>
+            <w:r>
+              <w:t xml:space="preserve">9, 10, 10, 10</w:t>
+            </w:r>
+          </w:p>
+        </w:tc>
+      </w:tr>
+      <w:tr>
+        <w:tc>
+          <w:tcPr>
+            <w:tcW w:type="dxa" w:w="2708"/>
+            <w:tcBorders>
+              <w:top w:val="single" w:color="BFBFBF" w:sz="4"/>
+              <w:left w:val="single" w:color="BFBFBF" w:sz="4"/>
+              <w:bottom w:val="single" w:color="BFBFBF" w:sz="4"/>
+              <w:right w:val="single" w:color="BFBFBF" w:sz="4"/>
+            </w:tcBorders>
+            <w:tcMar>
+              <w:top w:type="dxa" w:w="60"/>
+              <w:left w:type="dxa" w:w="100"/>
+              <w:bottom w:type="dxa" w:w="60"/>
+              <w:right w:type="dxa" w:w="100"/>
+            </w:tcMar>
+          </w:tcPr>
+          <w:p>
+            <w:r>
+              <w:t xml:space="preserve">bruteforce_02</w:t>
+            </w:r>
+          </w:p>
+        </w:tc>
+        <w:tc>
+          <w:tcPr>
+            <w:tcW w:type="dxa" w:w="2708"/>
+            <w:tcBorders>
+              <w:top w:val="single" w:color="BFBFBF" w:sz="4"/>
+              <w:left w:val="single" w:color="BFBFBF" w:sz="4"/>
+              <w:bottom w:val="single" w:color="BFBFBF" w:sz="4"/>
+              <w:right w:val="single" w:color="BFBFBF" w:sz="4"/>
+            </w:tcBorders>
+            <w:tcMar>
+              <w:top w:type="dxa" w:w="60"/>
+              <w:left w:type="dxa" w:w="100"/>
+              <w:bottom w:type="dxa" w:w="60"/>
+              <w:right w:type="dxa" w:w="100"/>
+            </w:tcMar>
+          </w:tcPr>
+          <w:p>
+            <w:r>
+              <w:t xml:space="preserve">2</w:t>
+            </w:r>
+          </w:p>
+        </w:tc>
+        <w:tc>
+          <w:tcPr>
+            <w:tcW w:type="dxa" w:w="3610"/>
+            <w:tcBorders>
+              <w:top w:val="single" w:color="BFBFBF" w:sz="4"/>
+              <w:left w:val="single" w:color="BFBFBF" w:sz="4"/>
+              <w:bottom w:val="single" w:color="BFBFBF" w:sz="4"/>
+              <w:right w:val="single" w:color="BFBFBF" w:sz="4"/>
+            </w:tcBorders>
+            <w:tcMar>
+              <w:top w:type="dxa" w:w="60"/>
+              <w:left w:type="dxa" w:w="100"/>
+              <w:bottom w:type="dxa" w:w="60"/>
+              <w:right w:type="dxa" w:w="100"/>
+            </w:tcMar>
+          </w:tcPr>
+          <w:p>
+            <w:r>
+              <w:t xml:space="preserve">17, 20, 20, 20</w:t>
+            </w:r>
+          </w:p>
+        </w:tc>
+      </w:tr>
+      <w:tr>
+        <w:tc>
+          <w:tcPr>
+            <w:tcW w:type="dxa" w:w="2708"/>
+            <w:tcBorders>
+              <w:top w:val="single" w:color="BFBFBF" w:sz="4"/>
+              <w:left w:val="single" w:color="BFBFBF" w:sz="4"/>
+              <w:bottom w:val="single" w:color="BFBFBF" w:sz="4"/>
+              <w:right w:val="single" w:color="BFBFBF" w:sz="4"/>
+            </w:tcBorders>
+            <w:tcMar>
+              <w:top w:type="dxa" w:w="60"/>
+              <w:left w:type="dxa" w:w="100"/>
+              <w:bottom w:type="dxa" w:w="60"/>
+              <w:right w:type="dxa" w:w="100"/>
+            </w:tcMar>
+          </w:tcPr>
+          <w:p>
+            <w:r>
+              <w:t xml:space="preserve">bruteforce_03</w:t>
+            </w:r>
+          </w:p>
+        </w:tc>
+        <w:tc>
+          <w:tcPr>
+            <w:tcW w:type="dxa" w:w="2708"/>
+            <w:tcBorders>
+              <w:top w:val="single" w:color="BFBFBF" w:sz="4"/>
+              <w:left w:val="single" w:color="BFBFBF" w:sz="4"/>
+              <w:bottom w:val="single" w:color="BFBFBF" w:sz="4"/>
+              <w:right w:val="single" w:color="BFBFBF" w:sz="4"/>
+            </w:tcBorders>
+            <w:tcMar>
+              <w:top w:type="dxa" w:w="60"/>
+              <w:left w:type="dxa" w:w="100"/>
+              <w:bottom w:type="dxa" w:w="60"/>
+              <w:right w:type="dxa" w:w="100"/>
+            </w:tcMar>
+          </w:tcPr>
+          <w:p>
+            <w:r>
+              <w:t xml:space="preserve">3</w:t>
+            </w:r>
+          </w:p>
+        </w:tc>
+        <w:tc>
+          <w:tcPr>
+            <w:tcW w:type="dxa" w:w="3610"/>
+            <w:tcBorders>
+              <w:top w:val="single" w:color="BFBFBF" w:sz="4"/>
+              <w:left w:val="single" w:color="BFBFBF" w:sz="4"/>
+              <w:bottom w:val="single" w:color="BFBFBF" w:sz="4"/>
+              <w:right w:val="single" w:color="BFBFBF" w:sz="4"/>
+            </w:tcBorders>
+            <w:tcMar>
+              <w:top w:type="dxa" w:w="60"/>
+              <w:left w:type="dxa" w:w="100"/>
+              <w:bottom w:type="dxa" w:w="60"/>
+              <w:right w:type="dxa" w:w="100"/>
+            </w:tcMar>
+          </w:tcPr>
+          <w:p>
+            <w:r>
+              <w:t xml:space="preserve">25, 30, 30, 30</w:t>
+            </w:r>
+          </w:p>
+        </w:tc>
+      </w:tr>
+      <w:tr>
+        <w:tc>
+          <w:tcPr>
+            <w:tcW w:type="dxa" w:w="2708"/>
+            <w:tcBorders>
+              <w:top w:val="single" w:color="BFBFBF" w:sz="4"/>
+              <w:left w:val="single" w:color="BFBFBF" w:sz="4"/>
+              <w:bottom w:val="single" w:color="BFBFBF" w:sz="4"/>
+              <w:right w:val="single" w:color="BFBFBF" w:sz="4"/>
+            </w:tcBorders>
+            <w:tcMar>
+              <w:top w:type="dxa" w:w="60"/>
+              <w:left w:type="dxa" w:w="100"/>
+              <w:bottom w:type="dxa" w:w="60"/>
+              <w:right w:type="dxa" w:w="100"/>
+            </w:tcMar>
+          </w:tcPr>
+          <w:p>
+            <w:r>
+              <w:t xml:space="preserve">bruteforce_04</w:t>
+            </w:r>
+          </w:p>
+        </w:tc>
+        <w:tc>
+          <w:tcPr>
+            <w:tcW w:type="dxa" w:w="2708"/>
+            <w:tcBorders>
+              <w:top w:val="single" w:color="BFBFBF" w:sz="4"/>
+              <w:left w:val="single" w:color="BFBFBF" w:sz="4"/>
+              <w:bottom w:val="single" w:color="BFBFBF" w:sz="4"/>
+              <w:right w:val="single" w:color="BFBFBF" w:sz="4"/>
+            </w:tcBorders>
+            <w:tcMar>
+              <w:top w:type="dxa" w:w="60"/>
+              <w:left w:type="dxa" w:w="100"/>
+              <w:bottom w:type="dxa" w:w="60"/>
+              <w:right w:type="dxa" w:w="100"/>
+            </w:tcMar>
+          </w:tcPr>
+          <w:p>
+            <w:r>
+              <w:t xml:space="preserve">5</w:t>
+            </w:r>
+          </w:p>
+        </w:tc>
+        <w:tc>
+          <w:tcPr>
+            <w:tcW w:type="dxa" w:w="3610"/>
+            <w:tcBorders>
+              <w:top w:val="single" w:color="BFBFBF" w:sz="4"/>
+              <w:left w:val="single" w:color="BFBFBF" w:sz="4"/>
+              <w:bottom w:val="single" w:color="BFBFBF" w:sz="4"/>
+              <w:right w:val="single" w:color="BFBFBF" w:sz="4"/>
+            </w:tcBorders>
+            <w:tcMar>
+              <w:top w:type="dxa" w:w="60"/>
+              <w:left w:type="dxa" w:w="100"/>
+              <w:bottom w:type="dxa" w:w="60"/>
+              <w:right w:type="dxa" w:w="100"/>
+            </w:tcMar>
+          </w:tcPr>
+          <w:p>
+            <w:r>
+              <w:t xml:space="preserve">42, 50, 49, 50</w:t>
+            </w:r>
+          </w:p>
+        </w:tc>
+      </w:tr>
+      <w:tr>
+        <w:tc>
+          <w:tcPr>
+            <w:tcW w:type="dxa" w:w="2708"/>
+            <w:tcBorders>
+              <w:top w:val="single" w:color="BFBFBF" w:sz="4"/>
+              <w:left w:val="single" w:color="BFBFBF" w:sz="4"/>
+              <w:bottom w:val="single" w:color="BFBFBF" w:sz="4"/>
+              <w:right w:val="single" w:color="BFBFBF" w:sz="4"/>
+            </w:tcBorders>
+            <w:tcMar>
+              <w:top w:type="dxa" w:w="60"/>
+              <w:left w:type="dxa" w:w="100"/>
+              <w:bottom w:type="dxa" w:w="60"/>
+              <w:right w:type="dxa" w:w="100"/>
+            </w:tcMar>
+          </w:tcPr>
+          <w:p>
+            <w:r>
+              <w:t xml:space="preserve">bruteforce_05</w:t>
+            </w:r>
+          </w:p>
+        </w:tc>
+        <w:tc>
+          <w:tcPr>
+            <w:tcW w:type="dxa" w:w="2708"/>
+            <w:tcBorders>
+              <w:top w:val="single" w:color="BFBFBF" w:sz="4"/>
+              <w:left w:val="single" w:color="BFBFBF" w:sz="4"/>
+              <w:bottom w:val="single" w:color="BFBFBF" w:sz="4"/>
+              <w:right w:val="single" w:color="BFBFBF" w:sz="4"/>
+            </w:tcBorders>
+            <w:tcMar>
+              <w:top w:type="dxa" w:w="60"/>
+              <w:left w:type="dxa" w:w="100"/>
+              <w:bottom w:type="dxa" w:w="60"/>
+              <w:right w:type="dxa" w:w="100"/>
+            </w:tcMar>
+          </w:tcPr>
+          <w:p>
+            <w:r>
+              <w:t xml:space="preserve">8</w:t>
+            </w:r>
+          </w:p>
+        </w:tc>
+        <w:tc>
+          <w:tcPr>
+            <w:tcW w:type="dxa" w:w="3610"/>
+            <w:tcBorders>
+              <w:top w:val="single" w:color="BFBFBF" w:sz="4"/>
+              <w:left w:val="single" w:color="BFBFBF" w:sz="4"/>
+              <w:bottom w:val="single" w:color="BFBFBF" w:sz="4"/>
+              <w:right w:val="single" w:color="BFBFBF" w:sz="4"/>
+            </w:tcBorders>
+            <w:tcMar>
+              <w:top w:type="dxa" w:w="60"/>
+              <w:left w:type="dxa" w:w="100"/>
+              <w:bottom w:type="dxa" w:w="60"/>
+              <w:right w:type="dxa" w:w="100"/>
+            </w:tcMar>
+          </w:tcPr>
+          <w:p>
+            <w:r>
+              <w:t xml:space="preserve">67, 79, 80, 79</w:t>
+            </w:r>
+          </w:p>
+        </w:tc>
+      </w:tr>
+    </w:tbl>
+    <w:p>
+      <w:pPr>
+        <w:spacing w:after="120"/>
+      </w:pPr>
+    </w:p>
+    <w:p>
+      <w:pPr>
+        <w:spacing w:after="120"/>
+      </w:pPr>
+      <w:r>
+        <w:t xml:space="preserve">Across all datasets, no row labelled normal has a single failed login. zt_traffic.py also gained two commands for the live demo: background (normal traffic only) and attack (start one attack without capturing).</w:t>
+      </w:r>
+    </w:p>
+    <w:p>
+      <w:pPr>
+        <w:spacing w:after="120"/>
+      </w:pPr>
+    </w:p>
+    <w:p>
+      <w:pPr>
         <w:spacing w:after="120"/>
       </w:pPr>
       <w:r>
@@ -10700,6 +11195,142 @@
           </w:tcPr>
           <w:p>
             <w:r>
+              <w:t xml:space="preserve">Brute-force requests from the SIEM got no reply</w:t>
+            </w:r>
+          </w:p>
+        </w:tc>
+        <w:tc>
+          <w:tcPr>
+            <w:tcW w:type="dxa" w:w="3069"/>
+            <w:tcBorders>
+              <w:top w:val="single" w:color="BFBFBF" w:sz="4"/>
+              <w:left w:val="single" w:color="BFBFBF" w:sz="4"/>
+              <w:bottom w:val="single" w:color="BFBFBF" w:sz="4"/>
+              <w:right w:val="single" w:color="BFBFBF" w:sz="4"/>
+            </w:tcBorders>
+            <w:tcMar>
+              <w:top w:type="dxa" w:w="60"/>
+              <w:left w:type="dxa" w:w="100"/>
+              <w:bottom w:type="dxa" w:w="60"/>
+              <w:right w:type="dxa" w:w="100"/>
+            </w:tcMar>
+          </w:tcPr>
+          <w:p>
+            <w:r>
+              <w:t xml:space="preserve">The SIEM's switch port is the SPAN destination, which is receive-only</w:t>
+            </w:r>
+          </w:p>
+        </w:tc>
+        <w:tc>
+          <w:tcPr>
+            <w:tcW w:type="dxa" w:w="3430"/>
+            <w:tcBorders>
+              <w:top w:val="single" w:color="BFBFBF" w:sz="4"/>
+              <w:left w:val="single" w:color="BFBFBF" w:sz="4"/>
+              <w:bottom w:val="single" w:color="BFBFBF" w:sz="4"/>
+              <w:right w:val="single" w:color="BFBFBF" w:sz="4"/>
+            </w:tcBorders>
+            <w:tcMar>
+              <w:top w:type="dxa" w:w="60"/>
+              <w:left w:type="dxa" w:w="100"/>
+              <w:bottom w:type="dxa" w:w="60"/>
+              <w:right w:type="dxa" w:w="100"/>
+            </w:tcMar>
+          </w:tcPr>
+          <w:p>
+            <w:r>
+              <w:t xml:space="preserve">Inject the switch-relayed requests at the RADIUS server with the switch's NAS address</w:t>
+            </w:r>
+          </w:p>
+        </w:tc>
+      </w:tr>
+      <w:tr>
+        <w:tc>
+          <w:tcPr>
+            <w:tcW w:type="dxa" w:w="2527"/>
+            <w:tcBorders>
+              <w:top w:val="single" w:color="BFBFBF" w:sz="4"/>
+              <w:left w:val="single" w:color="BFBFBF" w:sz="4"/>
+              <w:bottom w:val="single" w:color="BFBFBF" w:sz="4"/>
+              <w:right w:val="single" w:color="BFBFBF" w:sz="4"/>
+            </w:tcBorders>
+            <w:tcMar>
+              <w:top w:type="dxa" w:w="60"/>
+              <w:left w:type="dxa" w:w="100"/>
+              <w:bottom w:type="dxa" w:w="60"/>
+              <w:right w:type="dxa" w:w="100"/>
+            </w:tcMar>
+          </w:tcPr>
+          <w:p>
+            <w:r>
+              <w:t xml:space="preserve">Window after a brute force labelled normal with 9 failed logins</w:t>
+            </w:r>
+          </w:p>
+        </w:tc>
+        <w:tc>
+          <w:tcPr>
+            <w:tcW w:type="dxa" w:w="3069"/>
+            <w:tcBorders>
+              <w:top w:val="single" w:color="BFBFBF" w:sz="4"/>
+              <w:left w:val="single" w:color="BFBFBF" w:sz="4"/>
+              <w:bottom w:val="single" w:color="BFBFBF" w:sz="4"/>
+              <w:right w:val="single" w:color="BFBFBF" w:sz="4"/>
+            </w:tcBorders>
+            <w:tcMar>
+              <w:top w:type="dxa" w:w="60"/>
+              <w:left w:type="dxa" w:w="100"/>
+              <w:bottom w:type="dxa" w:w="60"/>
+              <w:right w:type="dxa" w:w="100"/>
+            </w:tcMar>
+          </w:tcPr>
+          <w:p>
+            <w:r>
+              <w:t xml:space="preserve">FreeRADIUS delays rejects by 1 s, so late rejects spill past the attack end</w:t>
+            </w:r>
+          </w:p>
+        </w:tc>
+        <w:tc>
+          <w:tcPr>
+            <w:tcW w:type="dxa" w:w="3430"/>
+            <w:tcBorders>
+              <w:top w:val="single" w:color="BFBFBF" w:sz="4"/>
+              <w:left w:val="single" w:color="BFBFBF" w:sz="4"/>
+              <w:bottom w:val="single" w:color="BFBFBF" w:sz="4"/>
+              <w:right w:val="single" w:color="BFBFBF" w:sz="4"/>
+            </w:tcBorders>
+            <w:tcMar>
+              <w:top w:type="dxa" w:w="60"/>
+              <w:left w:type="dxa" w:w="100"/>
+              <w:bottom w:type="dxa" w:w="60"/>
+              <w:right w:type="dxa" w:w="100"/>
+            </w:tcMar>
+          </w:tcPr>
+          <w:p>
+            <w:r>
+              <w:t xml:space="preserve">After-effect allowance drops those windows as transitions</w:t>
+            </w:r>
+          </w:p>
+        </w:tc>
+      </w:tr>
+      <w:tr>
+        <w:tc>
+          <w:tcPr>
+            <w:tcW w:type="dxa" w:w="2527"/>
+            <w:tcBorders>
+              <w:top w:val="single" w:color="BFBFBF" w:sz="4"/>
+              <w:left w:val="single" w:color="BFBFBF" w:sz="4"/>
+              <w:bottom w:val="single" w:color="BFBFBF" w:sz="4"/>
+              <w:right w:val="single" w:color="BFBFBF" w:sz="4"/>
+            </w:tcBorders>
+            <w:tcMar>
+              <w:top w:type="dxa" w:w="60"/>
+              <w:left w:type="dxa" w:w="100"/>
+              <w:bottom w:type="dxa" w:w="60"/>
+              <w:right w:type="dxa" w:w="100"/>
+            </w:tcMar>
+          </w:tcPr>
+          <w:p>
+            <w:r>
               <w:t xml:space="preserve">Little free RAM for captures</w:t>
             </w:r>
           </w:p>
@@ -11594,26 +12225,6 @@
           <w:b/>
           <w:bCs/>
         </w:rPr>
-        <w:t xml:space="preserve">Brute-force generator</w:t>
-      </w:r>
-      <w:r>
-        <w:t xml:space="preserve"> - drive RADIUS with radclient from the siem node using repeated bad passwords and a spoofed Calling-Station-Id (a real 802.1X retry only happens about every 20 s). Target: dozens of failed_logins per window.</w:t>
-      </w:r>
-    </w:p>
-    <w:p>
-      <w:pPr>
-        <w:pStyle w:val="ListParagraph"/>
-        <w:numPr>
-          <w:ilvl w:val="0"/>
-          <w:numId w:val="5"/>
-        </w:numPr>
-        <w:spacing w:after="60"/>
-      </w:pPr>
-      <w:r>
-        <w:rPr>
-          <w:b/>
-          <w:bCs/>
-        </w:rPr>
         <w:t xml:space="preserve">Isolation Forest model</w:t>
       </w:r>
       <w:r>
@@ -12371,7 +12982,7 @@
           </w:tcPr>
           <w:p>
             <w:r>
-              <w:t xml:space="preserve">Traffic generator with labelling and its 6 offline tests</w:t>
+              <w:t xml:space="preserve">Traffic generator (normal, dos, portscan, insider, offhours, bruteforce; background and attack commands for the demo) and its 9 offline tests</w:t>
             </w:r>
           </w:p>
         </w:tc>

</xml_diff>

<commit_message>
Log: model results section with charts
</commit_message>
<xml_diff>
--- a/ZT_Project_Implementation_Log.docx
+++ b/ZT_Project_Implementation_Log.docx
@@ -84,7 +84,7 @@
           <w:sz w:val="22"/>
           <w:szCs w:val="22"/>
         </w:rPr>
-        <w:t xml:space="preserve">Last updated 14 October 2026 at 13:38</w:t>
+        <w:t xml:space="preserve">Last updated 14 October 2026 at 13:43</w:t>
       </w:r>
     </w:p>
     <w:p>
@@ -696,7 +696,7 @@
           </w:pPr>
           <w:hyperlink w:history="1" w:anchor="_Toc26">
             <w:r>
-              <w:t xml:space="preserve">6. Verified Evidence for Chapter 5</w:t>
+              <w:t xml:space="preserve">6. The Isolation Forest Model (step 3E)</w:t>
             </w:r>
             <w:r>
               <w:tab/>
@@ -711,14 +711,15 @@
         </w:p>
         <w:p>
           <w:pPr>
-            <w:pStyle w:val="TOC1"/>
+            <w:pStyle w:val="TOC2"/>
             <w:tabs>
               <w:tab w:val="right" w:pos="9026" w:leader="dot"/>
             </w:tabs>
+            <w:ind w:left="220"/>
           </w:pPr>
           <w:hyperlink w:history="1" w:anchor="_Toc27">
             <w:r>
-              <w:t xml:space="preserve">7. Problems Encountered and Fixes</w:t>
+              <w:t xml:space="preserve">6.1 How it works</w:t>
             </w:r>
             <w:r>
               <w:tab/>
@@ -733,14 +734,15 @@
         </w:p>
         <w:p>
           <w:pPr>
-            <w:pStyle w:val="TOC1"/>
+            <w:pStyle w:val="TOC2"/>
             <w:tabs>
               <w:tab w:val="right" w:pos="9026" w:leader="dot"/>
             </w:tabs>
+            <w:ind w:left="220"/>
           </w:pPr>
           <w:hyperlink w:history="1" w:anchor="_Toc28">
             <w:r>
-              <w:t xml:space="preserve">8. Monitoring with Zabbix</w:t>
+              <w:t xml:space="preserve">6.2 Method</w:t>
             </w:r>
             <w:r>
               <w:tab/>
@@ -763,7 +765,7 @@
           </w:pPr>
           <w:hyperlink w:history="1" w:anchor="_Toc29">
             <w:r>
-              <w:t xml:space="preserve">8.1 Viewing the dashboard</w:t>
+              <w:t xml:space="preserve">6.3 Results</w:t>
             </w:r>
             <w:r>
               <w:tab/>
@@ -786,7 +788,7 @@
           </w:pPr>
           <w:hyperlink w:history="1" w:anchor="_Toc30">
             <w:r>
-              <w:t xml:space="preserve">8.2 What is monitored today</w:t>
+              <w:t xml:space="preserve">6.4 Findings</w:t>
             </w:r>
             <w:r>
               <w:tab/>
@@ -801,15 +803,14 @@
         </w:p>
         <w:p>
           <w:pPr>
-            <w:pStyle w:val="TOC2"/>
+            <w:pStyle w:val="TOC1"/>
             <w:tabs>
               <w:tab w:val="right" w:pos="9026" w:leader="dot"/>
             </w:tabs>
-            <w:ind w:left="220"/>
           </w:pPr>
           <w:hyperlink w:history="1" w:anchor="_Toc31">
             <w:r>
-              <w:t xml:space="preserve">8.3 Every node pushes its own data (zt_zbx_push.py)</w:t>
+              <w:t xml:space="preserve">7. Verified Evidence for Chapter 5</w:t>
             </w:r>
             <w:r>
               <w:tab/>
@@ -824,15 +825,14 @@
         </w:p>
         <w:p>
           <w:pPr>
-            <w:pStyle w:val="TOC2"/>
+            <w:pStyle w:val="TOC1"/>
             <w:tabs>
               <w:tab w:val="right" w:pos="9026" w:leader="dot"/>
             </w:tabs>
-            <w:ind w:left="220"/>
           </w:pPr>
           <w:hyperlink w:history="1" w:anchor="_Toc32">
             <w:r>
-              <w:t xml:space="preserve">8.4 The two dashboard pages</w:t>
+              <w:t xml:space="preserve">8. Problems Encountered and Fixes</w:t>
             </w:r>
             <w:r>
               <w:tab/>
@@ -854,7 +854,7 @@
           </w:pPr>
           <w:hyperlink w:history="1" w:anchor="_Toc33">
             <w:r>
-              <w:t xml:space="preserve">9. Remaining Work</w:t>
+              <w:t xml:space="preserve">9. Monitoring with Zabbix</w:t>
             </w:r>
             <w:r>
               <w:tab/>
@@ -877,7 +877,7 @@
           </w:pPr>
           <w:hyperlink w:history="1" w:anchor="_Toc34">
             <w:r>
-              <w:t xml:space="preserve">Phase 3 (detection and response)</w:t>
+              <w:t xml:space="preserve">9.1 Viewing the dashboard</w:t>
             </w:r>
             <w:r>
               <w:tab/>
@@ -900,7 +900,7 @@
           </w:pPr>
           <w:hyperlink w:history="1" w:anchor="_Toc35">
             <w:r>
-              <w:t xml:space="preserve">Phase 4 (validation and report)</w:t>
+              <w:t xml:space="preserve">9.2 What is monitored today</w:t>
             </w:r>
             <w:r>
               <w:tab/>
@@ -915,14 +915,15 @@
         </w:p>
         <w:p>
           <w:pPr>
-            <w:pStyle w:val="TOC1"/>
+            <w:pStyle w:val="TOC2"/>
             <w:tabs>
               <w:tab w:val="right" w:pos="9026" w:leader="dot"/>
             </w:tabs>
+            <w:ind w:left="220"/>
           </w:pPr>
           <w:hyperlink w:history="1" w:anchor="_Toc36">
             <w:r>
-              <w:t xml:space="preserve">10. Files and Commands</w:t>
+              <w:t xml:space="preserve">9.3 Every node pushes its own data (zt_zbx_push.py)</w:t>
             </w:r>
             <w:r>
               <w:tab/>
@@ -945,7 +946,7 @@
           </w:pPr>
           <w:hyperlink w:history="1" w:anchor="_Toc37">
             <w:r>
-              <w:t xml:space="preserve">Daily routine</w:t>
+              <w:t xml:space="preserve">9.4 The two dashboard pages</w:t>
             </w:r>
             <w:r>
               <w:tab/>
@@ -967,7 +968,7 @@
           </w:pPr>
           <w:hyperlink w:history="1" w:anchor="_Toc38">
             <w:r>
-              <w:t xml:space="preserve">11. Report Corrections Needed</w:t>
+              <w:t xml:space="preserve">10. Remaining Work</w:t>
             </w:r>
             <w:r>
               <w:tab/>
@@ -975,6 +976,52 @@
             <w:r>
               <w:fldChar w:fldCharType="begin" w:dirty="true"/>
               <w:instrText xml:space="preserve">PAGEREF _Toc38 \h</w:instrText>
+              <w:fldChar w:fldCharType="separate"/>
+              <w:fldChar w:fldCharType="end"/>
+            </w:r>
+          </w:hyperlink>
+        </w:p>
+        <w:p>
+          <w:pPr>
+            <w:pStyle w:val="TOC2"/>
+            <w:tabs>
+              <w:tab w:val="right" w:pos="9026" w:leader="dot"/>
+            </w:tabs>
+            <w:ind w:left="220"/>
+          </w:pPr>
+          <w:hyperlink w:history="1" w:anchor="_Toc39">
+            <w:r>
+              <w:t xml:space="preserve">Phase 3 (detection and response)</w:t>
+            </w:r>
+            <w:r>
+              <w:tab/>
+            </w:r>
+            <w:r>
+              <w:fldChar w:fldCharType="begin" w:dirty="true"/>
+              <w:instrText xml:space="preserve">PAGEREF _Toc39 \h</w:instrText>
+              <w:fldChar w:fldCharType="separate"/>
+              <w:fldChar w:fldCharType="end"/>
+            </w:r>
+          </w:hyperlink>
+        </w:p>
+        <w:p>
+          <w:pPr>
+            <w:pStyle w:val="TOC2"/>
+            <w:tabs>
+              <w:tab w:val="right" w:pos="9026" w:leader="dot"/>
+            </w:tabs>
+            <w:ind w:left="220"/>
+          </w:pPr>
+          <w:hyperlink w:history="1" w:anchor="_Toc40">
+            <w:r>
+              <w:t xml:space="preserve">Phase 4 (validation and report)</w:t>
+            </w:r>
+            <w:r>
+              <w:tab/>
+            </w:r>
+            <w:r>
+              <w:fldChar w:fldCharType="begin" w:dirty="true"/>
+              <w:instrText xml:space="preserve">PAGEREF _Toc40 \h</w:instrText>
               <w:fldChar w:fldCharType="separate"/>
               <w:fldChar w:fldCharType="end"/>
             </w:r>
@@ -987,16 +1034,83 @@
               <w:tab w:val="right" w:pos="9026" w:leader="dot"/>
             </w:tabs>
           </w:pPr>
-          <w:hyperlink w:history="1" w:anchor="_Toc39">
-            <w:r>
-              <w:t xml:space="preserve">12. Risks and Open Questions</w:t>
+          <w:hyperlink w:history="1" w:anchor="_Toc41">
+            <w:r>
+              <w:t xml:space="preserve">11. Files and Commands</w:t>
             </w:r>
             <w:r>
               <w:tab/>
             </w:r>
             <w:r>
               <w:fldChar w:fldCharType="begin" w:dirty="true"/>
-              <w:instrText xml:space="preserve">PAGEREF _Toc39 \h</w:instrText>
+              <w:instrText xml:space="preserve">PAGEREF _Toc41 \h</w:instrText>
+              <w:fldChar w:fldCharType="separate"/>
+              <w:fldChar w:fldCharType="end"/>
+            </w:r>
+          </w:hyperlink>
+        </w:p>
+        <w:p>
+          <w:pPr>
+            <w:pStyle w:val="TOC2"/>
+            <w:tabs>
+              <w:tab w:val="right" w:pos="9026" w:leader="dot"/>
+            </w:tabs>
+            <w:ind w:left="220"/>
+          </w:pPr>
+          <w:hyperlink w:history="1" w:anchor="_Toc42">
+            <w:r>
+              <w:t xml:space="preserve">Daily routine</w:t>
+            </w:r>
+            <w:r>
+              <w:tab/>
+            </w:r>
+            <w:r>
+              <w:fldChar w:fldCharType="begin" w:dirty="true"/>
+              <w:instrText xml:space="preserve">PAGEREF _Toc42 \h</w:instrText>
+              <w:fldChar w:fldCharType="separate"/>
+              <w:fldChar w:fldCharType="end"/>
+            </w:r>
+          </w:hyperlink>
+        </w:p>
+        <w:p>
+          <w:pPr>
+            <w:pStyle w:val="TOC1"/>
+            <w:tabs>
+              <w:tab w:val="right" w:pos="9026" w:leader="dot"/>
+            </w:tabs>
+          </w:pPr>
+          <w:hyperlink w:history="1" w:anchor="_Toc43">
+            <w:r>
+              <w:t xml:space="preserve">12. Report Corrections Needed</w:t>
+            </w:r>
+            <w:r>
+              <w:tab/>
+            </w:r>
+            <w:r>
+              <w:fldChar w:fldCharType="begin" w:dirty="true"/>
+              <w:instrText xml:space="preserve">PAGEREF _Toc43 \h</w:instrText>
+              <w:fldChar w:fldCharType="separate"/>
+              <w:fldChar w:fldCharType="end"/>
+            </w:r>
+          </w:hyperlink>
+        </w:p>
+        <w:p>
+          <w:pPr>
+            <w:pStyle w:val="TOC1"/>
+            <w:tabs>
+              <w:tab w:val="right" w:pos="9026" w:leader="dot"/>
+            </w:tabs>
+          </w:pPr>
+          <w:hyperlink w:history="1" w:anchor="_Toc44">
+            <w:r>
+              <w:t xml:space="preserve">13. Risks and Open Questions</w:t>
+            </w:r>
+            <w:r>
+              <w:tab/>
+            </w:r>
+            <w:r>
+              <w:fldChar w:fldCharType="begin" w:dirty="true"/>
+              <w:instrText xml:space="preserve">PAGEREF _Toc44 \h</w:instrText>
               <w:fldChar w:fldCharType="separate"/>
               <w:fldChar w:fldCharType="end"/>
             </w:r>
@@ -1544,7 +1658,7 @@
           </w:tcPr>
           <w:p>
             <w:r>
-              <w:t xml:space="preserve">Not started</w:t>
+              <w:t xml:space="preserve">Built and evaluated (5-fold): accuracy 98.0%, F1 0.90, false positives 1.1%; weak brute force partly missed</w:t>
             </w:r>
           </w:p>
         </w:tc>
@@ -1636,7 +1750,7 @@
           </w:tcPr>
           <w:p>
             <w:r>
-              <w:t xml:space="preserve">Not started (design in section 9)</w:t>
+              <w:t xml:space="preserve">Not started (design in section 10)</w:t>
             </w:r>
           </w:p>
         </w:tc>
@@ -1728,7 +1842,7 @@
           </w:tcPr>
           <w:p>
             <w:r>
-              <w:t xml:space="preserve">Not started (list in section 11)</w:t>
+              <w:t xml:space="preserve">Not started (list in section 12)</w:t>
             </w:r>
           </w:p>
         </w:tc>
@@ -9488,9 +9602,966 @@
       </w:pPr>
       <w:bookmarkStart w:name="_Toc26" w:id="26"/>
       <w:r>
-        <w:t xml:space="preserve">6. Verified Evidence for Chapter 5</w:t>
+        <w:t xml:space="preserve">6. The Isolation Forest Model (step 3E)</w:t>
       </w:r>
       <w:bookmarkEnd w:id="26"/>
+    </w:p>
+    <w:p>
+      <w:pPr>
+        <w:pStyle w:val="Heading2"/>
+      </w:pPr>
+      <w:bookmarkStart w:name="_Toc27" w:id="27"/>
+      <w:r>
+        <w:t xml:space="preserve">6.1 How it works</w:t>
+      </w:r>
+      <w:bookmarkEnd w:id="27"/>
+    </w:p>
+    <w:p>
+      <w:pPr>
+        <w:spacing w:after="120"/>
+      </w:pPr>
+      <w:r>
+        <w:t xml:space="preserve">Isolation Forest builds many random trees. Each tree keeps splitting the data on a random feature at a random value until every window sits alone. Normal windows are alike, so it takes many splits to isolate one; an attack is unusual and is isolated in a few splits. The average number of splits becomes the anomaly score: the fewer the splits, the higher the score. In the code, AnomalyDetector (as in the Chapter 4 class diagram) wraps a StandardScaler and scikit-learn's IsolationForest (200 trees) behind fit() and score(); score = minus decision_function, so higher means more anomalous. A window is flagged when its score is above a threshold.</w:t>
+      </w:r>
+    </w:p>
+    <w:p>
+      <w:pPr>
+        <w:pStyle w:val="Heading2"/>
+      </w:pPr>
+      <w:bookmarkStart w:name="_Toc28" w:id="28"/>
+      <w:r>
+        <w:t xml:space="preserve">6.2 Method</w:t>
+      </w:r>
+      <w:bookmarkEnd w:id="28"/>
+    </w:p>
+    <w:p>
+      <w:pPr>
+        <w:pStyle w:val="ListParagraph"/>
+        <w:numPr>
+          <w:ilvl w:val="0"/>
+          <w:numId w:val="3"/>
+        </w:numPr>
+        <w:spacing w:after="60"/>
+      </w:pPr>
+      <w:r>
+        <w:rPr>
+          <w:b/>
+          <w:bCs/>
+        </w:rPr>
+        <w:t xml:space="preserve">Unsupervised</w:t>
+      </w:r>
+      <w:r>
+        <w:t xml:space="preserve">: the model is never given labels. Labels are used only afterwards, to measure the result.</w:t>
+      </w:r>
+    </w:p>
+    <w:p>
+      <w:pPr>
+        <w:pStyle w:val="ListParagraph"/>
+        <w:numPr>
+          <w:ilvl w:val="0"/>
+          <w:numId w:val="3"/>
+        </w:numPr>
+        <w:spacing w:after="60"/>
+      </w:pPr>
+      <w:r>
+        <w:rPr>
+          <w:b/>
+          <w:bCs/>
+        </w:rPr>
+        <w:t xml:space="preserve">Threshold</w:t>
+      </w:r>
+      <w:r>
+        <w:t xml:space="preserve"> tuned on a separate normal run (normal_03): the 99th percentile of its scores, which targets about 1 % false alarms.</w:t>
+      </w:r>
+    </w:p>
+    <w:p>
+      <w:pPr>
+        <w:pStyle w:val="ListParagraph"/>
+        <w:numPr>
+          <w:ilvl w:val="0"/>
+          <w:numId w:val="3"/>
+        </w:numPr>
+        <w:spacing w:after="60"/>
+      </w:pPr>
+      <w:r>
+        <w:rPr>
+          <w:b/>
+          <w:bCs/>
+        </w:rPr>
+        <w:t xml:space="preserve">5-fold leave-one-run-out</w:t>
+      </w:r>
+      <w:r>
+        <w:t xml:space="preserve">: in fold k, run k of every attack type is held out for testing and the model trains on two other runs of each type. Every run, including the weakest attacks, is tested by a model that never saw it. normal_04 is the held-out normal run, scored in every fold.</w:t>
+      </w:r>
+    </w:p>
+    <w:p>
+      <w:pPr>
+        <w:pStyle w:val="ListParagraph"/>
+        <w:numPr>
+          <w:ilvl w:val="0"/>
+          <w:numId w:val="3"/>
+        </w:numPr>
+        <w:spacing w:after="60"/>
+      </w:pPr>
+      <w:r>
+        <w:rPr>
+          <w:b/>
+          <w:bCs/>
+        </w:rPr>
+        <w:t xml:space="preserve">Two training modes compared</w:t>
+      </w:r>
+      <w:r>
+        <w:t xml:space="preserve">: normal-only (novelty detection) and mixed (unlabelled traffic in which attacks are rare, about 9 % of windows), which is how Isolation Forest is normally used.</w:t>
+      </w:r>
+    </w:p>
+    <w:p>
+      <w:pPr>
+        <w:pStyle w:val="Heading2"/>
+      </w:pPr>
+      <w:bookmarkStart w:name="_Toc29" w:id="29"/>
+      <w:r>
+        <w:t xml:space="preserve">6.3 Results</w:t>
+      </w:r>
+      <w:bookmarkEnd w:id="29"/>
+    </w:p>
+    <w:tbl>
+      <w:tblPr>
+        <w:tblW w:type="dxa" w:w="9026"/>
+        <w:tblBorders>
+          <w:top w:val="single" w:color="auto" w:sz="4"/>
+          <w:left w:val="single" w:color="auto" w:sz="4"/>
+          <w:bottom w:val="single" w:color="auto" w:sz="4"/>
+          <w:right w:val="single" w:color="auto" w:sz="4"/>
+          <w:insideH w:val="single" w:color="auto" w:sz="4"/>
+          <w:insideV w:val="single" w:color="auto" w:sz="4"/>
+        </w:tblBorders>
+      </w:tblPr>
+      <w:tblGrid>
+        <w:gridCol w:w="1986"/>
+        <w:gridCol w:w="1173"/>
+        <w:gridCol w:w="1173"/>
+        <w:gridCol w:w="1083"/>
+        <w:gridCol w:w="903"/>
+        <w:gridCol w:w="1534"/>
+        <w:gridCol w:w="1174"/>
+      </w:tblGrid>
+      <w:tr>
+        <w:trPr>
+          <w:tblHeader/>
+        </w:trPr>
+        <w:tc>
+          <w:tcPr>
+            <w:tcW w:type="dxa" w:w="1986"/>
+            <w:tcBorders>
+              <w:top w:val="single" w:color="BFBFBF" w:sz="4"/>
+              <w:left w:val="single" w:color="BFBFBF" w:sz="4"/>
+              <w:bottom w:val="single" w:color="BFBFBF" w:sz="4"/>
+              <w:right w:val="single" w:color="BFBFBF" w:sz="4"/>
+            </w:tcBorders>
+            <w:shd w:fill="1F4E79" w:color="auto" w:val="clear"/>
+            <w:tcMar>
+              <w:top w:type="dxa" w:w="60"/>
+              <w:left w:type="dxa" w:w="100"/>
+              <w:bottom w:type="dxa" w:w="60"/>
+              <w:right w:type="dxa" w:w="100"/>
+            </w:tcMar>
+          </w:tcPr>
+          <w:p>
+            <w:r>
+              <w:rPr>
+                <w:b/>
+                <w:bCs/>
+                <w:color w:val="FFFFFF"/>
+                <w:sz w:val="19"/>
+                <w:szCs w:val="19"/>
+              </w:rPr>
+              <w:t xml:space="preserve">Training mode</w:t>
+            </w:r>
+          </w:p>
+        </w:tc>
+        <w:tc>
+          <w:tcPr>
+            <w:tcW w:type="dxa" w:w="1173"/>
+            <w:tcBorders>
+              <w:top w:val="single" w:color="BFBFBF" w:sz="4"/>
+              <w:left w:val="single" w:color="BFBFBF" w:sz="4"/>
+              <w:bottom w:val="single" w:color="BFBFBF" w:sz="4"/>
+              <w:right w:val="single" w:color="BFBFBF" w:sz="4"/>
+            </w:tcBorders>
+            <w:shd w:fill="1F4E79" w:color="auto" w:val="clear"/>
+            <w:tcMar>
+              <w:top w:type="dxa" w:w="60"/>
+              <w:left w:type="dxa" w:w="100"/>
+              <w:bottom w:type="dxa" w:w="60"/>
+              <w:right w:type="dxa" w:w="100"/>
+            </w:tcMar>
+          </w:tcPr>
+          <w:p>
+            <w:r>
+              <w:rPr>
+                <w:b/>
+                <w:bCs/>
+                <w:color w:val="FFFFFF"/>
+                <w:sz w:val="19"/>
+                <w:szCs w:val="19"/>
+              </w:rPr>
+              <w:t xml:space="preserve">Accuracy</w:t>
+            </w:r>
+          </w:p>
+        </w:tc>
+        <w:tc>
+          <w:tcPr>
+            <w:tcW w:type="dxa" w:w="1173"/>
+            <w:tcBorders>
+              <w:top w:val="single" w:color="BFBFBF" w:sz="4"/>
+              <w:left w:val="single" w:color="BFBFBF" w:sz="4"/>
+              <w:bottom w:val="single" w:color="BFBFBF" w:sz="4"/>
+              <w:right w:val="single" w:color="BFBFBF" w:sz="4"/>
+            </w:tcBorders>
+            <w:shd w:fill="1F4E79" w:color="auto" w:val="clear"/>
+            <w:tcMar>
+              <w:top w:type="dxa" w:w="60"/>
+              <w:left w:type="dxa" w:w="100"/>
+              <w:bottom w:type="dxa" w:w="60"/>
+              <w:right w:type="dxa" w:w="100"/>
+            </w:tcMar>
+          </w:tcPr>
+          <w:p>
+            <w:r>
+              <w:rPr>
+                <w:b/>
+                <w:bCs/>
+                <w:color w:val="FFFFFF"/>
+                <w:sz w:val="19"/>
+                <w:szCs w:val="19"/>
+              </w:rPr>
+              <w:t xml:space="preserve">Precision</w:t>
+            </w:r>
+          </w:p>
+        </w:tc>
+        <w:tc>
+          <w:tcPr>
+            <w:tcW w:type="dxa" w:w="1083"/>
+            <w:tcBorders>
+              <w:top w:val="single" w:color="BFBFBF" w:sz="4"/>
+              <w:left w:val="single" w:color="BFBFBF" w:sz="4"/>
+              <w:bottom w:val="single" w:color="BFBFBF" w:sz="4"/>
+              <w:right w:val="single" w:color="BFBFBF" w:sz="4"/>
+            </w:tcBorders>
+            <w:shd w:fill="1F4E79" w:color="auto" w:val="clear"/>
+            <w:tcMar>
+              <w:top w:type="dxa" w:w="60"/>
+              <w:left w:type="dxa" w:w="100"/>
+              <w:bottom w:type="dxa" w:w="60"/>
+              <w:right w:type="dxa" w:w="100"/>
+            </w:tcMar>
+          </w:tcPr>
+          <w:p>
+            <w:r>
+              <w:rPr>
+                <w:b/>
+                <w:bCs/>
+                <w:color w:val="FFFFFF"/>
+                <w:sz w:val="19"/>
+                <w:szCs w:val="19"/>
+              </w:rPr>
+              <w:t xml:space="preserve">Recall</w:t>
+            </w:r>
+          </w:p>
+        </w:tc>
+        <w:tc>
+          <w:tcPr>
+            <w:tcW w:type="dxa" w:w="903"/>
+            <w:tcBorders>
+              <w:top w:val="single" w:color="BFBFBF" w:sz="4"/>
+              <w:left w:val="single" w:color="BFBFBF" w:sz="4"/>
+              <w:bottom w:val="single" w:color="BFBFBF" w:sz="4"/>
+              <w:right w:val="single" w:color="BFBFBF" w:sz="4"/>
+            </w:tcBorders>
+            <w:shd w:fill="1F4E79" w:color="auto" w:val="clear"/>
+            <w:tcMar>
+              <w:top w:type="dxa" w:w="60"/>
+              <w:left w:type="dxa" w:w="100"/>
+              <w:bottom w:type="dxa" w:w="60"/>
+              <w:right w:type="dxa" w:w="100"/>
+            </w:tcMar>
+          </w:tcPr>
+          <w:p>
+            <w:r>
+              <w:rPr>
+                <w:b/>
+                <w:bCs/>
+                <w:color w:val="FFFFFF"/>
+                <w:sz w:val="19"/>
+                <w:szCs w:val="19"/>
+              </w:rPr>
+              <w:t xml:space="preserve">F1</w:t>
+            </w:r>
+          </w:p>
+        </w:tc>
+        <w:tc>
+          <w:tcPr>
+            <w:tcW w:type="dxa" w:w="1534"/>
+            <w:tcBorders>
+              <w:top w:val="single" w:color="BFBFBF" w:sz="4"/>
+              <w:left w:val="single" w:color="BFBFBF" w:sz="4"/>
+              <w:bottom w:val="single" w:color="BFBFBF" w:sz="4"/>
+              <w:right w:val="single" w:color="BFBFBF" w:sz="4"/>
+            </w:tcBorders>
+            <w:shd w:fill="1F4E79" w:color="auto" w:val="clear"/>
+            <w:tcMar>
+              <w:top w:type="dxa" w:w="60"/>
+              <w:left w:type="dxa" w:w="100"/>
+              <w:bottom w:type="dxa" w:w="60"/>
+              <w:right w:type="dxa" w:w="100"/>
+            </w:tcMar>
+          </w:tcPr>
+          <w:p>
+            <w:r>
+              <w:rPr>
+                <w:b/>
+                <w:bCs/>
+                <w:color w:val="FFFFFF"/>
+                <w:sz w:val="19"/>
+                <w:szCs w:val="19"/>
+              </w:rPr>
+              <w:t xml:space="preserve">False-positive rate</w:t>
+            </w:r>
+          </w:p>
+        </w:tc>
+        <w:tc>
+          <w:tcPr>
+            <w:tcW w:type="dxa" w:w="1174"/>
+            <w:tcBorders>
+              <w:top w:val="single" w:color="BFBFBF" w:sz="4"/>
+              <w:left w:val="single" w:color="BFBFBF" w:sz="4"/>
+              <w:bottom w:val="single" w:color="BFBFBF" w:sz="4"/>
+              <w:right w:val="single" w:color="BFBFBF" w:sz="4"/>
+            </w:tcBorders>
+            <w:shd w:fill="1F4E79" w:color="auto" w:val="clear"/>
+            <w:tcMar>
+              <w:top w:type="dxa" w:w="60"/>
+              <w:left w:type="dxa" w:w="100"/>
+              <w:bottom w:type="dxa" w:w="60"/>
+              <w:right w:type="dxa" w:w="100"/>
+            </w:tcMar>
+          </w:tcPr>
+          <w:p>
+            <w:r>
+              <w:rPr>
+                <w:b/>
+                <w:bCs/>
+                <w:color w:val="FFFFFF"/>
+                <w:sz w:val="19"/>
+                <w:szCs w:val="19"/>
+              </w:rPr>
+              <w:t xml:space="preserve">ROC-AUC</w:t>
+            </w:r>
+          </w:p>
+        </w:tc>
+      </w:tr>
+      <w:tr>
+        <w:tc>
+          <w:tcPr>
+            <w:tcW w:type="dxa" w:w="1986"/>
+            <w:tcBorders>
+              <w:top w:val="single" w:color="BFBFBF" w:sz="4"/>
+              <w:left w:val="single" w:color="BFBFBF" w:sz="4"/>
+              <w:bottom w:val="single" w:color="BFBFBF" w:sz="4"/>
+              <w:right w:val="single" w:color="BFBFBF" w:sz="4"/>
+            </w:tcBorders>
+            <w:tcMar>
+              <w:top w:type="dxa" w:w="60"/>
+              <w:left w:type="dxa" w:w="100"/>
+              <w:bottom w:type="dxa" w:w="60"/>
+              <w:right w:type="dxa" w:w="100"/>
+            </w:tcMar>
+          </w:tcPr>
+          <w:p>
+            <w:r>
+              <w:t xml:space="preserve">Normal-only</w:t>
+            </w:r>
+          </w:p>
+        </w:tc>
+        <w:tc>
+          <w:tcPr>
+            <w:tcW w:type="dxa" w:w="1173"/>
+            <w:tcBorders>
+              <w:top w:val="single" w:color="BFBFBF" w:sz="4"/>
+              <w:left w:val="single" w:color="BFBFBF" w:sz="4"/>
+              <w:bottom w:val="single" w:color="BFBFBF" w:sz="4"/>
+              <w:right w:val="single" w:color="BFBFBF" w:sz="4"/>
+            </w:tcBorders>
+            <w:tcMar>
+              <w:top w:type="dxa" w:w="60"/>
+              <w:left w:type="dxa" w:w="100"/>
+              <w:bottom w:type="dxa" w:w="60"/>
+              <w:right w:type="dxa" w:w="100"/>
+            </w:tcMar>
+          </w:tcPr>
+          <w:p>
+            <w:r>
+              <w:t xml:space="preserve">94.3%</w:t>
+            </w:r>
+          </w:p>
+        </w:tc>
+        <w:tc>
+          <w:tcPr>
+            <w:tcW w:type="dxa" w:w="1173"/>
+            <w:tcBorders>
+              <w:top w:val="single" w:color="BFBFBF" w:sz="4"/>
+              <w:left w:val="single" w:color="BFBFBF" w:sz="4"/>
+              <w:bottom w:val="single" w:color="BFBFBF" w:sz="4"/>
+              <w:right w:val="single" w:color="BFBFBF" w:sz="4"/>
+            </w:tcBorders>
+            <w:tcMar>
+              <w:top w:type="dxa" w:w="60"/>
+              <w:left w:type="dxa" w:w="100"/>
+              <w:bottom w:type="dxa" w:w="60"/>
+              <w:right w:type="dxa" w:w="100"/>
+            </w:tcMar>
+          </w:tcPr>
+          <w:p>
+            <w:r>
+              <w:t xml:space="preserve">0.904</w:t>
+            </w:r>
+          </w:p>
+        </w:tc>
+        <w:tc>
+          <w:tcPr>
+            <w:tcW w:type="dxa" w:w="1083"/>
+            <w:tcBorders>
+              <w:top w:val="single" w:color="BFBFBF" w:sz="4"/>
+              <w:left w:val="single" w:color="BFBFBF" w:sz="4"/>
+              <w:bottom w:val="single" w:color="BFBFBF" w:sz="4"/>
+              <w:right w:val="single" w:color="BFBFBF" w:sz="4"/>
+            </w:tcBorders>
+            <w:tcMar>
+              <w:top w:type="dxa" w:w="60"/>
+              <w:left w:type="dxa" w:w="100"/>
+              <w:bottom w:type="dxa" w:w="60"/>
+              <w:right w:type="dxa" w:w="100"/>
+            </w:tcMar>
+          </w:tcPr>
+          <w:p>
+            <w:r>
+              <w:t xml:space="preserve">0.470</w:t>
+            </w:r>
+          </w:p>
+        </w:tc>
+        <w:tc>
+          <w:tcPr>
+            <w:tcW w:type="dxa" w:w="903"/>
+            <w:tcBorders>
+              <w:top w:val="single" w:color="BFBFBF" w:sz="4"/>
+              <w:left w:val="single" w:color="BFBFBF" w:sz="4"/>
+              <w:bottom w:val="single" w:color="BFBFBF" w:sz="4"/>
+              <w:right w:val="single" w:color="BFBFBF" w:sz="4"/>
+            </w:tcBorders>
+            <w:tcMar>
+              <w:top w:type="dxa" w:w="60"/>
+              <w:left w:type="dxa" w:w="100"/>
+              <w:bottom w:type="dxa" w:w="60"/>
+              <w:right w:type="dxa" w:w="100"/>
+            </w:tcMar>
+          </w:tcPr>
+          <w:p>
+            <w:r>
+              <w:t xml:space="preserve">0.618</w:t>
+            </w:r>
+          </w:p>
+        </w:tc>
+        <w:tc>
+          <w:tcPr>
+            <w:tcW w:type="dxa" w:w="1534"/>
+            <w:tcBorders>
+              <w:top w:val="single" w:color="BFBFBF" w:sz="4"/>
+              <w:left w:val="single" w:color="BFBFBF" w:sz="4"/>
+              <w:bottom w:val="single" w:color="BFBFBF" w:sz="4"/>
+              <w:right w:val="single" w:color="BFBFBF" w:sz="4"/>
+            </w:tcBorders>
+            <w:tcMar>
+              <w:top w:type="dxa" w:w="60"/>
+              <w:left w:type="dxa" w:w="100"/>
+              <w:bottom w:type="dxa" w:w="60"/>
+              <w:right w:type="dxa" w:w="100"/>
+            </w:tcMar>
+          </w:tcPr>
+          <w:p>
+            <w:r>
+              <w:t xml:space="preserve">0.5%</w:t>
+            </w:r>
+          </w:p>
+        </w:tc>
+        <w:tc>
+          <w:tcPr>
+            <w:tcW w:type="dxa" w:w="1174"/>
+            <w:tcBorders>
+              <w:top w:val="single" w:color="BFBFBF" w:sz="4"/>
+              <w:left w:val="single" w:color="BFBFBF" w:sz="4"/>
+              <w:bottom w:val="single" w:color="BFBFBF" w:sz="4"/>
+              <w:right w:val="single" w:color="BFBFBF" w:sz="4"/>
+            </w:tcBorders>
+            <w:tcMar>
+              <w:top w:type="dxa" w:w="60"/>
+              <w:left w:type="dxa" w:w="100"/>
+              <w:bottom w:type="dxa" w:w="60"/>
+              <w:right w:type="dxa" w:w="100"/>
+            </w:tcMar>
+          </w:tcPr>
+          <w:p>
+            <w:r>
+              <w:t xml:space="preserve">0.807</w:t>
+            </w:r>
+          </w:p>
+        </w:tc>
+      </w:tr>
+      <w:tr>
+        <w:tc>
+          <w:tcPr>
+            <w:tcW w:type="dxa" w:w="1986"/>
+            <w:tcBorders>
+              <w:top w:val="single" w:color="BFBFBF" w:sz="4"/>
+              <w:left w:val="single" w:color="BFBFBF" w:sz="4"/>
+              <w:bottom w:val="single" w:color="BFBFBF" w:sz="4"/>
+              <w:right w:val="single" w:color="BFBFBF" w:sz="4"/>
+            </w:tcBorders>
+            <w:tcMar>
+              <w:top w:type="dxa" w:w="60"/>
+              <w:left w:type="dxa" w:w="100"/>
+              <w:bottom w:type="dxa" w:w="60"/>
+              <w:right w:type="dxa" w:w="100"/>
+            </w:tcMar>
+          </w:tcPr>
+          <w:p>
+            <w:r>
+              <w:t xml:space="preserve">Mixed (chosen)</w:t>
+            </w:r>
+          </w:p>
+        </w:tc>
+        <w:tc>
+          <w:tcPr>
+            <w:tcW w:type="dxa" w:w="1173"/>
+            <w:tcBorders>
+              <w:top w:val="single" w:color="BFBFBF" w:sz="4"/>
+              <w:left w:val="single" w:color="BFBFBF" w:sz="4"/>
+              <w:bottom w:val="single" w:color="BFBFBF" w:sz="4"/>
+              <w:right w:val="single" w:color="BFBFBF" w:sz="4"/>
+            </w:tcBorders>
+            <w:tcMar>
+              <w:top w:type="dxa" w:w="60"/>
+              <w:left w:type="dxa" w:w="100"/>
+              <w:bottom w:type="dxa" w:w="60"/>
+              <w:right w:type="dxa" w:w="100"/>
+            </w:tcMar>
+          </w:tcPr>
+          <w:p>
+            <w:r>
+              <w:t xml:space="preserve">98.0%</w:t>
+            </w:r>
+          </w:p>
+        </w:tc>
+        <w:tc>
+          <w:tcPr>
+            <w:tcW w:type="dxa" w:w="1173"/>
+            <w:tcBorders>
+              <w:top w:val="single" w:color="BFBFBF" w:sz="4"/>
+              <w:left w:val="single" w:color="BFBFBF" w:sz="4"/>
+              <w:bottom w:val="single" w:color="BFBFBF" w:sz="4"/>
+              <w:right w:val="single" w:color="BFBFBF" w:sz="4"/>
+            </w:tcBorders>
+            <w:tcMar>
+              <w:top w:type="dxa" w:w="60"/>
+              <w:left w:type="dxa" w:w="100"/>
+              <w:bottom w:type="dxa" w:w="60"/>
+              <w:right w:type="dxa" w:w="100"/>
+            </w:tcMar>
+          </w:tcPr>
+          <w:p>
+            <w:r>
+              <w:t xml:space="preserve">0.900</w:t>
+            </w:r>
+          </w:p>
+        </w:tc>
+        <w:tc>
+          <w:tcPr>
+            <w:tcW w:type="dxa" w:w="1083"/>
+            <w:tcBorders>
+              <w:top w:val="single" w:color="BFBFBF" w:sz="4"/>
+              <w:left w:val="single" w:color="BFBFBF" w:sz="4"/>
+              <w:bottom w:val="single" w:color="BFBFBF" w:sz="4"/>
+              <w:right w:val="single" w:color="BFBFBF" w:sz="4"/>
+            </w:tcBorders>
+            <w:tcMar>
+              <w:top w:type="dxa" w:w="60"/>
+              <w:left w:type="dxa" w:w="100"/>
+              <w:bottom w:type="dxa" w:w="60"/>
+              <w:right w:type="dxa" w:w="100"/>
+            </w:tcMar>
+          </w:tcPr>
+          <w:p>
+            <w:r>
+              <w:t xml:space="preserve">0.900</w:t>
+            </w:r>
+          </w:p>
+        </w:tc>
+        <w:tc>
+          <w:tcPr>
+            <w:tcW w:type="dxa" w:w="903"/>
+            <w:tcBorders>
+              <w:top w:val="single" w:color="BFBFBF" w:sz="4"/>
+              <w:left w:val="single" w:color="BFBFBF" w:sz="4"/>
+              <w:bottom w:val="single" w:color="BFBFBF" w:sz="4"/>
+              <w:right w:val="single" w:color="BFBFBF" w:sz="4"/>
+            </w:tcBorders>
+            <w:tcMar>
+              <w:top w:type="dxa" w:w="60"/>
+              <w:left w:type="dxa" w:w="100"/>
+              <w:bottom w:type="dxa" w:w="60"/>
+              <w:right w:type="dxa" w:w="100"/>
+            </w:tcMar>
+          </w:tcPr>
+          <w:p>
+            <w:r>
+              <w:t xml:space="preserve">0.900</w:t>
+            </w:r>
+          </w:p>
+        </w:tc>
+        <w:tc>
+          <w:tcPr>
+            <w:tcW w:type="dxa" w:w="1534"/>
+            <w:tcBorders>
+              <w:top w:val="single" w:color="BFBFBF" w:sz="4"/>
+              <w:left w:val="single" w:color="BFBFBF" w:sz="4"/>
+              <w:bottom w:val="single" w:color="BFBFBF" w:sz="4"/>
+              <w:right w:val="single" w:color="BFBFBF" w:sz="4"/>
+            </w:tcBorders>
+            <w:tcMar>
+              <w:top w:type="dxa" w:w="60"/>
+              <w:left w:type="dxa" w:w="100"/>
+              <w:bottom w:type="dxa" w:w="60"/>
+              <w:right w:type="dxa" w:w="100"/>
+            </w:tcMar>
+          </w:tcPr>
+          <w:p>
+            <w:r>
+              <w:t xml:space="preserve">1.1%</w:t>
+            </w:r>
+          </w:p>
+        </w:tc>
+        <w:tc>
+          <w:tcPr>
+            <w:tcW w:type="dxa" w:w="1174"/>
+            <w:tcBorders>
+              <w:top w:val="single" w:color="BFBFBF" w:sz="4"/>
+              <w:left w:val="single" w:color="BFBFBF" w:sz="4"/>
+              <w:bottom w:val="single" w:color="BFBFBF" w:sz="4"/>
+              <w:right w:val="single" w:color="BFBFBF" w:sz="4"/>
+            </w:tcBorders>
+            <w:tcMar>
+              <w:top w:type="dxa" w:w="60"/>
+              <w:left w:type="dxa" w:w="100"/>
+              <w:bottom w:type="dxa" w:w="60"/>
+              <w:right w:type="dxa" w:w="100"/>
+            </w:tcMar>
+          </w:tcPr>
+          <w:p>
+            <w:r>
+              <w:t xml:space="preserve">0.990</w:t>
+            </w:r>
+          </w:p>
+        </w:tc>
+      </w:tr>
+    </w:tbl>
+    <w:p>
+      <w:pPr>
+        <w:spacing w:after="120"/>
+      </w:pPr>
+    </w:p>
+    <w:p>
+      <w:pPr>
+        <w:spacing w:after="120"/>
+      </w:pPr>
+      <w:r>
+        <w:t xml:space="preserve">Totals over the 5 folds: 100 attack windows and 917 normal test windows (normal_04 plus the bystander and before/after windows of each held-out attack run).</w:t>
+      </w:r>
+    </w:p>
+    <w:p>
+      <w:pPr>
+        <w:jc w:val="center"/>
+      </w:pPr>
+      <w:r>
+        <w:drawing>
+          <wp:inline distT="0" distB="0" distL="0" distR="0">
+            <wp:extent cx="5715000" cy="2743200"/>
+            <wp:effectExtent t="0" r="0" b="0" l="0"/>
+            <wp:docPr id="1" name="" descr="" title=""/>
+            <wp:cNvGraphicFramePr>
+              <a:graphicFrameLocks xmlns:a="http://schemas.openxmlformats.org/drawingml/2006/main" noChangeAspect="1"/>
+            </wp:cNvGraphicFramePr>
+            <a:graphic xmlns:a="http://schemas.openxmlformats.org/drawingml/2006/main">
+              <a:graphicData uri="http://schemas.openxmlformats.org/drawingml/2006/picture">
+                <pic:pic xmlns:pic="http://schemas.openxmlformats.org/drawingml/2006/picture">
+                  <pic:nvPicPr>
+                    <pic:cNvPr id="0" name="" descr=""/>
+                    <pic:cNvPicPr>
+                      <a:picLocks noChangeAspect="1" noChangeArrowheads="1"/>
+                    </pic:cNvPicPr>
+                  </pic:nvPicPr>
+                  <pic:blipFill>
+                    <a:blip r:embed="rId8" cstate="none"/>
+                    <a:srcRect/>
+                    <a:stretch>
+                      <a:fillRect/>
+                    </a:stretch>
+                  </pic:blipFill>
+                  <pic:spPr bwMode="auto">
+                    <a:xfrm>
+                      <a:off x="0" y="0"/>
+                      <a:ext cx="5715000" cy="2743200"/>
+                    </a:xfrm>
+                    <a:prstGeom prst="rect">
+                      <a:avLst/>
+                    </a:prstGeom>
+                  </pic:spPr>
+                </pic:pic>
+              </a:graphicData>
+            </a:graphic>
+          </wp:inline>
+        </w:drawing>
+      </w:r>
+    </w:p>
+    <w:p>
+      <w:pPr>
+        <w:spacing w:after="200"/>
+        <w:jc w:val="center"/>
+      </w:pPr>
+      <w:r>
+        <w:rPr>
+          <w:i/>
+          <w:iCs/>
+          <w:color w:val="52514E"/>
+          <w:sz w:val="18"/>
+          <w:szCs w:val="18"/>
+        </w:rPr>
+        <w:t xml:space="preserve">Figure: detection rate per attack type, both training modes</w:t>
+      </w:r>
+    </w:p>
+    <w:p>
+      <w:pPr>
+        <w:jc w:val="center"/>
+      </w:pPr>
+      <w:r>
+        <w:drawing>
+          <wp:inline distT="0" distB="0" distL="0" distR="0">
+            <wp:extent cx="5715000" cy="2743200"/>
+            <wp:effectExtent t="0" r="0" b="0" l="0"/>
+            <wp:docPr id="2" name="" descr="" title=""/>
+            <wp:cNvGraphicFramePr>
+              <a:graphicFrameLocks xmlns:a="http://schemas.openxmlformats.org/drawingml/2006/main" noChangeAspect="1"/>
+            </wp:cNvGraphicFramePr>
+            <a:graphic xmlns:a="http://schemas.openxmlformats.org/drawingml/2006/main">
+              <a:graphicData uri="http://schemas.openxmlformats.org/drawingml/2006/picture">
+                <pic:pic xmlns:pic="http://schemas.openxmlformats.org/drawingml/2006/picture">
+                  <pic:nvPicPr>
+                    <pic:cNvPr id="0" name="" descr=""/>
+                    <pic:cNvPicPr>
+                      <a:picLocks noChangeAspect="1" noChangeArrowheads="1"/>
+                    </pic:cNvPicPr>
+                  </pic:nvPicPr>
+                  <pic:blipFill>
+                    <a:blip r:embed="rId9" cstate="none"/>
+                    <a:srcRect/>
+                    <a:stretch>
+                      <a:fillRect/>
+                    </a:stretch>
+                  </pic:blipFill>
+                  <pic:spPr bwMode="auto">
+                    <a:xfrm>
+                      <a:off x="0" y="0"/>
+                      <a:ext cx="5715000" cy="2743200"/>
+                    </a:xfrm>
+                    <a:prstGeom prst="rect">
+                      <a:avLst/>
+                    </a:prstGeom>
+                  </pic:spPr>
+                </pic:pic>
+              </a:graphicData>
+            </a:graphic>
+          </wp:inline>
+        </w:drawing>
+      </w:r>
+    </w:p>
+    <w:p>
+      <w:pPr>
+        <w:spacing w:after="200"/>
+        <w:jc w:val="center"/>
+      </w:pPr>
+      <w:r>
+        <w:rPr>
+          <w:i/>
+          <w:iCs/>
+          <w:color w:val="52514E"/>
+          <w:sz w:val="18"/>
+          <w:szCs w:val="18"/>
+        </w:rPr>
+        <w:t xml:space="preserve">Figure: anomaly score of every test window with the tuned threshold (mixed training)</w:t>
+      </w:r>
+    </w:p>
+    <w:p>
+      <w:pPr>
+        <w:jc w:val="center"/>
+      </w:pPr>
+      <w:r>
+        <w:drawing>
+          <wp:inline distT="0" distB="0" distL="0" distR="0">
+            <wp:extent cx="2857500" cy="2447925"/>
+            <wp:effectExtent t="0" r="0" b="0" l="0"/>
+            <wp:docPr id="3" name="" descr="" title=""/>
+            <wp:cNvGraphicFramePr>
+              <a:graphicFrameLocks xmlns:a="http://schemas.openxmlformats.org/drawingml/2006/main" noChangeAspect="1"/>
+            </wp:cNvGraphicFramePr>
+            <a:graphic xmlns:a="http://schemas.openxmlformats.org/drawingml/2006/main">
+              <a:graphicData uri="http://schemas.openxmlformats.org/drawingml/2006/picture">
+                <pic:pic xmlns:pic="http://schemas.openxmlformats.org/drawingml/2006/picture">
+                  <pic:nvPicPr>
+                    <pic:cNvPr id="0" name="" descr=""/>
+                    <pic:cNvPicPr>
+                      <a:picLocks noChangeAspect="1" noChangeArrowheads="1"/>
+                    </pic:cNvPicPr>
+                  </pic:nvPicPr>
+                  <pic:blipFill>
+                    <a:blip r:embed="rId10" cstate="none"/>
+                    <a:srcRect/>
+                    <a:stretch>
+                      <a:fillRect/>
+                    </a:stretch>
+                  </pic:blipFill>
+                  <pic:spPr bwMode="auto">
+                    <a:xfrm>
+                      <a:off x="0" y="0"/>
+                      <a:ext cx="2857500" cy="2447925"/>
+                    </a:xfrm>
+                    <a:prstGeom prst="rect">
+                      <a:avLst/>
+                    </a:prstGeom>
+                  </pic:spPr>
+                </pic:pic>
+              </a:graphicData>
+            </a:graphic>
+          </wp:inline>
+        </w:drawing>
+      </w:r>
+    </w:p>
+    <w:p>
+      <w:pPr>
+        <w:spacing w:after="200"/>
+        <w:jc w:val="center"/>
+      </w:pPr>
+      <w:r>
+        <w:rPr>
+          <w:i/>
+          <w:iCs/>
+          <w:color w:val="52514E"/>
+          <w:sz w:val="18"/>
+          <w:szCs w:val="18"/>
+        </w:rPr>
+        <w:t xml:space="preserve">Figure: confusion matrix, mixed training, 5 folds</w:t>
+      </w:r>
+    </w:p>
+    <w:p>
+      <w:pPr>
+        <w:pStyle w:val="Heading2"/>
+      </w:pPr>
+      <w:bookmarkStart w:name="_Toc30" w:id="30"/>
+      <w:r>
+        <w:t xml:space="preserve">6.4 Findings</w:t>
+      </w:r>
+      <w:bookmarkEnd w:id="30"/>
+    </w:p>
+    <w:p>
+      <w:pPr>
+        <w:pStyle w:val="ListParagraph"/>
+        <w:numPr>
+          <w:ilvl w:val="0"/>
+          <w:numId w:val="3"/>
+        </w:numPr>
+        <w:spacing w:after="60"/>
+      </w:pPr>
+      <w:r>
+        <w:rPr>
+          <w:b/>
+          <w:bCs/>
+        </w:rPr>
+        <w:t xml:space="preserve">Normal-only training is blind to features that never vary in normal traffic.</w:t>
+      </w:r>
+      <w:r>
+        <w:t xml:space="preserve"> failed_logins and off_hours are always 0 in normal windows and destination ports are almost always 1, so the trees never split on them: brute force and off-hours were detected 0 % of the time and port scans 40 %. This is a property of Isolation Forest, not a bug.</w:t>
+      </w:r>
+    </w:p>
+    <w:p>
+      <w:pPr>
+        <w:pStyle w:val="ListParagraph"/>
+        <w:numPr>
+          <w:ilvl w:val="0"/>
+          <w:numId w:val="3"/>
+        </w:numPr>
+        <w:spacing w:after="60"/>
+      </w:pPr>
+      <w:r>
+        <w:rPr>
+          <w:b/>
+          <w:bCs/>
+        </w:rPr>
+        <w:t xml:space="preserve">Mixed training fixes this</w:t>
+      </w:r>
+      <w:r>
+        <w:t xml:space="preserve">: DoS, port scan, insider and off-hours are all detected 100 % on held-out runs with 1.1 % false alarms.</w:t>
+      </w:r>
+    </w:p>
+    <w:p>
+      <w:pPr>
+        <w:pStyle w:val="ListParagraph"/>
+        <w:numPr>
+          <w:ilvl w:val="0"/>
+          <w:numId w:val="3"/>
+        </w:numPr>
+        <w:spacing w:after="60"/>
+      </w:pPr>
+      <w:r>
+        <w:rPr>
+          <w:b/>
+          <w:bCs/>
+        </w:rPr>
+        <w:t xml:space="preserve">Slow brute force is the hard case.</w:t>
+      </w:r>
+      <w:r>
+        <w:t xml:space="preserve"> At 1 to 2 attempts per second (about 10 to 20 failed logins per window) every other feature looks normal, and the score only reaches the level of a busy normal window; catching these by lowering the threshold would raise false alarms to about 5 to 10 %. At 3 attempts per second half the windows are caught, and from 5 per second all of them.</w:t>
+      </w:r>
+    </w:p>
+    <w:p>
+      <w:pPr>
+        <w:pStyle w:val="ListParagraph"/>
+        <w:numPr>
+          <w:ilvl w:val="0"/>
+          <w:numId w:val="3"/>
+        </w:numPr>
+        <w:spacing w:after="60"/>
+      </w:pPr>
+      <w:r>
+        <w:t xml:space="preserve">The final model (models/zt_iforest.joblib) is trained the same way as evaluated, on runs 2 and 4 of each attack (unlabelled) plus normal_01 and normal_02; on the unseen runs it detects DoS, port scan, insider and off-hours 100 % and brute force 58 %, with 1.5 % false alarms on normal_04.</w:t>
+      </w:r>
+    </w:p>
+    <w:p>
+      <w:pPr>
+        <w:pStyle w:val="Heading1"/>
+        <w:pageBreakBefore/>
+      </w:pPr>
+      <w:bookmarkStart w:name="_Toc31" w:id="31"/>
+      <w:r>
+        <w:t xml:space="preserve">7. Verified Evidence for Chapter 5</w:t>
+      </w:r>
+      <w:bookmarkEnd w:id="31"/>
     </w:p>
     <w:p>
       <w:pPr>
@@ -10106,11 +11177,11 @@
         <w:pStyle w:val="Heading1"/>
         <w:pageBreakBefore/>
       </w:pPr>
-      <w:bookmarkStart w:name="_Toc27" w:id="27"/>
-      <w:r>
-        <w:t xml:space="preserve">7. Problems Encountered and Fixes</w:t>
-      </w:r>
-      <w:bookmarkEnd w:id="27"/>
+      <w:bookmarkStart w:name="_Toc32" w:id="32"/>
+      <w:r>
+        <w:t xml:space="preserve">8. Problems Encountered and Fixes</w:t>
+      </w:r>
+      <w:bookmarkEnd w:id="32"/>
     </w:p>
     <w:tbl>
       <w:tblPr>
@@ -11386,21 +12457,21 @@
         <w:pStyle w:val="Heading1"/>
         <w:pageBreakBefore/>
       </w:pPr>
-      <w:bookmarkStart w:name="_Toc28" w:id="28"/>
-      <w:r>
-        <w:t xml:space="preserve">8. Monitoring with Zabbix</w:t>
-      </w:r>
-      <w:bookmarkEnd w:id="28"/>
+      <w:bookmarkStart w:name="_Toc33" w:id="33"/>
+      <w:r>
+        <w:t xml:space="preserve">9. Monitoring with Zabbix</w:t>
+      </w:r>
+      <w:bookmarkEnd w:id="33"/>
     </w:p>
     <w:p>
       <w:pPr>
         <w:pStyle w:val="Heading2"/>
       </w:pPr>
-      <w:bookmarkStart w:name="_Toc29" w:id="29"/>
-      <w:r>
-        <w:t xml:space="preserve">8.1 Viewing the dashboard</w:t>
-      </w:r>
-      <w:bookmarkEnd w:id="29"/>
+      <w:bookmarkStart w:name="_Toc34" w:id="34"/>
+      <w:r>
+        <w:t xml:space="preserve">9.1 Viewing the dashboard</w:t>
+      </w:r>
+      <w:bookmarkEnd w:id="34"/>
     </w:p>
     <w:p>
       <w:pPr>
@@ -11469,11 +12540,11 @@
       <w:pPr>
         <w:pStyle w:val="Heading2"/>
       </w:pPr>
-      <w:bookmarkStart w:name="_Toc30" w:id="30"/>
-      <w:r>
-        <w:t xml:space="preserve">8.2 What is monitored today</w:t>
-      </w:r>
-      <w:bookmarkEnd w:id="30"/>
+      <w:bookmarkStart w:name="_Toc35" w:id="35"/>
+      <w:r>
+        <w:t xml:space="preserve">9.2 What is monitored today</w:t>
+      </w:r>
+      <w:bookmarkEnd w:id="35"/>
     </w:p>
     <w:p>
       <w:pPr>
@@ -11505,11 +12576,11 @@
       <w:pPr>
         <w:pStyle w:val="Heading2"/>
       </w:pPr>
-      <w:bookmarkStart w:name="_Toc31" w:id="31"/>
-      <w:r>
-        <w:t xml:space="preserve">8.3 Every node pushes its own data (zt_zbx_push.py)</w:t>
-      </w:r>
-      <w:bookmarkEnd w:id="31"/>
+      <w:bookmarkStart w:name="_Toc36" w:id="36"/>
+      <w:r>
+        <w:t xml:space="preserve">9.3 Every node pushes its own data (zt_zbx_push.py)</w:t>
+      </w:r>
+      <w:bookmarkEnd w:id="36"/>
     </w:p>
     <w:p>
       <w:pPr>
@@ -11894,11 +12965,11 @@
       <w:pPr>
         <w:pStyle w:val="Heading2"/>
       </w:pPr>
-      <w:bookmarkStart w:name="_Toc32" w:id="32"/>
-      <w:r>
-        <w:t xml:space="preserve">8.4 The two dashboard pages</w:t>
-      </w:r>
-      <w:bookmarkEnd w:id="32"/>
+      <w:bookmarkStart w:name="_Toc37" w:id="37"/>
+      <w:r>
+        <w:t xml:space="preserve">9.4 The two dashboard pages</w:t>
+      </w:r>
+      <w:bookmarkEnd w:id="37"/>
     </w:p>
     <w:tbl>
       <w:tblPr>
@@ -12175,21 +13246,21 @@
         <w:pStyle w:val="Heading1"/>
         <w:pageBreakBefore/>
       </w:pPr>
-      <w:bookmarkStart w:name="_Toc33" w:id="33"/>
-      <w:r>
-        <w:t xml:space="preserve">9. Remaining Work</w:t>
-      </w:r>
-      <w:bookmarkEnd w:id="33"/>
+      <w:bookmarkStart w:name="_Toc38" w:id="38"/>
+      <w:r>
+        <w:t xml:space="preserve">10. Remaining Work</w:t>
+      </w:r>
+      <w:bookmarkEnd w:id="38"/>
     </w:p>
     <w:p>
       <w:pPr>
         <w:pStyle w:val="Heading2"/>
       </w:pPr>
-      <w:bookmarkStart w:name="_Toc34" w:id="34"/>
+      <w:bookmarkStart w:name="_Toc39" w:id="39"/>
       <w:r>
         <w:t xml:space="preserve">Phase 3 (detection and response)</w:t>
       </w:r>
-      <w:bookmarkEnd w:id="34"/>
+      <w:bookmarkEnd w:id="39"/>
     </w:p>
     <w:p>
       <w:pPr>
@@ -12205,10 +13276,10 @@
           <w:b/>
           <w:bCs/>
         </w:rPr>
-        <w:t xml:space="preserve">Datasets</w:t>
-      </w:r>
-      <w:r>
-        <w:t xml:space="preserve"> - collection in progress (section 5).</w:t>
+        <w:t xml:space="preserve">Response engine</w:t>
+      </w:r>
+      <w:r>
+        <w:t xml:space="preserve"> following the Chapter 4 activity diagram: DoS gives block source IP (deny line in ZT_POLICY above the permit, optionally iptables on edge); brute-force or port scan gives quarantine; off-hours or unclassified gives alert only; plus the abstract's disable-account action (reject the user in FreeRADIUS and bounce the port).</w:t>
       </w:r>
     </w:p>
     <w:p>
@@ -12225,10 +13296,10 @@
           <w:b/>
           <w:bCs/>
         </w:rPr>
-        <w:t xml:space="preserve">Isolation Forest model</w:t>
-      </w:r>
-      <w:r>
-        <w:t xml:space="preserve"> - StandardScaler plus IsolationForest trained on normal windows only, saved with joblib. Tune contamination and the score threshold on a validation run; report accuracy, precision, recall, F1, false positive rate and a score histogram on separate test runs.</w:t>
+        <w:t xml:space="preserve">Quarantine on cEOS</w:t>
+      </w:r>
+      <w:r>
+        <w:t xml:space="preserve"> - the riskiest piece: 802.1X assigns VLANs dynamically, so a plain access-VLAN change will not stick. Test the authentication-failure VLAN feature first; otherwise disable the account and bounce the port.</w:t>
       </w:r>
     </w:p>
     <w:p>
@@ -12245,10 +13316,10 @@
           <w:b/>
           <w:bCs/>
         </w:rPr>
-        <w:t xml:space="preserve">Response engine</w:t>
-      </w:r>
-      <w:r>
-        <w:t xml:space="preserve"> following the Chapter 4 activity diagram: DoS gives block source IP (deny line in ZT_POLICY above the permit, optionally iptables on edge); brute-force or port scan gives quarantine; off-hours or unclassified gives alert only; plus the abstract's disable-account action (reject the user in FreeRADIUS and bounce the port).</w:t>
+        <w:t xml:space="preserve">Alerts</w:t>
+      </w:r>
+      <w:r>
+        <w:t xml:space="preserve"> - JSON alert and incident log, pushed to Zabbix.</w:t>
       </w:r>
     </w:p>
     <w:p>
@@ -12265,46 +13336,6 @@
           <w:b/>
           <w:bCs/>
         </w:rPr>
-        <w:t xml:space="preserve">Quarantine on cEOS</w:t>
-      </w:r>
-      <w:r>
-        <w:t xml:space="preserve"> - the riskiest piece: 802.1X assigns VLANs dynamically, so a plain access-VLAN change will not stick. Test the authentication-failure VLAN feature first; otherwise disable the account and bounce the port.</w:t>
-      </w:r>
-    </w:p>
-    <w:p>
-      <w:pPr>
-        <w:pStyle w:val="ListParagraph"/>
-        <w:numPr>
-          <w:ilvl w:val="0"/>
-          <w:numId w:val="5"/>
-        </w:numPr>
-        <w:spacing w:after="60"/>
-      </w:pPr>
-      <w:r>
-        <w:rPr>
-          <w:b/>
-          <w:bCs/>
-        </w:rPr>
-        <w:t xml:space="preserve">Alerts</w:t>
-      </w:r>
-      <w:r>
-        <w:t xml:space="preserve"> - JSON alert and incident log, pushed to Zabbix.</w:t>
-      </w:r>
-    </w:p>
-    <w:p>
-      <w:pPr>
-        <w:pStyle w:val="ListParagraph"/>
-        <w:numPr>
-          <w:ilvl w:val="0"/>
-          <w:numId w:val="5"/>
-        </w:numPr>
-        <w:spacing w:after="60"/>
-      </w:pPr>
-      <w:r>
-        <w:rPr>
-          <w:b/>
-          <w:bCs/>
-        </w:rPr>
         <w:t xml:space="preserve">Orchestrator</w:t>
       </w:r>
       <w:r>
@@ -12315,11 +13346,11 @@
       <w:pPr>
         <w:pStyle w:val="Heading2"/>
       </w:pPr>
-      <w:bookmarkStart w:name="_Toc35" w:id="35"/>
+      <w:bookmarkStart w:name="_Toc40" w:id="40"/>
       <w:r>
         <w:t xml:space="preserve">Phase 4 (validation and report)</w:t>
       </w:r>
-      <w:bookmarkEnd w:id="35"/>
+      <w:bookmarkEnd w:id="40"/>
     </w:p>
     <w:p>
       <w:pPr>
@@ -12357,7 +13388,7 @@
         <w:spacing w:after="60"/>
       </w:pPr>
       <w:r>
-        <w:t xml:space="preserve">Write Chapter 5 with the evidence in section 6 and the limitations: simulated traffic only, cEOS-lab software data plane, SVI ACLs unsupported, simulated off-hours flag, 8 GB RAM, single access switch.</w:t>
+        <w:t xml:space="preserve">Write Chapter 5 with the evidence in section 7, the model results in section 6 and the limitations: simulated traffic only, cEOS-lab software data plane, SVI ACLs unsupported, simulated off-hours flag, 8 GB RAM, single access switch.</w:t>
       </w:r>
     </w:p>
     <w:p>
@@ -12365,11 +13396,11 @@
         <w:pStyle w:val="Heading1"/>
         <w:pageBreakBefore/>
       </w:pPr>
-      <w:bookmarkStart w:name="_Toc36" w:id="36"/>
-      <w:r>
-        <w:t xml:space="preserve">10. Files and Commands</w:t>
-      </w:r>
-      <w:bookmarkEnd w:id="36"/>
+      <w:bookmarkStart w:name="_Toc41" w:id="41"/>
+      <w:r>
+        <w:t xml:space="preserve">11. Files and Commands</w:t>
+      </w:r>
+      <w:bookmarkEnd w:id="41"/>
     </w:p>
     <w:p>
       <w:pPr>
@@ -13309,6 +14340,144 @@
           </w:p>
         </w:tc>
       </w:tr>
+      <w:tr>
+        <w:tc>
+          <w:tcPr>
+            <w:tcW w:type="dxa" w:w="4062"/>
+            <w:tcBorders>
+              <w:top w:val="single" w:color="BFBFBF" w:sz="4"/>
+              <w:left w:val="single" w:color="BFBFBF" w:sz="4"/>
+              <w:bottom w:val="single" w:color="BFBFBF" w:sz="4"/>
+              <w:right w:val="single" w:color="BFBFBF" w:sz="4"/>
+            </w:tcBorders>
+            <w:tcMar>
+              <w:top w:type="dxa" w:w="60"/>
+              <w:left w:type="dxa" w:w="100"/>
+              <w:bottom w:type="dxa" w:w="60"/>
+              <w:right w:type="dxa" w:w="100"/>
+            </w:tcMar>
+          </w:tcPr>
+          <w:p>
+            <w:r>
+              <w:t xml:space="preserve">zt_model.py</w:t>
+            </w:r>
+          </w:p>
+        </w:tc>
+        <w:tc>
+          <w:tcPr>
+            <w:tcW w:type="dxa" w:w="4964"/>
+            <w:tcBorders>
+              <w:top w:val="single" w:color="BFBFBF" w:sz="4"/>
+              <w:left w:val="single" w:color="BFBFBF" w:sz="4"/>
+              <w:bottom w:val="single" w:color="BFBFBF" w:sz="4"/>
+              <w:right w:val="single" w:color="BFBFBF" w:sz="4"/>
+            </w:tcBorders>
+            <w:tcMar>
+              <w:top w:type="dxa" w:w="60"/>
+              <w:left w:type="dxa" w:w="100"/>
+              <w:bottom w:type="dxa" w:w="60"/>
+              <w:right w:type="dxa" w:w="100"/>
+            </w:tcMar>
+          </w:tcPr>
+          <w:p>
+            <w:r>
+              <w:t xml:space="preserve">AnomalyDetector (Isolation Forest); evaluate, train and score commands</w:t>
+            </w:r>
+          </w:p>
+        </w:tc>
+      </w:tr>
+      <w:tr>
+        <w:tc>
+          <w:tcPr>
+            <w:tcW w:type="dxa" w:w="4062"/>
+            <w:tcBorders>
+              <w:top w:val="single" w:color="BFBFBF" w:sz="4"/>
+              <w:left w:val="single" w:color="BFBFBF" w:sz="4"/>
+              <w:bottom w:val="single" w:color="BFBFBF" w:sz="4"/>
+              <w:right w:val="single" w:color="BFBFBF" w:sz="4"/>
+            </w:tcBorders>
+            <w:tcMar>
+              <w:top w:type="dxa" w:w="60"/>
+              <w:left w:type="dxa" w:w="100"/>
+              <w:bottom w:type="dxa" w:w="60"/>
+              <w:right w:type="dxa" w:w="100"/>
+            </w:tcMar>
+          </w:tcPr>
+          <w:p>
+            <w:r>
+              <w:t xml:space="preserve">results/</w:t>
+            </w:r>
+          </w:p>
+        </w:tc>
+        <w:tc>
+          <w:tcPr>
+            <w:tcW w:type="dxa" w:w="4964"/>
+            <w:tcBorders>
+              <w:top w:val="single" w:color="BFBFBF" w:sz="4"/>
+              <w:left w:val="single" w:color="BFBFBF" w:sz="4"/>
+              <w:bottom w:val="single" w:color="BFBFBF" w:sz="4"/>
+              <w:right w:val="single" w:color="BFBFBF" w:sz="4"/>
+            </w:tcBorders>
+            <w:tcMar>
+              <w:top w:type="dxa" w:w="60"/>
+              <w:left w:type="dxa" w:w="100"/>
+              <w:bottom w:type="dxa" w:w="60"/>
+              <w:right w:type="dxa" w:w="100"/>
+            </w:tcMar>
+          </w:tcPr>
+          <w:p>
+            <w:r>
+              <w:t xml:space="preserve">metrics.json, per-window scores and the three Chapter 5 charts</w:t>
+            </w:r>
+          </w:p>
+        </w:tc>
+      </w:tr>
+      <w:tr>
+        <w:tc>
+          <w:tcPr>
+            <w:tcW w:type="dxa" w:w="4062"/>
+            <w:tcBorders>
+              <w:top w:val="single" w:color="BFBFBF" w:sz="4"/>
+              <w:left w:val="single" w:color="BFBFBF" w:sz="4"/>
+              <w:bottom w:val="single" w:color="BFBFBF" w:sz="4"/>
+              <w:right w:val="single" w:color="BFBFBF" w:sz="4"/>
+            </w:tcBorders>
+            <w:tcMar>
+              <w:top w:type="dxa" w:w="60"/>
+              <w:left w:type="dxa" w:w="100"/>
+              <w:bottom w:type="dxa" w:w="60"/>
+              <w:right w:type="dxa" w:w="100"/>
+            </w:tcMar>
+          </w:tcPr>
+          <w:p>
+            <w:r>
+              <w:t xml:space="preserve">models/zt_iforest.joblib</w:t>
+            </w:r>
+          </w:p>
+        </w:tc>
+        <w:tc>
+          <w:tcPr>
+            <w:tcW w:type="dxa" w:w="4964"/>
+            <w:tcBorders>
+              <w:top w:val="single" w:color="BFBFBF" w:sz="4"/>
+              <w:left w:val="single" w:color="BFBFBF" w:sz="4"/>
+              <w:bottom w:val="single" w:color="BFBFBF" w:sz="4"/>
+              <w:right w:val="single" w:color="BFBFBF" w:sz="4"/>
+            </w:tcBorders>
+            <w:tcMar>
+              <w:top w:type="dxa" w:w="60"/>
+              <w:left w:type="dxa" w:w="100"/>
+              <w:bottom w:type="dxa" w:w="60"/>
+              <w:right w:type="dxa" w:w="100"/>
+            </w:tcMar>
+          </w:tcPr>
+          <w:p>
+            <w:r>
+              <w:t xml:space="preserve">Trained model (rebuild any time with python zt_model.py train)</w:t>
+            </w:r>
+          </w:p>
+        </w:tc>
+      </w:tr>
     </w:tbl>
     <w:p>
       <w:pPr>
@@ -13319,11 +14488,11 @@
       <w:pPr>
         <w:pStyle w:val="Heading2"/>
       </w:pPr>
-      <w:bookmarkStart w:name="_Toc37" w:id="37"/>
+      <w:bookmarkStart w:name="_Toc42" w:id="42"/>
       <w:r>
         <w:t xml:space="preserve">Daily routine</w:t>
       </w:r>
-      <w:bookmarkEnd w:id="37"/>
+      <w:bookmarkEnd w:id="42"/>
     </w:p>
     <w:p>
       <w:pPr>
@@ -13443,11 +14612,11 @@
         <w:pStyle w:val="Heading1"/>
         <w:pageBreakBefore/>
       </w:pPr>
-      <w:bookmarkStart w:name="_Toc38" w:id="38"/>
-      <w:r>
-        <w:t xml:space="preserve">11. Report Corrections Needed</w:t>
-      </w:r>
-      <w:bookmarkEnd w:id="38"/>
+      <w:bookmarkStart w:name="_Toc43" w:id="43"/>
+      <w:r>
+        <w:t xml:space="preserve">12. Report Corrections Needed</w:t>
+      </w:r>
+      <w:bookmarkEnd w:id="43"/>
     </w:p>
     <w:p>
       <w:pPr>
@@ -13574,11 +14743,11 @@
         <w:pStyle w:val="Heading1"/>
         <w:pageBreakBefore/>
       </w:pPr>
-      <w:bookmarkStart w:name="_Toc39" w:id="39"/>
-      <w:r>
-        <w:t xml:space="preserve">12. Risks and Open Questions</w:t>
-      </w:r>
-      <w:bookmarkEnd w:id="39"/>
+      <w:bookmarkStart w:name="_Toc44" w:id="44"/>
+      <w:r>
+        <w:t xml:space="preserve">13. Risks and Open Questions</w:t>
+      </w:r>
+      <w:bookmarkEnd w:id="44"/>
     </w:p>
     <w:p>
       <w:pPr>

</xml_diff>

<commit_message>
Hybrid detection: Isolation Forest + brute-force policy rule (>=5 failed logins/window)
</commit_message>
<xml_diff>
--- a/ZT_Project_Implementation_Log.docx
+++ b/ZT_Project_Implementation_Log.docx
@@ -84,7 +84,7 @@
           <w:sz w:val="22"/>
           <w:szCs w:val="22"/>
         </w:rPr>
-        <w:t xml:space="preserve">Last updated 14 October 2026 at 13:43</w:t>
+        <w:t xml:space="preserve">Last updated 14 October 2026 at 13:59</w:t>
       </w:r>
     </w:p>
     <w:p>
@@ -803,14 +803,15 @@
         </w:p>
         <w:p>
           <w:pPr>
-            <w:pStyle w:val="TOC1"/>
+            <w:pStyle w:val="TOC2"/>
             <w:tabs>
               <w:tab w:val="right" w:pos="9026" w:leader="dot"/>
             </w:tabs>
+            <w:ind w:left="220"/>
           </w:pPr>
           <w:hyperlink w:history="1" w:anchor="_Toc31">
             <w:r>
-              <w:t xml:space="preserve">7. Verified Evidence for Chapter 5</w:t>
+              <w:t xml:space="preserve">6.5 Design decision: hybrid detection</w:t>
             </w:r>
             <w:r>
               <w:tab/>
@@ -832,7 +833,7 @@
           </w:pPr>
           <w:hyperlink w:history="1" w:anchor="_Toc32">
             <w:r>
-              <w:t xml:space="preserve">8. Problems Encountered and Fixes</w:t>
+              <w:t xml:space="preserve">7. Verified Evidence for Chapter 5</w:t>
             </w:r>
             <w:r>
               <w:tab/>
@@ -854,7 +855,7 @@
           </w:pPr>
           <w:hyperlink w:history="1" w:anchor="_Toc33">
             <w:r>
-              <w:t xml:space="preserve">9. Monitoring with Zabbix</w:t>
+              <w:t xml:space="preserve">8. Problems Encountered and Fixes</w:t>
             </w:r>
             <w:r>
               <w:tab/>
@@ -869,15 +870,14 @@
         </w:p>
         <w:p>
           <w:pPr>
-            <w:pStyle w:val="TOC2"/>
+            <w:pStyle w:val="TOC1"/>
             <w:tabs>
               <w:tab w:val="right" w:pos="9026" w:leader="dot"/>
             </w:tabs>
-            <w:ind w:left="220"/>
           </w:pPr>
           <w:hyperlink w:history="1" w:anchor="_Toc34">
             <w:r>
-              <w:t xml:space="preserve">9.1 Viewing the dashboard</w:t>
+              <w:t xml:space="preserve">9. Monitoring with Zabbix</w:t>
             </w:r>
             <w:r>
               <w:tab/>
@@ -900,7 +900,7 @@
           </w:pPr>
           <w:hyperlink w:history="1" w:anchor="_Toc35">
             <w:r>
-              <w:t xml:space="preserve">9.2 What is monitored today</w:t>
+              <w:t xml:space="preserve">9.1 Viewing the dashboard</w:t>
             </w:r>
             <w:r>
               <w:tab/>
@@ -923,7 +923,7 @@
           </w:pPr>
           <w:hyperlink w:history="1" w:anchor="_Toc36">
             <w:r>
-              <w:t xml:space="preserve">9.3 Every node pushes its own data (zt_zbx_push.py)</w:t>
+              <w:t xml:space="preserve">9.2 What is monitored today</w:t>
             </w:r>
             <w:r>
               <w:tab/>
@@ -946,7 +946,7 @@
           </w:pPr>
           <w:hyperlink w:history="1" w:anchor="_Toc37">
             <w:r>
-              <w:t xml:space="preserve">9.4 The two dashboard pages</w:t>
+              <w:t xml:space="preserve">9.3 Every node pushes its own data (zt_zbx_push.py)</w:t>
             </w:r>
             <w:r>
               <w:tab/>
@@ -954,28 +954,6 @@
             <w:r>
               <w:fldChar w:fldCharType="begin" w:dirty="true"/>
               <w:instrText xml:space="preserve">PAGEREF _Toc37 \h</w:instrText>
-              <w:fldChar w:fldCharType="separate"/>
-              <w:fldChar w:fldCharType="end"/>
-            </w:r>
-          </w:hyperlink>
-        </w:p>
-        <w:p>
-          <w:pPr>
-            <w:pStyle w:val="TOC1"/>
-            <w:tabs>
-              <w:tab w:val="right" w:pos="9026" w:leader="dot"/>
-            </w:tabs>
-          </w:pPr>
-          <w:hyperlink w:history="1" w:anchor="_Toc38">
-            <w:r>
-              <w:t xml:space="preserve">10. Remaining Work</w:t>
-            </w:r>
-            <w:r>
-              <w:tab/>
-            </w:r>
-            <w:r>
-              <w:fldChar w:fldCharType="begin" w:dirty="true"/>
-              <w:instrText xml:space="preserve">PAGEREF _Toc38 \h</w:instrText>
               <w:fldChar w:fldCharType="separate"/>
               <w:fldChar w:fldCharType="end"/>
             </w:r>
@@ -989,9 +967,31 @@
             </w:tabs>
             <w:ind w:left="220"/>
           </w:pPr>
+          <w:hyperlink w:history="1" w:anchor="_Toc38">
+            <w:r>
+              <w:t xml:space="preserve">9.4 The two dashboard pages</w:t>
+            </w:r>
+            <w:r>
+              <w:tab/>
+            </w:r>
+            <w:r>
+              <w:fldChar w:fldCharType="begin" w:dirty="true"/>
+              <w:instrText xml:space="preserve">PAGEREF _Toc38 \h</w:instrText>
+              <w:fldChar w:fldCharType="separate"/>
+              <w:fldChar w:fldCharType="end"/>
+            </w:r>
+          </w:hyperlink>
+        </w:p>
+        <w:p>
+          <w:pPr>
+            <w:pStyle w:val="TOC1"/>
+            <w:tabs>
+              <w:tab w:val="right" w:pos="9026" w:leader="dot"/>
+            </w:tabs>
+          </w:pPr>
           <w:hyperlink w:history="1" w:anchor="_Toc39">
             <w:r>
-              <w:t xml:space="preserve">Phase 3 (detection and response)</w:t>
+              <w:t xml:space="preserve">10. Remaining Work</w:t>
             </w:r>
             <w:r>
               <w:tab/>
@@ -1014,7 +1014,7 @@
           </w:pPr>
           <w:hyperlink w:history="1" w:anchor="_Toc40">
             <w:r>
-              <w:t xml:space="preserve">Phase 4 (validation and report)</w:t>
+              <w:t xml:space="preserve">Phase 3 (detection and response)</w:t>
             </w:r>
             <w:r>
               <w:tab/>
@@ -1022,28 +1022,6 @@
             <w:r>
               <w:fldChar w:fldCharType="begin" w:dirty="true"/>
               <w:instrText xml:space="preserve">PAGEREF _Toc40 \h</w:instrText>
-              <w:fldChar w:fldCharType="separate"/>
-              <w:fldChar w:fldCharType="end"/>
-            </w:r>
-          </w:hyperlink>
-        </w:p>
-        <w:p>
-          <w:pPr>
-            <w:pStyle w:val="TOC1"/>
-            <w:tabs>
-              <w:tab w:val="right" w:pos="9026" w:leader="dot"/>
-            </w:tabs>
-          </w:pPr>
-          <w:hyperlink w:history="1" w:anchor="_Toc41">
-            <w:r>
-              <w:t xml:space="preserve">11. Files and Commands</w:t>
-            </w:r>
-            <w:r>
-              <w:tab/>
-            </w:r>
-            <w:r>
-              <w:fldChar w:fldCharType="begin" w:dirty="true"/>
-              <w:instrText xml:space="preserve">PAGEREF _Toc41 \h</w:instrText>
               <w:fldChar w:fldCharType="separate"/>
               <w:fldChar w:fldCharType="end"/>
             </w:r>
@@ -1057,16 +1035,16 @@
             </w:tabs>
             <w:ind w:left="220"/>
           </w:pPr>
-          <w:hyperlink w:history="1" w:anchor="_Toc42">
-            <w:r>
-              <w:t xml:space="preserve">Daily routine</w:t>
+          <w:hyperlink w:history="1" w:anchor="_Toc41">
+            <w:r>
+              <w:t xml:space="preserve">Phase 4 (validation and report)</w:t>
             </w:r>
             <w:r>
               <w:tab/>
             </w:r>
             <w:r>
               <w:fldChar w:fldCharType="begin" w:dirty="true"/>
-              <w:instrText xml:space="preserve">PAGEREF _Toc42 \h</w:instrText>
+              <w:instrText xml:space="preserve">PAGEREF _Toc41 \h</w:instrText>
               <w:fldChar w:fldCharType="separate"/>
               <w:fldChar w:fldCharType="end"/>
             </w:r>
@@ -1079,9 +1057,32 @@
               <w:tab w:val="right" w:pos="9026" w:leader="dot"/>
             </w:tabs>
           </w:pPr>
+          <w:hyperlink w:history="1" w:anchor="_Toc42">
+            <w:r>
+              <w:t xml:space="preserve">11. Files and Commands</w:t>
+            </w:r>
+            <w:r>
+              <w:tab/>
+            </w:r>
+            <w:r>
+              <w:fldChar w:fldCharType="begin" w:dirty="true"/>
+              <w:instrText xml:space="preserve">PAGEREF _Toc42 \h</w:instrText>
+              <w:fldChar w:fldCharType="separate"/>
+              <w:fldChar w:fldCharType="end"/>
+            </w:r>
+          </w:hyperlink>
+        </w:p>
+        <w:p>
+          <w:pPr>
+            <w:pStyle w:val="TOC2"/>
+            <w:tabs>
+              <w:tab w:val="right" w:pos="9026" w:leader="dot"/>
+            </w:tabs>
+            <w:ind w:left="220"/>
+          </w:pPr>
           <w:hyperlink w:history="1" w:anchor="_Toc43">
             <w:r>
-              <w:t xml:space="preserve">12. Report Corrections Needed</w:t>
+              <w:t xml:space="preserve">Daily routine</w:t>
             </w:r>
             <w:r>
               <w:tab/>
@@ -1103,7 +1104,7 @@
           </w:pPr>
           <w:hyperlink w:history="1" w:anchor="_Toc44">
             <w:r>
-              <w:t xml:space="preserve">13. Risks and Open Questions</w:t>
+              <w:t xml:space="preserve">12. Report Corrections Needed</w:t>
             </w:r>
             <w:r>
               <w:tab/>
@@ -1111,6 +1112,28 @@
             <w:r>
               <w:fldChar w:fldCharType="begin" w:dirty="true"/>
               <w:instrText xml:space="preserve">PAGEREF _Toc44 \h</w:instrText>
+              <w:fldChar w:fldCharType="separate"/>
+              <w:fldChar w:fldCharType="end"/>
+            </w:r>
+          </w:hyperlink>
+        </w:p>
+        <w:p>
+          <w:pPr>
+            <w:pStyle w:val="TOC1"/>
+            <w:tabs>
+              <w:tab w:val="right" w:pos="9026" w:leader="dot"/>
+            </w:tabs>
+          </w:pPr>
+          <w:hyperlink w:history="1" w:anchor="_Toc45">
+            <w:r>
+              <w:t xml:space="preserve">13. Risks and Open Questions</w:t>
+            </w:r>
+            <w:r>
+              <w:tab/>
+            </w:r>
+            <w:r>
+              <w:fldChar w:fldCharType="begin" w:dirty="true"/>
+              <w:instrText xml:space="preserve">PAGEREF _Toc45 \h</w:instrText>
               <w:fldChar w:fldCharType="separate"/>
               <w:fldChar w:fldCharType="end"/>
             </w:r>
@@ -1658,7 +1681,7 @@
           </w:tcPr>
           <w:p>
             <w:r>
-              <w:t xml:space="preserve">Built and evaluated (5-fold): accuracy 98.0%, F1 0.90, false positives 1.1%; weak brute force partly missed</w:t>
+              <w:t xml:space="preserve">Done: hybrid detector (IF + brute-force rule), 5-fold accuracy 99.0%, recall 100%, false positives 1.1%</w:t>
             </w:r>
           </w:p>
         </w:tc>
@@ -10135,7 +10158,7 @@
           </w:tcPr>
           <w:p>
             <w:r>
-              <w:t xml:space="preserve">Mixed (chosen)</w:t>
+              <w:t xml:space="preserve">Mixed, IF only</w:t>
             </w:r>
           </w:p>
         </w:tc>
@@ -10268,6 +10291,162 @@
           <w:p>
             <w:r>
               <w:t xml:space="preserve">0.990</w:t>
+            </w:r>
+          </w:p>
+        </w:tc>
+      </w:tr>
+      <w:tr>
+        <w:tc>
+          <w:tcPr>
+            <w:tcW w:type="dxa" w:w="1986"/>
+            <w:tcBorders>
+              <w:top w:val="single" w:color="BFBFBF" w:sz="4"/>
+              <w:left w:val="single" w:color="BFBFBF" w:sz="4"/>
+              <w:bottom w:val="single" w:color="BFBFBF" w:sz="4"/>
+              <w:right w:val="single" w:color="BFBFBF" w:sz="4"/>
+            </w:tcBorders>
+            <w:tcMar>
+              <w:top w:type="dxa" w:w="60"/>
+              <w:left w:type="dxa" w:w="100"/>
+              <w:bottom w:type="dxa" w:w="60"/>
+              <w:right w:type="dxa" w:w="100"/>
+            </w:tcMar>
+          </w:tcPr>
+          <w:p>
+            <w:r>
+              <w:t xml:space="preserve">Hybrid: IF (mixed) + rule (chosen)</w:t>
+            </w:r>
+          </w:p>
+        </w:tc>
+        <w:tc>
+          <w:tcPr>
+            <w:tcW w:type="dxa" w:w="1173"/>
+            <w:tcBorders>
+              <w:top w:val="single" w:color="BFBFBF" w:sz="4"/>
+              <w:left w:val="single" w:color="BFBFBF" w:sz="4"/>
+              <w:bottom w:val="single" w:color="BFBFBF" w:sz="4"/>
+              <w:right w:val="single" w:color="BFBFBF" w:sz="4"/>
+            </w:tcBorders>
+            <w:tcMar>
+              <w:top w:type="dxa" w:w="60"/>
+              <w:left w:type="dxa" w:w="100"/>
+              <w:bottom w:type="dxa" w:w="60"/>
+              <w:right w:type="dxa" w:w="100"/>
+            </w:tcMar>
+          </w:tcPr>
+          <w:p>
+            <w:r>
+              <w:t xml:space="preserve">99.0%</w:t>
+            </w:r>
+          </w:p>
+        </w:tc>
+        <w:tc>
+          <w:tcPr>
+            <w:tcW w:type="dxa" w:w="1173"/>
+            <w:tcBorders>
+              <w:top w:val="single" w:color="BFBFBF" w:sz="4"/>
+              <w:left w:val="single" w:color="BFBFBF" w:sz="4"/>
+              <w:bottom w:val="single" w:color="BFBFBF" w:sz="4"/>
+              <w:right w:val="single" w:color="BFBFBF" w:sz="4"/>
+            </w:tcBorders>
+            <w:tcMar>
+              <w:top w:type="dxa" w:w="60"/>
+              <w:left w:type="dxa" w:w="100"/>
+              <w:bottom w:type="dxa" w:w="60"/>
+              <w:right w:type="dxa" w:w="100"/>
+            </w:tcMar>
+          </w:tcPr>
+          <w:p>
+            <w:r>
+              <w:t xml:space="preserve">0.909</w:t>
+            </w:r>
+          </w:p>
+        </w:tc>
+        <w:tc>
+          <w:tcPr>
+            <w:tcW w:type="dxa" w:w="1083"/>
+            <w:tcBorders>
+              <w:top w:val="single" w:color="BFBFBF" w:sz="4"/>
+              <w:left w:val="single" w:color="BFBFBF" w:sz="4"/>
+              <w:bottom w:val="single" w:color="BFBFBF" w:sz="4"/>
+              <w:right w:val="single" w:color="BFBFBF" w:sz="4"/>
+            </w:tcBorders>
+            <w:tcMar>
+              <w:top w:type="dxa" w:w="60"/>
+              <w:left w:type="dxa" w:w="100"/>
+              <w:bottom w:type="dxa" w:w="60"/>
+              <w:right w:type="dxa" w:w="100"/>
+            </w:tcMar>
+          </w:tcPr>
+          <w:p>
+            <w:r>
+              <w:t xml:space="preserve">1.000</w:t>
+            </w:r>
+          </w:p>
+        </w:tc>
+        <w:tc>
+          <w:tcPr>
+            <w:tcW w:type="dxa" w:w="903"/>
+            <w:tcBorders>
+              <w:top w:val="single" w:color="BFBFBF" w:sz="4"/>
+              <w:left w:val="single" w:color="BFBFBF" w:sz="4"/>
+              <w:bottom w:val="single" w:color="BFBFBF" w:sz="4"/>
+              <w:right w:val="single" w:color="BFBFBF" w:sz="4"/>
+            </w:tcBorders>
+            <w:tcMar>
+              <w:top w:type="dxa" w:w="60"/>
+              <w:left w:type="dxa" w:w="100"/>
+              <w:bottom w:type="dxa" w:w="60"/>
+              <w:right w:type="dxa" w:w="100"/>
+            </w:tcMar>
+          </w:tcPr>
+          <w:p>
+            <w:r>
+              <w:t xml:space="preserve">0.952</w:t>
+            </w:r>
+          </w:p>
+        </w:tc>
+        <w:tc>
+          <w:tcPr>
+            <w:tcW w:type="dxa" w:w="1534"/>
+            <w:tcBorders>
+              <w:top w:val="single" w:color="BFBFBF" w:sz="4"/>
+              <w:left w:val="single" w:color="BFBFBF" w:sz="4"/>
+              <w:bottom w:val="single" w:color="BFBFBF" w:sz="4"/>
+              <w:right w:val="single" w:color="BFBFBF" w:sz="4"/>
+            </w:tcBorders>
+            <w:tcMar>
+              <w:top w:type="dxa" w:w="60"/>
+              <w:left w:type="dxa" w:w="100"/>
+              <w:bottom w:type="dxa" w:w="60"/>
+              <w:right w:type="dxa" w:w="100"/>
+            </w:tcMar>
+          </w:tcPr>
+          <w:p>
+            <w:r>
+              <w:t xml:space="preserve">1.1%</w:t>
+            </w:r>
+          </w:p>
+        </w:tc>
+        <w:tc>
+          <w:tcPr>
+            <w:tcW w:type="dxa" w:w="1174"/>
+            <w:tcBorders>
+              <w:top w:val="single" w:color="BFBFBF" w:sz="4"/>
+              <w:left w:val="single" w:color="BFBFBF" w:sz="4"/>
+              <w:bottom w:val="single" w:color="BFBFBF" w:sz="4"/>
+              <w:right w:val="single" w:color="BFBFBF" w:sz="4"/>
+            </w:tcBorders>
+            <w:tcMar>
+              <w:top w:type="dxa" w:w="60"/>
+              <w:left w:type="dxa" w:w="100"/>
+              <w:bottom w:type="dxa" w:w="60"/>
+              <w:right w:type="dxa" w:w="100"/>
+            </w:tcMar>
+          </w:tcPr>
+          <w:p>
+            <w:r>
+              <w:t xml:space="preserve">0.990*</w:t>
             </w:r>
           </w:p>
         </w:tc>
@@ -10277,6 +10456,14 @@
       <w:pPr>
         <w:spacing w:after="120"/>
       </w:pPr>
+      <w:r>
+        <w:t xml:space="preserve">* ROC-AUC is computed from the Isolation Forest score alone; the rule is a yes/no decision and has no score.</w:t>
+      </w:r>
+    </w:p>
+    <w:p>
+      <w:pPr>
+        <w:spacing w:after="120"/>
+      </w:pPr>
     </w:p>
     <w:p>
       <w:pPr>
@@ -10293,7 +10480,7 @@
       <w:r>
         <w:drawing>
           <wp:inline distT="0" distB="0" distL="0" distR="0">
-            <wp:extent cx="5715000" cy="2743200"/>
+            <wp:extent cx="5715000" cy="2714625"/>
             <wp:effectExtent t="0" r="0" b="0" l="0"/>
             <wp:docPr id="1" name="" descr="" title=""/>
             <wp:cNvGraphicFramePr>
@@ -10318,7 +10505,7 @@
                   <pic:spPr bwMode="auto">
                     <a:xfrm>
                       <a:off x="0" y="0"/>
-                      <a:ext cx="5715000" cy="2743200"/>
+                      <a:ext cx="5715000" cy="2714625"/>
                     </a:xfrm>
                     <a:prstGeom prst="rect">
                       <a:avLst/>
@@ -10344,7 +10531,7 @@
           <w:sz w:val="18"/>
           <w:szCs w:val="18"/>
         </w:rPr>
-        <w:t xml:space="preserve">Figure: detection rate per attack type, both training modes</w:t>
+        <w:t xml:space="preserve">Figure: detection rate per attack type for the three detector designs</w:t>
       </w:r>
     </w:p>
     <w:p>
@@ -10466,7 +10653,7 @@
           <w:sz w:val="18"/>
           <w:szCs w:val="18"/>
         </w:rPr>
-        <w:t xml:space="preserve">Figure: confusion matrix, mixed training, 5 folds</w:t>
+        <w:t xml:space="preserve">Figure: confusion matrix, hybrid detector, 5 folds</w:t>
       </w:r>
     </w:p>
     <w:p>
@@ -10541,6 +10728,24 @@
     </w:p>
     <w:p>
       <w:pPr>
+        <w:pStyle w:val="Heading2"/>
+      </w:pPr>
+      <w:bookmarkStart w:name="_Toc31" w:id="31"/>
+      <w:r>
+        <w:t xml:space="preserve">6.5 Design decision: hybrid detection</w:t>
+      </w:r>
+      <w:bookmarkEnd w:id="31"/>
+    </w:p>
+    <w:p>
+      <w:pPr>
+        <w:spacing w:after="120"/>
+      </w:pPr>
+      <w:r>
+        <w:t xml:space="preserve">To close the slow brute-force gap without raising false alarms, the student chose a hybrid design: the Isolation Forest stays the main detector, and one Zero Trust policy rule is added, 5 or more failed logins from one port in a 10-second window. The rule fires on 100 % of brute-force windows at every tested speed and on none of the normal windows (no normal window has a single failed login), so the false-positive rate stays at 1.1 %. Combining a learned model with a small number of explicit policy rules is common practice in security monitoring, and the results are reported both with and without the rule so the contribution of the model alone stays visible. In the code, detect() returns the model flag, the rule flag and which of them fired; the response engine records that reason with every alert.</w:t>
+      </w:r>
+    </w:p>
+    <w:p>
+      <w:pPr>
         <w:pStyle w:val="ListParagraph"/>
         <w:numPr>
           <w:ilvl w:val="0"/>
@@ -10557,11 +10762,11 @@
         <w:pStyle w:val="Heading1"/>
         <w:pageBreakBefore/>
       </w:pPr>
-      <w:bookmarkStart w:name="_Toc31" w:id="31"/>
+      <w:bookmarkStart w:name="_Toc32" w:id="32"/>
       <w:r>
         <w:t xml:space="preserve">7. Verified Evidence for Chapter 5</w:t>
       </w:r>
-      <w:bookmarkEnd w:id="31"/>
+      <w:bookmarkEnd w:id="32"/>
     </w:p>
     <w:p>
       <w:pPr>
@@ -11177,11 +11382,11 @@
         <w:pStyle w:val="Heading1"/>
         <w:pageBreakBefore/>
       </w:pPr>
-      <w:bookmarkStart w:name="_Toc32" w:id="32"/>
+      <w:bookmarkStart w:name="_Toc33" w:id="33"/>
       <w:r>
         <w:t xml:space="preserve">8. Problems Encountered and Fixes</w:t>
       </w:r>
-      <w:bookmarkEnd w:id="32"/>
+      <w:bookmarkEnd w:id="33"/>
     </w:p>
     <w:tbl>
       <w:tblPr>
@@ -12457,21 +12662,21 @@
         <w:pStyle w:val="Heading1"/>
         <w:pageBreakBefore/>
       </w:pPr>
-      <w:bookmarkStart w:name="_Toc33" w:id="33"/>
+      <w:bookmarkStart w:name="_Toc34" w:id="34"/>
       <w:r>
         <w:t xml:space="preserve">9. Monitoring with Zabbix</w:t>
       </w:r>
-      <w:bookmarkEnd w:id="33"/>
+      <w:bookmarkEnd w:id="34"/>
     </w:p>
     <w:p>
       <w:pPr>
         <w:pStyle w:val="Heading2"/>
       </w:pPr>
-      <w:bookmarkStart w:name="_Toc34" w:id="34"/>
+      <w:bookmarkStart w:name="_Toc35" w:id="35"/>
       <w:r>
         <w:t xml:space="preserve">9.1 Viewing the dashboard</w:t>
       </w:r>
-      <w:bookmarkEnd w:id="34"/>
+      <w:bookmarkEnd w:id="35"/>
     </w:p>
     <w:p>
       <w:pPr>
@@ -12540,11 +12745,11 @@
       <w:pPr>
         <w:pStyle w:val="Heading2"/>
       </w:pPr>
-      <w:bookmarkStart w:name="_Toc35" w:id="35"/>
+      <w:bookmarkStart w:name="_Toc36" w:id="36"/>
       <w:r>
         <w:t xml:space="preserve">9.2 What is monitored today</w:t>
       </w:r>
-      <w:bookmarkEnd w:id="35"/>
+      <w:bookmarkEnd w:id="36"/>
     </w:p>
     <w:p>
       <w:pPr>
@@ -12576,11 +12781,11 @@
       <w:pPr>
         <w:pStyle w:val="Heading2"/>
       </w:pPr>
-      <w:bookmarkStart w:name="_Toc36" w:id="36"/>
+      <w:bookmarkStart w:name="_Toc37" w:id="37"/>
       <w:r>
         <w:t xml:space="preserve">9.3 Every node pushes its own data (zt_zbx_push.py)</w:t>
       </w:r>
-      <w:bookmarkEnd w:id="36"/>
+      <w:bookmarkEnd w:id="37"/>
     </w:p>
     <w:p>
       <w:pPr>
@@ -12965,11 +13170,11 @@
       <w:pPr>
         <w:pStyle w:val="Heading2"/>
       </w:pPr>
-      <w:bookmarkStart w:name="_Toc37" w:id="37"/>
+      <w:bookmarkStart w:name="_Toc38" w:id="38"/>
       <w:r>
         <w:t xml:space="preserve">9.4 The two dashboard pages</w:t>
       </w:r>
-      <w:bookmarkEnd w:id="37"/>
+      <w:bookmarkEnd w:id="38"/>
     </w:p>
     <w:tbl>
       <w:tblPr>
@@ -13246,21 +13451,21 @@
         <w:pStyle w:val="Heading1"/>
         <w:pageBreakBefore/>
       </w:pPr>
-      <w:bookmarkStart w:name="_Toc38" w:id="38"/>
+      <w:bookmarkStart w:name="_Toc39" w:id="39"/>
       <w:r>
         <w:t xml:space="preserve">10. Remaining Work</w:t>
       </w:r>
-      <w:bookmarkEnd w:id="38"/>
+      <w:bookmarkEnd w:id="39"/>
     </w:p>
     <w:p>
       <w:pPr>
         <w:pStyle w:val="Heading2"/>
       </w:pPr>
-      <w:bookmarkStart w:name="_Toc39" w:id="39"/>
+      <w:bookmarkStart w:name="_Toc40" w:id="40"/>
       <w:r>
         <w:t xml:space="preserve">Phase 3 (detection and response)</w:t>
       </w:r>
-      <w:bookmarkEnd w:id="39"/>
+      <w:bookmarkEnd w:id="40"/>
     </w:p>
     <w:p>
       <w:pPr>
@@ -13346,11 +13551,11 @@
       <w:pPr>
         <w:pStyle w:val="Heading2"/>
       </w:pPr>
-      <w:bookmarkStart w:name="_Toc40" w:id="40"/>
+      <w:bookmarkStart w:name="_Toc41" w:id="41"/>
       <w:r>
         <w:t xml:space="preserve">Phase 4 (validation and report)</w:t>
       </w:r>
-      <w:bookmarkEnd w:id="40"/>
+      <w:bookmarkEnd w:id="41"/>
     </w:p>
     <w:p>
       <w:pPr>
@@ -13396,11 +13601,11 @@
         <w:pStyle w:val="Heading1"/>
         <w:pageBreakBefore/>
       </w:pPr>
-      <w:bookmarkStart w:name="_Toc41" w:id="41"/>
+      <w:bookmarkStart w:name="_Toc42" w:id="42"/>
       <w:r>
         <w:t xml:space="preserve">11. Files and Commands</w:t>
       </w:r>
-      <w:bookmarkEnd w:id="41"/>
+      <w:bookmarkEnd w:id="42"/>
     </w:p>
     <w:p>
       <w:pPr>
@@ -14381,7 +14586,7 @@
           </w:tcPr>
           <w:p>
             <w:r>
-              <w:t xml:space="preserve">AnomalyDetector (Isolation Forest); evaluate, train and score commands</w:t>
+              <w:t xml:space="preserve">AnomalyDetector (Isolation Forest), hybrid detect() with the brute-force rule; evaluate, train and score commands</w:t>
             </w:r>
           </w:p>
         </w:tc>
@@ -14488,11 +14693,11 @@
       <w:pPr>
         <w:pStyle w:val="Heading2"/>
       </w:pPr>
-      <w:bookmarkStart w:name="_Toc42" w:id="42"/>
+      <w:bookmarkStart w:name="_Toc43" w:id="43"/>
       <w:r>
         <w:t xml:space="preserve">Daily routine</w:t>
       </w:r>
-      <w:bookmarkEnd w:id="42"/>
+      <w:bookmarkEnd w:id="43"/>
     </w:p>
     <w:p>
       <w:pPr>
@@ -14612,11 +14817,11 @@
         <w:pStyle w:val="Heading1"/>
         <w:pageBreakBefore/>
       </w:pPr>
-      <w:bookmarkStart w:name="_Toc43" w:id="43"/>
+      <w:bookmarkStart w:name="_Toc44" w:id="44"/>
       <w:r>
         <w:t xml:space="preserve">12. Report Corrections Needed</w:t>
       </w:r>
-      <w:bookmarkEnd w:id="43"/>
+      <w:bookmarkEnd w:id="44"/>
     </w:p>
     <w:p>
       <w:pPr>
@@ -14743,11 +14948,11 @@
         <w:pStyle w:val="Heading1"/>
         <w:pageBreakBefore/>
       </w:pPr>
-      <w:bookmarkStart w:name="_Toc44" w:id="44"/>
+      <w:bookmarkStart w:name="_Toc45" w:id="45"/>
       <w:r>
         <w:t xml:space="preserve">13. Risks and Open Questions</w:t>
       </w:r>
-      <w:bookmarkEnd w:id="44"/>
+      <w:bookmarkEnd w:id="45"/>
     </w:p>
     <w:p>
       <w:pPr>

</xml_diff>

<commit_message>
Log: response engine part 1
</commit_message>
<xml_diff>
--- a/ZT_Project_Implementation_Log.docx
+++ b/ZT_Project_Implementation_Log.docx
@@ -84,7 +84,7 @@
           <w:sz w:val="22"/>
           <w:szCs w:val="22"/>
         </w:rPr>
-        <w:t xml:space="preserve">Last updated 14 October 2026 at 13:59</w:t>
+        <w:t xml:space="preserve">Last updated 14 October 2026 at 14:14</w:t>
       </w:r>
     </w:p>
     <w:p>
@@ -826,14 +826,15 @@
         </w:p>
         <w:p>
           <w:pPr>
-            <w:pStyle w:val="TOC1"/>
+            <w:pStyle w:val="TOC2"/>
             <w:tabs>
               <w:tab w:val="right" w:pos="9026" w:leader="dot"/>
             </w:tabs>
+            <w:ind w:left="220"/>
           </w:pPr>
           <w:hyperlink w:history="1" w:anchor="_Toc32">
             <w:r>
-              <w:t xml:space="preserve">7. Verified Evidence for Chapter 5</w:t>
+              <w:t xml:space="preserve">6.6 Response engine, part 1: block IP (step 3F)</w:t>
             </w:r>
             <w:r>
               <w:tab/>
@@ -855,7 +856,7 @@
           </w:pPr>
           <w:hyperlink w:history="1" w:anchor="_Toc33">
             <w:r>
-              <w:t xml:space="preserve">8. Problems Encountered and Fixes</w:t>
+              <w:t xml:space="preserve">7. Verified Evidence for Chapter 5</w:t>
             </w:r>
             <w:r>
               <w:tab/>
@@ -877,7 +878,7 @@
           </w:pPr>
           <w:hyperlink w:history="1" w:anchor="_Toc34">
             <w:r>
-              <w:t xml:space="preserve">9. Monitoring with Zabbix</w:t>
+              <w:t xml:space="preserve">8. Problems Encountered and Fixes</w:t>
             </w:r>
             <w:r>
               <w:tab/>
@@ -892,15 +893,14 @@
         </w:p>
         <w:p>
           <w:pPr>
-            <w:pStyle w:val="TOC2"/>
+            <w:pStyle w:val="TOC1"/>
             <w:tabs>
               <w:tab w:val="right" w:pos="9026" w:leader="dot"/>
             </w:tabs>
-            <w:ind w:left="220"/>
           </w:pPr>
           <w:hyperlink w:history="1" w:anchor="_Toc35">
             <w:r>
-              <w:t xml:space="preserve">9.1 Viewing the dashboard</w:t>
+              <w:t xml:space="preserve">9. Monitoring with Zabbix</w:t>
             </w:r>
             <w:r>
               <w:tab/>
@@ -923,7 +923,7 @@
           </w:pPr>
           <w:hyperlink w:history="1" w:anchor="_Toc36">
             <w:r>
-              <w:t xml:space="preserve">9.2 What is monitored today</w:t>
+              <w:t xml:space="preserve">9.1 Viewing the dashboard</w:t>
             </w:r>
             <w:r>
               <w:tab/>
@@ -946,7 +946,7 @@
           </w:pPr>
           <w:hyperlink w:history="1" w:anchor="_Toc37">
             <w:r>
-              <w:t xml:space="preserve">9.3 Every node pushes its own data (zt_zbx_push.py)</w:t>
+              <w:t xml:space="preserve">9.2 What is monitored today</w:t>
             </w:r>
             <w:r>
               <w:tab/>
@@ -969,7 +969,7 @@
           </w:pPr>
           <w:hyperlink w:history="1" w:anchor="_Toc38">
             <w:r>
-              <w:t xml:space="preserve">9.4 The two dashboard pages</w:t>
+              <w:t xml:space="preserve">9.3 Every node pushes its own data (zt_zbx_push.py)</w:t>
             </w:r>
             <w:r>
               <w:tab/>
@@ -977,28 +977,6 @@
             <w:r>
               <w:fldChar w:fldCharType="begin" w:dirty="true"/>
               <w:instrText xml:space="preserve">PAGEREF _Toc38 \h</w:instrText>
-              <w:fldChar w:fldCharType="separate"/>
-              <w:fldChar w:fldCharType="end"/>
-            </w:r>
-          </w:hyperlink>
-        </w:p>
-        <w:p>
-          <w:pPr>
-            <w:pStyle w:val="TOC1"/>
-            <w:tabs>
-              <w:tab w:val="right" w:pos="9026" w:leader="dot"/>
-            </w:tabs>
-          </w:pPr>
-          <w:hyperlink w:history="1" w:anchor="_Toc39">
-            <w:r>
-              <w:t xml:space="preserve">10. Remaining Work</w:t>
-            </w:r>
-            <w:r>
-              <w:tab/>
-            </w:r>
-            <w:r>
-              <w:fldChar w:fldCharType="begin" w:dirty="true"/>
-              <w:instrText xml:space="preserve">PAGEREF _Toc39 \h</w:instrText>
               <w:fldChar w:fldCharType="separate"/>
               <w:fldChar w:fldCharType="end"/>
             </w:r>
@@ -1012,9 +990,31 @@
             </w:tabs>
             <w:ind w:left="220"/>
           </w:pPr>
+          <w:hyperlink w:history="1" w:anchor="_Toc39">
+            <w:r>
+              <w:t xml:space="preserve">9.4 The two dashboard pages</w:t>
+            </w:r>
+            <w:r>
+              <w:tab/>
+            </w:r>
+            <w:r>
+              <w:fldChar w:fldCharType="begin" w:dirty="true"/>
+              <w:instrText xml:space="preserve">PAGEREF _Toc39 \h</w:instrText>
+              <w:fldChar w:fldCharType="separate"/>
+              <w:fldChar w:fldCharType="end"/>
+            </w:r>
+          </w:hyperlink>
+        </w:p>
+        <w:p>
+          <w:pPr>
+            <w:pStyle w:val="TOC1"/>
+            <w:tabs>
+              <w:tab w:val="right" w:pos="9026" w:leader="dot"/>
+            </w:tabs>
+          </w:pPr>
           <w:hyperlink w:history="1" w:anchor="_Toc40">
             <w:r>
-              <w:t xml:space="preserve">Phase 3 (detection and response)</w:t>
+              <w:t xml:space="preserve">10. Remaining Work</w:t>
             </w:r>
             <w:r>
               <w:tab/>
@@ -1037,7 +1037,7 @@
           </w:pPr>
           <w:hyperlink w:history="1" w:anchor="_Toc41">
             <w:r>
-              <w:t xml:space="preserve">Phase 4 (validation and report)</w:t>
+              <w:t xml:space="preserve">Phase 3 (detection and response)</w:t>
             </w:r>
             <w:r>
               <w:tab/>
@@ -1045,28 +1045,6 @@
             <w:r>
               <w:fldChar w:fldCharType="begin" w:dirty="true"/>
               <w:instrText xml:space="preserve">PAGEREF _Toc41 \h</w:instrText>
-              <w:fldChar w:fldCharType="separate"/>
-              <w:fldChar w:fldCharType="end"/>
-            </w:r>
-          </w:hyperlink>
-        </w:p>
-        <w:p>
-          <w:pPr>
-            <w:pStyle w:val="TOC1"/>
-            <w:tabs>
-              <w:tab w:val="right" w:pos="9026" w:leader="dot"/>
-            </w:tabs>
-          </w:pPr>
-          <w:hyperlink w:history="1" w:anchor="_Toc42">
-            <w:r>
-              <w:t xml:space="preserve">11. Files and Commands</w:t>
-            </w:r>
-            <w:r>
-              <w:tab/>
-            </w:r>
-            <w:r>
-              <w:fldChar w:fldCharType="begin" w:dirty="true"/>
-              <w:instrText xml:space="preserve">PAGEREF _Toc42 \h</w:instrText>
               <w:fldChar w:fldCharType="separate"/>
               <w:fldChar w:fldCharType="end"/>
             </w:r>
@@ -1080,16 +1058,16 @@
             </w:tabs>
             <w:ind w:left="220"/>
           </w:pPr>
-          <w:hyperlink w:history="1" w:anchor="_Toc43">
-            <w:r>
-              <w:t xml:space="preserve">Daily routine</w:t>
+          <w:hyperlink w:history="1" w:anchor="_Toc42">
+            <w:r>
+              <w:t xml:space="preserve">Phase 4 (validation and report)</w:t>
             </w:r>
             <w:r>
               <w:tab/>
             </w:r>
             <w:r>
               <w:fldChar w:fldCharType="begin" w:dirty="true"/>
-              <w:instrText xml:space="preserve">PAGEREF _Toc43 \h</w:instrText>
+              <w:instrText xml:space="preserve">PAGEREF _Toc42 \h</w:instrText>
               <w:fldChar w:fldCharType="separate"/>
               <w:fldChar w:fldCharType="end"/>
             </w:r>
@@ -1102,9 +1080,32 @@
               <w:tab w:val="right" w:pos="9026" w:leader="dot"/>
             </w:tabs>
           </w:pPr>
+          <w:hyperlink w:history="1" w:anchor="_Toc43">
+            <w:r>
+              <w:t xml:space="preserve">11. Files and Commands</w:t>
+            </w:r>
+            <w:r>
+              <w:tab/>
+            </w:r>
+            <w:r>
+              <w:fldChar w:fldCharType="begin" w:dirty="true"/>
+              <w:instrText xml:space="preserve">PAGEREF _Toc43 \h</w:instrText>
+              <w:fldChar w:fldCharType="separate"/>
+              <w:fldChar w:fldCharType="end"/>
+            </w:r>
+          </w:hyperlink>
+        </w:p>
+        <w:p>
+          <w:pPr>
+            <w:pStyle w:val="TOC2"/>
+            <w:tabs>
+              <w:tab w:val="right" w:pos="9026" w:leader="dot"/>
+            </w:tabs>
+            <w:ind w:left="220"/>
+          </w:pPr>
           <w:hyperlink w:history="1" w:anchor="_Toc44">
             <w:r>
-              <w:t xml:space="preserve">12. Report Corrections Needed</w:t>
+              <w:t xml:space="preserve">Daily routine</w:t>
             </w:r>
             <w:r>
               <w:tab/>
@@ -1126,7 +1127,7 @@
           </w:pPr>
           <w:hyperlink w:history="1" w:anchor="_Toc45">
             <w:r>
-              <w:t xml:space="preserve">13. Risks and Open Questions</w:t>
+              <w:t xml:space="preserve">12. Report Corrections Needed</w:t>
             </w:r>
             <w:r>
               <w:tab/>
@@ -1134,6 +1135,28 @@
             <w:r>
               <w:fldChar w:fldCharType="begin" w:dirty="true"/>
               <w:instrText xml:space="preserve">PAGEREF _Toc45 \h</w:instrText>
+              <w:fldChar w:fldCharType="separate"/>
+              <w:fldChar w:fldCharType="end"/>
+            </w:r>
+          </w:hyperlink>
+        </w:p>
+        <w:p>
+          <w:pPr>
+            <w:pStyle w:val="TOC1"/>
+            <w:tabs>
+              <w:tab w:val="right" w:pos="9026" w:leader="dot"/>
+            </w:tabs>
+          </w:pPr>
+          <w:hyperlink w:history="1" w:anchor="_Toc46">
+            <w:r>
+              <w:t xml:space="preserve">13. Risks and Open Questions</w:t>
+            </w:r>
+            <w:r>
+              <w:tab/>
+            </w:r>
+            <w:r>
+              <w:fldChar w:fldCharType="begin" w:dirty="true"/>
+              <w:instrText xml:space="preserve">PAGEREF _Toc46 \h</w:instrText>
               <w:fldChar w:fldCharType="separate"/>
               <w:fldChar w:fldCharType="end"/>
             </w:r>
@@ -1773,7 +1796,7 @@
           </w:tcPr>
           <w:p>
             <w:r>
-              <w:t xml:space="preserve">Not started (design in section 10)</w:t>
+              <w:t xml:space="preserve">In progress: block IP and alert-only done and tested live; quarantine and disable-account next</w:t>
             </w:r>
           </w:p>
         </w:tc>
@@ -10759,14 +10782,411 @@
     </w:p>
     <w:p>
       <w:pPr>
+        <w:pStyle w:val="Heading2"/>
+      </w:pPr>
+      <w:bookmarkStart w:name="_Toc32" w:id="32"/>
+      <w:r>
+        <w:t xml:space="preserve">6.6 Response engine, part 1: block IP (step 3F)</w:t>
+      </w:r>
+      <w:bookmarkEnd w:id="32"/>
+    </w:p>
+    <w:p>
+      <w:pPr>
+        <w:spacing w:after="120"/>
+      </w:pPr>
+      <w:r>
+        <w:t xml:space="preserve">zt_respond.py follows the Chapter 4 class diagram: NetworkActions builds the exact CLI commands (pure functions, unit-tested), AlertBuilder builds the structured alert, and ResponseEngine applies the commands over SSH with Netmiko, remembers what it has already done, writes every incident to logs/incidents.jsonl and pushes the alert, the action and the detection-to-action time to Zabbix. A Zabbix outage never stops a response.</w:t>
+      </w:r>
+    </w:p>
+    <w:p>
+      <w:pPr>
+        <w:spacing w:after="120"/>
+      </w:pPr>
+      <w:r>
+        <w:t xml:space="preserve">Block IP inserts one line per offender into ZT_POLICY on core Ethernet1, in the reserved range 71 to 79: after the guest rules and before the final permit. Infrastructure addresses (RADIUS, SIEM, switch, gateways) are refused, and a host already blocked is never acted on twice. SSH login to the switch takes about 0.75 s and the change itself about 0.10 s, so the live pipeline keeps the SSH session open.</w:t>
+      </w:r>
+    </w:p>
+    <w:tbl>
+      <w:tblPr>
+        <w:tblW w:type="dxa" w:w="9026"/>
+        <w:tblBorders>
+          <w:top w:val="single" w:color="auto" w:sz="4"/>
+          <w:left w:val="single" w:color="auto" w:sz="4"/>
+          <w:bottom w:val="single" w:color="auto" w:sz="4"/>
+          <w:right w:val="single" w:color="auto" w:sz="4"/>
+          <w:insideH w:val="single" w:color="auto" w:sz="4"/>
+          <w:insideV w:val="single" w:color="auto" w:sz="4"/>
+        </w:tblBorders>
+      </w:tblPr>
+      <w:tblGrid>
+        <w:gridCol w:w="3159"/>
+        <w:gridCol w:w="5867"/>
+      </w:tblGrid>
+      <w:tr>
+        <w:trPr>
+          <w:tblHeader/>
+        </w:trPr>
+        <w:tc>
+          <w:tcPr>
+            <w:tcW w:type="dxa" w:w="3159"/>
+            <w:tcBorders>
+              <w:top w:val="single" w:color="BFBFBF" w:sz="4"/>
+              <w:left w:val="single" w:color="BFBFBF" w:sz="4"/>
+              <w:bottom w:val="single" w:color="BFBFBF" w:sz="4"/>
+              <w:right w:val="single" w:color="BFBFBF" w:sz="4"/>
+            </w:tcBorders>
+            <w:shd w:fill="1F4E79" w:color="auto" w:val="clear"/>
+            <w:tcMar>
+              <w:top w:type="dxa" w:w="60"/>
+              <w:left w:type="dxa" w:w="100"/>
+              <w:bottom w:type="dxa" w:w="60"/>
+              <w:right w:type="dxa" w:w="100"/>
+            </w:tcMar>
+          </w:tcPr>
+          <w:p>
+            <w:r>
+              <w:rPr>
+                <w:b/>
+                <w:bCs/>
+                <w:color w:val="FFFFFF"/>
+                <w:sz w:val="19"/>
+                <w:szCs w:val="19"/>
+              </w:rPr>
+              <w:t xml:space="preserve">Live test (14 Oct)</w:t>
+            </w:r>
+          </w:p>
+        </w:tc>
+        <w:tc>
+          <w:tcPr>
+            <w:tcW w:type="dxa" w:w="5867"/>
+            <w:tcBorders>
+              <w:top w:val="single" w:color="BFBFBF" w:sz="4"/>
+              <w:left w:val="single" w:color="BFBFBF" w:sz="4"/>
+              <w:bottom w:val="single" w:color="BFBFBF" w:sz="4"/>
+              <w:right w:val="single" w:color="BFBFBF" w:sz="4"/>
+            </w:tcBorders>
+            <w:shd w:fill="1F4E79" w:color="auto" w:val="clear"/>
+            <w:tcMar>
+              <w:top w:type="dxa" w:w="60"/>
+              <w:left w:type="dxa" w:w="100"/>
+              <w:bottom w:type="dxa" w:w="60"/>
+              <w:right w:type="dxa" w:w="100"/>
+            </w:tcMar>
+          </w:tcPr>
+          <w:p>
+            <w:r>
+              <w:rPr>
+                <w:b/>
+                <w:bCs/>
+                <w:color w:val="FFFFFF"/>
+                <w:sz w:val="19"/>
+                <w:szCs w:val="19"/>
+              </w:rPr>
+              <w:t xml:space="preserve">Result</w:t>
+            </w:r>
+          </w:p>
+        </w:tc>
+      </w:tr>
+      <w:tr>
+        <w:tc>
+          <w:tcPr>
+            <w:tcW w:type="dxa" w:w="3159"/>
+            <w:tcBorders>
+              <w:top w:val="single" w:color="BFBFBF" w:sz="4"/>
+              <w:left w:val="single" w:color="BFBFBF" w:sz="4"/>
+              <w:bottom w:val="single" w:color="BFBFBF" w:sz="4"/>
+              <w:right w:val="single" w:color="BFBFBF" w:sz="4"/>
+            </w:tcBorders>
+            <w:tcMar>
+              <w:top w:type="dxa" w:w="60"/>
+              <w:left w:type="dxa" w:w="100"/>
+              <w:bottom w:type="dxa" w:w="60"/>
+              <w:right w:type="dxa" w:w="100"/>
+            </w:tcMar>
+          </w:tcPr>
+          <w:p>
+            <w:r>
+              <w:t xml:space="preserve">Before</w:t>
+            </w:r>
+          </w:p>
+        </w:tc>
+        <w:tc>
+          <w:tcPr>
+            <w:tcW w:type="dxa" w:w="5867"/>
+            <w:tcBorders>
+              <w:top w:val="single" w:color="BFBFBF" w:sz="4"/>
+              <w:left w:val="single" w:color="BFBFBF" w:sz="4"/>
+              <w:bottom w:val="single" w:color="BFBFBF" w:sz="4"/>
+              <w:right w:val="single" w:color="BFBFBF" w:sz="4"/>
+            </w:tcBorders>
+            <w:tcMar>
+              <w:top w:type="dxa" w:w="60"/>
+              <w:left w:type="dxa" w:w="100"/>
+              <w:bottom w:type="dxa" w:w="60"/>
+              <w:right w:type="dxa" w:w="100"/>
+            </w:tcMar>
+          </w:tcPr>
+          <w:p>
+            <w:r>
+              <w:t xml:space="preserve">guest-pc and staff-pc both reach the DMZ web server (HTTP 200)</w:t>
+            </w:r>
+          </w:p>
+        </w:tc>
+      </w:tr>
+      <w:tr>
+        <w:tc>
+          <w:tcPr>
+            <w:tcW w:type="dxa" w:w="3159"/>
+            <w:tcBorders>
+              <w:top w:val="single" w:color="BFBFBF" w:sz="4"/>
+              <w:left w:val="single" w:color="BFBFBF" w:sz="4"/>
+              <w:bottom w:val="single" w:color="BFBFBF" w:sz="4"/>
+              <w:right w:val="single" w:color="BFBFBF" w:sz="4"/>
+            </w:tcBorders>
+            <w:tcMar>
+              <w:top w:type="dxa" w:w="60"/>
+              <w:left w:type="dxa" w:w="100"/>
+              <w:bottom w:type="dxa" w:w="60"/>
+              <w:right w:type="dxa" w:w="100"/>
+            </w:tcMar>
+          </w:tcPr>
+          <w:p>
+            <w:r>
+              <w:t xml:space="preserve">block 10.10.30.50</w:t>
+            </w:r>
+          </w:p>
+        </w:tc>
+        <w:tc>
+          <w:tcPr>
+            <w:tcW w:type="dxa" w:w="5867"/>
+            <w:tcBorders>
+              <w:top w:val="single" w:color="BFBFBF" w:sz="4"/>
+              <w:left w:val="single" w:color="BFBFBF" w:sz="4"/>
+              <w:bottom w:val="single" w:color="BFBFBF" w:sz="4"/>
+              <w:right w:val="single" w:color="BFBFBF" w:sz="4"/>
+            </w:tcBorders>
+            <w:tcMar>
+              <w:top w:type="dxa" w:w="60"/>
+              <w:left w:type="dxa" w:w="100"/>
+              <w:bottom w:type="dxa" w:w="60"/>
+              <w:right w:type="dxa" w:w="100"/>
+            </w:tcMar>
+          </w:tcPr>
+          <w:p>
+            <w:r>
+              <w:t xml:space="preserve">Line 71 deny ip host 10.10.30.50 any added; 5 packets matched within a second</w:t>
+            </w:r>
+          </w:p>
+        </w:tc>
+      </w:tr>
+      <w:tr>
+        <w:tc>
+          <w:tcPr>
+            <w:tcW w:type="dxa" w:w="3159"/>
+            <w:tcBorders>
+              <w:top w:val="single" w:color="BFBFBF" w:sz="4"/>
+              <w:left w:val="single" w:color="BFBFBF" w:sz="4"/>
+              <w:bottom w:val="single" w:color="BFBFBF" w:sz="4"/>
+              <w:right w:val="single" w:color="BFBFBF" w:sz="4"/>
+            </w:tcBorders>
+            <w:tcMar>
+              <w:top w:type="dxa" w:w="60"/>
+              <w:left w:type="dxa" w:w="100"/>
+              <w:bottom w:type="dxa" w:w="60"/>
+              <w:right w:type="dxa" w:w="100"/>
+            </w:tcMar>
+          </w:tcPr>
+          <w:p>
+            <w:r>
+              <w:t xml:space="preserve">After block</w:t>
+            </w:r>
+          </w:p>
+        </w:tc>
+        <w:tc>
+          <w:tcPr>
+            <w:tcW w:type="dxa" w:w="5867"/>
+            <w:tcBorders>
+              <w:top w:val="single" w:color="BFBFBF" w:sz="4"/>
+              <w:left w:val="single" w:color="BFBFBF" w:sz="4"/>
+              <w:bottom w:val="single" w:color="BFBFBF" w:sz="4"/>
+              <w:right w:val="single" w:color="BFBFBF" w:sz="4"/>
+            </w:tcBorders>
+            <w:tcMar>
+              <w:top w:type="dxa" w:w="60"/>
+              <w:left w:type="dxa" w:w="100"/>
+              <w:bottom w:type="dxa" w:w="60"/>
+              <w:right w:type="dxa" w:w="100"/>
+            </w:tcMar>
+          </w:tcPr>
+          <w:p>
+            <w:r>
+              <w:t xml:space="preserve">guest-pc cut off (HTTP 000, its gateway unreachable); staff-pc unaffected (HTTP 200)</w:t>
+            </w:r>
+          </w:p>
+        </w:tc>
+      </w:tr>
+      <w:tr>
+        <w:tc>
+          <w:tcPr>
+            <w:tcW w:type="dxa" w:w="3159"/>
+            <w:tcBorders>
+              <w:top w:val="single" w:color="BFBFBF" w:sz="4"/>
+              <w:left w:val="single" w:color="BFBFBF" w:sz="4"/>
+              <w:bottom w:val="single" w:color="BFBFBF" w:sz="4"/>
+              <w:right w:val="single" w:color="BFBFBF" w:sz="4"/>
+            </w:tcBorders>
+            <w:tcMar>
+              <w:top w:type="dxa" w:w="60"/>
+              <w:left w:type="dxa" w:w="100"/>
+              <w:bottom w:type="dxa" w:w="60"/>
+              <w:right w:type="dxa" w:w="100"/>
+            </w:tcMar>
+          </w:tcPr>
+          <w:p>
+            <w:r>
+              <w:t xml:space="preserve">Second block of the same IP</w:t>
+            </w:r>
+          </w:p>
+        </w:tc>
+        <w:tc>
+          <w:tcPr>
+            <w:tcW w:type="dxa" w:w="5867"/>
+            <w:tcBorders>
+              <w:top w:val="single" w:color="BFBFBF" w:sz="4"/>
+              <w:left w:val="single" w:color="BFBFBF" w:sz="4"/>
+              <w:bottom w:val="single" w:color="BFBFBF" w:sz="4"/>
+              <w:right w:val="single" w:color="BFBFBF" w:sz="4"/>
+            </w:tcBorders>
+            <w:tcMar>
+              <w:top w:type="dxa" w:w="60"/>
+              <w:left w:type="dxa" w:w="100"/>
+              <w:bottom w:type="dxa" w:w="60"/>
+              <w:right w:type="dxa" w:w="100"/>
+            </w:tcMar>
+          </w:tcPr>
+          <w:p>
+            <w:r>
+              <w:t xml:space="preserve">Ignored (already blocked)</w:t>
+            </w:r>
+          </w:p>
+        </w:tc>
+      </w:tr>
+      <w:tr>
+        <w:tc>
+          <w:tcPr>
+            <w:tcW w:type="dxa" w:w="3159"/>
+            <w:tcBorders>
+              <w:top w:val="single" w:color="BFBFBF" w:sz="4"/>
+              <w:left w:val="single" w:color="BFBFBF" w:sz="4"/>
+              <w:bottom w:val="single" w:color="BFBFBF" w:sz="4"/>
+              <w:right w:val="single" w:color="BFBFBF" w:sz="4"/>
+            </w:tcBorders>
+            <w:tcMar>
+              <w:top w:type="dxa" w:w="60"/>
+              <w:left w:type="dxa" w:w="100"/>
+              <w:bottom w:type="dxa" w:w="60"/>
+              <w:right w:type="dxa" w:w="100"/>
+            </w:tcMar>
+          </w:tcPr>
+          <w:p>
+            <w:r>
+              <w:t xml:space="preserve">unblock</w:t>
+            </w:r>
+          </w:p>
+        </w:tc>
+        <w:tc>
+          <w:tcPr>
+            <w:tcW w:type="dxa" w:w="5867"/>
+            <w:tcBorders>
+              <w:top w:val="single" w:color="BFBFBF" w:sz="4"/>
+              <w:left w:val="single" w:color="BFBFBF" w:sz="4"/>
+              <w:bottom w:val="single" w:color="BFBFBF" w:sz="4"/>
+              <w:right w:val="single" w:color="BFBFBF" w:sz="4"/>
+            </w:tcBorders>
+            <w:tcMar>
+              <w:top w:type="dxa" w:w="60"/>
+              <w:left w:type="dxa" w:w="100"/>
+              <w:bottom w:type="dxa" w:w="60"/>
+              <w:right w:type="dxa" w:w="100"/>
+            </w:tcMar>
+          </w:tcPr>
+          <w:p>
+            <w:r>
+              <w:t xml:space="preserve">guest-pc back to HTTP 200</w:t>
+            </w:r>
+          </w:p>
+        </w:tc>
+      </w:tr>
+      <w:tr>
+        <w:tc>
+          <w:tcPr>
+            <w:tcW w:type="dxa" w:w="3159"/>
+            <w:tcBorders>
+              <w:top w:val="single" w:color="BFBFBF" w:sz="4"/>
+              <w:left w:val="single" w:color="BFBFBF" w:sz="4"/>
+              <w:bottom w:val="single" w:color="BFBFBF" w:sz="4"/>
+              <w:right w:val="single" w:color="BFBFBF" w:sz="4"/>
+            </w:tcBorders>
+            <w:tcMar>
+              <w:top w:type="dxa" w:w="60"/>
+              <w:left w:type="dxa" w:w="100"/>
+              <w:bottom w:type="dxa" w:w="60"/>
+              <w:right w:type="dxa" w:w="100"/>
+            </w:tcMar>
+          </w:tcPr>
+          <w:p>
+            <w:r>
+              <w:t xml:space="preserve">block 10.10.10.5 (RADIUS)</w:t>
+            </w:r>
+          </w:p>
+        </w:tc>
+        <w:tc>
+          <w:tcPr>
+            <w:tcW w:type="dxa" w:w="5867"/>
+            <w:tcBorders>
+              <w:top w:val="single" w:color="BFBFBF" w:sz="4"/>
+              <w:left w:val="single" w:color="BFBFBF" w:sz="4"/>
+              <w:bottom w:val="single" w:color="BFBFBF" w:sz="4"/>
+              <w:right w:val="single" w:color="BFBFBF" w:sz="4"/>
+            </w:tcBorders>
+            <w:tcMar>
+              <w:top w:type="dxa" w:w="60"/>
+              <w:left w:type="dxa" w:w="100"/>
+              <w:bottom w:type="dxa" w:w="60"/>
+              <w:right w:type="dxa" w:w="100"/>
+            </w:tcMar>
+          </w:tcPr>
+          <w:p>
+            <w:r>
+              <w:t xml:space="preserve">Refused: infrastructure address</w:t>
+            </w:r>
+          </w:p>
+        </w:tc>
+      </w:tr>
+    </w:tbl>
+    <w:p>
+      <w:pPr>
+        <w:spacing w:after="120"/>
+      </w:pPr>
+    </w:p>
+    <w:p>
+      <w:pPr>
+        <w:spacing w:after="120"/>
+      </w:pPr>
+      <w:r>
+        <w:t xml:space="preserve">test_respond.py checks the commands, de-duplication, line reuse, state persistence, infrastructure protection and alert-only behaviour offline (6 checks, all pass).</w:t>
+      </w:r>
+    </w:p>
+    <w:p>
+      <w:pPr>
         <w:pStyle w:val="Heading1"/>
         <w:pageBreakBefore/>
       </w:pPr>
-      <w:bookmarkStart w:name="_Toc32" w:id="32"/>
+      <w:bookmarkStart w:name="_Toc33" w:id="33"/>
       <w:r>
         <w:t xml:space="preserve">7. Verified Evidence for Chapter 5</w:t>
       </w:r>
-      <w:bookmarkEnd w:id="32"/>
+      <w:bookmarkEnd w:id="33"/>
     </w:p>
     <w:p>
       <w:pPr>
@@ -11382,11 +11802,11 @@
         <w:pStyle w:val="Heading1"/>
         <w:pageBreakBefore/>
       </w:pPr>
-      <w:bookmarkStart w:name="_Toc33" w:id="33"/>
+      <w:bookmarkStart w:name="_Toc34" w:id="34"/>
       <w:r>
         <w:t xml:space="preserve">8. Problems Encountered and Fixes</w:t>
       </w:r>
-      <w:bookmarkEnd w:id="33"/>
+      <w:bookmarkEnd w:id="34"/>
     </w:p>
     <w:tbl>
       <w:tblPr>
@@ -12662,21 +13082,21 @@
         <w:pStyle w:val="Heading1"/>
         <w:pageBreakBefore/>
       </w:pPr>
-      <w:bookmarkStart w:name="_Toc34" w:id="34"/>
+      <w:bookmarkStart w:name="_Toc35" w:id="35"/>
       <w:r>
         <w:t xml:space="preserve">9. Monitoring with Zabbix</w:t>
       </w:r>
-      <w:bookmarkEnd w:id="34"/>
+      <w:bookmarkEnd w:id="35"/>
     </w:p>
     <w:p>
       <w:pPr>
         <w:pStyle w:val="Heading2"/>
       </w:pPr>
-      <w:bookmarkStart w:name="_Toc35" w:id="35"/>
+      <w:bookmarkStart w:name="_Toc36" w:id="36"/>
       <w:r>
         <w:t xml:space="preserve">9.1 Viewing the dashboard</w:t>
       </w:r>
-      <w:bookmarkEnd w:id="35"/>
+      <w:bookmarkEnd w:id="36"/>
     </w:p>
     <w:p>
       <w:pPr>
@@ -12745,11 +13165,11 @@
       <w:pPr>
         <w:pStyle w:val="Heading2"/>
       </w:pPr>
-      <w:bookmarkStart w:name="_Toc36" w:id="36"/>
+      <w:bookmarkStart w:name="_Toc37" w:id="37"/>
       <w:r>
         <w:t xml:space="preserve">9.2 What is monitored today</w:t>
       </w:r>
-      <w:bookmarkEnd w:id="36"/>
+      <w:bookmarkEnd w:id="37"/>
     </w:p>
     <w:p>
       <w:pPr>
@@ -12781,11 +13201,11 @@
       <w:pPr>
         <w:pStyle w:val="Heading2"/>
       </w:pPr>
-      <w:bookmarkStart w:name="_Toc37" w:id="37"/>
+      <w:bookmarkStart w:name="_Toc38" w:id="38"/>
       <w:r>
         <w:t xml:space="preserve">9.3 Every node pushes its own data (zt_zbx_push.py)</w:t>
       </w:r>
-      <w:bookmarkEnd w:id="37"/>
+      <w:bookmarkEnd w:id="38"/>
     </w:p>
     <w:p>
       <w:pPr>
@@ -13170,11 +13590,11 @@
       <w:pPr>
         <w:pStyle w:val="Heading2"/>
       </w:pPr>
-      <w:bookmarkStart w:name="_Toc38" w:id="38"/>
+      <w:bookmarkStart w:name="_Toc39" w:id="39"/>
       <w:r>
         <w:t xml:space="preserve">9.4 The two dashboard pages</w:t>
       </w:r>
-      <w:bookmarkEnd w:id="38"/>
+      <w:bookmarkEnd w:id="39"/>
     </w:p>
     <w:tbl>
       <w:tblPr>
@@ -13451,21 +13871,21 @@
         <w:pStyle w:val="Heading1"/>
         <w:pageBreakBefore/>
       </w:pPr>
-      <w:bookmarkStart w:name="_Toc39" w:id="39"/>
+      <w:bookmarkStart w:name="_Toc40" w:id="40"/>
       <w:r>
         <w:t xml:space="preserve">10. Remaining Work</w:t>
       </w:r>
-      <w:bookmarkEnd w:id="39"/>
+      <w:bookmarkEnd w:id="40"/>
     </w:p>
     <w:p>
       <w:pPr>
         <w:pStyle w:val="Heading2"/>
       </w:pPr>
-      <w:bookmarkStart w:name="_Toc40" w:id="40"/>
+      <w:bookmarkStart w:name="_Toc41" w:id="41"/>
       <w:r>
         <w:t xml:space="preserve">Phase 3 (detection and response)</w:t>
       </w:r>
-      <w:bookmarkEnd w:id="40"/>
+      <w:bookmarkEnd w:id="41"/>
     </w:p>
     <w:p>
       <w:pPr>
@@ -13551,11 +13971,11 @@
       <w:pPr>
         <w:pStyle w:val="Heading2"/>
       </w:pPr>
-      <w:bookmarkStart w:name="_Toc41" w:id="41"/>
+      <w:bookmarkStart w:name="_Toc42" w:id="42"/>
       <w:r>
         <w:t xml:space="preserve">Phase 4 (validation and report)</w:t>
       </w:r>
-      <w:bookmarkEnd w:id="41"/>
+      <w:bookmarkEnd w:id="42"/>
     </w:p>
     <w:p>
       <w:pPr>
@@ -13601,11 +14021,11 @@
         <w:pStyle w:val="Heading1"/>
         <w:pageBreakBefore/>
       </w:pPr>
-      <w:bookmarkStart w:name="_Toc42" w:id="42"/>
+      <w:bookmarkStart w:name="_Toc43" w:id="43"/>
       <w:r>
         <w:t xml:space="preserve">11. Files and Commands</w:t>
       </w:r>
-      <w:bookmarkEnd w:id="42"/>
+      <w:bookmarkEnd w:id="43"/>
     </w:p>
     <w:p>
       <w:pPr>
@@ -14610,6 +15030,52 @@
           </w:tcPr>
           <w:p>
             <w:r>
+              <w:t xml:space="preserve">zt_respond.py, test_respond.py</w:t>
+            </w:r>
+          </w:p>
+        </w:tc>
+        <w:tc>
+          <w:tcPr>
+            <w:tcW w:type="dxa" w:w="4964"/>
+            <w:tcBorders>
+              <w:top w:val="single" w:color="BFBFBF" w:sz="4"/>
+              <w:left w:val="single" w:color="BFBFBF" w:sz="4"/>
+              <w:bottom w:val="single" w:color="BFBFBF" w:sz="4"/>
+              <w:right w:val="single" w:color="BFBFBF" w:sz="4"/>
+            </w:tcBorders>
+            <w:tcMar>
+              <w:top w:type="dxa" w:w="60"/>
+              <w:left w:type="dxa" w:w="100"/>
+              <w:bottom w:type="dxa" w:w="60"/>
+              <w:right w:type="dxa" w:w="100"/>
+            </w:tcMar>
+          </w:tcPr>
+          <w:p>
+            <w:r>
+              <w:t xml:space="preserve">Response engine (block IP, alert only, incident log, Zabbix) and its 6 offline tests</w:t>
+            </w:r>
+          </w:p>
+        </w:tc>
+      </w:tr>
+      <w:tr>
+        <w:tc>
+          <w:tcPr>
+            <w:tcW w:type="dxa" w:w="4062"/>
+            <w:tcBorders>
+              <w:top w:val="single" w:color="BFBFBF" w:sz="4"/>
+              <w:left w:val="single" w:color="BFBFBF" w:sz="4"/>
+              <w:bottom w:val="single" w:color="BFBFBF" w:sz="4"/>
+              <w:right w:val="single" w:color="BFBFBF" w:sz="4"/>
+            </w:tcBorders>
+            <w:tcMar>
+              <w:top w:type="dxa" w:w="60"/>
+              <w:left w:type="dxa" w:w="100"/>
+              <w:bottom w:type="dxa" w:w="60"/>
+              <w:right w:type="dxa" w:w="100"/>
+            </w:tcMar>
+          </w:tcPr>
+          <w:p>
+            <w:r>
               <w:t xml:space="preserve">results/</w:t>
             </w:r>
           </w:p>
@@ -14693,11 +15159,11 @@
       <w:pPr>
         <w:pStyle w:val="Heading2"/>
       </w:pPr>
-      <w:bookmarkStart w:name="_Toc43" w:id="43"/>
+      <w:bookmarkStart w:name="_Toc44" w:id="44"/>
       <w:r>
         <w:t xml:space="preserve">Daily routine</w:t>
       </w:r>
-      <w:bookmarkEnd w:id="43"/>
+      <w:bookmarkEnd w:id="44"/>
     </w:p>
     <w:p>
       <w:pPr>
@@ -14817,11 +15283,11 @@
         <w:pStyle w:val="Heading1"/>
         <w:pageBreakBefore/>
       </w:pPr>
-      <w:bookmarkStart w:name="_Toc44" w:id="44"/>
+      <w:bookmarkStart w:name="_Toc45" w:id="45"/>
       <w:r>
         <w:t xml:space="preserve">12. Report Corrections Needed</w:t>
       </w:r>
-      <w:bookmarkEnd w:id="44"/>
+      <w:bookmarkEnd w:id="45"/>
     </w:p>
     <w:p>
       <w:pPr>
@@ -14948,11 +15414,11 @@
         <w:pStyle w:val="Heading1"/>
         <w:pageBreakBefore/>
       </w:pPr>
-      <w:bookmarkStart w:name="_Toc45" w:id="45"/>
+      <w:bookmarkStart w:name="_Toc46" w:id="46"/>
       <w:r>
         <w:t xml:space="preserve">13. Risks and Open Questions</w:t>
       </w:r>
-      <w:bookmarkEnd w:id="45"/>
+      <w:bookmarkEnd w:id="46"/>
     </w:p>
     <w:p>
       <w:pPr>

</xml_diff>

<commit_message>
Response engine: identity-based quarantine (RADIUS VLAN 99), disable/enable account, release
</commit_message>
<xml_diff>
--- a/ZT_Project_Implementation_Log.docx
+++ b/ZT_Project_Implementation_Log.docx
@@ -84,7 +84,7 @@
           <w:sz w:val="22"/>
           <w:szCs w:val="22"/>
         </w:rPr>
-        <w:t xml:space="preserve">Last updated 14 October 2026 at 14:14</w:t>
+        <w:t xml:space="preserve">Last updated 14 October 2026 at 14:21</w:t>
       </w:r>
     </w:p>
     <w:p>
@@ -849,14 +849,15 @@
         </w:p>
         <w:p>
           <w:pPr>
-            <w:pStyle w:val="TOC1"/>
+            <w:pStyle w:val="TOC2"/>
             <w:tabs>
               <w:tab w:val="right" w:pos="9026" w:leader="dot"/>
             </w:tabs>
+            <w:ind w:left="220"/>
           </w:pPr>
           <w:hyperlink w:history="1" w:anchor="_Toc33">
             <w:r>
-              <w:t xml:space="preserve">7. Verified Evidence for Chapter 5</w:t>
+              <w:t xml:space="preserve">6.7 Response engine, part 2: quarantine and disable account</w:t>
             </w:r>
             <w:r>
               <w:tab/>
@@ -878,7 +879,7 @@
           </w:pPr>
           <w:hyperlink w:history="1" w:anchor="_Toc34">
             <w:r>
-              <w:t xml:space="preserve">8. Problems Encountered and Fixes</w:t>
+              <w:t xml:space="preserve">7. Verified Evidence for Chapter 5</w:t>
             </w:r>
             <w:r>
               <w:tab/>
@@ -900,7 +901,7 @@
           </w:pPr>
           <w:hyperlink w:history="1" w:anchor="_Toc35">
             <w:r>
-              <w:t xml:space="preserve">9. Monitoring with Zabbix</w:t>
+              <w:t xml:space="preserve">8. Problems Encountered and Fixes</w:t>
             </w:r>
             <w:r>
               <w:tab/>
@@ -915,15 +916,14 @@
         </w:p>
         <w:p>
           <w:pPr>
-            <w:pStyle w:val="TOC2"/>
+            <w:pStyle w:val="TOC1"/>
             <w:tabs>
               <w:tab w:val="right" w:pos="9026" w:leader="dot"/>
             </w:tabs>
-            <w:ind w:left="220"/>
           </w:pPr>
           <w:hyperlink w:history="1" w:anchor="_Toc36">
             <w:r>
-              <w:t xml:space="preserve">9.1 Viewing the dashboard</w:t>
+              <w:t xml:space="preserve">9. Monitoring with Zabbix</w:t>
             </w:r>
             <w:r>
               <w:tab/>
@@ -946,7 +946,7 @@
           </w:pPr>
           <w:hyperlink w:history="1" w:anchor="_Toc37">
             <w:r>
-              <w:t xml:space="preserve">9.2 What is monitored today</w:t>
+              <w:t xml:space="preserve">9.1 Viewing the dashboard</w:t>
             </w:r>
             <w:r>
               <w:tab/>
@@ -969,7 +969,7 @@
           </w:pPr>
           <w:hyperlink w:history="1" w:anchor="_Toc38">
             <w:r>
-              <w:t xml:space="preserve">9.3 Every node pushes its own data (zt_zbx_push.py)</w:t>
+              <w:t xml:space="preserve">9.2 What is monitored today</w:t>
             </w:r>
             <w:r>
               <w:tab/>
@@ -992,7 +992,7 @@
           </w:pPr>
           <w:hyperlink w:history="1" w:anchor="_Toc39">
             <w:r>
-              <w:t xml:space="preserve">9.4 The two dashboard pages</w:t>
+              <w:t xml:space="preserve">9.3 Every node pushes its own data (zt_zbx_push.py)</w:t>
             </w:r>
             <w:r>
               <w:tab/>
@@ -1000,28 +1000,6 @@
             <w:r>
               <w:fldChar w:fldCharType="begin" w:dirty="true"/>
               <w:instrText xml:space="preserve">PAGEREF _Toc39 \h</w:instrText>
-              <w:fldChar w:fldCharType="separate"/>
-              <w:fldChar w:fldCharType="end"/>
-            </w:r>
-          </w:hyperlink>
-        </w:p>
-        <w:p>
-          <w:pPr>
-            <w:pStyle w:val="TOC1"/>
-            <w:tabs>
-              <w:tab w:val="right" w:pos="9026" w:leader="dot"/>
-            </w:tabs>
-          </w:pPr>
-          <w:hyperlink w:history="1" w:anchor="_Toc40">
-            <w:r>
-              <w:t xml:space="preserve">10. Remaining Work</w:t>
-            </w:r>
-            <w:r>
-              <w:tab/>
-            </w:r>
-            <w:r>
-              <w:fldChar w:fldCharType="begin" w:dirty="true"/>
-              <w:instrText xml:space="preserve">PAGEREF _Toc40 \h</w:instrText>
               <w:fldChar w:fldCharType="separate"/>
               <w:fldChar w:fldCharType="end"/>
             </w:r>
@@ -1035,9 +1013,31 @@
             </w:tabs>
             <w:ind w:left="220"/>
           </w:pPr>
+          <w:hyperlink w:history="1" w:anchor="_Toc40">
+            <w:r>
+              <w:t xml:space="preserve">9.4 The two dashboard pages</w:t>
+            </w:r>
+            <w:r>
+              <w:tab/>
+            </w:r>
+            <w:r>
+              <w:fldChar w:fldCharType="begin" w:dirty="true"/>
+              <w:instrText xml:space="preserve">PAGEREF _Toc40 \h</w:instrText>
+              <w:fldChar w:fldCharType="separate"/>
+              <w:fldChar w:fldCharType="end"/>
+            </w:r>
+          </w:hyperlink>
+        </w:p>
+        <w:p>
+          <w:pPr>
+            <w:pStyle w:val="TOC1"/>
+            <w:tabs>
+              <w:tab w:val="right" w:pos="9026" w:leader="dot"/>
+            </w:tabs>
+          </w:pPr>
           <w:hyperlink w:history="1" w:anchor="_Toc41">
             <w:r>
-              <w:t xml:space="preserve">Phase 3 (detection and response)</w:t>
+              <w:t xml:space="preserve">10. Remaining Work</w:t>
             </w:r>
             <w:r>
               <w:tab/>
@@ -1060,7 +1060,7 @@
           </w:pPr>
           <w:hyperlink w:history="1" w:anchor="_Toc42">
             <w:r>
-              <w:t xml:space="preserve">Phase 4 (validation and report)</w:t>
+              <w:t xml:space="preserve">Phase 3 (detection and response)</w:t>
             </w:r>
             <w:r>
               <w:tab/>
@@ -1068,28 +1068,6 @@
             <w:r>
               <w:fldChar w:fldCharType="begin" w:dirty="true"/>
               <w:instrText xml:space="preserve">PAGEREF _Toc42 \h</w:instrText>
-              <w:fldChar w:fldCharType="separate"/>
-              <w:fldChar w:fldCharType="end"/>
-            </w:r>
-          </w:hyperlink>
-        </w:p>
-        <w:p>
-          <w:pPr>
-            <w:pStyle w:val="TOC1"/>
-            <w:tabs>
-              <w:tab w:val="right" w:pos="9026" w:leader="dot"/>
-            </w:tabs>
-          </w:pPr>
-          <w:hyperlink w:history="1" w:anchor="_Toc43">
-            <w:r>
-              <w:t xml:space="preserve">11. Files and Commands</w:t>
-            </w:r>
-            <w:r>
-              <w:tab/>
-            </w:r>
-            <w:r>
-              <w:fldChar w:fldCharType="begin" w:dirty="true"/>
-              <w:instrText xml:space="preserve">PAGEREF _Toc43 \h</w:instrText>
               <w:fldChar w:fldCharType="separate"/>
               <w:fldChar w:fldCharType="end"/>
             </w:r>
@@ -1103,16 +1081,16 @@
             </w:tabs>
             <w:ind w:left="220"/>
           </w:pPr>
-          <w:hyperlink w:history="1" w:anchor="_Toc44">
-            <w:r>
-              <w:t xml:space="preserve">Daily routine</w:t>
+          <w:hyperlink w:history="1" w:anchor="_Toc43">
+            <w:r>
+              <w:t xml:space="preserve">Phase 4 (validation and report)</w:t>
             </w:r>
             <w:r>
               <w:tab/>
             </w:r>
             <w:r>
               <w:fldChar w:fldCharType="begin" w:dirty="true"/>
-              <w:instrText xml:space="preserve">PAGEREF _Toc44 \h</w:instrText>
+              <w:instrText xml:space="preserve">PAGEREF _Toc43 \h</w:instrText>
               <w:fldChar w:fldCharType="separate"/>
               <w:fldChar w:fldCharType="end"/>
             </w:r>
@@ -1125,9 +1103,32 @@
               <w:tab w:val="right" w:pos="9026" w:leader="dot"/>
             </w:tabs>
           </w:pPr>
+          <w:hyperlink w:history="1" w:anchor="_Toc44">
+            <w:r>
+              <w:t xml:space="preserve">11. Files and Commands</w:t>
+            </w:r>
+            <w:r>
+              <w:tab/>
+            </w:r>
+            <w:r>
+              <w:fldChar w:fldCharType="begin" w:dirty="true"/>
+              <w:instrText xml:space="preserve">PAGEREF _Toc44 \h</w:instrText>
+              <w:fldChar w:fldCharType="separate"/>
+              <w:fldChar w:fldCharType="end"/>
+            </w:r>
+          </w:hyperlink>
+        </w:p>
+        <w:p>
+          <w:pPr>
+            <w:pStyle w:val="TOC2"/>
+            <w:tabs>
+              <w:tab w:val="right" w:pos="9026" w:leader="dot"/>
+            </w:tabs>
+            <w:ind w:left="220"/>
+          </w:pPr>
           <w:hyperlink w:history="1" w:anchor="_Toc45">
             <w:r>
-              <w:t xml:space="preserve">12. Report Corrections Needed</w:t>
+              <w:t xml:space="preserve">Daily routine</w:t>
             </w:r>
             <w:r>
               <w:tab/>
@@ -1149,7 +1150,7 @@
           </w:pPr>
           <w:hyperlink w:history="1" w:anchor="_Toc46">
             <w:r>
-              <w:t xml:space="preserve">13. Risks and Open Questions</w:t>
+              <w:t xml:space="preserve">12. Report Corrections Needed</w:t>
             </w:r>
             <w:r>
               <w:tab/>
@@ -1157,6 +1158,28 @@
             <w:r>
               <w:fldChar w:fldCharType="begin" w:dirty="true"/>
               <w:instrText xml:space="preserve">PAGEREF _Toc46 \h</w:instrText>
+              <w:fldChar w:fldCharType="separate"/>
+              <w:fldChar w:fldCharType="end"/>
+            </w:r>
+          </w:hyperlink>
+        </w:p>
+        <w:p>
+          <w:pPr>
+            <w:pStyle w:val="TOC1"/>
+            <w:tabs>
+              <w:tab w:val="right" w:pos="9026" w:leader="dot"/>
+            </w:tabs>
+          </w:pPr>
+          <w:hyperlink w:history="1" w:anchor="_Toc47">
+            <w:r>
+              <w:t xml:space="preserve">13. Risks and Open Questions</w:t>
+            </w:r>
+            <w:r>
+              <w:tab/>
+            </w:r>
+            <w:r>
+              <w:fldChar w:fldCharType="begin" w:dirty="true"/>
+              <w:instrText xml:space="preserve">PAGEREF _Toc47 \h</w:instrText>
               <w:fldChar w:fldCharType="separate"/>
               <w:fldChar w:fldCharType="end"/>
             </w:r>
@@ -1796,7 +1819,7 @@
           </w:tcPr>
           <w:p>
             <w:r>
-              <w:t xml:space="preserve">In progress: block IP and alert-only done and tested live; quarantine and disable-account next</w:t>
+              <w:t xml:space="preserve">All four actions built and tested live: block IP, quarantine, disable account, alert only</w:t>
             </w:r>
           </w:p>
         </w:tc>
@@ -11179,14 +11202,357 @@
     </w:p>
     <w:p>
       <w:pPr>
+        <w:pStyle w:val="Heading2"/>
+      </w:pPr>
+      <w:bookmarkStart w:name="_Toc33" w:id="33"/>
+      <w:r>
+        <w:t xml:space="preserve">6.7 Response engine, part 2: quarantine and disable account</w:t>
+      </w:r>
+      <w:bookmarkEnd w:id="33"/>
+    </w:p>
+    <w:p>
+      <w:pPr>
+        <w:spacing w:after="120"/>
+      </w:pPr>
+      <w:r>
+        <w:t xml:space="preserve">Because the access ports get their VLAN from RADIUS at login, quarantine is identity-based, the way Cisco ISE does it. The engine writes a rule into /etc/freeradius/3.0/zt_dynamic in the radius container (included at the top of radius/users, so it overrides the normal entry), reloads FreeRADIUS, and bounces the PC's access port. The PC's supplicant logs in again at once and RADIUS now answers with VLAN 99. The lab has no DHCP, so the engine then gives the PC its quarantine address (10.10.30.50 becomes 10.10.99.50), exactly as lab-up.sh addresses the PCs. Disable account uses the same mechanism with a reject rule: the PC fails 802.1X and has no network at all.</w:t>
+      </w:r>
+    </w:p>
+    <w:tbl>
+      <w:tblPr>
+        <w:tblW w:type="dxa" w:w="9026"/>
+        <w:tblBorders>
+          <w:top w:val="single" w:color="auto" w:sz="4"/>
+          <w:left w:val="single" w:color="auto" w:sz="4"/>
+          <w:bottom w:val="single" w:color="auto" w:sz="4"/>
+          <w:right w:val="single" w:color="auto" w:sz="4"/>
+          <w:insideH w:val="single" w:color="auto" w:sz="4"/>
+          <w:insideV w:val="single" w:color="auto" w:sz="4"/>
+        </w:tblBorders>
+      </w:tblPr>
+      <w:tblGrid>
+        <w:gridCol w:w="2708"/>
+        <w:gridCol w:w="6318"/>
+      </w:tblGrid>
+      <w:tr>
+        <w:trPr>
+          <w:tblHeader/>
+        </w:trPr>
+        <w:tc>
+          <w:tcPr>
+            <w:tcW w:type="dxa" w:w="2708"/>
+            <w:tcBorders>
+              <w:top w:val="single" w:color="BFBFBF" w:sz="4"/>
+              <w:left w:val="single" w:color="BFBFBF" w:sz="4"/>
+              <w:bottom w:val="single" w:color="BFBFBF" w:sz="4"/>
+              <w:right w:val="single" w:color="BFBFBF" w:sz="4"/>
+            </w:tcBorders>
+            <w:shd w:fill="1F4E79" w:color="auto" w:val="clear"/>
+            <w:tcMar>
+              <w:top w:type="dxa" w:w="60"/>
+              <w:left w:type="dxa" w:w="100"/>
+              <w:bottom w:type="dxa" w:w="60"/>
+              <w:right w:type="dxa" w:w="100"/>
+            </w:tcMar>
+          </w:tcPr>
+          <w:p>
+            <w:r>
+              <w:rPr>
+                <w:b/>
+                <w:bCs/>
+                <w:color w:val="FFFFFF"/>
+                <w:sz w:val="19"/>
+                <w:szCs w:val="19"/>
+              </w:rPr>
+              <w:t xml:space="preserve">Live test (14 Oct)</w:t>
+            </w:r>
+          </w:p>
+        </w:tc>
+        <w:tc>
+          <w:tcPr>
+            <w:tcW w:type="dxa" w:w="6318"/>
+            <w:tcBorders>
+              <w:top w:val="single" w:color="BFBFBF" w:sz="4"/>
+              <w:left w:val="single" w:color="BFBFBF" w:sz="4"/>
+              <w:bottom w:val="single" w:color="BFBFBF" w:sz="4"/>
+              <w:right w:val="single" w:color="BFBFBF" w:sz="4"/>
+            </w:tcBorders>
+            <w:shd w:fill="1F4E79" w:color="auto" w:val="clear"/>
+            <w:tcMar>
+              <w:top w:type="dxa" w:w="60"/>
+              <w:left w:type="dxa" w:w="100"/>
+              <w:bottom w:type="dxa" w:w="60"/>
+              <w:right w:type="dxa" w:w="100"/>
+            </w:tcMar>
+          </w:tcPr>
+          <w:p>
+            <w:r>
+              <w:rPr>
+                <w:b/>
+                <w:bCs/>
+                <w:color w:val="FFFFFF"/>
+                <w:sz w:val="19"/>
+                <w:szCs w:val="19"/>
+              </w:rPr>
+              <w:t xml:space="preserve">Result</w:t>
+            </w:r>
+          </w:p>
+        </w:tc>
+      </w:tr>
+      <w:tr>
+        <w:tc>
+          <w:tcPr>
+            <w:tcW w:type="dxa" w:w="2708"/>
+            <w:tcBorders>
+              <w:top w:val="single" w:color="BFBFBF" w:sz="4"/>
+              <w:left w:val="single" w:color="BFBFBF" w:sz="4"/>
+              <w:bottom w:val="single" w:color="BFBFBF" w:sz="4"/>
+              <w:right w:val="single" w:color="BFBFBF" w:sz="4"/>
+            </w:tcBorders>
+            <w:tcMar>
+              <w:top w:type="dxa" w:w="60"/>
+              <w:left w:type="dxa" w:w="100"/>
+              <w:bottom w:type="dxa" w:w="60"/>
+              <w:right w:type="dxa" w:w="100"/>
+            </w:tcMar>
+          </w:tcPr>
+          <w:p>
+            <w:r>
+              <w:t xml:space="preserve">quarantine guest-pc</w:t>
+            </w:r>
+          </w:p>
+        </w:tc>
+        <w:tc>
+          <w:tcPr>
+            <w:tcW w:type="dxa" w:w="6318"/>
+            <w:tcBorders>
+              <w:top w:val="single" w:color="BFBFBF" w:sz="4"/>
+              <w:left w:val="single" w:color="BFBFBF" w:sz="4"/>
+              <w:bottom w:val="single" w:color="BFBFBF" w:sz="4"/>
+              <w:right w:val="single" w:color="BFBFBF" w:sz="4"/>
+            </w:tcBorders>
+            <w:tcMar>
+              <w:top w:type="dxa" w:w="60"/>
+              <w:left w:type="dxa" w:w="100"/>
+              <w:bottom w:type="dxa" w:w="60"/>
+              <w:right w:type="dxa" w:w="100"/>
+            </w:tcMar>
+          </w:tcPr>
+          <w:p>
+            <w:r>
+              <w:t xml:space="preserve">guest1 in VLAN 99 QUARANTINE 1.1 s after the bounce; action applied in 1.4 s including SSH login; guest-pc lost web access, staff-pc unaffected</w:t>
+            </w:r>
+          </w:p>
+        </w:tc>
+      </w:tr>
+      <w:tr>
+        <w:tc>
+          <w:tcPr>
+            <w:tcW w:type="dxa" w:w="2708"/>
+            <w:tcBorders>
+              <w:top w:val="single" w:color="BFBFBF" w:sz="4"/>
+              <w:left w:val="single" w:color="BFBFBF" w:sz="4"/>
+              <w:bottom w:val="single" w:color="BFBFBF" w:sz="4"/>
+              <w:right w:val="single" w:color="BFBFBF" w:sz="4"/>
+            </w:tcBorders>
+            <w:tcMar>
+              <w:top w:type="dxa" w:w="60"/>
+              <w:left w:type="dxa" w:w="100"/>
+              <w:bottom w:type="dxa" w:w="60"/>
+              <w:right w:type="dxa" w:w="100"/>
+            </w:tcMar>
+          </w:tcPr>
+          <w:p>
+            <w:r>
+              <w:t xml:space="preserve">What a quarantined PC may reach</w:t>
+            </w:r>
+          </w:p>
+        </w:tc>
+        <w:tc>
+          <w:tcPr>
+            <w:tcW w:type="dxa" w:w="6318"/>
+            <w:tcBorders>
+              <w:top w:val="single" w:color="BFBFBF" w:sz="4"/>
+              <w:left w:val="single" w:color="BFBFBF" w:sz="4"/>
+              <w:bottom w:val="single" w:color="BFBFBF" w:sz="4"/>
+              <w:right w:val="single" w:color="BFBFBF" w:sz="4"/>
+            </w:tcBorders>
+            <w:tcMar>
+              <w:top w:type="dxa" w:w="60"/>
+              <w:left w:type="dxa" w:w="100"/>
+              <w:bottom w:type="dxa" w:w="60"/>
+              <w:right w:type="dxa" w:w="100"/>
+            </w:tcMar>
+          </w:tcPr>
+          <w:p>
+            <w:r>
+              <w:t xml:space="preserve">ZT_POLICY counters: line 20 (RADIUS udp 1812) 1 packet permitted, line 30 (SIEM) 2 permitted, line 40 (everything else) 11 denied: web, staff PC, internet, gateway, RADIUS ping</w:t>
+            </w:r>
+          </w:p>
+        </w:tc>
+      </w:tr>
+      <w:tr>
+        <w:tc>
+          <w:tcPr>
+            <w:tcW w:type="dxa" w:w="2708"/>
+            <w:tcBorders>
+              <w:top w:val="single" w:color="BFBFBF" w:sz="4"/>
+              <w:left w:val="single" w:color="BFBFBF" w:sz="4"/>
+              <w:bottom w:val="single" w:color="BFBFBF" w:sz="4"/>
+              <w:right w:val="single" w:color="BFBFBF" w:sz="4"/>
+            </w:tcBorders>
+            <w:tcMar>
+              <w:top w:type="dxa" w:w="60"/>
+              <w:left w:type="dxa" w:w="100"/>
+              <w:bottom w:type="dxa" w:w="60"/>
+              <w:right w:type="dxa" w:w="100"/>
+            </w:tcMar>
+          </w:tcPr>
+          <w:p>
+            <w:r>
+              <w:t xml:space="preserve">release guest-pc</w:t>
+            </w:r>
+          </w:p>
+        </w:tc>
+        <w:tc>
+          <w:tcPr>
+            <w:tcW w:type="dxa" w:w="6318"/>
+            <w:tcBorders>
+              <w:top w:val="single" w:color="BFBFBF" w:sz="4"/>
+              <w:left w:val="single" w:color="BFBFBF" w:sz="4"/>
+              <w:bottom w:val="single" w:color="BFBFBF" w:sz="4"/>
+              <w:right w:val="single" w:color="BFBFBF" w:sz="4"/>
+            </w:tcBorders>
+            <w:tcMar>
+              <w:top w:type="dxa" w:w="60"/>
+              <w:left w:type="dxa" w:w="100"/>
+              <w:bottom w:type="dxa" w:w="60"/>
+              <w:right w:type="dxa" w:w="100"/>
+            </w:tcMar>
+          </w:tcPr>
+          <w:p>
+            <w:r>
+              <w:t xml:space="preserve">Back in VLAN 30 after 1.1 s; web access restored</w:t>
+            </w:r>
+          </w:p>
+        </w:tc>
+      </w:tr>
+      <w:tr>
+        <w:tc>
+          <w:tcPr>
+            <w:tcW w:type="dxa" w:w="2708"/>
+            <w:tcBorders>
+              <w:top w:val="single" w:color="BFBFBF" w:sz="4"/>
+              <w:left w:val="single" w:color="BFBFBF" w:sz="4"/>
+              <w:bottom w:val="single" w:color="BFBFBF" w:sz="4"/>
+              <w:right w:val="single" w:color="BFBFBF" w:sz="4"/>
+            </w:tcBorders>
+            <w:tcMar>
+              <w:top w:type="dxa" w:w="60"/>
+              <w:left w:type="dxa" w:w="100"/>
+              <w:bottom w:type="dxa" w:w="60"/>
+              <w:right w:type="dxa" w:w="100"/>
+            </w:tcMar>
+          </w:tcPr>
+          <w:p>
+            <w:r>
+              <w:t xml:space="preserve">disable staff-pc (alice)</w:t>
+            </w:r>
+          </w:p>
+        </w:tc>
+        <w:tc>
+          <w:tcPr>
+            <w:tcW w:type="dxa" w:w="6318"/>
+            <w:tcBorders>
+              <w:top w:val="single" w:color="BFBFBF" w:sz="4"/>
+              <w:left w:val="single" w:color="BFBFBF" w:sz="4"/>
+              <w:bottom w:val="single" w:color="BFBFBF" w:sz="4"/>
+              <w:right w:val="single" w:color="BFBFBF" w:sz="4"/>
+            </w:tcBorders>
+            <w:tcMar>
+              <w:top w:type="dxa" w:w="60"/>
+              <w:left w:type="dxa" w:w="100"/>
+              <w:bottom w:type="dxa" w:w="60"/>
+              <w:right w:type="dxa" w:w="100"/>
+            </w:tcMar>
+          </w:tcPr>
+          <w:p>
+            <w:r>
+              <w:t xml:space="preserve">Port Et3 FAILED 1.1 s after the bounce; staff-pc has no network</w:t>
+            </w:r>
+          </w:p>
+        </w:tc>
+      </w:tr>
+      <w:tr>
+        <w:tc>
+          <w:tcPr>
+            <w:tcW w:type="dxa" w:w="2708"/>
+            <w:tcBorders>
+              <w:top w:val="single" w:color="BFBFBF" w:sz="4"/>
+              <w:left w:val="single" w:color="BFBFBF" w:sz="4"/>
+              <w:bottom w:val="single" w:color="BFBFBF" w:sz="4"/>
+              <w:right w:val="single" w:color="BFBFBF" w:sz="4"/>
+            </w:tcBorders>
+            <w:tcMar>
+              <w:top w:type="dxa" w:w="60"/>
+              <w:left w:type="dxa" w:w="100"/>
+              <w:bottom w:type="dxa" w:w="60"/>
+              <w:right w:type="dxa" w:w="100"/>
+            </w:tcMar>
+          </w:tcPr>
+          <w:p>
+            <w:r>
+              <w:t xml:space="preserve">enable staff-pc</w:t>
+            </w:r>
+          </w:p>
+        </w:tc>
+        <w:tc>
+          <w:tcPr>
+            <w:tcW w:type="dxa" w:w="6318"/>
+            <w:tcBorders>
+              <w:top w:val="single" w:color="BFBFBF" w:sz="4"/>
+              <w:left w:val="single" w:color="BFBFBF" w:sz="4"/>
+              <w:bottom w:val="single" w:color="BFBFBF" w:sz="4"/>
+              <w:right w:val="single" w:color="BFBFBF" w:sz="4"/>
+            </w:tcBorders>
+            <w:tcMar>
+              <w:top w:type="dxa" w:w="60"/>
+              <w:left w:type="dxa" w:w="100"/>
+              <w:bottom w:type="dxa" w:w="60"/>
+              <w:right w:type="dxa" w:w="100"/>
+            </w:tcMar>
+          </w:tcPr>
+          <w:p>
+            <w:r>
+              <w:t xml:space="preserve">Back in VLAN 20 after 2.2 s; web access restored</w:t>
+            </w:r>
+          </w:p>
+        </w:tc>
+      </w:tr>
+    </w:tbl>
+    <w:p>
+      <w:pPr>
+        <w:spacing w:after="120"/>
+      </w:pPr>
+    </w:p>
+    <w:p>
+      <w:pPr>
+        <w:spacing w:after="120"/>
+      </w:pPr>
+      <w:r>
+        <w:t xml:space="preserve">Three problems were found and fixed on the way: FreeRADIUS ignores a reload signal when only an included file changed, so the engine also touches the main users file; Netmiko's is_alive() check sends a stray byte that leaves the Arista CLI out of step and makes the next command time out, so the engine checks the SSH transport instead; and the dynamic rules file must exist before FreeRADIUS starts, so the topology now creates it. test_respond.py covers the rule text, port bounce, quarantine address, de-duplication and restore (9 checks, all pass).</w:t>
+      </w:r>
+    </w:p>
+    <w:p>
+      <w:pPr>
         <w:pStyle w:val="Heading1"/>
         <w:pageBreakBefore/>
       </w:pPr>
-      <w:bookmarkStart w:name="_Toc33" w:id="33"/>
+      <w:bookmarkStart w:name="_Toc34" w:id="34"/>
       <w:r>
         <w:t xml:space="preserve">7. Verified Evidence for Chapter 5</w:t>
       </w:r>
-      <w:bookmarkEnd w:id="33"/>
+      <w:bookmarkEnd w:id="34"/>
     </w:p>
     <w:p>
       <w:pPr>
@@ -11802,11 +12168,11 @@
         <w:pStyle w:val="Heading1"/>
         <w:pageBreakBefore/>
       </w:pPr>
-      <w:bookmarkStart w:name="_Toc34" w:id="34"/>
+      <w:bookmarkStart w:name="_Toc35" w:id="35"/>
       <w:r>
         <w:t xml:space="preserve">8. Problems Encountered and Fixes</w:t>
       </w:r>
-      <w:bookmarkEnd w:id="34"/>
+      <w:bookmarkEnd w:id="35"/>
     </w:p>
     <w:tbl>
       <w:tblPr>
@@ -13027,6 +13393,142 @@
           </w:tcPr>
           <w:p>
             <w:r>
+              <w:t xml:space="preserve">Quarantine rule had no effect after reload</w:t>
+            </w:r>
+          </w:p>
+        </w:tc>
+        <w:tc>
+          <w:tcPr>
+            <w:tcW w:type="dxa" w:w="3069"/>
+            <w:tcBorders>
+              <w:top w:val="single" w:color="BFBFBF" w:sz="4"/>
+              <w:left w:val="single" w:color="BFBFBF" w:sz="4"/>
+              <w:bottom w:val="single" w:color="BFBFBF" w:sz="4"/>
+              <w:right w:val="single" w:color="BFBFBF" w:sz="4"/>
+            </w:tcBorders>
+            <w:tcMar>
+              <w:top w:type="dxa" w:w="60"/>
+              <w:left w:type="dxa" w:w="100"/>
+              <w:bottom w:type="dxa" w:w="60"/>
+              <w:right w:type="dxa" w:w="100"/>
+            </w:tcMar>
+          </w:tcPr>
+          <w:p>
+            <w:r>
+              <w:t xml:space="preserve">FreeRADIUS reloads on SIGHUP only when the main users file changed, not an included file</w:t>
+            </w:r>
+          </w:p>
+        </w:tc>
+        <w:tc>
+          <w:tcPr>
+            <w:tcW w:type="dxa" w:w="3430"/>
+            <w:tcBorders>
+              <w:top w:val="single" w:color="BFBFBF" w:sz="4"/>
+              <w:left w:val="single" w:color="BFBFBF" w:sz="4"/>
+              <w:bottom w:val="single" w:color="BFBFBF" w:sz="4"/>
+              <w:right w:val="single" w:color="BFBFBF" w:sz="4"/>
+            </w:tcBorders>
+            <w:tcMar>
+              <w:top w:type="dxa" w:w="60"/>
+              <w:left w:type="dxa" w:w="100"/>
+              <w:bottom w:type="dxa" w:w="60"/>
+              <w:right w:type="dxa" w:w="100"/>
+            </w:tcMar>
+          </w:tcPr>
+          <w:p>
+            <w:r>
+              <w:t xml:space="preserve">Engine touches the main users file before each reload</w:t>
+            </w:r>
+          </w:p>
+        </w:tc>
+      </w:tr>
+      <w:tr>
+        <w:tc>
+          <w:tcPr>
+            <w:tcW w:type="dxa" w:w="2527"/>
+            <w:tcBorders>
+              <w:top w:val="single" w:color="BFBFBF" w:sz="4"/>
+              <w:left w:val="single" w:color="BFBFBF" w:sz="4"/>
+              <w:bottom w:val="single" w:color="BFBFBF" w:sz="4"/>
+              <w:right w:val="single" w:color="BFBFBF" w:sz="4"/>
+            </w:tcBorders>
+            <w:tcMar>
+              <w:top w:type="dxa" w:w="60"/>
+              <w:left w:type="dxa" w:w="100"/>
+              <w:bottom w:type="dxa" w:w="60"/>
+              <w:right w:type="dxa" w:w="100"/>
+            </w:tcMar>
+          </w:tcPr>
+          <w:p>
+            <w:r>
+              <w:t xml:space="preserve">SSH command timed out right after a port bounce</w:t>
+            </w:r>
+          </w:p>
+        </w:tc>
+        <w:tc>
+          <w:tcPr>
+            <w:tcW w:type="dxa" w:w="3069"/>
+            <w:tcBorders>
+              <w:top w:val="single" w:color="BFBFBF" w:sz="4"/>
+              <w:left w:val="single" w:color="BFBFBF" w:sz="4"/>
+              <w:bottom w:val="single" w:color="BFBFBF" w:sz="4"/>
+              <w:right w:val="single" w:color="BFBFBF" w:sz="4"/>
+            </w:tcBorders>
+            <w:tcMar>
+              <w:top w:type="dxa" w:w="60"/>
+              <w:left w:type="dxa" w:w="100"/>
+              <w:bottom w:type="dxa" w:w="60"/>
+              <w:right w:type="dxa" w:w="100"/>
+            </w:tcMar>
+          </w:tcPr>
+          <w:p>
+            <w:r>
+              <w:t xml:space="preserve">Netmiko is_alive() writes a NUL byte that leaves the Arista CLI out of step</w:t>
+            </w:r>
+          </w:p>
+        </w:tc>
+        <w:tc>
+          <w:tcPr>
+            <w:tcW w:type="dxa" w:w="3430"/>
+            <w:tcBorders>
+              <w:top w:val="single" w:color="BFBFBF" w:sz="4"/>
+              <w:left w:val="single" w:color="BFBFBF" w:sz="4"/>
+              <w:bottom w:val="single" w:color="BFBFBF" w:sz="4"/>
+              <w:right w:val="single" w:color="BFBFBF" w:sz="4"/>
+            </w:tcBorders>
+            <w:tcMar>
+              <w:top w:type="dxa" w:w="60"/>
+              <w:left w:type="dxa" w:w="100"/>
+              <w:bottom w:type="dxa" w:w="60"/>
+              <w:right w:type="dxa" w:w="100"/>
+            </w:tcMar>
+          </w:tcPr>
+          <w:p>
+            <w:r>
+              <w:t xml:space="preserve">Check the SSH transport instead of calling is_alive()</w:t>
+            </w:r>
+          </w:p>
+        </w:tc>
+      </w:tr>
+      <w:tr>
+        <w:tc>
+          <w:tcPr>
+            <w:tcW w:type="dxa" w:w="2527"/>
+            <w:tcBorders>
+              <w:top w:val="single" w:color="BFBFBF" w:sz="4"/>
+              <w:left w:val="single" w:color="BFBFBF" w:sz="4"/>
+              <w:bottom w:val="single" w:color="BFBFBF" w:sz="4"/>
+              <w:right w:val="single" w:color="BFBFBF" w:sz="4"/>
+            </w:tcBorders>
+            <w:tcMar>
+              <w:top w:type="dxa" w:w="60"/>
+              <w:left w:type="dxa" w:w="100"/>
+              <w:bottom w:type="dxa" w:w="60"/>
+              <w:right w:type="dxa" w:w="100"/>
+            </w:tcMar>
+          </w:tcPr>
+          <w:p>
+            <w:r>
               <w:t xml:space="preserve">Little free RAM for captures</w:t>
             </w:r>
           </w:p>
@@ -13082,21 +13584,21 @@
         <w:pStyle w:val="Heading1"/>
         <w:pageBreakBefore/>
       </w:pPr>
-      <w:bookmarkStart w:name="_Toc35" w:id="35"/>
+      <w:bookmarkStart w:name="_Toc36" w:id="36"/>
       <w:r>
         <w:t xml:space="preserve">9. Monitoring with Zabbix</w:t>
       </w:r>
-      <w:bookmarkEnd w:id="35"/>
+      <w:bookmarkEnd w:id="36"/>
     </w:p>
     <w:p>
       <w:pPr>
         <w:pStyle w:val="Heading2"/>
       </w:pPr>
-      <w:bookmarkStart w:name="_Toc36" w:id="36"/>
+      <w:bookmarkStart w:name="_Toc37" w:id="37"/>
       <w:r>
         <w:t xml:space="preserve">9.1 Viewing the dashboard</w:t>
       </w:r>
-      <w:bookmarkEnd w:id="36"/>
+      <w:bookmarkEnd w:id="37"/>
     </w:p>
     <w:p>
       <w:pPr>
@@ -13165,11 +13667,11 @@
       <w:pPr>
         <w:pStyle w:val="Heading2"/>
       </w:pPr>
-      <w:bookmarkStart w:name="_Toc37" w:id="37"/>
+      <w:bookmarkStart w:name="_Toc38" w:id="38"/>
       <w:r>
         <w:t xml:space="preserve">9.2 What is monitored today</w:t>
       </w:r>
-      <w:bookmarkEnd w:id="37"/>
+      <w:bookmarkEnd w:id="38"/>
     </w:p>
     <w:p>
       <w:pPr>
@@ -13201,11 +13703,11 @@
       <w:pPr>
         <w:pStyle w:val="Heading2"/>
       </w:pPr>
-      <w:bookmarkStart w:name="_Toc38" w:id="38"/>
+      <w:bookmarkStart w:name="_Toc39" w:id="39"/>
       <w:r>
         <w:t xml:space="preserve">9.3 Every node pushes its own data (zt_zbx_push.py)</w:t>
       </w:r>
-      <w:bookmarkEnd w:id="38"/>
+      <w:bookmarkEnd w:id="39"/>
     </w:p>
     <w:p>
       <w:pPr>
@@ -13590,11 +14092,11 @@
       <w:pPr>
         <w:pStyle w:val="Heading2"/>
       </w:pPr>
-      <w:bookmarkStart w:name="_Toc39" w:id="39"/>
+      <w:bookmarkStart w:name="_Toc40" w:id="40"/>
       <w:r>
         <w:t xml:space="preserve">9.4 The two dashboard pages</w:t>
       </w:r>
-      <w:bookmarkEnd w:id="39"/>
+      <w:bookmarkEnd w:id="40"/>
     </w:p>
     <w:tbl>
       <w:tblPr>
@@ -13871,21 +14373,21 @@
         <w:pStyle w:val="Heading1"/>
         <w:pageBreakBefore/>
       </w:pPr>
-      <w:bookmarkStart w:name="_Toc40" w:id="40"/>
+      <w:bookmarkStart w:name="_Toc41" w:id="41"/>
       <w:r>
         <w:t xml:space="preserve">10. Remaining Work</w:t>
       </w:r>
-      <w:bookmarkEnd w:id="40"/>
+      <w:bookmarkEnd w:id="41"/>
     </w:p>
     <w:p>
       <w:pPr>
         <w:pStyle w:val="Heading2"/>
       </w:pPr>
-      <w:bookmarkStart w:name="_Toc41" w:id="41"/>
+      <w:bookmarkStart w:name="_Toc42" w:id="42"/>
       <w:r>
         <w:t xml:space="preserve">Phase 3 (detection and response)</w:t>
       </w:r>
-      <w:bookmarkEnd w:id="41"/>
+      <w:bookmarkEnd w:id="42"/>
     </w:p>
     <w:p>
       <w:pPr>
@@ -13901,10 +14403,10 @@
           <w:b/>
           <w:bCs/>
         </w:rPr>
-        <w:t xml:space="preserve">Response engine</w:t>
-      </w:r>
-      <w:r>
-        <w:t xml:space="preserve"> following the Chapter 4 activity diagram: DoS gives block source IP (deny line in ZT_POLICY above the permit, optionally iptables on edge); brute-force or port scan gives quarantine; off-hours or unclassified gives alert only; plus the abstract's disable-account action (reject the user in FreeRADIUS and bounce the port).</w:t>
+        <w:t xml:space="preserve">Alerts</w:t>
+      </w:r>
+      <w:r>
+        <w:t xml:space="preserve"> - JSON alert and incident log, pushed to Zabbix.</w:t>
       </w:r>
     </w:p>
     <w:p>
@@ -13921,46 +14423,6 @@
           <w:b/>
           <w:bCs/>
         </w:rPr>
-        <w:t xml:space="preserve">Quarantine on cEOS</w:t>
-      </w:r>
-      <w:r>
-        <w:t xml:space="preserve"> - the riskiest piece: 802.1X assigns VLANs dynamically, so a plain access-VLAN change will not stick. Test the authentication-failure VLAN feature first; otherwise disable the account and bounce the port.</w:t>
-      </w:r>
-    </w:p>
-    <w:p>
-      <w:pPr>
-        <w:pStyle w:val="ListParagraph"/>
-        <w:numPr>
-          <w:ilvl w:val="0"/>
-          <w:numId w:val="5"/>
-        </w:numPr>
-        <w:spacing w:after="60"/>
-      </w:pPr>
-      <w:r>
-        <w:rPr>
-          <w:b/>
-          <w:bCs/>
-        </w:rPr>
-        <w:t xml:space="preserve">Alerts</w:t>
-      </w:r>
-      <w:r>
-        <w:t xml:space="preserve"> - JSON alert and incident log, pushed to Zabbix.</w:t>
-      </w:r>
-    </w:p>
-    <w:p>
-      <w:pPr>
-        <w:pStyle w:val="ListParagraph"/>
-        <w:numPr>
-          <w:ilvl w:val="0"/>
-          <w:numId w:val="5"/>
-        </w:numPr>
-        <w:spacing w:after="60"/>
-      </w:pPr>
-      <w:r>
-        <w:rPr>
-          <w:b/>
-          <w:bCs/>
-        </w:rPr>
         <w:t xml:space="preserve">Orchestrator</w:t>
       </w:r>
       <w:r>
@@ -13971,11 +14433,11 @@
       <w:pPr>
         <w:pStyle w:val="Heading2"/>
       </w:pPr>
-      <w:bookmarkStart w:name="_Toc42" w:id="42"/>
+      <w:bookmarkStart w:name="_Toc43" w:id="43"/>
       <w:r>
         <w:t xml:space="preserve">Phase 4 (validation and report)</w:t>
       </w:r>
-      <w:bookmarkEnd w:id="42"/>
+      <w:bookmarkEnd w:id="43"/>
     </w:p>
     <w:p>
       <w:pPr>
@@ -14021,11 +14483,11 @@
         <w:pStyle w:val="Heading1"/>
         <w:pageBreakBefore/>
       </w:pPr>
-      <w:bookmarkStart w:name="_Toc43" w:id="43"/>
+      <w:bookmarkStart w:name="_Toc44" w:id="44"/>
       <w:r>
         <w:t xml:space="preserve">11. Files and Commands</w:t>
       </w:r>
-      <w:bookmarkEnd w:id="43"/>
+      <w:bookmarkEnd w:id="44"/>
     </w:p>
     <w:p>
       <w:pPr>
@@ -15052,7 +15514,7 @@
           </w:tcPr>
           <w:p>
             <w:r>
-              <w:t xml:space="preserve">Response engine (block IP, alert only, incident log, Zabbix) and its 6 offline tests</w:t>
+              <w:t xml:space="preserve">Response engine (block IP, quarantine, disable account, alert only, reset; incident log, Zabbix) and its 9 offline tests</w:t>
             </w:r>
           </w:p>
         </w:tc>
@@ -15159,11 +15621,11 @@
       <w:pPr>
         <w:pStyle w:val="Heading2"/>
       </w:pPr>
-      <w:bookmarkStart w:name="_Toc44" w:id="44"/>
+      <w:bookmarkStart w:name="_Toc45" w:id="45"/>
       <w:r>
         <w:t xml:space="preserve">Daily routine</w:t>
       </w:r>
-      <w:bookmarkEnd w:id="44"/>
+      <w:bookmarkEnd w:id="45"/>
     </w:p>
     <w:p>
       <w:pPr>
@@ -15283,11 +15745,11 @@
         <w:pStyle w:val="Heading1"/>
         <w:pageBreakBefore/>
       </w:pPr>
-      <w:bookmarkStart w:name="_Toc45" w:id="45"/>
+      <w:bookmarkStart w:name="_Toc46" w:id="46"/>
       <w:r>
         <w:t xml:space="preserve">12. Report Corrections Needed</w:t>
       </w:r>
-      <w:bookmarkEnd w:id="45"/>
+      <w:bookmarkEnd w:id="46"/>
     </w:p>
     <w:p>
       <w:pPr>
@@ -15414,11 +15876,11 @@
         <w:pStyle w:val="Heading1"/>
         <w:pageBreakBefore/>
       </w:pPr>
-      <w:bookmarkStart w:name="_Toc46" w:id="46"/>
+      <w:bookmarkStart w:name="_Toc47" w:id="47"/>
       <w:r>
         <w:t xml:space="preserve">13. Risks and Open Questions</w:t>
       </w:r>
-      <w:bookmarkEnd w:id="46"/>
+      <w:bookmarkEnd w:id="47"/>
     </w:p>
     <w:p>
       <w:pPr>
@@ -15457,7 +15919,7 @@
         <w:t xml:space="preserve">Quarantine</w:t>
       </w:r>
       <w:r>
-        <w:t xml:space="preserve"> on a dynamically assigned 802.1X port is untested and is the riskiest remaining piece.</w:t>
+        <w:t xml:space="preserve"> was the riskiest piece and is now proven (section 6.7); it relies on a port bounce, which briefly interrupts the quarantined PC, as intended.</w:t>
       </w:r>
     </w:p>
     <w:p>

</xml_diff>

<commit_message>
Log: remaining work updated
</commit_message>
<xml_diff>
--- a/ZT_Project_Implementation_Log.docx
+++ b/ZT_Project_Implementation_Log.docx
@@ -84,7 +84,7 @@
           <w:sz w:val="22"/>
           <w:szCs w:val="22"/>
         </w:rPr>
-        <w:t xml:space="preserve">Last updated 14 October 2026 at 14:21</w:t>
+        <w:t xml:space="preserve">Last updated 14 October 2026 at 14:22</w:t>
       </w:r>
     </w:p>
     <w:p>
@@ -14388,26 +14388,6 @@
         <w:t xml:space="preserve">Phase 3 (detection and response)</w:t>
       </w:r>
       <w:bookmarkEnd w:id="42"/>
-    </w:p>
-    <w:p>
-      <w:pPr>
-        <w:pStyle w:val="ListParagraph"/>
-        <w:numPr>
-          <w:ilvl w:val="0"/>
-          <w:numId w:val="5"/>
-        </w:numPr>
-        <w:spacing w:after="60"/>
-      </w:pPr>
-      <w:r>
-        <w:rPr>
-          <w:b/>
-          <w:bCs/>
-        </w:rPr>
-        <w:t xml:space="preserve">Alerts</w:t>
-      </w:r>
-      <w:r>
-        <w:t xml:space="preserve"> - JSON alert and incident log, pushed to Zabbix.</w:t>
-      </w:r>
     </w:p>
     <w:p>
       <w:pPr>

</xml_diff>

<commit_message>
Live pipeline (PipelineOrchestrator): continuous capture, hybrid scoring, classification, automatic response
End-to-end test detects and answers all five attacks (1.0-1.8 s after the window
closes). Fixes from earlier runs: unique quarantine address per PC, spaced and
confirmed RADIUS reloads, pipeline survives failed responses, single instance,
SIGTERM stop. Classification accuracy added to the evaluation (100%).
</commit_message>
<xml_diff>
--- a/ZT_Project_Implementation_Log.docx
+++ b/ZT_Project_Implementation_Log.docx
@@ -84,7 +84,7 @@
           <w:sz w:val="22"/>
           <w:szCs w:val="22"/>
         </w:rPr>
-        <w:t xml:space="preserve">Last updated 14 October 2026 at 14:22</w:t>
+        <w:t xml:space="preserve">Last updated 14 October 2026 at 15:04</w:t>
       </w:r>
     </w:p>
     <w:p>
@@ -872,14 +872,15 @@
         </w:p>
         <w:p>
           <w:pPr>
-            <w:pStyle w:val="TOC1"/>
+            <w:pStyle w:val="TOC2"/>
             <w:tabs>
               <w:tab w:val="right" w:pos="9026" w:leader="dot"/>
             </w:tabs>
+            <w:ind w:left="220"/>
           </w:pPr>
           <w:hyperlink w:history="1" w:anchor="_Toc34">
             <w:r>
-              <w:t xml:space="preserve">7. Verified Evidence for Chapter 5</w:t>
+              <w:t xml:space="preserve">6.8 The live pipeline (step 3F.5)</w:t>
             </w:r>
             <w:r>
               <w:tab/>
@@ -901,7 +902,7 @@
           </w:pPr>
           <w:hyperlink w:history="1" w:anchor="_Toc35">
             <w:r>
-              <w:t xml:space="preserve">8. Problems Encountered and Fixes</w:t>
+              <w:t xml:space="preserve">7. Verified Evidence for Chapter 5</w:t>
             </w:r>
             <w:r>
               <w:tab/>
@@ -923,7 +924,7 @@
           </w:pPr>
           <w:hyperlink w:history="1" w:anchor="_Toc36">
             <w:r>
-              <w:t xml:space="preserve">9. Monitoring with Zabbix</w:t>
+              <w:t xml:space="preserve">8. Problems Encountered and Fixes</w:t>
             </w:r>
             <w:r>
               <w:tab/>
@@ -938,15 +939,14 @@
         </w:p>
         <w:p>
           <w:pPr>
-            <w:pStyle w:val="TOC2"/>
+            <w:pStyle w:val="TOC1"/>
             <w:tabs>
               <w:tab w:val="right" w:pos="9026" w:leader="dot"/>
             </w:tabs>
-            <w:ind w:left="220"/>
           </w:pPr>
           <w:hyperlink w:history="1" w:anchor="_Toc37">
             <w:r>
-              <w:t xml:space="preserve">9.1 Viewing the dashboard</w:t>
+              <w:t xml:space="preserve">9. Monitoring with Zabbix</w:t>
             </w:r>
             <w:r>
               <w:tab/>
@@ -969,7 +969,7 @@
           </w:pPr>
           <w:hyperlink w:history="1" w:anchor="_Toc38">
             <w:r>
-              <w:t xml:space="preserve">9.2 What is monitored today</w:t>
+              <w:t xml:space="preserve">9.1 Viewing the dashboard</w:t>
             </w:r>
             <w:r>
               <w:tab/>
@@ -992,7 +992,7 @@
           </w:pPr>
           <w:hyperlink w:history="1" w:anchor="_Toc39">
             <w:r>
-              <w:t xml:space="preserve">9.3 Every node pushes its own data (zt_zbx_push.py)</w:t>
+              <w:t xml:space="preserve">9.2 What is monitored today</w:t>
             </w:r>
             <w:r>
               <w:tab/>
@@ -1015,7 +1015,7 @@
           </w:pPr>
           <w:hyperlink w:history="1" w:anchor="_Toc40">
             <w:r>
-              <w:t xml:space="preserve">9.4 The two dashboard pages</w:t>
+              <w:t xml:space="preserve">9.3 Every node pushes its own data (zt_zbx_push.py)</w:t>
             </w:r>
             <w:r>
               <w:tab/>
@@ -1023,28 +1023,6 @@
             <w:r>
               <w:fldChar w:fldCharType="begin" w:dirty="true"/>
               <w:instrText xml:space="preserve">PAGEREF _Toc40 \h</w:instrText>
-              <w:fldChar w:fldCharType="separate"/>
-              <w:fldChar w:fldCharType="end"/>
-            </w:r>
-          </w:hyperlink>
-        </w:p>
-        <w:p>
-          <w:pPr>
-            <w:pStyle w:val="TOC1"/>
-            <w:tabs>
-              <w:tab w:val="right" w:pos="9026" w:leader="dot"/>
-            </w:tabs>
-          </w:pPr>
-          <w:hyperlink w:history="1" w:anchor="_Toc41">
-            <w:r>
-              <w:t xml:space="preserve">10. Remaining Work</w:t>
-            </w:r>
-            <w:r>
-              <w:tab/>
-            </w:r>
-            <w:r>
-              <w:fldChar w:fldCharType="begin" w:dirty="true"/>
-              <w:instrText xml:space="preserve">PAGEREF _Toc41 \h</w:instrText>
               <w:fldChar w:fldCharType="separate"/>
               <w:fldChar w:fldCharType="end"/>
             </w:r>
@@ -1058,9 +1036,31 @@
             </w:tabs>
             <w:ind w:left="220"/>
           </w:pPr>
+          <w:hyperlink w:history="1" w:anchor="_Toc41">
+            <w:r>
+              <w:t xml:space="preserve">9.4 The two dashboard pages</w:t>
+            </w:r>
+            <w:r>
+              <w:tab/>
+            </w:r>
+            <w:r>
+              <w:fldChar w:fldCharType="begin" w:dirty="true"/>
+              <w:instrText xml:space="preserve">PAGEREF _Toc41 \h</w:instrText>
+              <w:fldChar w:fldCharType="separate"/>
+              <w:fldChar w:fldCharType="end"/>
+            </w:r>
+          </w:hyperlink>
+        </w:p>
+        <w:p>
+          <w:pPr>
+            <w:pStyle w:val="TOC1"/>
+            <w:tabs>
+              <w:tab w:val="right" w:pos="9026" w:leader="dot"/>
+            </w:tabs>
+          </w:pPr>
           <w:hyperlink w:history="1" w:anchor="_Toc42">
             <w:r>
-              <w:t xml:space="preserve">Phase 3 (detection and response)</w:t>
+              <w:t xml:space="preserve">10. Remaining Work</w:t>
             </w:r>
             <w:r>
               <w:tab/>
@@ -1083,7 +1083,7 @@
           </w:pPr>
           <w:hyperlink w:history="1" w:anchor="_Toc43">
             <w:r>
-              <w:t xml:space="preserve">Phase 4 (validation and report)</w:t>
+              <w:t xml:space="preserve">Phase 3 (detection and response)</w:t>
             </w:r>
             <w:r>
               <w:tab/>
@@ -1091,28 +1091,6 @@
             <w:r>
               <w:fldChar w:fldCharType="begin" w:dirty="true"/>
               <w:instrText xml:space="preserve">PAGEREF _Toc43 \h</w:instrText>
-              <w:fldChar w:fldCharType="separate"/>
-              <w:fldChar w:fldCharType="end"/>
-            </w:r>
-          </w:hyperlink>
-        </w:p>
-        <w:p>
-          <w:pPr>
-            <w:pStyle w:val="TOC1"/>
-            <w:tabs>
-              <w:tab w:val="right" w:pos="9026" w:leader="dot"/>
-            </w:tabs>
-          </w:pPr>
-          <w:hyperlink w:history="1" w:anchor="_Toc44">
-            <w:r>
-              <w:t xml:space="preserve">11. Files and Commands</w:t>
-            </w:r>
-            <w:r>
-              <w:tab/>
-            </w:r>
-            <w:r>
-              <w:fldChar w:fldCharType="begin" w:dirty="true"/>
-              <w:instrText xml:space="preserve">PAGEREF _Toc44 \h</w:instrText>
               <w:fldChar w:fldCharType="separate"/>
               <w:fldChar w:fldCharType="end"/>
             </w:r>
@@ -1126,16 +1104,16 @@
             </w:tabs>
             <w:ind w:left="220"/>
           </w:pPr>
-          <w:hyperlink w:history="1" w:anchor="_Toc45">
-            <w:r>
-              <w:t xml:space="preserve">Daily routine</w:t>
+          <w:hyperlink w:history="1" w:anchor="_Toc44">
+            <w:r>
+              <w:t xml:space="preserve">Phase 4 (validation and report)</w:t>
             </w:r>
             <w:r>
               <w:tab/>
             </w:r>
             <w:r>
               <w:fldChar w:fldCharType="begin" w:dirty="true"/>
-              <w:instrText xml:space="preserve">PAGEREF _Toc45 \h</w:instrText>
+              <w:instrText xml:space="preserve">PAGEREF _Toc44 \h</w:instrText>
               <w:fldChar w:fldCharType="separate"/>
               <w:fldChar w:fldCharType="end"/>
             </w:r>
@@ -1148,9 +1126,32 @@
               <w:tab w:val="right" w:pos="9026" w:leader="dot"/>
             </w:tabs>
           </w:pPr>
+          <w:hyperlink w:history="1" w:anchor="_Toc45">
+            <w:r>
+              <w:t xml:space="preserve">11. Files and Commands</w:t>
+            </w:r>
+            <w:r>
+              <w:tab/>
+            </w:r>
+            <w:r>
+              <w:fldChar w:fldCharType="begin" w:dirty="true"/>
+              <w:instrText xml:space="preserve">PAGEREF _Toc45 \h</w:instrText>
+              <w:fldChar w:fldCharType="separate"/>
+              <w:fldChar w:fldCharType="end"/>
+            </w:r>
+          </w:hyperlink>
+        </w:p>
+        <w:p>
+          <w:pPr>
+            <w:pStyle w:val="TOC2"/>
+            <w:tabs>
+              <w:tab w:val="right" w:pos="9026" w:leader="dot"/>
+            </w:tabs>
+            <w:ind w:left="220"/>
+          </w:pPr>
           <w:hyperlink w:history="1" w:anchor="_Toc46">
             <w:r>
-              <w:t xml:space="preserve">12. Report Corrections Needed</w:t>
+              <w:t xml:space="preserve">Daily routine</w:t>
             </w:r>
             <w:r>
               <w:tab/>
@@ -1172,7 +1173,7 @@
           </w:pPr>
           <w:hyperlink w:history="1" w:anchor="_Toc47">
             <w:r>
-              <w:t xml:space="preserve">13. Risks and Open Questions</w:t>
+              <w:t xml:space="preserve">12. Report Corrections Needed</w:t>
             </w:r>
             <w:r>
               <w:tab/>
@@ -1180,6 +1181,28 @@
             <w:r>
               <w:fldChar w:fldCharType="begin" w:dirty="true"/>
               <w:instrText xml:space="preserve">PAGEREF _Toc47 \h</w:instrText>
+              <w:fldChar w:fldCharType="separate"/>
+              <w:fldChar w:fldCharType="end"/>
+            </w:r>
+          </w:hyperlink>
+        </w:p>
+        <w:p>
+          <w:pPr>
+            <w:pStyle w:val="TOC1"/>
+            <w:tabs>
+              <w:tab w:val="right" w:pos="9026" w:leader="dot"/>
+            </w:tabs>
+          </w:pPr>
+          <w:hyperlink w:history="1" w:anchor="_Toc48">
+            <w:r>
+              <w:t xml:space="preserve">13. Risks and Open Questions</w:t>
+            </w:r>
+            <w:r>
+              <w:tab/>
+            </w:r>
+            <w:r>
+              <w:fldChar w:fldCharType="begin" w:dirty="true"/>
+              <w:instrText xml:space="preserve">PAGEREF _Toc48 \h</w:instrText>
               <w:fldChar w:fldCharType="separate"/>
               <w:fldChar w:fldCharType="end"/>
             </w:r>
@@ -1820,6 +1843,52 @@
           <w:p>
             <w:r>
               <w:t xml:space="preserve">All four actions built and tested live: block IP, quarantine, disable account, alert only</w:t>
+            </w:r>
+          </w:p>
+        </w:tc>
+      </w:tr>
+      <w:tr>
+        <w:tc>
+          <w:tcPr>
+            <w:tcW w:type="dxa" w:w="3610"/>
+            <w:tcBorders>
+              <w:top w:val="single" w:color="BFBFBF" w:sz="4"/>
+              <w:left w:val="single" w:color="BFBFBF" w:sz="4"/>
+              <w:bottom w:val="single" w:color="BFBFBF" w:sz="4"/>
+              <w:right w:val="single" w:color="BFBFBF" w:sz="4"/>
+            </w:tcBorders>
+            <w:tcMar>
+              <w:top w:type="dxa" w:w="60"/>
+              <w:left w:type="dxa" w:w="100"/>
+              <w:bottom w:type="dxa" w:w="60"/>
+              <w:right w:type="dxa" w:w="100"/>
+            </w:tcMar>
+          </w:tcPr>
+          <w:p>
+            <w:r>
+              <w:t xml:space="preserve">Live pipeline (orchestrator)</w:t>
+            </w:r>
+          </w:p>
+        </w:tc>
+        <w:tc>
+          <w:tcPr>
+            <w:tcW w:type="dxa" w:w="5416"/>
+            <w:tcBorders>
+              <w:top w:val="single" w:color="BFBFBF" w:sz="4"/>
+              <w:left w:val="single" w:color="BFBFBF" w:sz="4"/>
+              <w:bottom w:val="single" w:color="BFBFBF" w:sz="4"/>
+              <w:right w:val="single" w:color="BFBFBF" w:sz="4"/>
+            </w:tcBorders>
+            <w:tcMar>
+              <w:top w:type="dxa" w:w="60"/>
+              <w:left w:type="dxa" w:w="100"/>
+              <w:bottom w:type="dxa" w:w="60"/>
+              <w:right w:type="dxa" w:w="100"/>
+            </w:tcMar>
+          </w:tcPr>
+          <w:p>
+            <w:r>
+              <w:t xml:space="preserve">Done: end-to-end test detects and answers all five attacks automatically in 1.0 to 1.8 s after the window closes</w:t>
             </w:r>
           </w:p>
         </w:tc>
@@ -11545,14 +11614,820 @@
     </w:p>
     <w:p>
       <w:pPr>
+        <w:pStyle w:val="Heading2"/>
+      </w:pPr>
+      <w:bookmarkStart w:name="_Toc34" w:id="34"/>
+      <w:r>
+        <w:t xml:space="preserve">6.8 The live pipeline (step 3F.5)</w:t>
+      </w:r>
+      <w:bookmarkEnd w:id="34"/>
+    </w:p>
+    <w:p>
+      <w:pPr>
+        <w:spacing w:after="120"/>
+      </w:pPr>
+      <w:r>
+        <w:t xml:space="preserve">zt_pipeline.py (PipelineOrchestrator in the class diagram) joins the pieces. It streams the SPAN mirror from the SIEM without gaps (tcpdump writes pcap to its output and the pipeline parses it as it arrives) and tails the RADIUS log. Every 10 seconds it builds the eight features per PC, scores them with the hybrid detector, pushes the scores to Zabbix, and for each flagged PC classifies the attack and calls the response engine. The SSH sessions to both switches are opened at start, so a response does not wait for a login. A PC already contained is logged but not acted on twice, the same alert is repeated at most once a minute, a failed response is logged and never stops detection, and only one pipeline can run at a time.</w:t>
+      </w:r>
+    </w:p>
+    <w:p>
+      <w:pPr>
+        <w:spacing w:after="120"/>
+      </w:pPr>
+      <w:r>
+        <w:t xml:space="preserve">Attack classification (AlertBuilder.classify) checks, in order: 5 or more failed logins is brute force; 10 or more destination ports is a port scan; 300 or more new connections per minute is DoS; 5 MB or more in a window is insider data theft; the off-hours flag is an off-hours session; anything else is unclassified. Each threshold is far above normal traffic (99th percentile of normal windows: 1 port, 48 connections per minute, 430 kB). On all 100 labelled attack windows the classification is 100 % correct.</w:t>
+      </w:r>
+    </w:p>
+    <w:p>
+      <w:pPr>
+        <w:spacing w:after="120"/>
+      </w:pPr>
+      <w:r>
+        <w:t xml:space="preserve">The model was trained on business-hours traffic, so the pipeline treats every window as 12:00 by default. An off-hours session is simulated per host: zt_traffic.py attack --mode offhours makes the pipeline set the off-hours flag on that PC's windows for the duration.</w:t>
+      </w:r>
+    </w:p>
+    <w:p>
+      <w:pPr>
+        <w:pStyle w:val="Heading3"/>
+      </w:pPr>
+      <w:r>
+        <w:t xml:space="preserve">End-to-end test (14 October, 14:56 to 15:03)</w:t>
+      </w:r>
+    </w:p>
+    <w:p>
+      <w:pPr>
+        <w:spacing w:after="120"/>
+      </w:pPr>
+      <w:r>
+        <w:t xml:space="preserve">e2e_test.sh starts normal traffic on all three PCs and the pipeline, then launches each attack for 40 seconds with a reset in between. Evidence is kept in results/e2e_run_20261014_1456/.</w:t>
+      </w:r>
+    </w:p>
+    <w:tbl>
+      <w:tblPr>
+        <w:tblW w:type="dxa" w:w="9026"/>
+        <w:tblBorders>
+          <w:top w:val="single" w:color="auto" w:sz="4"/>
+          <w:left w:val="single" w:color="auto" w:sz="4"/>
+          <w:bottom w:val="single" w:color="auto" w:sz="4"/>
+          <w:right w:val="single" w:color="auto" w:sz="4"/>
+          <w:insideH w:val="single" w:color="auto" w:sz="4"/>
+          <w:insideV w:val="single" w:color="auto" w:sz="4"/>
+        </w:tblBorders>
+      </w:tblPr>
+      <w:tblGrid>
+        <w:gridCol w:w="2708"/>
+        <w:gridCol w:w="1625"/>
+        <w:gridCol w:w="1264"/>
+        <w:gridCol w:w="1986"/>
+        <w:gridCol w:w="1443"/>
+      </w:tblGrid>
+      <w:tr>
+        <w:trPr>
+          <w:tblHeader/>
+        </w:trPr>
+        <w:tc>
+          <w:tcPr>
+            <w:tcW w:type="dxa" w:w="2708"/>
+            <w:tcBorders>
+              <w:top w:val="single" w:color="BFBFBF" w:sz="4"/>
+              <w:left w:val="single" w:color="BFBFBF" w:sz="4"/>
+              <w:bottom w:val="single" w:color="BFBFBF" w:sz="4"/>
+              <w:right w:val="single" w:color="BFBFBF" w:sz="4"/>
+            </w:tcBorders>
+            <w:shd w:fill="1F4E79" w:color="auto" w:val="clear"/>
+            <w:tcMar>
+              <w:top w:type="dxa" w:w="60"/>
+              <w:left w:type="dxa" w:w="100"/>
+              <w:bottom w:type="dxa" w:w="60"/>
+              <w:right w:type="dxa" w:w="100"/>
+            </w:tcMar>
+          </w:tcPr>
+          <w:p>
+            <w:r>
+              <w:rPr>
+                <w:b/>
+                <w:bCs/>
+                <w:color w:val="FFFFFF"/>
+                <w:sz w:val="19"/>
+                <w:szCs w:val="19"/>
+              </w:rPr>
+              <w:t xml:space="preserve">Attack (launched)</w:t>
+            </w:r>
+          </w:p>
+        </w:tc>
+        <w:tc>
+          <w:tcPr>
+            <w:tcW w:type="dxa" w:w="1625"/>
+            <w:tcBorders>
+              <w:top w:val="single" w:color="BFBFBF" w:sz="4"/>
+              <w:left w:val="single" w:color="BFBFBF" w:sz="4"/>
+              <w:bottom w:val="single" w:color="BFBFBF" w:sz="4"/>
+              <w:right w:val="single" w:color="BFBFBF" w:sz="4"/>
+            </w:tcBorders>
+            <w:shd w:fill="1F4E79" w:color="auto" w:val="clear"/>
+            <w:tcMar>
+              <w:top w:type="dxa" w:w="60"/>
+              <w:left w:type="dxa" w:w="100"/>
+              <w:bottom w:type="dxa" w:w="60"/>
+              <w:right w:type="dxa" w:w="100"/>
+            </w:tcMar>
+          </w:tcPr>
+          <w:p>
+            <w:r>
+              <w:rPr>
+                <w:b/>
+                <w:bCs/>
+                <w:color w:val="FFFFFF"/>
+                <w:sz w:val="19"/>
+                <w:szCs w:val="19"/>
+              </w:rPr>
+              <w:t xml:space="preserve">Flagged window</w:t>
+            </w:r>
+          </w:p>
+        </w:tc>
+        <w:tc>
+          <w:tcPr>
+            <w:tcW w:type="dxa" w:w="1264"/>
+            <w:tcBorders>
+              <w:top w:val="single" w:color="BFBFBF" w:sz="4"/>
+              <w:left w:val="single" w:color="BFBFBF" w:sz="4"/>
+              <w:bottom w:val="single" w:color="BFBFBF" w:sz="4"/>
+              <w:right w:val="single" w:color="BFBFBF" w:sz="4"/>
+            </w:tcBorders>
+            <w:shd w:fill="1F4E79" w:color="auto" w:val="clear"/>
+            <w:tcMar>
+              <w:top w:type="dxa" w:w="60"/>
+              <w:left w:type="dxa" w:w="100"/>
+              <w:bottom w:type="dxa" w:w="60"/>
+              <w:right w:type="dxa" w:w="100"/>
+            </w:tcMar>
+          </w:tcPr>
+          <w:p>
+            <w:r>
+              <w:rPr>
+                <w:b/>
+                <w:bCs/>
+                <w:color w:val="FFFFFF"/>
+                <w:sz w:val="19"/>
+                <w:szCs w:val="19"/>
+              </w:rPr>
+              <w:t xml:space="preserve">Classified as</w:t>
+            </w:r>
+          </w:p>
+        </w:tc>
+        <w:tc>
+          <w:tcPr>
+            <w:tcW w:type="dxa" w:w="1986"/>
+            <w:tcBorders>
+              <w:top w:val="single" w:color="BFBFBF" w:sz="4"/>
+              <w:left w:val="single" w:color="BFBFBF" w:sz="4"/>
+              <w:bottom w:val="single" w:color="BFBFBF" w:sz="4"/>
+              <w:right w:val="single" w:color="BFBFBF" w:sz="4"/>
+            </w:tcBorders>
+            <w:shd w:fill="1F4E79" w:color="auto" w:val="clear"/>
+            <w:tcMar>
+              <w:top w:type="dxa" w:w="60"/>
+              <w:left w:type="dxa" w:w="100"/>
+              <w:bottom w:type="dxa" w:w="60"/>
+              <w:right w:type="dxa" w:w="100"/>
+            </w:tcMar>
+          </w:tcPr>
+          <w:p>
+            <w:r>
+              <w:rPr>
+                <w:b/>
+                <w:bCs/>
+                <w:color w:val="FFFFFF"/>
+                <w:sz w:val="19"/>
+                <w:szCs w:val="19"/>
+              </w:rPr>
+              <w:t xml:space="preserve">Automatic action</w:t>
+            </w:r>
+          </w:p>
+        </w:tc>
+        <w:tc>
+          <w:tcPr>
+            <w:tcW w:type="dxa" w:w="1443"/>
+            <w:tcBorders>
+              <w:top w:val="single" w:color="BFBFBF" w:sz="4"/>
+              <w:left w:val="single" w:color="BFBFBF" w:sz="4"/>
+              <w:bottom w:val="single" w:color="BFBFBF" w:sz="4"/>
+              <w:right w:val="single" w:color="BFBFBF" w:sz="4"/>
+            </w:tcBorders>
+            <w:shd w:fill="1F4E79" w:color="auto" w:val="clear"/>
+            <w:tcMar>
+              <w:top w:type="dxa" w:w="60"/>
+              <w:left w:type="dxa" w:w="100"/>
+              <w:bottom w:type="dxa" w:w="60"/>
+              <w:right w:type="dxa" w:w="100"/>
+            </w:tcMar>
+          </w:tcPr>
+          <w:p>
+            <w:r>
+              <w:rPr>
+                <w:b/>
+                <w:bCs/>
+                <w:color w:val="FFFFFF"/>
+                <w:sz w:val="19"/>
+                <w:szCs w:val="19"/>
+              </w:rPr>
+              <w:t xml:space="preserve">Window close to action</w:t>
+            </w:r>
+          </w:p>
+        </w:tc>
+      </w:tr>
+      <w:tr>
+        <w:tc>
+          <w:tcPr>
+            <w:tcW w:type="dxa" w:w="2708"/>
+            <w:tcBorders>
+              <w:top w:val="single" w:color="BFBFBF" w:sz="4"/>
+              <w:left w:val="single" w:color="BFBFBF" w:sz="4"/>
+              <w:bottom w:val="single" w:color="BFBFBF" w:sz="4"/>
+              <w:right w:val="single" w:color="BFBFBF" w:sz="4"/>
+            </w:tcBorders>
+            <w:tcMar>
+              <w:top w:type="dxa" w:w="60"/>
+              <w:left w:type="dxa" w:w="100"/>
+              <w:bottom w:type="dxa" w:w="60"/>
+              <w:right w:type="dxa" w:w="100"/>
+            </w:tcMar>
+          </w:tcPr>
+          <w:p>
+            <w:r>
+              <w:t xml:space="preserve">DoS from guest-pc (14:56:30)</w:t>
+            </w:r>
+          </w:p>
+        </w:tc>
+        <w:tc>
+          <w:tcPr>
+            <w:tcW w:type="dxa" w:w="1625"/>
+            <w:tcBorders>
+              <w:top w:val="single" w:color="BFBFBF" w:sz="4"/>
+              <w:left w:val="single" w:color="BFBFBF" w:sz="4"/>
+              <w:bottom w:val="single" w:color="BFBFBF" w:sz="4"/>
+              <w:right w:val="single" w:color="BFBFBF" w:sz="4"/>
+            </w:tcBorders>
+            <w:tcMar>
+              <w:top w:type="dxa" w:w="60"/>
+              <w:left w:type="dxa" w:w="100"/>
+              <w:bottom w:type="dxa" w:w="60"/>
+              <w:right w:type="dxa" w:w="100"/>
+            </w:tcMar>
+          </w:tcPr>
+          <w:p>
+            <w:r>
+              <w:t xml:space="preserve">14:56:26 (model)</w:t>
+            </w:r>
+          </w:p>
+        </w:tc>
+        <w:tc>
+          <w:tcPr>
+            <w:tcW w:type="dxa" w:w="1264"/>
+            <w:tcBorders>
+              <w:top w:val="single" w:color="BFBFBF" w:sz="4"/>
+              <w:left w:val="single" w:color="BFBFBF" w:sz="4"/>
+              <w:bottom w:val="single" w:color="BFBFBF" w:sz="4"/>
+              <w:right w:val="single" w:color="BFBFBF" w:sz="4"/>
+            </w:tcBorders>
+            <w:tcMar>
+              <w:top w:type="dxa" w:w="60"/>
+              <w:left w:type="dxa" w:w="100"/>
+              <w:bottom w:type="dxa" w:w="60"/>
+              <w:right w:type="dxa" w:w="100"/>
+            </w:tcMar>
+          </w:tcPr>
+          <w:p>
+            <w:r>
+              <w:t xml:space="preserve">dos</w:t>
+            </w:r>
+          </w:p>
+        </w:tc>
+        <w:tc>
+          <w:tcPr>
+            <w:tcW w:type="dxa" w:w="1986"/>
+            <w:tcBorders>
+              <w:top w:val="single" w:color="BFBFBF" w:sz="4"/>
+              <w:left w:val="single" w:color="BFBFBF" w:sz="4"/>
+              <w:bottom w:val="single" w:color="BFBFBF" w:sz="4"/>
+              <w:right w:val="single" w:color="BFBFBF" w:sz="4"/>
+            </w:tcBorders>
+            <w:tcMar>
+              <w:top w:type="dxa" w:w="60"/>
+              <w:left w:type="dxa" w:w="100"/>
+              <w:bottom w:type="dxa" w:w="60"/>
+              <w:right w:type="dxa" w:w="100"/>
+            </w:tcMar>
+          </w:tcPr>
+          <w:p>
+            <w:r>
+              <w:t xml:space="preserve">BLOCKED 10.10.30.50</w:t>
+            </w:r>
+          </w:p>
+        </w:tc>
+        <w:tc>
+          <w:tcPr>
+            <w:tcW w:type="dxa" w:w="1443"/>
+            <w:tcBorders>
+              <w:top w:val="single" w:color="BFBFBF" w:sz="4"/>
+              <w:left w:val="single" w:color="BFBFBF" w:sz="4"/>
+              <w:bottom w:val="single" w:color="BFBFBF" w:sz="4"/>
+              <w:right w:val="single" w:color="BFBFBF" w:sz="4"/>
+            </w:tcBorders>
+            <w:tcMar>
+              <w:top w:type="dxa" w:w="60"/>
+              <w:left w:type="dxa" w:w="100"/>
+              <w:bottom w:type="dxa" w:w="60"/>
+              <w:right w:type="dxa" w:w="100"/>
+            </w:tcMar>
+          </w:tcPr>
+          <w:p>
+            <w:r>
+              <w:t xml:space="preserve">1.1 s</w:t>
+            </w:r>
+          </w:p>
+        </w:tc>
+      </w:tr>
+      <w:tr>
+        <w:tc>
+          <w:tcPr>
+            <w:tcW w:type="dxa" w:w="2708"/>
+            <w:tcBorders>
+              <w:top w:val="single" w:color="BFBFBF" w:sz="4"/>
+              <w:left w:val="single" w:color="BFBFBF" w:sz="4"/>
+              <w:bottom w:val="single" w:color="BFBFBF" w:sz="4"/>
+              <w:right w:val="single" w:color="BFBFBF" w:sz="4"/>
+            </w:tcBorders>
+            <w:tcMar>
+              <w:top w:type="dxa" w:w="60"/>
+              <w:left w:type="dxa" w:w="100"/>
+              <w:bottom w:type="dxa" w:w="60"/>
+              <w:right w:type="dxa" w:w="100"/>
+            </w:tcMar>
+          </w:tcPr>
+          <w:p>
+            <w:r>
+              <w:t xml:space="preserve">Port scan from guest-pc (14:57:53)</w:t>
+            </w:r>
+          </w:p>
+        </w:tc>
+        <w:tc>
+          <w:tcPr>
+            <w:tcW w:type="dxa" w:w="1625"/>
+            <w:tcBorders>
+              <w:top w:val="single" w:color="BFBFBF" w:sz="4"/>
+              <w:left w:val="single" w:color="BFBFBF" w:sz="4"/>
+              <w:bottom w:val="single" w:color="BFBFBF" w:sz="4"/>
+              <w:right w:val="single" w:color="BFBFBF" w:sz="4"/>
+            </w:tcBorders>
+            <w:tcMar>
+              <w:top w:type="dxa" w:w="60"/>
+              <w:left w:type="dxa" w:w="100"/>
+              <w:bottom w:type="dxa" w:w="60"/>
+              <w:right w:type="dxa" w:w="100"/>
+            </w:tcMar>
+          </w:tcPr>
+          <w:p>
+            <w:r>
+              <w:t xml:space="preserve">14:57:46 (model)</w:t>
+            </w:r>
+          </w:p>
+        </w:tc>
+        <w:tc>
+          <w:tcPr>
+            <w:tcW w:type="dxa" w:w="1264"/>
+            <w:tcBorders>
+              <w:top w:val="single" w:color="BFBFBF" w:sz="4"/>
+              <w:left w:val="single" w:color="BFBFBF" w:sz="4"/>
+              <w:bottom w:val="single" w:color="BFBFBF" w:sz="4"/>
+              <w:right w:val="single" w:color="BFBFBF" w:sz="4"/>
+            </w:tcBorders>
+            <w:tcMar>
+              <w:top w:type="dxa" w:w="60"/>
+              <w:left w:type="dxa" w:w="100"/>
+              <w:bottom w:type="dxa" w:w="60"/>
+              <w:right w:type="dxa" w:w="100"/>
+            </w:tcMar>
+          </w:tcPr>
+          <w:p>
+            <w:r>
+              <w:t xml:space="preserve">portscan</w:t>
+            </w:r>
+          </w:p>
+        </w:tc>
+        <w:tc>
+          <w:tcPr>
+            <w:tcW w:type="dxa" w:w="1986"/>
+            <w:tcBorders>
+              <w:top w:val="single" w:color="BFBFBF" w:sz="4"/>
+              <w:left w:val="single" w:color="BFBFBF" w:sz="4"/>
+              <w:bottom w:val="single" w:color="BFBFBF" w:sz="4"/>
+              <w:right w:val="single" w:color="BFBFBF" w:sz="4"/>
+            </w:tcBorders>
+            <w:tcMar>
+              <w:top w:type="dxa" w:w="60"/>
+              <w:left w:type="dxa" w:w="100"/>
+              <w:bottom w:type="dxa" w:w="60"/>
+              <w:right w:type="dxa" w:w="100"/>
+            </w:tcMar>
+          </w:tcPr>
+          <w:p>
+            <w:r>
+              <w:t xml:space="preserve">QUARANTINED guest-pc</w:t>
+            </w:r>
+          </w:p>
+        </w:tc>
+        <w:tc>
+          <w:tcPr>
+            <w:tcW w:type="dxa" w:w="1443"/>
+            <w:tcBorders>
+              <w:top w:val="single" w:color="BFBFBF" w:sz="4"/>
+              <w:left w:val="single" w:color="BFBFBF" w:sz="4"/>
+              <w:bottom w:val="single" w:color="BFBFBF" w:sz="4"/>
+              <w:right w:val="single" w:color="BFBFBF" w:sz="4"/>
+            </w:tcBorders>
+            <w:tcMar>
+              <w:top w:type="dxa" w:w="60"/>
+              <w:left w:type="dxa" w:w="100"/>
+              <w:bottom w:type="dxa" w:w="60"/>
+              <w:right w:type="dxa" w:w="100"/>
+            </w:tcMar>
+          </w:tcPr>
+          <w:p>
+            <w:r>
+              <w:t xml:space="preserve">1.8 s</w:t>
+            </w:r>
+          </w:p>
+        </w:tc>
+      </w:tr>
+      <w:tr>
+        <w:tc>
+          <w:tcPr>
+            <w:tcW w:type="dxa" w:w="2708"/>
+            <w:tcBorders>
+              <w:top w:val="single" w:color="BFBFBF" w:sz="4"/>
+              <w:left w:val="single" w:color="BFBFBF" w:sz="4"/>
+              <w:bottom w:val="single" w:color="BFBFBF" w:sz="4"/>
+              <w:right w:val="single" w:color="BFBFBF" w:sz="4"/>
+            </w:tcBorders>
+            <w:tcMar>
+              <w:top w:type="dxa" w:w="60"/>
+              <w:left w:type="dxa" w:w="100"/>
+              <w:bottom w:type="dxa" w:w="60"/>
+              <w:right w:type="dxa" w:w="100"/>
+            </w:tcMar>
+          </w:tcPr>
+          <w:p>
+            <w:r>
+              <w:t xml:space="preserve">Brute force on guest-pc's port (14:59:18)</w:t>
+            </w:r>
+          </w:p>
+        </w:tc>
+        <w:tc>
+          <w:tcPr>
+            <w:tcW w:type="dxa" w:w="1625"/>
+            <w:tcBorders>
+              <w:top w:val="single" w:color="BFBFBF" w:sz="4"/>
+              <w:left w:val="single" w:color="BFBFBF" w:sz="4"/>
+              <w:bottom w:val="single" w:color="BFBFBF" w:sz="4"/>
+              <w:right w:val="single" w:color="BFBFBF" w:sz="4"/>
+            </w:tcBorders>
+            <w:tcMar>
+              <w:top w:type="dxa" w:w="60"/>
+              <w:left w:type="dxa" w:w="100"/>
+              <w:bottom w:type="dxa" w:w="60"/>
+              <w:right w:type="dxa" w:w="100"/>
+            </w:tcMar>
+          </w:tcPr>
+          <w:p>
+            <w:r>
+              <w:t xml:space="preserve">14:59:16 (model+rule)</w:t>
+            </w:r>
+          </w:p>
+        </w:tc>
+        <w:tc>
+          <w:tcPr>
+            <w:tcW w:type="dxa" w:w="1264"/>
+            <w:tcBorders>
+              <w:top w:val="single" w:color="BFBFBF" w:sz="4"/>
+              <w:left w:val="single" w:color="BFBFBF" w:sz="4"/>
+              <w:bottom w:val="single" w:color="BFBFBF" w:sz="4"/>
+              <w:right w:val="single" w:color="BFBFBF" w:sz="4"/>
+            </w:tcBorders>
+            <w:tcMar>
+              <w:top w:type="dxa" w:w="60"/>
+              <w:left w:type="dxa" w:w="100"/>
+              <w:bottom w:type="dxa" w:w="60"/>
+              <w:right w:type="dxa" w:w="100"/>
+            </w:tcMar>
+          </w:tcPr>
+          <w:p>
+            <w:r>
+              <w:t xml:space="preserve">bruteforce</w:t>
+            </w:r>
+          </w:p>
+        </w:tc>
+        <w:tc>
+          <w:tcPr>
+            <w:tcW w:type="dxa" w:w="1986"/>
+            <w:tcBorders>
+              <w:top w:val="single" w:color="BFBFBF" w:sz="4"/>
+              <w:left w:val="single" w:color="BFBFBF" w:sz="4"/>
+              <w:bottom w:val="single" w:color="BFBFBF" w:sz="4"/>
+              <w:right w:val="single" w:color="BFBFBF" w:sz="4"/>
+            </w:tcBorders>
+            <w:tcMar>
+              <w:top w:type="dxa" w:w="60"/>
+              <w:left w:type="dxa" w:w="100"/>
+              <w:bottom w:type="dxa" w:w="60"/>
+              <w:right w:type="dxa" w:w="100"/>
+            </w:tcMar>
+          </w:tcPr>
+          <w:p>
+            <w:r>
+              <w:t xml:space="preserve">QUARANTINED guest-pc</w:t>
+            </w:r>
+          </w:p>
+        </w:tc>
+        <w:tc>
+          <w:tcPr>
+            <w:tcW w:type="dxa" w:w="1443"/>
+            <w:tcBorders>
+              <w:top w:val="single" w:color="BFBFBF" w:sz="4"/>
+              <w:left w:val="single" w:color="BFBFBF" w:sz="4"/>
+              <w:bottom w:val="single" w:color="BFBFBF" w:sz="4"/>
+              <w:right w:val="single" w:color="BFBFBF" w:sz="4"/>
+            </w:tcBorders>
+            <w:tcMar>
+              <w:top w:type="dxa" w:w="60"/>
+              <w:left w:type="dxa" w:w="100"/>
+              <w:bottom w:type="dxa" w:w="60"/>
+              <w:right w:type="dxa" w:w="100"/>
+            </w:tcMar>
+          </w:tcPr>
+          <w:p>
+            <w:r>
+              <w:t xml:space="preserve">1.8 s</w:t>
+            </w:r>
+          </w:p>
+        </w:tc>
+      </w:tr>
+      <w:tr>
+        <w:tc>
+          <w:tcPr>
+            <w:tcW w:type="dxa" w:w="2708"/>
+            <w:tcBorders>
+              <w:top w:val="single" w:color="BFBFBF" w:sz="4"/>
+              <w:left w:val="single" w:color="BFBFBF" w:sz="4"/>
+              <w:bottom w:val="single" w:color="BFBFBF" w:sz="4"/>
+              <w:right w:val="single" w:color="BFBFBF" w:sz="4"/>
+            </w:tcBorders>
+            <w:tcMar>
+              <w:top w:type="dxa" w:w="60"/>
+              <w:left w:type="dxa" w:w="100"/>
+              <w:bottom w:type="dxa" w:w="60"/>
+              <w:right w:type="dxa" w:w="100"/>
+            </w:tcMar>
+          </w:tcPr>
+          <w:p>
+            <w:r>
+              <w:t xml:space="preserve">Insider bulk download on staff-pc (15:00:43)</w:t>
+            </w:r>
+          </w:p>
+        </w:tc>
+        <w:tc>
+          <w:tcPr>
+            <w:tcW w:type="dxa" w:w="1625"/>
+            <w:tcBorders>
+              <w:top w:val="single" w:color="BFBFBF" w:sz="4"/>
+              <w:left w:val="single" w:color="BFBFBF" w:sz="4"/>
+              <w:bottom w:val="single" w:color="BFBFBF" w:sz="4"/>
+              <w:right w:val="single" w:color="BFBFBF" w:sz="4"/>
+            </w:tcBorders>
+            <w:tcMar>
+              <w:top w:type="dxa" w:w="60"/>
+              <w:left w:type="dxa" w:w="100"/>
+              <w:bottom w:type="dxa" w:w="60"/>
+              <w:right w:type="dxa" w:w="100"/>
+            </w:tcMar>
+          </w:tcPr>
+          <w:p>
+            <w:r>
+              <w:t xml:space="preserve">15:00:46 (model)</w:t>
+            </w:r>
+          </w:p>
+        </w:tc>
+        <w:tc>
+          <w:tcPr>
+            <w:tcW w:type="dxa" w:w="1264"/>
+            <w:tcBorders>
+              <w:top w:val="single" w:color="BFBFBF" w:sz="4"/>
+              <w:left w:val="single" w:color="BFBFBF" w:sz="4"/>
+              <w:bottom w:val="single" w:color="BFBFBF" w:sz="4"/>
+              <w:right w:val="single" w:color="BFBFBF" w:sz="4"/>
+            </w:tcBorders>
+            <w:tcMar>
+              <w:top w:type="dxa" w:w="60"/>
+              <w:left w:type="dxa" w:w="100"/>
+              <w:bottom w:type="dxa" w:w="60"/>
+              <w:right w:type="dxa" w:w="100"/>
+            </w:tcMar>
+          </w:tcPr>
+          <w:p>
+            <w:r>
+              <w:t xml:space="preserve">insider</w:t>
+            </w:r>
+          </w:p>
+        </w:tc>
+        <w:tc>
+          <w:tcPr>
+            <w:tcW w:type="dxa" w:w="1986"/>
+            <w:tcBorders>
+              <w:top w:val="single" w:color="BFBFBF" w:sz="4"/>
+              <w:left w:val="single" w:color="BFBFBF" w:sz="4"/>
+              <w:bottom w:val="single" w:color="BFBFBF" w:sz="4"/>
+              <w:right w:val="single" w:color="BFBFBF" w:sz="4"/>
+            </w:tcBorders>
+            <w:tcMar>
+              <w:top w:type="dxa" w:w="60"/>
+              <w:left w:type="dxa" w:w="100"/>
+              <w:bottom w:type="dxa" w:w="60"/>
+              <w:right w:type="dxa" w:w="100"/>
+            </w:tcMar>
+          </w:tcPr>
+          <w:p>
+            <w:r>
+              <w:t xml:space="preserve">DISABLED account alice</w:t>
+            </w:r>
+          </w:p>
+        </w:tc>
+        <w:tc>
+          <w:tcPr>
+            <w:tcW w:type="dxa" w:w="1443"/>
+            <w:tcBorders>
+              <w:top w:val="single" w:color="BFBFBF" w:sz="4"/>
+              <w:left w:val="single" w:color="BFBFBF" w:sz="4"/>
+              <w:bottom w:val="single" w:color="BFBFBF" w:sz="4"/>
+              <w:right w:val="single" w:color="BFBFBF" w:sz="4"/>
+            </w:tcBorders>
+            <w:tcMar>
+              <w:top w:type="dxa" w:w="60"/>
+              <w:left w:type="dxa" w:w="100"/>
+              <w:bottom w:type="dxa" w:w="60"/>
+              <w:right w:type="dxa" w:w="100"/>
+            </w:tcMar>
+          </w:tcPr>
+          <w:p>
+            <w:r>
+              <w:t xml:space="preserve">1.8 s</w:t>
+            </w:r>
+          </w:p>
+        </w:tc>
+      </w:tr>
+      <w:tr>
+        <w:tc>
+          <w:tcPr>
+            <w:tcW w:type="dxa" w:w="2708"/>
+            <w:tcBorders>
+              <w:top w:val="single" w:color="BFBFBF" w:sz="4"/>
+              <w:left w:val="single" w:color="BFBFBF" w:sz="4"/>
+              <w:bottom w:val="single" w:color="BFBFBF" w:sz="4"/>
+              <w:right w:val="single" w:color="BFBFBF" w:sz="4"/>
+            </w:tcBorders>
+            <w:tcMar>
+              <w:top w:type="dxa" w:w="60"/>
+              <w:left w:type="dxa" w:w="100"/>
+              <w:bottom w:type="dxa" w:w="60"/>
+              <w:right w:type="dxa" w:w="100"/>
+            </w:tcMar>
+          </w:tcPr>
+          <w:p>
+            <w:r>
+              <w:t xml:space="preserve">Off-hours session on staff-pc (15:02:09)</w:t>
+            </w:r>
+          </w:p>
+        </w:tc>
+        <w:tc>
+          <w:tcPr>
+            <w:tcW w:type="dxa" w:w="1625"/>
+            <w:tcBorders>
+              <w:top w:val="single" w:color="BFBFBF" w:sz="4"/>
+              <w:left w:val="single" w:color="BFBFBF" w:sz="4"/>
+              <w:bottom w:val="single" w:color="BFBFBF" w:sz="4"/>
+              <w:right w:val="single" w:color="BFBFBF" w:sz="4"/>
+            </w:tcBorders>
+            <w:tcMar>
+              <w:top w:type="dxa" w:w="60"/>
+              <w:left w:type="dxa" w:w="100"/>
+              <w:bottom w:type="dxa" w:w="60"/>
+              <w:right w:type="dxa" w:w="100"/>
+            </w:tcMar>
+          </w:tcPr>
+          <w:p>
+            <w:r>
+              <w:t xml:space="preserve">15:02:06 (model)</w:t>
+            </w:r>
+          </w:p>
+        </w:tc>
+        <w:tc>
+          <w:tcPr>
+            <w:tcW w:type="dxa" w:w="1264"/>
+            <w:tcBorders>
+              <w:top w:val="single" w:color="BFBFBF" w:sz="4"/>
+              <w:left w:val="single" w:color="BFBFBF" w:sz="4"/>
+              <w:bottom w:val="single" w:color="BFBFBF" w:sz="4"/>
+              <w:right w:val="single" w:color="BFBFBF" w:sz="4"/>
+            </w:tcBorders>
+            <w:tcMar>
+              <w:top w:type="dxa" w:w="60"/>
+              <w:left w:type="dxa" w:w="100"/>
+              <w:bottom w:type="dxa" w:w="60"/>
+              <w:right w:type="dxa" w:w="100"/>
+            </w:tcMar>
+          </w:tcPr>
+          <w:p>
+            <w:r>
+              <w:t xml:space="preserve">offhours</w:t>
+            </w:r>
+          </w:p>
+        </w:tc>
+        <w:tc>
+          <w:tcPr>
+            <w:tcW w:type="dxa" w:w="1986"/>
+            <w:tcBorders>
+              <w:top w:val="single" w:color="BFBFBF" w:sz="4"/>
+              <w:left w:val="single" w:color="BFBFBF" w:sz="4"/>
+              <w:bottom w:val="single" w:color="BFBFBF" w:sz="4"/>
+              <w:right w:val="single" w:color="BFBFBF" w:sz="4"/>
+            </w:tcBorders>
+            <w:tcMar>
+              <w:top w:type="dxa" w:w="60"/>
+              <w:left w:type="dxa" w:w="100"/>
+              <w:bottom w:type="dxa" w:w="60"/>
+              <w:right w:type="dxa" w:w="100"/>
+            </w:tcMar>
+          </w:tcPr>
+          <w:p>
+            <w:r>
+              <w:t xml:space="preserve">ALERT ONLY</w:t>
+            </w:r>
+          </w:p>
+        </w:tc>
+        <w:tc>
+          <w:tcPr>
+            <w:tcW w:type="dxa" w:w="1443"/>
+            <w:tcBorders>
+              <w:top w:val="single" w:color="BFBFBF" w:sz="4"/>
+              <w:left w:val="single" w:color="BFBFBF" w:sz="4"/>
+              <w:bottom w:val="single" w:color="BFBFBF" w:sz="4"/>
+              <w:right w:val="single" w:color="BFBFBF" w:sz="4"/>
+            </w:tcBorders>
+            <w:tcMar>
+              <w:top w:type="dxa" w:w="60"/>
+              <w:left w:type="dxa" w:w="100"/>
+              <w:bottom w:type="dxa" w:w="60"/>
+              <w:right w:type="dxa" w:w="100"/>
+            </w:tcMar>
+          </w:tcPr>
+          <w:p>
+            <w:r>
+              <w:t xml:space="preserve">1.0 s</w:t>
+            </w:r>
+          </w:p>
+        </w:tc>
+      </w:tr>
+    </w:tbl>
+    <w:p>
+      <w:pPr>
+        <w:spacing w:after="120"/>
+      </w:pPr>
+    </w:p>
+    <w:p>
+      <w:pPr>
+        <w:spacing w:after="120"/>
+      </w:pPr>
+      <w:r>
+        <w:t xml:space="preserve">Two other alerts were raised, both alert-only, so nothing was disrupted: staff-pc at 15:00:36, the window in which the insider download had just begun (too little data yet to be classified as insider), and guest-pc at 15:01:06 during normal traffic, a genuine false alarm consistent with the 1.1 % false-positive rate. Each attack is answered within its first or second window, so the time from the start of an attack to the response is at most one 10-second window plus 1 to 2 seconds; most of the remaining time is the 1-second grace for late packets, the RADIUS reload and the port bounce.</w:t>
+      </w:r>
+    </w:p>
+    <w:p>
+      <w:pPr>
+        <w:spacing w:after="120"/>
+      </w:pPr>
+      <w:r>
+        <w:t xml:space="preserve">Earlier runs of the same test found three problems, all fixed: (1) all PCs end in .50, so a quarantined PC's address 10.10.99.50 was matched to the wrong PC and admin-pc was quarantined by mistake; each PC now has its own quarantine address (10.10.99.10, .20, .30) and a test checks that every address maps to exactly one PC; (2) FreeRADIUS compares file times to the second, so two quick rule changes during a reset could leave a rule in force; reloads are now spaced and confirmed by counting reload messages in its log; (3) the reload check looked only at the last lines of a log that grows by dozens of lines a second during a brute force, and its error stopped the pipeline; the check now counts reloads over the whole log and a failed response no longer stops detection.</w:t>
+      </w:r>
+    </w:p>
+    <w:p>
+      <w:pPr>
         <w:pStyle w:val="Heading1"/>
         <w:pageBreakBefore/>
       </w:pPr>
-      <w:bookmarkStart w:name="_Toc34" w:id="34"/>
+      <w:bookmarkStart w:name="_Toc35" w:id="35"/>
       <w:r>
         <w:t xml:space="preserve">7. Verified Evidence for Chapter 5</w:t>
       </w:r>
-      <w:bookmarkEnd w:id="34"/>
+      <w:bookmarkEnd w:id="35"/>
     </w:p>
     <w:p>
       <w:pPr>
@@ -12168,11 +13043,11 @@
         <w:pStyle w:val="Heading1"/>
         <w:pageBreakBefore/>
       </w:pPr>
-      <w:bookmarkStart w:name="_Toc35" w:id="35"/>
+      <w:bookmarkStart w:name="_Toc36" w:id="36"/>
       <w:r>
         <w:t xml:space="preserve">8. Problems Encountered and Fixes</w:t>
       </w:r>
-      <w:bookmarkEnd w:id="35"/>
+      <w:bookmarkEnd w:id="36"/>
     </w:p>
     <w:tbl>
       <w:tblPr>
@@ -13529,6 +14404,278 @@
           </w:tcPr>
           <w:p>
             <w:r>
+              <w:t xml:space="preserve">admin-pc quarantined by mistake in the first end-to-end test</w:t>
+            </w:r>
+          </w:p>
+        </w:tc>
+        <w:tc>
+          <w:tcPr>
+            <w:tcW w:type="dxa" w:w="3069"/>
+            <w:tcBorders>
+              <w:top w:val="single" w:color="BFBFBF" w:sz="4"/>
+              <w:left w:val="single" w:color="BFBFBF" w:sz="4"/>
+              <w:bottom w:val="single" w:color="BFBFBF" w:sz="4"/>
+              <w:right w:val="single" w:color="BFBFBF" w:sz="4"/>
+            </w:tcBorders>
+            <w:tcMar>
+              <w:top w:type="dxa" w:w="60"/>
+              <w:left w:type="dxa" w:w="100"/>
+              <w:bottom w:type="dxa" w:w="60"/>
+              <w:right w:type="dxa" w:w="100"/>
+            </w:tcMar>
+          </w:tcPr>
+          <w:p>
+            <w:r>
+              <w:t xml:space="preserve">All PCs end in .50, so the quarantine address 10.10.99.50 matched the first PC</w:t>
+            </w:r>
+          </w:p>
+        </w:tc>
+        <w:tc>
+          <w:tcPr>
+            <w:tcW w:type="dxa" w:w="3430"/>
+            <w:tcBorders>
+              <w:top w:val="single" w:color="BFBFBF" w:sz="4"/>
+              <w:left w:val="single" w:color="BFBFBF" w:sz="4"/>
+              <w:bottom w:val="single" w:color="BFBFBF" w:sz="4"/>
+              <w:right w:val="single" w:color="BFBFBF" w:sz="4"/>
+            </w:tcBorders>
+            <w:tcMar>
+              <w:top w:type="dxa" w:w="60"/>
+              <w:left w:type="dxa" w:w="100"/>
+              <w:bottom w:type="dxa" w:w="60"/>
+              <w:right w:type="dxa" w:w="100"/>
+            </w:tcMar>
+          </w:tcPr>
+          <w:p>
+            <w:r>
+              <w:t xml:space="preserve">One fixed quarantine address per PC (10.10.99.10/.20/.30), unit-tested</w:t>
+            </w:r>
+          </w:p>
+        </w:tc>
+      </w:tr>
+      <w:tr>
+        <w:tc>
+          <w:tcPr>
+            <w:tcW w:type="dxa" w:w="2527"/>
+            <w:tcBorders>
+              <w:top w:val="single" w:color="BFBFBF" w:sz="4"/>
+              <w:left w:val="single" w:color="BFBFBF" w:sz="4"/>
+              <w:bottom w:val="single" w:color="BFBFBF" w:sz="4"/>
+              <w:right w:val="single" w:color="BFBFBF" w:sz="4"/>
+            </w:tcBorders>
+            <w:tcMar>
+              <w:top w:type="dxa" w:w="60"/>
+              <w:left w:type="dxa" w:w="100"/>
+              <w:bottom w:type="dxa" w:w="60"/>
+              <w:right w:type="dxa" w:w="100"/>
+            </w:tcMar>
+          </w:tcPr>
+          <w:p>
+            <w:r>
+              <w:t xml:space="preserve">A rule stayed in force after reset</w:t>
+            </w:r>
+          </w:p>
+        </w:tc>
+        <w:tc>
+          <w:tcPr>
+            <w:tcW w:type="dxa" w:w="3069"/>
+            <w:tcBorders>
+              <w:top w:val="single" w:color="BFBFBF" w:sz="4"/>
+              <w:left w:val="single" w:color="BFBFBF" w:sz="4"/>
+              <w:bottom w:val="single" w:color="BFBFBF" w:sz="4"/>
+              <w:right w:val="single" w:color="BFBFBF" w:sz="4"/>
+            </w:tcBorders>
+            <w:tcMar>
+              <w:top w:type="dxa" w:w="60"/>
+              <w:left w:type="dxa" w:w="100"/>
+              <w:bottom w:type="dxa" w:w="60"/>
+              <w:right w:type="dxa" w:w="100"/>
+            </w:tcMar>
+          </w:tcPr>
+          <w:p>
+            <w:r>
+              <w:t xml:space="preserve">FreeRADIUS compares file times to the second; two reloads within one second</w:t>
+            </w:r>
+          </w:p>
+        </w:tc>
+        <w:tc>
+          <w:tcPr>
+            <w:tcW w:type="dxa" w:w="3430"/>
+            <w:tcBorders>
+              <w:top w:val="single" w:color="BFBFBF" w:sz="4"/>
+              <w:left w:val="single" w:color="BFBFBF" w:sz="4"/>
+              <w:bottom w:val="single" w:color="BFBFBF" w:sz="4"/>
+              <w:right w:val="single" w:color="BFBFBF" w:sz="4"/>
+            </w:tcBorders>
+            <w:tcMar>
+              <w:top w:type="dxa" w:w="60"/>
+              <w:left w:type="dxa" w:w="100"/>
+              <w:bottom w:type="dxa" w:w="60"/>
+              <w:right w:type="dxa" w:w="100"/>
+            </w:tcMar>
+          </w:tcPr>
+          <w:p>
+            <w:r>
+              <w:t xml:space="preserve">Reloads spaced over a second apart and confirmed in the log</w:t>
+            </w:r>
+          </w:p>
+        </w:tc>
+      </w:tr>
+      <w:tr>
+        <w:tc>
+          <w:tcPr>
+            <w:tcW w:type="dxa" w:w="2527"/>
+            <w:tcBorders>
+              <w:top w:val="single" w:color="BFBFBF" w:sz="4"/>
+              <w:left w:val="single" w:color="BFBFBF" w:sz="4"/>
+              <w:bottom w:val="single" w:color="BFBFBF" w:sz="4"/>
+              <w:right w:val="single" w:color="BFBFBF" w:sz="4"/>
+            </w:tcBorders>
+            <w:tcMar>
+              <w:top w:type="dxa" w:w="60"/>
+              <w:left w:type="dxa" w:w="100"/>
+              <w:bottom w:type="dxa" w:w="60"/>
+              <w:right w:type="dxa" w:w="100"/>
+            </w:tcMar>
+          </w:tcPr>
+          <w:p>
+            <w:r>
+              <w:t xml:space="preserve">Pipeline stopped during a brute force</w:t>
+            </w:r>
+          </w:p>
+        </w:tc>
+        <w:tc>
+          <w:tcPr>
+            <w:tcW w:type="dxa" w:w="3069"/>
+            <w:tcBorders>
+              <w:top w:val="single" w:color="BFBFBF" w:sz="4"/>
+              <w:left w:val="single" w:color="BFBFBF" w:sz="4"/>
+              <w:bottom w:val="single" w:color="BFBFBF" w:sz="4"/>
+              <w:right w:val="single" w:color="BFBFBF" w:sz="4"/>
+            </w:tcBorders>
+            <w:tcMar>
+              <w:top w:type="dxa" w:w="60"/>
+              <w:left w:type="dxa" w:w="100"/>
+              <w:bottom w:type="dxa" w:w="60"/>
+              <w:right w:type="dxa" w:w="100"/>
+            </w:tcMar>
+          </w:tcPr>
+          <w:p>
+            <w:r>
+              <w:t xml:space="preserve">Reload check missed its message in a fast-growing log and the error ended the loop</w:t>
+            </w:r>
+          </w:p>
+        </w:tc>
+        <w:tc>
+          <w:tcPr>
+            <w:tcW w:type="dxa" w:w="3430"/>
+            <w:tcBorders>
+              <w:top w:val="single" w:color="BFBFBF" w:sz="4"/>
+              <w:left w:val="single" w:color="BFBFBF" w:sz="4"/>
+              <w:bottom w:val="single" w:color="BFBFBF" w:sz="4"/>
+              <w:right w:val="single" w:color="BFBFBF" w:sz="4"/>
+            </w:tcBorders>
+            <w:tcMar>
+              <w:top w:type="dxa" w:w="60"/>
+              <w:left w:type="dxa" w:w="100"/>
+              <w:bottom w:type="dxa" w:w="60"/>
+              <w:right w:type="dxa" w:w="100"/>
+            </w:tcMar>
+          </w:tcPr>
+          <w:p>
+            <w:r>
+              <w:t xml:space="preserve">Count reload messages over the whole log; failed responses are logged and detection continues</w:t>
+            </w:r>
+          </w:p>
+        </w:tc>
+      </w:tr>
+      <w:tr>
+        <w:tc>
+          <w:tcPr>
+            <w:tcW w:type="dxa" w:w="2527"/>
+            <w:tcBorders>
+              <w:top w:val="single" w:color="BFBFBF" w:sz="4"/>
+              <w:left w:val="single" w:color="BFBFBF" w:sz="4"/>
+              <w:bottom w:val="single" w:color="BFBFBF" w:sz="4"/>
+              <w:right w:val="single" w:color="BFBFBF" w:sz="4"/>
+            </w:tcBorders>
+            <w:tcMar>
+              <w:top w:type="dxa" w:w="60"/>
+              <w:left w:type="dxa" w:w="100"/>
+              <w:bottom w:type="dxa" w:w="60"/>
+              <w:right w:type="dxa" w:w="100"/>
+            </w:tcMar>
+          </w:tcPr>
+          <w:p>
+            <w:r>
+              <w:t xml:space="preserve">Test pipelines kept running after the test</w:t>
+            </w:r>
+          </w:p>
+        </w:tc>
+        <w:tc>
+          <w:tcPr>
+            <w:tcW w:type="dxa" w:w="3069"/>
+            <w:tcBorders>
+              <w:top w:val="single" w:color="BFBFBF" w:sz="4"/>
+              <w:left w:val="single" w:color="BFBFBF" w:sz="4"/>
+              <w:bottom w:val="single" w:color="BFBFBF" w:sz="4"/>
+              <w:right w:val="single" w:color="BFBFBF" w:sz="4"/>
+            </w:tcBorders>
+            <w:tcMar>
+              <w:top w:type="dxa" w:w="60"/>
+              <w:left w:type="dxa" w:w="100"/>
+              <w:bottom w:type="dxa" w:w="60"/>
+              <w:right w:type="dxa" w:w="100"/>
+            </w:tcMar>
+          </w:tcPr>
+          <w:p>
+            <w:r>
+              <w:t xml:space="preserve">Background processes in a script ignore Ctrl+C (SIGINT)</w:t>
+            </w:r>
+          </w:p>
+        </w:tc>
+        <w:tc>
+          <w:tcPr>
+            <w:tcW w:type="dxa" w:w="3430"/>
+            <w:tcBorders>
+              <w:top w:val="single" w:color="BFBFBF" w:sz="4"/>
+              <w:left w:val="single" w:color="BFBFBF" w:sz="4"/>
+              <w:bottom w:val="single" w:color="BFBFBF" w:sz="4"/>
+              <w:right w:val="single" w:color="BFBFBF" w:sz="4"/>
+            </w:tcBorders>
+            <w:tcMar>
+              <w:top w:type="dxa" w:w="60"/>
+              <w:left w:type="dxa" w:w="100"/>
+              <w:bottom w:type="dxa" w:w="60"/>
+              <w:right w:type="dxa" w:w="100"/>
+            </w:tcMar>
+          </w:tcPr>
+          <w:p>
+            <w:r>
+              <w:t xml:space="preserve">Pipeline stops on SIGTERM too, and refuses to start while another is running</w:t>
+            </w:r>
+          </w:p>
+        </w:tc>
+      </w:tr>
+      <w:tr>
+        <w:tc>
+          <w:tcPr>
+            <w:tcW w:type="dxa" w:w="2527"/>
+            <w:tcBorders>
+              <w:top w:val="single" w:color="BFBFBF" w:sz="4"/>
+              <w:left w:val="single" w:color="BFBFBF" w:sz="4"/>
+              <w:bottom w:val="single" w:color="BFBFBF" w:sz="4"/>
+              <w:right w:val="single" w:color="BFBFBF" w:sz="4"/>
+            </w:tcBorders>
+            <w:tcMar>
+              <w:top w:type="dxa" w:w="60"/>
+              <w:left w:type="dxa" w:w="100"/>
+              <w:bottom w:type="dxa" w:w="60"/>
+              <w:right w:type="dxa" w:w="100"/>
+            </w:tcMar>
+          </w:tcPr>
+          <w:p>
+            <w:r>
               <w:t xml:space="preserve">Little free RAM for captures</w:t>
             </w:r>
           </w:p>
@@ -13584,21 +14731,21 @@
         <w:pStyle w:val="Heading1"/>
         <w:pageBreakBefore/>
       </w:pPr>
-      <w:bookmarkStart w:name="_Toc36" w:id="36"/>
+      <w:bookmarkStart w:name="_Toc37" w:id="37"/>
       <w:r>
         <w:t xml:space="preserve">9. Monitoring with Zabbix</w:t>
       </w:r>
-      <w:bookmarkEnd w:id="36"/>
+      <w:bookmarkEnd w:id="37"/>
     </w:p>
     <w:p>
       <w:pPr>
         <w:pStyle w:val="Heading2"/>
       </w:pPr>
-      <w:bookmarkStart w:name="_Toc37" w:id="37"/>
+      <w:bookmarkStart w:name="_Toc38" w:id="38"/>
       <w:r>
         <w:t xml:space="preserve">9.1 Viewing the dashboard</w:t>
       </w:r>
-      <w:bookmarkEnd w:id="37"/>
+      <w:bookmarkEnd w:id="38"/>
     </w:p>
     <w:p>
       <w:pPr>
@@ -13667,11 +14814,11 @@
       <w:pPr>
         <w:pStyle w:val="Heading2"/>
       </w:pPr>
-      <w:bookmarkStart w:name="_Toc38" w:id="38"/>
+      <w:bookmarkStart w:name="_Toc39" w:id="39"/>
       <w:r>
         <w:t xml:space="preserve">9.2 What is monitored today</w:t>
       </w:r>
-      <w:bookmarkEnd w:id="38"/>
+      <w:bookmarkEnd w:id="39"/>
     </w:p>
     <w:p>
       <w:pPr>
@@ -13703,11 +14850,11 @@
       <w:pPr>
         <w:pStyle w:val="Heading2"/>
       </w:pPr>
-      <w:bookmarkStart w:name="_Toc39" w:id="39"/>
+      <w:bookmarkStart w:name="_Toc40" w:id="40"/>
       <w:r>
         <w:t xml:space="preserve">9.3 Every node pushes its own data (zt_zbx_push.py)</w:t>
       </w:r>
-      <w:bookmarkEnd w:id="39"/>
+      <w:bookmarkEnd w:id="40"/>
     </w:p>
     <w:p>
       <w:pPr>
@@ -14092,11 +15239,11 @@
       <w:pPr>
         <w:pStyle w:val="Heading2"/>
       </w:pPr>
-      <w:bookmarkStart w:name="_Toc40" w:id="40"/>
+      <w:bookmarkStart w:name="_Toc41" w:id="41"/>
       <w:r>
         <w:t xml:space="preserve">9.4 The two dashboard pages</w:t>
       </w:r>
-      <w:bookmarkEnd w:id="40"/>
+      <w:bookmarkEnd w:id="41"/>
     </w:p>
     <w:tbl>
       <w:tblPr>
@@ -14373,21 +15520,21 @@
         <w:pStyle w:val="Heading1"/>
         <w:pageBreakBefore/>
       </w:pPr>
-      <w:bookmarkStart w:name="_Toc41" w:id="41"/>
+      <w:bookmarkStart w:name="_Toc42" w:id="42"/>
       <w:r>
         <w:t xml:space="preserve">10. Remaining Work</w:t>
       </w:r>
-      <w:bookmarkEnd w:id="41"/>
+      <w:bookmarkEnd w:id="42"/>
     </w:p>
     <w:p>
       <w:pPr>
         <w:pStyle w:val="Heading2"/>
       </w:pPr>
-      <w:bookmarkStart w:name="_Toc42" w:id="42"/>
+      <w:bookmarkStart w:name="_Toc43" w:id="43"/>
       <w:r>
         <w:t xml:space="preserve">Phase 3 (detection and response)</w:t>
       </w:r>
-      <w:bookmarkEnd w:id="42"/>
+      <w:bookmarkEnd w:id="43"/>
     </w:p>
     <w:p>
       <w:pPr>
@@ -14403,21 +15550,21 @@
           <w:b/>
           <w:bCs/>
         </w:rPr>
-        <w:t xml:space="preserve">Orchestrator</w:t>
-      </w:r>
-      <w:r>
-        <w:t xml:space="preserve"> - one process that collects, scores, classifies, responds and timestamps each step to measure response time.</w:t>
+        <w:t xml:space="preserve">Rehearse the full demo with Zabbix running</w:t>
+      </w:r>
+      <w:r>
+        <w:t xml:space="preserve"> (the end-to-end test ran with Zabbix stopped to save RAM) and record a backup video.</w:t>
       </w:r>
     </w:p>
     <w:p>
       <w:pPr>
         <w:pStyle w:val="Heading2"/>
       </w:pPr>
-      <w:bookmarkStart w:name="_Toc43" w:id="43"/>
+      <w:bookmarkStart w:name="_Toc44" w:id="44"/>
       <w:r>
         <w:t xml:space="preserve">Phase 4 (validation and report)</w:t>
       </w:r>
-      <w:bookmarkEnd w:id="43"/>
+      <w:bookmarkEnd w:id="44"/>
     </w:p>
     <w:p>
       <w:pPr>
@@ -14463,11 +15610,11 @@
         <w:pStyle w:val="Heading1"/>
         <w:pageBreakBefore/>
       </w:pPr>
-      <w:bookmarkStart w:name="_Toc44" w:id="44"/>
+      <w:bookmarkStart w:name="_Toc45" w:id="45"/>
       <w:r>
         <w:t xml:space="preserve">11. Files and Commands</w:t>
       </w:r>
-      <w:bookmarkEnd w:id="44"/>
+      <w:bookmarkEnd w:id="45"/>
     </w:p>
     <w:p>
       <w:pPr>
@@ -15494,7 +16641,7 @@
           </w:tcPr>
           <w:p>
             <w:r>
-              <w:t xml:space="preserve">Response engine (block IP, quarantine, disable account, alert only, reset; incident log, Zabbix) and its 9 offline tests</w:t>
+              <w:t xml:space="preserve">Response engine (block IP, quarantine, disable account, alert only, reset; attack classification; incident log, Zabbix) and its 11 offline tests</w:t>
             </w:r>
           </w:p>
         </w:tc>
@@ -15518,6 +16665,144 @@
           </w:tcPr>
           <w:p>
             <w:r>
+              <w:t xml:space="preserve">zt_pipeline.py</w:t>
+            </w:r>
+          </w:p>
+        </w:tc>
+        <w:tc>
+          <w:tcPr>
+            <w:tcW w:type="dxa" w:w="4964"/>
+            <w:tcBorders>
+              <w:top w:val="single" w:color="BFBFBF" w:sz="4"/>
+              <w:left w:val="single" w:color="BFBFBF" w:sz="4"/>
+              <w:bottom w:val="single" w:color="BFBFBF" w:sz="4"/>
+              <w:right w:val="single" w:color="BFBFBF" w:sz="4"/>
+            </w:tcBorders>
+            <w:tcMar>
+              <w:top w:type="dxa" w:w="60"/>
+              <w:left w:type="dxa" w:w="100"/>
+              <w:bottom w:type="dxa" w:w="60"/>
+              <w:right w:type="dxa" w:w="100"/>
+            </w:tcMar>
+          </w:tcPr>
+          <w:p>
+            <w:r>
+              <w:t xml:space="preserve">Live pipeline: continuous capture, features, scoring, classification, response, timing</w:t>
+            </w:r>
+          </w:p>
+        </w:tc>
+      </w:tr>
+      <w:tr>
+        <w:tc>
+          <w:tcPr>
+            <w:tcW w:type="dxa" w:w="4062"/>
+            <w:tcBorders>
+              <w:top w:val="single" w:color="BFBFBF" w:sz="4"/>
+              <w:left w:val="single" w:color="BFBFBF" w:sz="4"/>
+              <w:bottom w:val="single" w:color="BFBFBF" w:sz="4"/>
+              <w:right w:val="single" w:color="BFBFBF" w:sz="4"/>
+            </w:tcBorders>
+            <w:tcMar>
+              <w:top w:type="dxa" w:w="60"/>
+              <w:left w:type="dxa" w:w="100"/>
+              <w:bottom w:type="dxa" w:w="60"/>
+              <w:right w:type="dxa" w:w="100"/>
+            </w:tcMar>
+          </w:tcPr>
+          <w:p>
+            <w:r>
+              <w:t xml:space="preserve">e2e_test.sh</w:t>
+            </w:r>
+          </w:p>
+        </w:tc>
+        <w:tc>
+          <w:tcPr>
+            <w:tcW w:type="dxa" w:w="4964"/>
+            <w:tcBorders>
+              <w:top w:val="single" w:color="BFBFBF" w:sz="4"/>
+              <w:left w:val="single" w:color="BFBFBF" w:sz="4"/>
+              <w:bottom w:val="single" w:color="BFBFBF" w:sz="4"/>
+              <w:right w:val="single" w:color="BFBFBF" w:sz="4"/>
+            </w:tcBorders>
+            <w:tcMar>
+              <w:top w:type="dxa" w:w="60"/>
+              <w:left w:type="dxa" w:w="100"/>
+              <w:bottom w:type="dxa" w:w="60"/>
+              <w:right w:type="dxa" w:w="100"/>
+            </w:tcMar>
+          </w:tcPr>
+          <w:p>
+            <w:r>
+              <w:t xml:space="preserve">8-minute end-to-end test of all five attacks</w:t>
+            </w:r>
+          </w:p>
+        </w:tc>
+      </w:tr>
+      <w:tr>
+        <w:tc>
+          <w:tcPr>
+            <w:tcW w:type="dxa" w:w="4062"/>
+            <w:tcBorders>
+              <w:top w:val="single" w:color="BFBFBF" w:sz="4"/>
+              <w:left w:val="single" w:color="BFBFBF" w:sz="4"/>
+              <w:bottom w:val="single" w:color="BFBFBF" w:sz="4"/>
+              <w:right w:val="single" w:color="BFBFBF" w:sz="4"/>
+            </w:tcBorders>
+            <w:tcMar>
+              <w:top w:type="dxa" w:w="60"/>
+              <w:left w:type="dxa" w:w="100"/>
+              <w:bottom w:type="dxa" w:w="60"/>
+              <w:right w:type="dxa" w:w="100"/>
+            </w:tcMar>
+          </w:tcPr>
+          <w:p>
+            <w:r>
+              <w:t xml:space="preserve">logs/</w:t>
+            </w:r>
+          </w:p>
+        </w:tc>
+        <w:tc>
+          <w:tcPr>
+            <w:tcW w:type="dxa" w:w="4964"/>
+            <w:tcBorders>
+              <w:top w:val="single" w:color="BFBFBF" w:sz="4"/>
+              <w:left w:val="single" w:color="BFBFBF" w:sz="4"/>
+              <w:bottom w:val="single" w:color="BFBFBF" w:sz="4"/>
+              <w:right w:val="single" w:color="BFBFBF" w:sz="4"/>
+            </w:tcBorders>
+            <w:tcMar>
+              <w:top w:type="dxa" w:w="60"/>
+              <w:left w:type="dxa" w:w="100"/>
+              <w:bottom w:type="dxa" w:w="60"/>
+              <w:right w:type="dxa" w:w="100"/>
+            </w:tcMar>
+          </w:tcPr>
+          <w:p>
+            <w:r>
+              <w:t xml:space="preserve">incidents.jsonl (every alert and action), response_state.json, test logs</w:t>
+            </w:r>
+          </w:p>
+        </w:tc>
+      </w:tr>
+      <w:tr>
+        <w:tc>
+          <w:tcPr>
+            <w:tcW w:type="dxa" w:w="4062"/>
+            <w:tcBorders>
+              <w:top w:val="single" w:color="BFBFBF" w:sz="4"/>
+              <w:left w:val="single" w:color="BFBFBF" w:sz="4"/>
+              <w:bottom w:val="single" w:color="BFBFBF" w:sz="4"/>
+              <w:right w:val="single" w:color="BFBFBF" w:sz="4"/>
+            </w:tcBorders>
+            <w:tcMar>
+              <w:top w:type="dxa" w:w="60"/>
+              <w:left w:type="dxa" w:w="100"/>
+              <w:bottom w:type="dxa" w:w="60"/>
+              <w:right w:type="dxa" w:w="100"/>
+            </w:tcMar>
+          </w:tcPr>
+          <w:p>
+            <w:r>
               <w:t xml:space="preserve">results/</w:t>
             </w:r>
           </w:p>
@@ -15601,11 +16886,11 @@
       <w:pPr>
         <w:pStyle w:val="Heading2"/>
       </w:pPr>
-      <w:bookmarkStart w:name="_Toc45" w:id="45"/>
+      <w:bookmarkStart w:name="_Toc46" w:id="46"/>
       <w:r>
         <w:t xml:space="preserve">Daily routine</w:t>
       </w:r>
-      <w:bookmarkEnd w:id="45"/>
+      <w:bookmarkEnd w:id="46"/>
     </w:p>
     <w:p>
       <w:pPr>
@@ -15725,11 +17010,11 @@
         <w:pStyle w:val="Heading1"/>
         <w:pageBreakBefore/>
       </w:pPr>
-      <w:bookmarkStart w:name="_Toc46" w:id="46"/>
+      <w:bookmarkStart w:name="_Toc47" w:id="47"/>
       <w:r>
         <w:t xml:space="preserve">12. Report Corrections Needed</w:t>
       </w:r>
-      <w:bookmarkEnd w:id="46"/>
+      <w:bookmarkEnd w:id="47"/>
     </w:p>
     <w:p>
       <w:pPr>
@@ -15856,11 +17141,11 @@
         <w:pStyle w:val="Heading1"/>
         <w:pageBreakBefore/>
       </w:pPr>
-      <w:bookmarkStart w:name="_Toc47" w:id="47"/>
+      <w:bookmarkStart w:name="_Toc48" w:id="48"/>
       <w:r>
         <w:t xml:space="preserve">13. Risks and Open Questions</w:t>
       </w:r>
-      <w:bookmarkEnd w:id="47"/>
+      <w:bookmarkEnd w:id="48"/>
     </w:p>
     <w:p>
       <w:pPr>

</xml_diff>

<commit_message>
Chapter 5 (Results and Discussion) generated from results/ as chapter5.json for the report builder
</commit_message>
<xml_diff>
--- a/ZT_Project_Implementation_Log.docx
+++ b/ZT_Project_Implementation_Log.docx
@@ -84,7 +84,7 @@
           <w:sz w:val="22"/>
           <w:szCs w:val="22"/>
         </w:rPr>
-        <w:t xml:space="preserve">Last updated 14 October 2026 at 15:04</w:t>
+        <w:t xml:space="preserve">Last updated 14 October 2026 at 17:25</w:t>
       </w:r>
     </w:p>
     <w:p>
@@ -1980,7 +1980,53 @@
           </w:tcPr>
           <w:p>
             <w:r>
-              <w:t xml:space="preserve">Not started (list in section 12)</w:t>
+              <w:t xml:space="preserve">Done by a second Claude session in docs/report/ (Chapters 1 to 4 match the built system; Chapter 6 in progress there)</w:t>
+            </w:r>
+          </w:p>
+        </w:tc>
+      </w:tr>
+      <w:tr>
+        <w:tc>
+          <w:tcPr>
+            <w:tcW w:type="dxa" w:w="3610"/>
+            <w:tcBorders>
+              <w:top w:val="single" w:color="BFBFBF" w:sz="4"/>
+              <w:left w:val="single" w:color="BFBFBF" w:sz="4"/>
+              <w:bottom w:val="single" w:color="BFBFBF" w:sz="4"/>
+              <w:right w:val="single" w:color="BFBFBF" w:sz="4"/>
+            </w:tcBorders>
+            <w:tcMar>
+              <w:top w:type="dxa" w:w="60"/>
+              <w:left w:type="dxa" w:w="100"/>
+              <w:bottom w:type="dxa" w:w="60"/>
+              <w:right w:type="dxa" w:w="100"/>
+            </w:tcMar>
+          </w:tcPr>
+          <w:p>
+            <w:r>
+              <w:t xml:space="preserve">Chapter 5 (Results and Discussion)</w:t>
+            </w:r>
+          </w:p>
+        </w:tc>
+        <w:tc>
+          <w:tcPr>
+            <w:tcW w:type="dxa" w:w="5416"/>
+            <w:tcBorders>
+              <w:top w:val="single" w:color="BFBFBF" w:sz="4"/>
+              <w:left w:val="single" w:color="BFBFBF" w:sz="4"/>
+              <w:bottom w:val="single" w:color="BFBFBF" w:sz="4"/>
+              <w:right w:val="single" w:color="BFBFBF" w:sz="4"/>
+            </w:tcBorders>
+            <w:tcMar>
+              <w:top w:type="dxa" w:w="60"/>
+              <w:left w:type="dxa" w:w="100"/>
+              <w:bottom w:type="dxa" w:w="60"/>
+              <w:right w:type="dxa" w:w="100"/>
+            </w:tcMar>
+          </w:tcPr>
+          <w:p>
+            <w:r>
+              <w:t xml:space="preserve">Written: docs/chapter5/chapter5.json, generated from results/ by build_chapter5.py, merged by the report builder</w:t>
             </w:r>
           </w:p>
         </w:tc>
@@ -14653,6 +14699,74 @@
           <w:p>
             <w:r>
               <w:t xml:space="preserve">Pipeline stops on SIGTERM too, and refuses to start while another is running</w:t>
+            </w:r>
+          </w:p>
+        </w:tc>
+      </w:tr>
+      <w:tr>
+        <w:tc>
+          <w:tcPr>
+            <w:tcW w:type="dxa" w:w="2527"/>
+            <w:tcBorders>
+              <w:top w:val="single" w:color="BFBFBF" w:sz="4"/>
+              <w:left w:val="single" w:color="BFBFBF" w:sz="4"/>
+              <w:bottom w:val="single" w:color="BFBFBF" w:sz="4"/>
+              <w:right w:val="single" w:color="BFBFBF" w:sz="4"/>
+            </w:tcBorders>
+            <w:tcMar>
+              <w:top w:type="dxa" w:w="60"/>
+              <w:left w:type="dxa" w:w="100"/>
+              <w:bottom w:type="dxa" w:w="60"/>
+              <w:right w:type="dxa" w:w="100"/>
+            </w:tcMar>
+          </w:tcPr>
+          <w:p>
+            <w:r>
+              <w:t xml:space="preserve">Core, access switch and staff-pc killed during the Zabbix rehearsal (15:09)</w:t>
+            </w:r>
+          </w:p>
+        </w:tc>
+        <w:tc>
+          <w:tcPr>
+            <w:tcW w:type="dxa" w:w="3069"/>
+            <w:tcBorders>
+              <w:top w:val="single" w:color="BFBFBF" w:sz="4"/>
+              <w:left w:val="single" w:color="BFBFBF" w:sz="4"/>
+              <w:bottom w:val="single" w:color="BFBFBF" w:sz="4"/>
+              <w:right w:val="single" w:color="BFBFBF" w:sz="4"/>
+            </w:tcBorders>
+            <w:tcMar>
+              <w:top w:type="dxa" w:w="60"/>
+              <w:left w:type="dxa" w:w="100"/>
+              <w:bottom w:type="dxa" w:w="60"/>
+              <w:right w:type="dxa" w:w="100"/>
+            </w:tcMar>
+          </w:tcPr>
+          <w:p>
+            <w:r>
+              <w:t xml:space="preserve">Lab + Zabbix + pipeline + document renders exceeded RAM; free memory fell to 75 MB and the kernel killed containers</w:t>
+            </w:r>
+          </w:p>
+        </w:tc>
+        <w:tc>
+          <w:tcPr>
+            <w:tcW w:type="dxa" w:w="3430"/>
+            <w:tcBorders>
+              <w:top w:val="single" w:color="BFBFBF" w:sz="4"/>
+              <w:left w:val="single" w:color="BFBFBF" w:sz="4"/>
+              <w:bottom w:val="single" w:color="BFBFBF" w:sz="4"/>
+              <w:right w:val="single" w:color="BFBFBF" w:sz="4"/>
+            </w:tcBorders>
+            <w:tcMar>
+              <w:top w:type="dxa" w:w="60"/>
+              <w:left w:type="dxa" w:w="100"/>
+              <w:bottom w:type="dxa" w:w="60"/>
+              <w:right w:type="dxa" w:w="100"/>
+            </w:tcMar>
+          </w:tcPr>
+          <w:p>
+            <w:r>
+              <w:t xml:space="preserve">Rebuild with lab-up.sh; no heavy programs during lab runs; report renders only while the lab is idle</w:t>
             </w:r>
           </w:p>
         </w:tc>

</xml_diff>

<commit_message>
Final rehearsal with Zabbix running passed; result added to Chapter 5 (5.6)
</commit_message>
<xml_diff>
--- a/ZT_Project_Implementation_Log.docx
+++ b/ZT_Project_Implementation_Log.docx
@@ -84,7 +84,7 @@
           <w:sz w:val="22"/>
           <w:szCs w:val="22"/>
         </w:rPr>
-        <w:t xml:space="preserve">Last updated 14 October 2026 at 17:25</w:t>
+        <w:t xml:space="preserve">Last updated 14 October 2026 at 19:16</w:t>
       </w:r>
     </w:p>
     <w:p>
@@ -1889,6 +1889,52 @@
           <w:p>
             <w:r>
               <w:t xml:space="preserve">Done: end-to-end test detects and answers all five attacks automatically in 1.0 to 1.8 s after the window closes</w:t>
+            </w:r>
+          </w:p>
+        </w:tc>
+      </w:tr>
+      <w:tr>
+        <w:tc>
+          <w:tcPr>
+            <w:tcW w:type="dxa" w:w="3610"/>
+            <w:tcBorders>
+              <w:top w:val="single" w:color="BFBFBF" w:sz="4"/>
+              <w:left w:val="single" w:color="BFBFBF" w:sz="4"/>
+              <w:bottom w:val="single" w:color="BFBFBF" w:sz="4"/>
+              <w:right w:val="single" w:color="BFBFBF" w:sz="4"/>
+            </w:tcBorders>
+            <w:tcMar>
+              <w:top w:type="dxa" w:w="60"/>
+              <w:left w:type="dxa" w:w="100"/>
+              <w:bottom w:type="dxa" w:w="60"/>
+              <w:right w:type="dxa" w:w="100"/>
+            </w:tcMar>
+          </w:tcPr>
+          <w:p>
+            <w:r>
+              <w:t xml:space="preserve">Final rehearsal with Zabbix running</w:t>
+            </w:r>
+          </w:p>
+        </w:tc>
+        <w:tc>
+          <w:tcPr>
+            <w:tcW w:type="dxa" w:w="5416"/>
+            <w:tcBorders>
+              <w:top w:val="single" w:color="BFBFBF" w:sz="4"/>
+              <w:left w:val="single" w:color="BFBFBF" w:sz="4"/>
+              <w:bottom w:val="single" w:color="BFBFBF" w:sz="4"/>
+              <w:right w:val="single" w:color="BFBFBF" w:sz="4"/>
+            </w:tcBorders>
+            <w:tcMar>
+              <w:top w:type="dxa" w:w="60"/>
+              <w:left w:type="dxa" w:w="100"/>
+              <w:bottom w:type="dxa" w:w="60"/>
+              <w:right w:type="dxa" w:w="100"/>
+            </w:tcMar>
+          </w:tcPr>
+          <w:p>
+            <w:r>
+              <w:t xml:space="preserve">Passed 14 Oct 19:08: 5 of 5 attacks answered (1.1 to 1.9 s), no false alarms, 113 scores and 6 actions in Zabbix, lowest free memory 1,272 MB</w:t>
             </w:r>
           </w:p>
         </w:tc>
@@ -15664,10 +15710,10 @@
           <w:b/>
           <w:bCs/>
         </w:rPr>
-        <w:t xml:space="preserve">Rehearse the full demo with Zabbix running</w:t>
-      </w:r>
-      <w:r>
-        <w:t xml:space="preserve"> (the end-to-end test ran with Zabbix stopped to save RAM) and record a backup video.</w:t>
+        <w:t xml:space="preserve">Record a backup video</w:t>
+      </w:r>
+      <w:r>
+        <w:t xml:space="preserve"> of one full demo run (demo.md).</w:t>
       </w:r>
     </w:p>
     <w:p>

</xml_diff>

<commit_message>
Tidy implementation log wording and slides README
</commit_message>
<xml_diff>
--- a/ZT_Project_Implementation_Log.docx
+++ b/ZT_Project_Implementation_Log.docx
@@ -84,7 +84,7 @@
           <w:sz w:val="22"/>
           <w:szCs w:val="22"/>
         </w:rPr>
-        <w:t xml:space="preserve">Last updated 14 October 2026 at 19:16</w:t>
+        <w:t xml:space="preserve">Last updated 29 October 2026 at 11:17</w:t>
       </w:r>
     </w:p>
     <w:p>
@@ -2026,7 +2026,7 @@
           </w:tcPr>
           <w:p>
             <w:r>
-              <w:t xml:space="preserve">Done by a second Claude session in docs/report/ (Chapters 1 to 4 match the built system; Chapter 6 in progress there)</w:t>
+              <w:t xml:space="preserve">Done in docs/report/ (Chapters 1 to 4 match the built system; Chapter 6 in progress there)</w:t>
             </w:r>
           </w:p>
         </w:tc>

</xml_diff>